<commit_message>
Atualizacao automatica 2026-09-19 11:08:33
</commit_message>
<xml_diff>
--- a/docs/template-tcc-geologia-ufsc.docx
+++ b/docs/template-tcc-geologia-ufsc.docx
@@ -1692,7 +1692,7 @@
     </w:p>
     <w:sdt>
       <w:sdtPr>
-        <w:id w:val="-7491702"/>
+        <w:id w:val="1398935853"/>
         <w:docPartObj>
           <w:docPartGallery w:val="Table of Contents"/>
           <w:docPartUnique w:val="1"/>
@@ -2381,20 +2381,9 @@
       </w:pPr>
       <w:r>
         <w:rPr>
-          <w:rFonts w:ascii="Times New Roman" w:cs="Times New Roman" w:eastAsia="Times New Roman" w:hAnsi="Times New Roman"/>
-          <w:b w:val="1"/>
-          <w:bCs w:val="1"/>
-          <w:color w:val="000000"/>
-          <w:sz w:val="24"/>
-          <w:szCs w:val="24"/>
-          <w:rtl w:val="0"/>
-        </w:rPr>
-        <w:t xml:space="preserve">3.1 Pesquisa bibliográfica e bases de dados</w:t>
-      </w:r>
-      <w:r>
-        <w:rPr>
-          <w:rtl w:val="0"/>
-        </w:rPr>
+          <w:rtl w:val="0"/>
+        </w:rPr>
+        <w:t xml:space="preserve">4.1 Pesquisa bibliográfica e bases de dados</w:t>
       </w:r>
     </w:p>
     <w:p>
@@ -2430,15 +2419,9 @@
       </w:pPr>
       <w:r>
         <w:rPr>
-          <w:rFonts w:ascii="Times New Roman" w:cs="Times New Roman" w:eastAsia="Times New Roman" w:hAnsi="Times New Roman"/>
-          <w:b w:val="1"/>
-          <w:bCs w:val="1"/>
-          <w:color w:val="000000"/>
-          <w:sz w:val="24"/>
-          <w:szCs w:val="24"/>
-          <w:rtl w:val="0"/>
-        </w:rPr>
-        <w:t xml:space="preserve">3.2 Etapa de campo</w:t>
+          <w:rtl w:val="0"/>
+        </w:rPr>
+        <w:t xml:space="preserve">4.2 Etapa de campo</w:t>
       </w:r>
       <w:r>
         <w:rPr>
@@ -2479,15 +2462,9 @@
       </w:pPr>
       <w:r>
         <w:rPr>
-          <w:rFonts w:ascii="Times New Roman" w:cs="Times New Roman" w:eastAsia="Times New Roman" w:hAnsi="Times New Roman"/>
-          <w:b w:val="1"/>
-          <w:bCs w:val="1"/>
-          <w:color w:val="000000"/>
-          <w:sz w:val="24"/>
-          <w:szCs w:val="24"/>
-          <w:rtl w:val="0"/>
-        </w:rPr>
-        <w:t xml:space="preserve">3.3 Etapa laboratorial</w:t>
+          <w:rtl w:val="0"/>
+        </w:rPr>
+        <w:t xml:space="preserve">4.3 Etapa laboratorial</w:t>
       </w:r>
       <w:r>
         <w:rPr>
@@ -2528,15 +2505,9 @@
       </w:pPr>
       <w:r>
         <w:rPr>
-          <w:rFonts w:ascii="Times New Roman" w:cs="Times New Roman" w:eastAsia="Times New Roman" w:hAnsi="Times New Roman"/>
-          <w:b w:val="1"/>
-          <w:bCs w:val="1"/>
-          <w:color w:val="000000"/>
-          <w:sz w:val="24"/>
-          <w:szCs w:val="24"/>
-          <w:rtl w:val="0"/>
-        </w:rPr>
-        <w:t xml:space="preserve">3.4 Tratamento e integração dos dados</w:t>
+          <w:rtl w:val="0"/>
+        </w:rPr>
+        <w:t xml:space="preserve">4.4 Tratamento e integração dos dados</w:t>
       </w:r>
       <w:r>
         <w:rPr>
@@ -3105,15 +3076,9 @@
       </w:pPr>
       <w:r>
         <w:rPr>
-          <w:rFonts w:ascii="Times New Roman" w:cs="Times New Roman" w:eastAsia="Times New Roman" w:hAnsi="Times New Roman"/>
-          <w:b w:val="1"/>
-          <w:bCs w:val="1"/>
-          <w:color w:val="000000"/>
-          <w:sz w:val="24"/>
-          <w:szCs w:val="24"/>
-          <w:rtl w:val="0"/>
-        </w:rPr>
-        <w:t xml:space="preserve">4 RESULTADOS</w:t>
+          <w:rtl w:val="0"/>
+        </w:rPr>
+        <w:t xml:space="preserve">5 RESULTADOS</w:t>
       </w:r>
       <w:r>
         <w:rPr>
@@ -3154,15 +3119,9 @@
       </w:pPr>
       <w:r>
         <w:rPr>
-          <w:rFonts w:ascii="Times New Roman" w:cs="Times New Roman" w:eastAsia="Times New Roman" w:hAnsi="Times New Roman"/>
-          <w:b w:val="1"/>
-          <w:bCs w:val="1"/>
-          <w:color w:val="000000"/>
-          <w:sz w:val="24"/>
-          <w:szCs w:val="24"/>
-          <w:rtl w:val="0"/>
-        </w:rPr>
-        <w:t xml:space="preserve">4.1 Exemplo de subseção de resultados</w:t>
+          <w:rtl w:val="0"/>
+        </w:rPr>
+        <w:t xml:space="preserve">5.1 Exemplo de subseção de resultados</w:t>
       </w:r>
       <w:r>
         <w:rPr>
@@ -3364,15 +3323,9 @@
       </w:pPr>
       <w:r>
         <w:rPr>
-          <w:rFonts w:ascii="Times New Roman" w:cs="Times New Roman" w:eastAsia="Times New Roman" w:hAnsi="Times New Roman"/>
-          <w:b w:val="1"/>
-          <w:bCs w:val="1"/>
-          <w:color w:val="000000"/>
-          <w:sz w:val="24"/>
-          <w:szCs w:val="24"/>
-          <w:rtl w:val="0"/>
-        </w:rPr>
-        <w:t xml:space="preserve">5 DISCUSSÃO</w:t>
+          <w:rtl w:val="0"/>
+        </w:rPr>
+        <w:t xml:space="preserve">6 DISCUSSÃO</w:t>
       </w:r>
       <w:r>
         <w:rPr>
@@ -3413,15 +3366,9 @@
       </w:pPr>
       <w:r>
         <w:rPr>
-          <w:rFonts w:ascii="Times New Roman" w:cs="Times New Roman" w:eastAsia="Times New Roman" w:hAnsi="Times New Roman"/>
-          <w:b w:val="1"/>
-          <w:bCs w:val="1"/>
-          <w:color w:val="000000"/>
-          <w:sz w:val="24"/>
-          <w:szCs w:val="24"/>
-          <w:rtl w:val="0"/>
-        </w:rPr>
-        <w:t xml:space="preserve">5.1 Limitações e incertezas</w:t>
+          <w:rtl w:val="0"/>
+        </w:rPr>
+        <w:t xml:space="preserve">6.1 Limitações e incertezas</w:t>
       </w:r>
       <w:r>
         <w:rPr>
@@ -3462,15 +3409,9 @@
       </w:pPr>
       <w:r>
         <w:rPr>
-          <w:rFonts w:ascii="Times New Roman" w:cs="Times New Roman" w:eastAsia="Times New Roman" w:hAnsi="Times New Roman"/>
-          <w:b w:val="1"/>
-          <w:bCs w:val="1"/>
-          <w:color w:val="000000"/>
-          <w:sz w:val="24"/>
-          <w:szCs w:val="24"/>
-          <w:rtl w:val="0"/>
-        </w:rPr>
-        <w:t xml:space="preserve">6 CONCLUSÕES</w:t>
+          <w:rtl w:val="0"/>
+        </w:rPr>
+        <w:t xml:space="preserve">7 CONCLUSÕES</w:t>
       </w:r>
       <w:r>
         <w:rPr>

</xml_diff>

<commit_message>
Atualizacao automatica 2026-09-19 11:23:11
</commit_message>
<xml_diff>
--- a/docs/template-tcc-geologia-ufsc.docx
+++ b/docs/template-tcc-geologia-ufsc.docx
@@ -1692,7 +1692,7 @@
     </w:p>
     <w:sdt>
       <w:sdtPr>
-        <w:id w:val="1398935853"/>
+        <w:id w:val="971864706"/>
         <w:docPartObj>
           <w:docPartGallery w:val="Table of Contents"/>
           <w:docPartUnique w:val="1"/>
@@ -2135,22 +2135,146 @@
     </w:p>
     <w:p>
       <w:pPr>
-        <w:spacing w:after="120" w:line="360" w:lineRule="auto"/>
-        <w:ind w:firstLine="709"/>
+        <w:tabs>
+          <w:tab w:val="left" w:leader="none" w:pos="1267"/>
+        </w:tabs>
+        <w:spacing w:after="0" w:line="240" w:lineRule="auto"/>
         <w:jc w:val="both"/>
         <w:rPr/>
       </w:pPr>
       <w:r>
         <w:rPr>
-          <w:rFonts w:ascii="Times New Roman" w:cs="Times New Roman" w:eastAsia="Times New Roman" w:hAnsi="Times New Roman"/>
+          <w:rFonts w:ascii="Arial" w:cs="Arial" w:eastAsia="Arial" w:hAnsi="Arial"/>
+          <w:rtl w:val="0"/>
+        </w:rPr>
+        <w:t xml:space="preserve"> </w:t>
+        <w:tab/>
+      </w:r>
+      <w:r>
+        <w:rPr>
+          <w:rtl w:val="0"/>
+        </w:rPr>
+        <w:t xml:space="preserve">Apesar de serem menos estudados quando comparado aos deslizamentos terrestres, os movimentos de massa em ambiente marinho também são importantes em termos sociais, econômicos e ecológicos (Clare </w:t>
+      </w:r>
+      <w:r>
+        <w:rPr>
           <w:i w:val="1"/>
           <w:iCs w:val="1"/>
-          <w:color w:val="595959"/>
-          <w:sz w:val="24"/>
-          <w:szCs w:val="24"/>
-          <w:rtl w:val="0"/>
-        </w:rPr>
-        <w:t xml:space="preserve">Explique a relevância científica, regional, ambiental, econômica ou metodológica do estudo, sem repetir os objetivos.</w:t>
+          <w:rtl w:val="0"/>
+        </w:rPr>
+        <w:t xml:space="preserve">et al</w:t>
+      </w:r>
+      <w:r>
+        <w:rPr>
+          <w:rtl w:val="0"/>
+        </w:rPr>
+        <w:t xml:space="preserve">., 2018), uma vez que são fontes potenciais a gerar danos (Vanneste </w:t>
+      </w:r>
+      <w:r>
+        <w:rPr>
+          <w:i w:val="1"/>
+          <w:iCs w:val="1"/>
+          <w:rtl w:val="0"/>
+        </w:rPr>
+        <w:t xml:space="preserve">et al</w:t>
+      </w:r>
+      <w:r>
+        <w:rPr>
+          <w:rtl w:val="0"/>
+        </w:rPr>
+        <w:t xml:space="preserve">., 2014). Frequentemente, esses deslizamentos submarinos geram fluxos de dezenas a centenas de quilômetros, capazes de danificar a infraestrutura estratégica no fundo do mar, como cabos de telecomunicações, plataformas de produção e dutos de hidrocarbonetos (Pope </w:t>
+      </w:r>
+      <w:r>
+        <w:rPr>
+          <w:i w:val="1"/>
+          <w:iCs w:val="1"/>
+          <w:rtl w:val="0"/>
+        </w:rPr>
+        <w:t xml:space="preserve">et al</w:t>
+      </w:r>
+      <w:r>
+        <w:rPr>
+          <w:rtl w:val="0"/>
+        </w:rPr>
+        <w:t xml:space="preserve">., 2016), os quais estão presentes na região norte da Bacia de Santos. </w:t>
+      </w:r>
+    </w:p>
+    <w:p>
+      <w:pPr>
+        <w:tabs>
+          <w:tab w:val="left" w:leader="none" w:pos="1267"/>
+        </w:tabs>
+        <w:spacing w:after="0" w:line="240" w:lineRule="auto"/>
+        <w:jc w:val="both"/>
+        <w:rPr/>
+      </w:pPr>
+      <w:r>
+        <w:rPr>
+          <w:rtl w:val="0"/>
+        </w:rPr>
+        <w:tab/>
+        <w:t xml:space="preserve">Sob soterramento, os depósitos de deslizamentos subaquáticos são elementos importantes nos sistemas petrolíferos, pois influenciam a distribuição dos reservatórios (Kneller </w:t>
+      </w:r>
+      <w:r>
+        <w:rPr>
+          <w:i w:val="1"/>
+          <w:iCs w:val="1"/>
+          <w:rtl w:val="0"/>
+        </w:rPr>
+        <w:t xml:space="preserve">et al</w:t>
+      </w:r>
+      <w:r>
+        <w:rPr>
+          <w:rtl w:val="0"/>
+        </w:rPr>
+        <w:t xml:space="preserve">., 2016), podem atuar como selos (Cardona </w:t>
+      </w:r>
+      <w:r>
+        <w:rPr>
+          <w:i w:val="1"/>
+          <w:iCs w:val="1"/>
+          <w:rtl w:val="0"/>
+        </w:rPr>
+        <w:t xml:space="preserve">et al</w:t>
+      </w:r>
+      <w:r>
+        <w:rPr>
+          <w:rtl w:val="0"/>
+        </w:rPr>
+        <w:t xml:space="preserve">., 2016) e também como potenciais reservatórios (Meckel, 2011).</w:t>
+      </w:r>
+    </w:p>
+    <w:p>
+      <w:pPr>
+        <w:tabs>
+          <w:tab w:val="left" w:leader="none" w:pos="1267"/>
+        </w:tabs>
+        <w:spacing w:after="0" w:line="240" w:lineRule="auto"/>
+        <w:jc w:val="both"/>
+        <w:rPr>
+          <w:highlight w:val="yellow"/>
+        </w:rPr>
+      </w:pPr>
+      <w:r>
+        <w:rPr>
+          <w:rtl w:val="0"/>
+        </w:rPr>
+        <w:tab/>
+        <w:t xml:space="preserve">Um dos maiores desafios de estudos sobre transportes de massa submarinos é a sua natureza, em mar aberto e longe da costa, o que dificulta a aquisição dos dados bem como a falta de informação consistente, por vezes, de baixa resolução (Clare </w:t>
+      </w:r>
+      <w:r>
+        <w:rPr>
+          <w:i w:val="1"/>
+          <w:iCs w:val="1"/>
+          <w:rtl w:val="0"/>
+        </w:rPr>
+        <w:t xml:space="preserve">et al</w:t>
+      </w:r>
+      <w:r>
+        <w:rPr>
+          <w:rtl w:val="0"/>
+        </w:rPr>
+        <w:t xml:space="preserve">., 2018). Assim, convergir conhecimentos da atividade sismoestratigráfica e sismológica, visando a identificação e caracterização de movimentos de massa, dará suporte para avançar no entendimento de processos atuantes na margem continental sudeste e, consequentemente, no planejamento de ações da indústria do petróleo na implantação e monitoramento de infraestrutura de exploração e produção de hidrocarbonetos.</w:t>
       </w:r>
       <w:r>
         <w:rPr>
@@ -2199,33 +2323,179 @@
           <w:szCs w:val="24"/>
           <w:rtl w:val="0"/>
         </w:rPr>
-        <w:t xml:space="preserve">2.1 Localização e acesso</w:t>
-      </w:r>
-      <w:r>
-        <w:rPr>
-          <w:rtl w:val="0"/>
-        </w:rPr>
-      </w:r>
-    </w:p>
-    <w:p>
-      <w:pPr>
-        <w:spacing w:after="120" w:line="360" w:lineRule="auto"/>
-        <w:ind w:firstLine="709"/>
+        <w:t xml:space="preserve">2.1 </w:t>
+      </w:r>
+      <w:r>
+        <w:rPr>
+          <w:rtl w:val="0"/>
+        </w:rPr>
+        <w:t xml:space="preserve">Sísmica de reflexão</w:t>
+      </w:r>
+    </w:p>
+    <w:p>
+      <w:pPr>
+        <w:spacing w:after="240" w:lineRule="auto"/>
+        <w:ind w:firstLine="720"/>
         <w:jc w:val="both"/>
         <w:rPr/>
       </w:pPr>
       <w:r>
         <w:rPr>
-          <w:rFonts w:ascii="Times New Roman" w:cs="Times New Roman" w:eastAsia="Times New Roman" w:hAnsi="Times New Roman"/>
+          <w:rtl w:val="0"/>
+        </w:rPr>
+        <w:t xml:space="preserve">A sísmica de reflexão é um dos métodos geofísicos mais efetivos para mapear a geologia de uma determinada área, principalmente em ambientes submersos, utilizando fontes artificiais. Esse método baseia-se no princípio de que, quando um pulso sísmico é provocado próximo à superfície da coluna d’água por uma fonte artificial, ondas mecânicas se propagam em direção ao interior da Terra até encontrarem interfaces que delimitam camadas litológicas com diferentes impedâncias acústicas, nas quais parte de sua energia é refletida (Tóth, 2011).</w:t>
+      </w:r>
+    </w:p>
+    <w:p>
+      <w:pPr>
+        <w:spacing w:after="240" w:lineRule="auto"/>
+        <w:ind w:firstLine="720"/>
+        <w:jc w:val="both"/>
+        <w:rPr/>
+      </w:pPr>
+      <w:r>
+        <w:rPr>
+          <w:rtl w:val="0"/>
+        </w:rPr>
+        <w:t xml:space="preserve">A impedância acústica (Z) é uma propriedade que pode ser determinada pelo produto entre a densidade (ρ) do meio e a velocidade de propagação (c) da onda, considerando-se uma onda plana com incidência normal à interface. Assim, a impedância acústica de um meio pode ser expressa pela relação: Z = ρc (Yilmaz, 2001). O fenômeno físico da reflexão das ondas acústicas ocorre quando existem contrastes representativos de impedância entre os meios atravessados pelo sinal emitido (Tóth, 2011). Nessas interfaces, parte da energia da onda retorna em direção à superfície, enquanto outra parte é transmitida e continua sua propagação até encontrar uma nova camada com impedância acústica distinta, repetindo-se sucessivamente os processos de reflexão e transmissão.</w:t>
+      </w:r>
+    </w:p>
+    <w:p>
+      <w:pPr>
+        <w:spacing w:after="240" w:lineRule="auto"/>
+        <w:ind w:firstLine="720"/>
+        <w:jc w:val="both"/>
+        <w:rPr/>
+      </w:pPr>
+      <w:r>
+        <w:rPr>
+          <w:rtl w:val="0"/>
+        </w:rPr>
+        <w:t xml:space="preserve">A técnica baseia-se na análise dos intervalos de tempo decorridos entre a emissão dos sinais pela fonte artificial e a chegada das ondas refletidas aos receptores, bem como de suas amplitudes. Esse intervalo é denominado tempo duplo de percurso, ou </w:t>
+      </w:r>
+      <w:r>
+        <w:rPr>
           <w:i w:val="1"/>
           <w:iCs w:val="1"/>
-          <w:color w:val="595959"/>
-          <w:sz w:val="24"/>
-          <w:szCs w:val="24"/>
-          <w:rtl w:val="0"/>
-        </w:rPr>
-        <w:t xml:space="preserve">Delimite a área, descreva os acessos e informe sistema de referência, datum, escala e fontes cartográficas.</w:t>
-      </w:r>
+          <w:rtl w:val="0"/>
+        </w:rPr>
+        <w:t xml:space="preserve">two-way travel time</w:t>
+      </w:r>
+      <w:r>
+        <w:rPr>
+          <w:rtl w:val="0"/>
+        </w:rPr>
+        <w:t xml:space="preserve"> (TWT), pois corresponde ao tempo necessário para que a onda se desloque da fonte até uma determinada interface e retorne à superfície. Dessa forma, os refletores presentes nas seções sísmicas são inicialmente posicionados em função do tempo, geralmente expresso em segundos ou milissegundos, e não diretamente em profundidade. A conversão do tempo em profundidade depende do conhecimento ou da estimativa das velocidades de propagação das ondas nos diferentes materiais atravessados (Yilmaz, 2001).</w:t>
+      </w:r>
+    </w:p>
+    <w:p>
+      <w:pPr>
+        <w:spacing w:after="240" w:lineRule="auto"/>
+        <w:ind w:firstLine="720"/>
+        <w:jc w:val="both"/>
+        <w:rPr/>
+      </w:pPr>
+      <w:r>
+        <w:rPr>
+          <w:rtl w:val="0"/>
+        </w:rPr>
+        <w:t xml:space="preserve">Cada receptor registra, ao longo do tempo, as variações de amplitude das ondas que retornam à superfície. Esse registro individual é denominado traço sísmico e representa a resposta do meio geológico ao pulso emitido em uma determinada posição. A organização de vários traços sísmicos lado a lado forma uma seção sísmica, na qual a continuidade, a geometria e a amplitude das reflexões permitem identificar e interpretar interfaces e estruturas geológicas em subsuperfície (Kearey, 2009; Yilmaz, 2001). Assim, o método de sísmica de reflexão fundamenta-se no processamento e na posterior interpretação das reflexões registradas na superfície (Kearey, 2009).</w:t>
+      </w:r>
+    </w:p>
+    <w:p>
+      <w:pPr>
+        <w:pStyle w:val="Heading3"/>
+        <w:rPr/>
+      </w:pPr>
+      <w:bookmarkStart w:colFirst="0" w:colLast="0" w:name="_1rbldzm8syoo" w:id="0"/>
+      <w:bookmarkEnd w:id="0"/>
+      <w:r>
+        <w:rPr>
+          <w:rtl w:val="0"/>
+        </w:rPr>
+        <w:t xml:space="preserve">2.1.1 Cosseno de fase instantânea</w:t>
+      </w:r>
+    </w:p>
+    <w:p>
+      <w:pPr>
+        <w:spacing w:after="240" w:before="240" w:lineRule="auto"/>
+        <w:ind w:firstLine="720"/>
+        <w:jc w:val="both"/>
+        <w:rPr/>
+      </w:pPr>
+      <w:r>
+        <w:rPr>
+          <w:rtl w:val="0"/>
+        </w:rPr>
+        <w:t xml:space="preserve">O atributo sísmico cosseno da fase instantânea é obtido a partir do cálculo do cosseno da fase instantânea do sinal sísmico, conforme a seguinte equação:</w:t>
+      </w:r>
+    </w:p>
+    <w:p>
+      <w:pPr>
+        <w:jc w:val="center"/>
+        <w:rPr/>
+      </w:pPr>
+      <w:r>
+        <w:rPr>
+          <w:rtl w:val="0"/>
+        </w:rPr>
+        <w:t xml:space="preserve">C(t) = cos(φ(t))    (1)</w:t>
+      </w:r>
+    </w:p>
+    <w:p>
+      <w:pPr>
+        <w:spacing w:after="240" w:before="240" w:lineRule="auto"/>
+        <w:ind w:firstLine="720"/>
+        <w:jc w:val="both"/>
+        <w:rPr/>
+      </w:pPr>
+      <w:r>
+        <w:rPr>
+          <w:rtl w:val="0"/>
+        </w:rPr>
+        <w:t xml:space="preserve">em que C(t) corresponde ao cosseno da fase instantânea e φ(t) representa a fase instantânea do sinal sísmico no tempo t. A fase instantânea é determinada a partir do sinal analítico, cuja parte imaginária é obtida por meio da transformada de Hilbert. Esse procedimento permite separar as informações de fase e amplitude do traço sísmico (Chopra &amp; Marfurt, 2007). Consequentemente, o cálculo do cosseno da fase torna-se independente dos valores de amplitude, promovendo uma normalização do traço sísmico e removendo as variações relacionadas à intensidade do sinal (Meneses, 2010).</w:t>
+      </w:r>
+    </w:p>
+    <w:p>
+      <w:pPr>
+        <w:spacing w:after="240" w:before="240" w:lineRule="auto"/>
+        <w:ind w:firstLine="720"/>
+        <w:jc w:val="both"/>
+        <w:rPr/>
+      </w:pPr>
+      <w:r>
+        <w:rPr>
+          <w:rtl w:val="0"/>
+        </w:rPr>
+        <w:t xml:space="preserve">Ao reduzir a influência dos contrastes de amplitude, esse atributo evidencia a geometria e a configuração dos refletores, permitindo que feições anteriormente pouco perceptíveis sejam visualizadas com maior clareza (Chopra &amp; Marfurt, 2007). Dessa forma, o cosseno da fase instantânea contribui para realçar a continuidade lateral dos refletores, as mudanças no padrão de acamamento e os limites entre sequências sísmicas, auxiliando a interpretação estratigráfica e estrutural dos dados (Alvarenga, 2016).</w:t>
+      </w:r>
+    </w:p>
+    <w:p>
+      <w:pPr>
+        <w:rPr/>
+      </w:pPr>
+      <w:r>
+        <w:rPr>
+          <w:rtl w:val="0"/>
+        </w:rPr>
+      </w:r>
+    </w:p>
+    <w:p>
+      <w:pPr>
+        <w:rPr/>
+      </w:pPr>
+      <w:r>
+        <w:rPr>
+          <w:rtl w:val="0"/>
+        </w:rPr>
+      </w:r>
+    </w:p>
+    <w:p>
+      <w:pPr>
+        <w:pStyle w:val="Heading2"/>
+        <w:keepNext w:val="1"/>
+        <w:rPr/>
+      </w:pPr>
       <w:r>
         <w:rPr>
           <w:rtl w:val="0"/>

</xml_diff>

<commit_message>
Atualizacao automatica 2026-09-19 11:31:35
</commit_message>
<xml_diff>
--- a/docs/template-tcc-geologia-ufsc.docx
+++ b/docs/template-tcc-geologia-ufsc.docx
@@ -1692,7 +1692,7 @@
     </w:p>
     <w:sdt>
       <w:sdtPr>
-        <w:id w:val="971864706"/>
+        <w:id w:val="1911466230"/>
         <w:docPartObj>
           <w:docPartGallery w:val="Table of Contents"/>
           <w:docPartUnique w:val="1"/>
@@ -1775,16 +1775,14 @@
       <w:pPr>
         <w:pStyle w:val="Heading1"/>
         <w:keepNext w:val="1"/>
-        <w:rPr/>
-      </w:pPr>
-      <w:r>
-        <w:rPr>
-          <w:rFonts w:ascii="Times New Roman" w:cs="Times New Roman" w:eastAsia="Times New Roman" w:hAnsi="Times New Roman"/>
-          <w:b w:val="1"/>
-          <w:bCs w:val="1"/>
-          <w:color w:val="000000"/>
-          <w:sz w:val="24"/>
-          <w:szCs w:val="24"/>
+        <w:spacing w:after="240" w:before="240" w:line="360" w:lineRule="auto"/>
+        <w:ind w:firstLine="0"/>
+        <w:jc w:val="left"/>
+        <w:rPr/>
+      </w:pPr>
+      <w:r>
+        <w:rPr>
+          <w:color w:val="000000"/>
           <w:rtl w:val="0"/>
         </w:rPr>
         <w:t xml:space="preserve">1 INTRODUÇÃO</w:t>
@@ -1797,19 +1795,16 @@
     </w:p>
     <w:p>
       <w:pPr>
-        <w:spacing w:after="120" w:line="360" w:lineRule="auto"/>
+        <w:spacing w:after="0" w:before="0" w:line="360" w:lineRule="auto"/>
         <w:ind w:firstLine="709"/>
         <w:jc w:val="both"/>
         <w:rPr/>
       </w:pPr>
       <w:r>
         <w:rPr>
-          <w:rFonts w:ascii="Times New Roman" w:cs="Times New Roman" w:eastAsia="Times New Roman" w:hAnsi="Times New Roman"/>
           <w:i w:val="1"/>
           <w:iCs w:val="1"/>
           <w:color w:val="595959"/>
-          <w:sz w:val="24"/>
-          <w:szCs w:val="24"/>
           <w:rtl w:val="0"/>
         </w:rPr>
         <w:t xml:space="preserve">Apresente o tema, delimite o problema geológico, sintetize o estado do conhecimento, justifique o estudo e antecipe a abordagem utilizada. A introdução deve conduzir naturalmente aos objetivos.</w:t>
@@ -1824,16 +1819,14 @@
       <w:pPr>
         <w:pStyle w:val="Heading2"/>
         <w:keepNext w:val="1"/>
-        <w:rPr/>
-      </w:pPr>
-      <w:r>
-        <w:rPr>
-          <w:rFonts w:ascii="Times New Roman" w:cs="Times New Roman" w:eastAsia="Times New Roman" w:hAnsi="Times New Roman"/>
-          <w:b w:val="1"/>
-          <w:bCs w:val="1"/>
-          <w:color w:val="000000"/>
-          <w:sz w:val="24"/>
-          <w:szCs w:val="24"/>
+        <w:spacing w:after="240" w:before="240" w:line="360" w:lineRule="auto"/>
+        <w:ind w:firstLine="0"/>
+        <w:jc w:val="left"/>
+        <w:rPr/>
+      </w:pPr>
+      <w:r>
+        <w:rPr>
+          <w:color w:val="000000"/>
           <w:rtl w:val="0"/>
         </w:rPr>
         <w:t xml:space="preserve">1.1 Objetivos</w:t>
@@ -1848,16 +1841,14 @@
       <w:pPr>
         <w:pStyle w:val="Heading3"/>
         <w:keepNext w:val="1"/>
-        <w:rPr/>
-      </w:pPr>
-      <w:r>
-        <w:rPr>
-          <w:rFonts w:ascii="Times New Roman" w:cs="Times New Roman" w:eastAsia="Times New Roman" w:hAnsi="Times New Roman"/>
-          <w:b w:val="1"/>
-          <w:bCs w:val="1"/>
-          <w:color w:val="000000"/>
-          <w:sz w:val="24"/>
-          <w:szCs w:val="24"/>
+        <w:spacing w:after="240" w:before="240" w:line="360" w:lineRule="auto"/>
+        <w:ind w:firstLine="0"/>
+        <w:jc w:val="left"/>
+        <w:rPr/>
+      </w:pPr>
+      <w:r>
+        <w:rPr>
+          <w:color w:val="000000"/>
           <w:rtl w:val="0"/>
         </w:rPr>
         <w:t xml:space="preserve">1.1.1 Objetivo geral</w:t>
@@ -1870,19 +1861,16 @@
     </w:p>
     <w:p>
       <w:pPr>
-        <w:spacing w:after="120" w:line="360" w:lineRule="auto"/>
+        <w:spacing w:after="0" w:before="0" w:line="360" w:lineRule="auto"/>
         <w:ind w:firstLine="709"/>
         <w:jc w:val="both"/>
         <w:rPr/>
       </w:pPr>
       <w:r>
         <w:rPr>
-          <w:rFonts w:ascii="Times New Roman" w:cs="Times New Roman" w:eastAsia="Times New Roman" w:hAnsi="Times New Roman"/>
           <w:i w:val="1"/>
           <w:iCs w:val="1"/>
           <w:color w:val="595959"/>
-          <w:sz w:val="24"/>
-          <w:szCs w:val="24"/>
           <w:rtl w:val="0"/>
         </w:rPr>
         <w:t xml:space="preserve">Declare o resultado científico principal que o trabalho pretende alcançar.</w:t>
@@ -1897,16 +1885,14 @@
       <w:pPr>
         <w:pStyle w:val="Heading3"/>
         <w:keepNext w:val="1"/>
-        <w:rPr/>
-      </w:pPr>
-      <w:r>
-        <w:rPr>
-          <w:rFonts w:ascii="Times New Roman" w:cs="Times New Roman" w:eastAsia="Times New Roman" w:hAnsi="Times New Roman"/>
-          <w:b w:val="1"/>
-          <w:bCs w:val="1"/>
-          <w:color w:val="000000"/>
-          <w:sz w:val="24"/>
-          <w:szCs w:val="24"/>
+        <w:spacing w:after="240" w:before="240" w:line="360" w:lineRule="auto"/>
+        <w:ind w:firstLine="0"/>
+        <w:jc w:val="left"/>
+        <w:rPr/>
+      </w:pPr>
+      <w:r>
+        <w:rPr>
+          <w:color w:val="000000"/>
           <w:rtl w:val="0"/>
         </w:rPr>
         <w:t xml:space="preserve">1.1.2 Objetivos específicos</w:t>
@@ -1938,20 +1924,17 @@
         <w:spacing w:after="0" w:before="0" w:line="360" w:lineRule="auto"/>
         <w:ind w:left="360" w:right="0" w:hanging="360"/>
         <w:jc w:val="left"/>
-        <w:rPr/>
-      </w:pPr>
-      <w:r>
-        <w:rPr>
-          <w:rFonts w:ascii="Times New Roman" w:cs="Times New Roman" w:eastAsia="Times New Roman" w:hAnsi="Times New Roman"/>
-          <w:b w:val="0"/>
-          <w:bCs w:val="0"/>
+        <w:rPr>
+          <w:rFonts w:ascii="Times New Roman" w:cs="Times New Roman" w:eastAsia="Times New Roman" w:hAnsi="Times New Roman"/>
+        </w:rPr>
+      </w:pPr>
+      <w:r>
+        <w:rPr>
           <w:i w:val="1"/>
           <w:iCs w:val="1"/>
           <w:smallCaps w:val="0"/>
           <w:strike w:val="0"/>
           <w:color w:val="000000"/>
-          <w:sz w:val="24"/>
-          <w:szCs w:val="24"/>
           <w:u w:val="none"/>
           <w:shd w:fill="auto" w:val="clear"/>
           <w:vertAlign w:val="baseline"/>
@@ -1986,20 +1969,17 @@
         <w:spacing w:after="0" w:before="0" w:line="360" w:lineRule="auto"/>
         <w:ind w:left="360" w:right="0" w:hanging="360"/>
         <w:jc w:val="left"/>
-        <w:rPr/>
-      </w:pPr>
-      <w:r>
-        <w:rPr>
-          <w:rFonts w:ascii="Times New Roman" w:cs="Times New Roman" w:eastAsia="Times New Roman" w:hAnsi="Times New Roman"/>
-          <w:b w:val="0"/>
-          <w:bCs w:val="0"/>
+        <w:rPr>
+          <w:rFonts w:ascii="Times New Roman" w:cs="Times New Roman" w:eastAsia="Times New Roman" w:hAnsi="Times New Roman"/>
+        </w:rPr>
+      </w:pPr>
+      <w:r>
+        <w:rPr>
           <w:i w:val="1"/>
           <w:iCs w:val="1"/>
           <w:smallCaps w:val="0"/>
           <w:strike w:val="0"/>
           <w:color w:val="000000"/>
-          <w:sz w:val="24"/>
-          <w:szCs w:val="24"/>
           <w:u w:val="none"/>
           <w:shd w:fill="auto" w:val="clear"/>
           <w:vertAlign w:val="baseline"/>
@@ -2034,20 +2014,17 @@
         <w:spacing w:after="0" w:before="0" w:line="360" w:lineRule="auto"/>
         <w:ind w:left="360" w:right="0" w:hanging="360"/>
         <w:jc w:val="left"/>
-        <w:rPr/>
-      </w:pPr>
-      <w:r>
-        <w:rPr>
-          <w:rFonts w:ascii="Times New Roman" w:cs="Times New Roman" w:eastAsia="Times New Roman" w:hAnsi="Times New Roman"/>
-          <w:b w:val="0"/>
-          <w:bCs w:val="0"/>
+        <w:rPr>
+          <w:rFonts w:ascii="Times New Roman" w:cs="Times New Roman" w:eastAsia="Times New Roman" w:hAnsi="Times New Roman"/>
+        </w:rPr>
+      </w:pPr>
+      <w:r>
+        <w:rPr>
           <w:i w:val="1"/>
           <w:iCs w:val="1"/>
           <w:smallCaps w:val="0"/>
           <w:strike w:val="0"/>
           <w:color w:val="000000"/>
-          <w:sz w:val="24"/>
-          <w:szCs w:val="24"/>
           <w:u w:val="none"/>
           <w:shd w:fill="auto" w:val="clear"/>
           <w:vertAlign w:val="baseline"/>
@@ -2079,23 +2056,20 @@
           <w:between w:space="0" w:sz="0" w:val="nil"/>
         </w:pBdr>
         <w:shd w:fill="auto" w:val="clear"/>
-        <w:spacing w:after="120" w:before="0" w:line="360" w:lineRule="auto"/>
+        <w:spacing w:after="0" w:before="0" w:line="360" w:lineRule="auto"/>
         <w:ind w:left="360" w:right="0" w:hanging="360"/>
         <w:jc w:val="left"/>
-        <w:rPr/>
-      </w:pPr>
-      <w:r>
-        <w:rPr>
-          <w:rFonts w:ascii="Times New Roman" w:cs="Times New Roman" w:eastAsia="Times New Roman" w:hAnsi="Times New Roman"/>
-          <w:b w:val="0"/>
-          <w:bCs w:val="0"/>
+        <w:rPr>
+          <w:rFonts w:ascii="Times New Roman" w:cs="Times New Roman" w:eastAsia="Times New Roman" w:hAnsi="Times New Roman"/>
+        </w:rPr>
+      </w:pPr>
+      <w:r>
+        <w:rPr>
           <w:i w:val="1"/>
           <w:iCs w:val="1"/>
           <w:smallCaps w:val="0"/>
           <w:strike w:val="0"/>
           <w:color w:val="000000"/>
-          <w:sz w:val="24"/>
-          <w:szCs w:val="24"/>
           <w:u w:val="none"/>
           <w:shd w:fill="auto" w:val="clear"/>
           <w:vertAlign w:val="baseline"/>
@@ -2113,16 +2087,14 @@
       <w:pPr>
         <w:pStyle w:val="Heading2"/>
         <w:keepNext w:val="1"/>
-        <w:rPr/>
-      </w:pPr>
-      <w:r>
-        <w:rPr>
-          <w:rFonts w:ascii="Times New Roman" w:cs="Times New Roman" w:eastAsia="Times New Roman" w:hAnsi="Times New Roman"/>
-          <w:b w:val="1"/>
-          <w:bCs w:val="1"/>
-          <w:color w:val="000000"/>
-          <w:sz w:val="24"/>
-          <w:szCs w:val="24"/>
+        <w:spacing w:after="240" w:before="240" w:line="360" w:lineRule="auto"/>
+        <w:ind w:firstLine="0"/>
+        <w:jc w:val="left"/>
+        <w:rPr/>
+      </w:pPr>
+      <w:r>
+        <w:rPr>
+          <w:color w:val="000000"/>
           <w:rtl w:val="0"/>
         </w:rPr>
         <w:t xml:space="preserve">1.2 Justificativa</w:t>
@@ -2138,18 +2110,11 @@
         <w:tabs>
           <w:tab w:val="left" w:leader="none" w:pos="1267"/>
         </w:tabs>
-        <w:spacing w:after="0" w:line="240" w:lineRule="auto"/>
+        <w:spacing w:after="0" w:before="0" w:line="360" w:lineRule="auto"/>
+        <w:ind w:firstLine="709"/>
         <w:jc w:val="both"/>
         <w:rPr/>
       </w:pPr>
-      <w:r>
-        <w:rPr>
-          <w:rFonts w:ascii="Arial" w:cs="Arial" w:eastAsia="Arial" w:hAnsi="Arial"/>
-          <w:rtl w:val="0"/>
-        </w:rPr>
-        <w:t xml:space="preserve"> </w:t>
-        <w:tab/>
-      </w:r>
       <w:r>
         <w:rPr>
           <w:rtl w:val="0"/>
@@ -2204,7 +2169,8 @@
         <w:tabs>
           <w:tab w:val="left" w:leader="none" w:pos="1267"/>
         </w:tabs>
-        <w:spacing w:after="0" w:line="240" w:lineRule="auto"/>
+        <w:spacing w:after="0" w:before="0" w:line="360" w:lineRule="auto"/>
+        <w:ind w:firstLine="709"/>
         <w:jc w:val="both"/>
         <w:rPr/>
       </w:pPr>
@@ -2212,7 +2178,6 @@
         <w:rPr>
           <w:rtl w:val="0"/>
         </w:rPr>
-        <w:tab/>
         <w:t xml:space="preserve">Sob soterramento, os depósitos de deslizamentos subaquáticos são elementos importantes nos sistemas petrolíferos, pois influenciam a distribuição dos reservatórios (Kneller </w:t>
       </w:r>
       <w:r>
@@ -2249,7 +2214,8 @@
         <w:tabs>
           <w:tab w:val="left" w:leader="none" w:pos="1267"/>
         </w:tabs>
-        <w:spacing w:after="0" w:line="240" w:lineRule="auto"/>
+        <w:spacing w:after="0" w:before="0" w:line="360" w:lineRule="auto"/>
+        <w:ind w:firstLine="709"/>
         <w:jc w:val="both"/>
         <w:rPr>
           <w:highlight w:val="yellow"/>
@@ -2259,7 +2225,6 @@
         <w:rPr>
           <w:rtl w:val="0"/>
         </w:rPr>
-        <w:tab/>
         <w:t xml:space="preserve">Um dos maiores desafios de estudos sobre transportes de massa submarinos é a sua natureza, em mar aberto e longe da costa, o que dificulta a aquisição dos dados bem como a falta de informação consistente, por vezes, de baixa resolução (Clare </w:t>
       </w:r>
       <w:r>
@@ -2286,16 +2251,14 @@
       <w:pPr>
         <w:pStyle w:val="Heading1"/>
         <w:keepNext w:val="1"/>
-        <w:rPr/>
-      </w:pPr>
-      <w:r>
-        <w:rPr>
-          <w:rFonts w:ascii="Times New Roman" w:cs="Times New Roman" w:eastAsia="Times New Roman" w:hAnsi="Times New Roman"/>
-          <w:b w:val="1"/>
-          <w:bCs w:val="1"/>
-          <w:color w:val="000000"/>
-          <w:sz w:val="24"/>
-          <w:szCs w:val="24"/>
+        <w:spacing w:after="240" w:before="240" w:line="360" w:lineRule="auto"/>
+        <w:ind w:firstLine="0"/>
+        <w:jc w:val="left"/>
+        <w:rPr/>
+      </w:pPr>
+      <w:r>
+        <w:rPr>
+          <w:color w:val="000000"/>
           <w:rtl w:val="0"/>
         </w:rPr>
         <w:t xml:space="preserve">2 </w:t>
@@ -2311,16 +2274,14 @@
       <w:pPr>
         <w:pStyle w:val="Heading2"/>
         <w:keepNext w:val="1"/>
-        <w:rPr/>
-      </w:pPr>
-      <w:r>
-        <w:rPr>
-          <w:rFonts w:ascii="Times New Roman" w:cs="Times New Roman" w:eastAsia="Times New Roman" w:hAnsi="Times New Roman"/>
-          <w:b w:val="1"/>
-          <w:bCs w:val="1"/>
-          <w:color w:val="000000"/>
-          <w:sz w:val="24"/>
-          <w:szCs w:val="24"/>
+        <w:spacing w:after="240" w:before="240" w:line="360" w:lineRule="auto"/>
+        <w:ind w:firstLine="0"/>
+        <w:jc w:val="left"/>
+        <w:rPr/>
+      </w:pPr>
+      <w:r>
+        <w:rPr>
+          <w:color w:val="000000"/>
           <w:rtl w:val="0"/>
         </w:rPr>
         <w:t xml:space="preserve">2.1 </w:t>
@@ -2334,8 +2295,8 @@
     </w:p>
     <w:p>
       <w:pPr>
-        <w:spacing w:after="240" w:lineRule="auto"/>
-        <w:ind w:firstLine="720"/>
+        <w:spacing w:after="0" w:before="0" w:line="360" w:lineRule="auto"/>
+        <w:ind w:firstLine="709"/>
         <w:jc w:val="both"/>
         <w:rPr/>
       </w:pPr>
@@ -2348,8 +2309,8 @@
     </w:p>
     <w:p>
       <w:pPr>
-        <w:spacing w:after="240" w:lineRule="auto"/>
-        <w:ind w:firstLine="720"/>
+        <w:spacing w:after="0" w:before="0" w:line="360" w:lineRule="auto"/>
+        <w:ind w:firstLine="709"/>
         <w:jc w:val="both"/>
         <w:rPr/>
       </w:pPr>
@@ -2362,8 +2323,8 @@
     </w:p>
     <w:p>
       <w:pPr>
-        <w:spacing w:after="240" w:lineRule="auto"/>
-        <w:ind w:firstLine="720"/>
+        <w:spacing w:after="0" w:before="0" w:line="360" w:lineRule="auto"/>
+        <w:ind w:firstLine="709"/>
         <w:jc w:val="both"/>
         <w:rPr/>
       </w:pPr>
@@ -2390,8 +2351,8 @@
     </w:p>
     <w:p>
       <w:pPr>
-        <w:spacing w:after="240" w:lineRule="auto"/>
-        <w:ind w:firstLine="720"/>
+        <w:spacing w:after="0" w:before="0" w:line="360" w:lineRule="auto"/>
+        <w:ind w:firstLine="709"/>
         <w:jc w:val="both"/>
         <w:rPr/>
       </w:pPr>
@@ -2405,6 +2366,10 @@
     <w:p>
       <w:pPr>
         <w:pStyle w:val="Heading3"/>
+        <w:keepNext w:val="1"/>
+        <w:spacing w:after="240" w:before="240" w:line="360" w:lineRule="auto"/>
+        <w:ind w:firstLine="0"/>
+        <w:jc w:val="left"/>
         <w:rPr/>
       </w:pPr>
       <w:bookmarkStart w:colFirst="0" w:colLast="0" w:name="_1rbldzm8syoo" w:id="0"/>
@@ -2418,8 +2383,8 @@
     </w:p>
     <w:p>
       <w:pPr>
-        <w:spacing w:after="240" w:before="240" w:lineRule="auto"/>
-        <w:ind w:firstLine="720"/>
+        <w:spacing w:after="0" w:before="0" w:line="360" w:lineRule="auto"/>
+        <w:ind w:firstLine="709"/>
         <w:jc w:val="both"/>
         <w:rPr/>
       </w:pPr>
@@ -2432,6 +2397,8 @@
     </w:p>
     <w:p>
       <w:pPr>
+        <w:spacing w:after="0" w:before="0" w:line="360" w:lineRule="auto"/>
+        <w:ind w:firstLine="0"/>
         <w:jc w:val="center"/>
         <w:rPr/>
       </w:pPr>
@@ -2444,8 +2411,8 @@
     </w:p>
     <w:p>
       <w:pPr>
-        <w:spacing w:after="240" w:before="240" w:lineRule="auto"/>
-        <w:ind w:firstLine="720"/>
+        <w:spacing w:after="0" w:before="0" w:line="360" w:lineRule="auto"/>
+        <w:ind w:firstLine="709"/>
         <w:jc w:val="both"/>
         <w:rPr/>
       </w:pPr>
@@ -2458,8 +2425,8 @@
     </w:p>
     <w:p>
       <w:pPr>
-        <w:spacing w:after="240" w:before="240" w:lineRule="auto"/>
-        <w:ind w:firstLine="720"/>
+        <w:spacing w:after="0" w:before="0" w:line="360" w:lineRule="auto"/>
+        <w:ind w:firstLine="709"/>
         <w:jc w:val="both"/>
         <w:rPr/>
       </w:pPr>
@@ -2506,16 +2473,14 @@
       <w:pPr>
         <w:pStyle w:val="Heading2"/>
         <w:keepNext w:val="1"/>
-        <w:rPr/>
-      </w:pPr>
-      <w:r>
-        <w:rPr>
-          <w:rFonts w:ascii="Times New Roman" w:cs="Times New Roman" w:eastAsia="Times New Roman" w:hAnsi="Times New Roman"/>
-          <w:b w:val="1"/>
-          <w:bCs w:val="1"/>
-          <w:color w:val="000000"/>
-          <w:sz w:val="24"/>
-          <w:szCs w:val="24"/>
+        <w:spacing w:after="240" w:before="240" w:line="360" w:lineRule="auto"/>
+        <w:ind w:firstLine="0"/>
+        <w:jc w:val="left"/>
+        <w:rPr/>
+      </w:pPr>
+      <w:r>
+        <w:rPr>
+          <w:color w:val="000000"/>
           <w:rtl w:val="0"/>
         </w:rPr>
         <w:t xml:space="preserve">2.2 Contexto geológico regional</w:t>
@@ -2528,19 +2493,16 @@
     </w:p>
     <w:p>
       <w:pPr>
-        <w:spacing w:after="120" w:line="360" w:lineRule="auto"/>
+        <w:spacing w:after="0" w:before="0" w:line="360" w:lineRule="auto"/>
         <w:ind w:firstLine="709"/>
         <w:jc w:val="both"/>
         <w:rPr/>
       </w:pPr>
       <w:r>
         <w:rPr>
-          <w:rFonts w:ascii="Times New Roman" w:cs="Times New Roman" w:eastAsia="Times New Roman" w:hAnsi="Times New Roman"/>
           <w:i w:val="1"/>
           <w:iCs w:val="1"/>
           <w:color w:val="595959"/>
-          <w:sz w:val="24"/>
-          <w:szCs w:val="24"/>
           <w:rtl w:val="0"/>
         </w:rPr>
         <w:t xml:space="preserve">Apresente unidades litoestratigráficas, evolução tectônica, idades, estruturas e trabalhos prévios relevantes.</w:t>
@@ -2555,16 +2517,14 @@
       <w:pPr>
         <w:pStyle w:val="Heading2"/>
         <w:keepNext w:val="1"/>
-        <w:rPr/>
-      </w:pPr>
-      <w:r>
-        <w:rPr>
-          <w:rFonts w:ascii="Times New Roman" w:cs="Times New Roman" w:eastAsia="Times New Roman" w:hAnsi="Times New Roman"/>
-          <w:b w:val="1"/>
-          <w:bCs w:val="1"/>
-          <w:color w:val="000000"/>
-          <w:sz w:val="24"/>
-          <w:szCs w:val="24"/>
+        <w:spacing w:after="240" w:before="240" w:line="360" w:lineRule="auto"/>
+        <w:ind w:firstLine="0"/>
+        <w:jc w:val="left"/>
+        <w:rPr/>
+      </w:pPr>
+      <w:r>
+        <w:rPr>
+          <w:color w:val="000000"/>
           <w:rtl w:val="0"/>
         </w:rPr>
         <w:t xml:space="preserve">2.3 Geologia local</w:t>
@@ -2577,19 +2537,16 @@
     </w:p>
     <w:p>
       <w:pPr>
-        <w:spacing w:after="120" w:line="360" w:lineRule="auto"/>
+        <w:spacing w:after="0" w:before="0" w:line="360" w:lineRule="auto"/>
         <w:ind w:firstLine="709"/>
         <w:jc w:val="both"/>
         <w:rPr/>
       </w:pPr>
       <w:r>
         <w:rPr>
-          <w:rFonts w:ascii="Times New Roman" w:cs="Times New Roman" w:eastAsia="Times New Roman" w:hAnsi="Times New Roman"/>
           <w:i w:val="1"/>
           <w:iCs w:val="1"/>
           <w:color w:val="595959"/>
-          <w:sz w:val="24"/>
-          <w:szCs w:val="24"/>
           <w:rtl w:val="0"/>
         </w:rPr>
         <w:t xml:space="preserve">Descreva as unidades e relações observadas na escala do estudo. Separe observações de interpretações quando necessário.</w:t>
@@ -2604,6 +2561,9 @@
       <w:pPr>
         <w:pStyle w:val="Heading1"/>
         <w:keepNext w:val="1"/>
+        <w:spacing w:after="240" w:before="240" w:line="360" w:lineRule="auto"/>
+        <w:ind w:firstLine="0"/>
+        <w:jc w:val="left"/>
         <w:rPr/>
       </w:pPr>
       <w:r>
@@ -2617,6 +2577,9 @@
       <w:pPr>
         <w:pStyle w:val="Heading1"/>
         <w:keepNext w:val="1"/>
+        <w:spacing w:after="240" w:before="240" w:line="360" w:lineRule="auto"/>
+        <w:ind w:firstLine="0"/>
+        <w:jc w:val="left"/>
         <w:rPr/>
       </w:pPr>
       <w:r>
@@ -2627,12 +2590,7 @@
       </w:r>
       <w:r>
         <w:rPr>
-          <w:rFonts w:ascii="Times New Roman" w:cs="Times New Roman" w:eastAsia="Times New Roman" w:hAnsi="Times New Roman"/>
-          <w:b w:val="1"/>
-          <w:bCs w:val="1"/>
-          <w:color w:val="000000"/>
-          <w:sz w:val="24"/>
-          <w:szCs w:val="24"/>
+          <w:color w:val="000000"/>
           <w:rtl w:val="0"/>
         </w:rPr>
         <w:t xml:space="preserve"> MATERIAIS E MÉTODOS</w:t>
@@ -2647,6 +2605,9 @@
       <w:pPr>
         <w:pStyle w:val="Heading2"/>
         <w:keepNext w:val="1"/>
+        <w:spacing w:after="240" w:before="240" w:line="360" w:lineRule="auto"/>
+        <w:ind w:firstLine="0"/>
+        <w:jc w:val="left"/>
         <w:rPr/>
       </w:pPr>
       <w:r>
@@ -2658,19 +2619,16 @@
     </w:p>
     <w:p>
       <w:pPr>
-        <w:spacing w:after="120" w:line="360" w:lineRule="auto"/>
+        <w:spacing w:after="0" w:before="0" w:line="360" w:lineRule="auto"/>
         <w:ind w:firstLine="709"/>
         <w:jc w:val="both"/>
         <w:rPr/>
       </w:pPr>
       <w:r>
         <w:rPr>
-          <w:rFonts w:ascii="Times New Roman" w:cs="Times New Roman" w:eastAsia="Times New Roman" w:hAnsi="Times New Roman"/>
           <w:i w:val="1"/>
           <w:iCs w:val="1"/>
           <w:color w:val="595959"/>
-          <w:sz w:val="24"/>
-          <w:szCs w:val="24"/>
           <w:rtl w:val="0"/>
         </w:rPr>
         <w:t xml:space="preserve">Indique bases consultadas, critérios de seleção, mapas, imagens, modelos digitais de elevação, dados geoquímicos e demais produtos utilizados.</w:t>
@@ -2685,6 +2643,9 @@
       <w:pPr>
         <w:pStyle w:val="Heading2"/>
         <w:keepNext w:val="1"/>
+        <w:spacing w:after="240" w:before="240" w:line="360" w:lineRule="auto"/>
+        <w:ind w:firstLine="0"/>
+        <w:jc w:val="left"/>
         <w:rPr/>
       </w:pPr>
       <w:r>
@@ -2701,19 +2662,16 @@
     </w:p>
     <w:p>
       <w:pPr>
-        <w:spacing w:after="120" w:line="360" w:lineRule="auto"/>
+        <w:spacing w:after="0" w:before="0" w:line="360" w:lineRule="auto"/>
         <w:ind w:firstLine="709"/>
         <w:jc w:val="both"/>
         <w:rPr/>
       </w:pPr>
       <w:r>
         <w:rPr>
-          <w:rFonts w:ascii="Times New Roman" w:cs="Times New Roman" w:eastAsia="Times New Roman" w:hAnsi="Times New Roman"/>
           <w:i w:val="1"/>
           <w:iCs w:val="1"/>
           <w:color w:val="595959"/>
-          <w:sz w:val="24"/>
-          <w:szCs w:val="24"/>
           <w:rtl w:val="0"/>
         </w:rPr>
         <w:t xml:space="preserve">Informe período, escala de trabalho, equipamentos, critérios de descrição de afloramentos, amostragem, controle de qualidade e registro de coordenadas.</w:t>
@@ -2728,6 +2686,9 @@
       <w:pPr>
         <w:pStyle w:val="Heading2"/>
         <w:keepNext w:val="1"/>
+        <w:spacing w:after="240" w:before="240" w:line="360" w:lineRule="auto"/>
+        <w:ind w:firstLine="0"/>
+        <w:jc w:val="left"/>
         <w:rPr/>
       </w:pPr>
       <w:r>
@@ -2744,19 +2705,16 @@
     </w:p>
     <w:p>
       <w:pPr>
-        <w:spacing w:after="120" w:line="360" w:lineRule="auto"/>
+        <w:spacing w:after="0" w:before="0" w:line="360" w:lineRule="auto"/>
         <w:ind w:firstLine="709"/>
         <w:jc w:val="both"/>
         <w:rPr/>
       </w:pPr>
       <w:r>
         <w:rPr>
-          <w:rFonts w:ascii="Times New Roman" w:cs="Times New Roman" w:eastAsia="Times New Roman" w:hAnsi="Times New Roman"/>
           <w:i w:val="1"/>
           <w:iCs w:val="1"/>
           <w:color w:val="595959"/>
-          <w:sz w:val="24"/>
-          <w:szCs w:val="24"/>
           <w:rtl w:val="0"/>
         </w:rPr>
         <w:t xml:space="preserve">Descreva preparação das amostras, métodos analíticos, equipamentos, padrões, limites de detecção, brancos, duplicatas e tratamento de incertezas.</w:t>
@@ -2771,6 +2729,9 @@
       <w:pPr>
         <w:pStyle w:val="Heading2"/>
         <w:keepNext w:val="1"/>
+        <w:spacing w:after="240" w:before="240" w:line="360" w:lineRule="auto"/>
+        <w:ind w:firstLine="0"/>
+        <w:jc w:val="left"/>
         <w:rPr/>
       </w:pPr>
       <w:r>
@@ -2787,19 +2748,16 @@
     </w:p>
     <w:p>
       <w:pPr>
-        <w:spacing w:after="120" w:line="360" w:lineRule="auto"/>
+        <w:spacing w:after="0" w:before="0" w:line="360" w:lineRule="auto"/>
         <w:ind w:firstLine="709"/>
         <w:jc w:val="both"/>
         <w:rPr/>
       </w:pPr>
       <w:r>
         <w:rPr>
-          <w:rFonts w:ascii="Times New Roman" w:cs="Times New Roman" w:eastAsia="Times New Roman" w:hAnsi="Times New Roman"/>
           <w:i w:val="1"/>
           <w:iCs w:val="1"/>
           <w:color w:val="595959"/>
-          <w:sz w:val="24"/>
-          <w:szCs w:val="24"/>
           <w:rtl w:val="0"/>
         </w:rPr>
         <w:t xml:space="preserve">Explique os procedimentos estatísticos, petrográficos, geoquímicos, geocronológicos, geofísicos, geotécnicos ou de geoprocessamento. Declare softwares e versões quando relevantes à reprodutibilidade.</w:t>
@@ -2828,9 +2786,18 @@
         <w:ind w:left="0" w:right="0" w:firstLine="0"/>
         <w:jc w:val="left"/>
         <w:rPr>
-          <w:rFonts w:ascii="Times New Roman" w:cs="Times New Roman" w:eastAsia="Times New Roman" w:hAnsi="Times New Roman"/>
-          <w:b w:val="0"/>
-          <w:bCs w:val="0"/>
+          <w:i w:val="0"/>
+          <w:iCs w:val="0"/>
+          <w:smallCaps w:val="0"/>
+          <w:strike w:val="0"/>
+          <w:color w:val="000000"/>
+          <w:u w:val="none"/>
+          <w:shd w:fill="auto" w:val="clear"/>
+          <w:vertAlign w:val="baseline"/>
+        </w:rPr>
+      </w:pPr>
+      <w:r>
+        <w:rPr>
           <w:i w:val="0"/>
           <w:iCs w:val="0"/>
           <w:smallCaps w:val="0"/>
@@ -2841,26 +2808,23 @@
           <w:u w:val="none"/>
           <w:shd w:fill="auto" w:val="clear"/>
           <w:vertAlign w:val="baseline"/>
-        </w:rPr>
-      </w:pPr>
-      <w:r>
-        <w:rPr>
-          <w:rFonts w:ascii="Times New Roman" w:cs="Times New Roman" w:eastAsia="Times New Roman" w:hAnsi="Times New Roman"/>
-          <w:b w:val="0"/>
-          <w:bCs w:val="0"/>
+          <w:rtl w:val="0"/>
+        </w:rPr>
+        <w:t xml:space="preserve">Quadro 1 — Exemplo de organização do levantamento de camp</w:t>
+      </w:r>
+      <w:r>
+        <w:rPr>
           <w:i w:val="0"/>
           <w:iCs w:val="0"/>
           <w:smallCaps w:val="0"/>
           <w:strike w:val="0"/>
           <w:color w:val="000000"/>
-          <w:sz w:val="20"/>
-          <w:szCs w:val="20"/>
           <w:u w:val="none"/>
           <w:shd w:fill="auto" w:val="clear"/>
           <w:vertAlign w:val="baseline"/>
           <w:rtl w:val="0"/>
         </w:rPr>
-        <w:t xml:space="preserve">Quadro 1 — Exemplo de organização do levantamento de campo</w:t>
+        <w:t xml:space="preserve">o</w:t>
       </w:r>
     </w:p>
     <w:tbl>
@@ -3320,9 +3284,6 @@
       </w:pPr>
       <w:r>
         <w:rPr>
-          <w:rFonts w:ascii="Times New Roman" w:cs="Times New Roman" w:eastAsia="Times New Roman" w:hAnsi="Times New Roman"/>
-          <w:b w:val="0"/>
-          <w:bCs w:val="0"/>
           <w:i w:val="0"/>
           <w:iCs w:val="0"/>
           <w:smallCaps w:val="0"/>
@@ -3335,13 +3296,35 @@
           <w:vertAlign w:val="baseline"/>
           <w:rtl w:val="0"/>
         </w:rPr>
-        <w:t xml:space="preserve">Fonte: elaboração própria.</w:t>
+        <w:t xml:space="preserve">Fonte: elaboração própria</w:t>
+      </w:r>
+      <w:r>
+        <w:rPr>
+          <w:rFonts w:ascii="Times New Roman" w:cs="Times New Roman" w:eastAsia="Times New Roman" w:hAnsi="Times New Roman"/>
+          <w:b w:val="0"/>
+          <w:bCs w:val="0"/>
+          <w:i w:val="0"/>
+          <w:iCs w:val="0"/>
+          <w:smallCaps w:val="0"/>
+          <w:strike w:val="0"/>
+          <w:color w:val="000000"/>
+          <w:sz w:val="20"/>
+          <w:szCs w:val="20"/>
+          <w:u w:val="none"/>
+          <w:shd w:fill="auto" w:val="clear"/>
+          <w:vertAlign w:val="baseline"/>
+          <w:rtl w:val="0"/>
+        </w:rPr>
+        <w:t xml:space="preserve">.</w:t>
       </w:r>
     </w:p>
     <w:p>
       <w:pPr>
         <w:pStyle w:val="Heading1"/>
         <w:keepNext w:val="1"/>
+        <w:spacing w:after="240" w:before="240" w:line="360" w:lineRule="auto"/>
+        <w:ind w:firstLine="0"/>
+        <w:jc w:val="left"/>
         <w:rPr/>
       </w:pPr>
       <w:r>
@@ -3358,19 +3341,16 @@
     </w:p>
     <w:p>
       <w:pPr>
-        <w:spacing w:after="120" w:line="360" w:lineRule="auto"/>
+        <w:spacing w:after="0" w:before="0" w:line="360" w:lineRule="auto"/>
         <w:ind w:firstLine="709"/>
         <w:jc w:val="both"/>
         <w:rPr/>
       </w:pPr>
       <w:r>
         <w:rPr>
-          <w:rFonts w:ascii="Times New Roman" w:cs="Times New Roman" w:eastAsia="Times New Roman" w:hAnsi="Times New Roman"/>
           <w:i w:val="1"/>
           <w:iCs w:val="1"/>
           <w:color w:val="595959"/>
-          <w:sz w:val="24"/>
-          <w:szCs w:val="24"/>
           <w:rtl w:val="0"/>
         </w:rPr>
         <w:t xml:space="preserve">Apresente observações, medições e produtos do estudo de forma ordenada. Use mapas, perfis, fotografias, tabelas e diagramas quando contribuírem para a análise. Informe escala, orientação, coordenadas, datum, fonte e legenda sempre que aplicável.</w:t>
@@ -3385,6 +3365,9 @@
       <w:pPr>
         <w:pStyle w:val="Heading2"/>
         <w:keepNext w:val="1"/>
+        <w:spacing w:after="240" w:before="240" w:line="360" w:lineRule="auto"/>
+        <w:ind w:firstLine="0"/>
+        <w:jc w:val="left"/>
         <w:rPr/>
       </w:pPr>
       <w:r>
@@ -3401,19 +3384,16 @@
     </w:p>
     <w:p>
       <w:pPr>
-        <w:spacing w:after="120" w:line="360" w:lineRule="auto"/>
+        <w:spacing w:after="0" w:before="0" w:line="360" w:lineRule="auto"/>
         <w:ind w:firstLine="709"/>
         <w:jc w:val="both"/>
         <w:rPr/>
       </w:pPr>
       <w:r>
         <w:rPr>
-          <w:rFonts w:ascii="Times New Roman" w:cs="Times New Roman" w:eastAsia="Times New Roman" w:hAnsi="Times New Roman"/>
           <w:i w:val="1"/>
           <w:iCs w:val="1"/>
           <w:color w:val="595959"/>
-          <w:sz w:val="24"/>
-          <w:szCs w:val="24"/>
           <w:rtl w:val="0"/>
         </w:rPr>
         <w:t xml:space="preserve">Substitua por uma organização coerente com os conjuntos de dados do trabalho, como geologia de campo, petrografia, geoquímica, geofísica ou geoprocessamento.</w:t>
@@ -3442,9 +3422,18 @@
         <w:ind w:left="0" w:right="0" w:firstLine="0"/>
         <w:jc w:val="left"/>
         <w:rPr>
-          <w:rFonts w:ascii="Times New Roman" w:cs="Times New Roman" w:eastAsia="Times New Roman" w:hAnsi="Times New Roman"/>
-          <w:b w:val="0"/>
-          <w:bCs w:val="0"/>
+          <w:i w:val="0"/>
+          <w:iCs w:val="0"/>
+          <w:smallCaps w:val="0"/>
+          <w:strike w:val="0"/>
+          <w:color w:val="000000"/>
+          <w:u w:val="none"/>
+          <w:shd w:fill="auto" w:val="clear"/>
+          <w:vertAlign w:val="baseline"/>
+        </w:rPr>
+      </w:pPr>
+      <w:r>
+        <w:rPr>
           <w:i w:val="0"/>
           <w:iCs w:val="0"/>
           <w:smallCaps w:val="0"/>
@@ -3455,26 +3444,23 @@
           <w:u w:val="none"/>
           <w:shd w:fill="auto" w:val="clear"/>
           <w:vertAlign w:val="baseline"/>
-        </w:rPr>
-      </w:pPr>
-      <w:r>
-        <w:rPr>
-          <w:rFonts w:ascii="Times New Roman" w:cs="Times New Roman" w:eastAsia="Times New Roman" w:hAnsi="Times New Roman"/>
-          <w:b w:val="0"/>
-          <w:bCs w:val="0"/>
+          <w:rtl w:val="0"/>
+        </w:rPr>
+        <w:t xml:space="preserve">Figura 1 — Título descritivo da figur</w:t>
+      </w:r>
+      <w:r>
+        <w:rPr>
           <w:i w:val="0"/>
           <w:iCs w:val="0"/>
           <w:smallCaps w:val="0"/>
           <w:strike w:val="0"/>
           <w:color w:val="000000"/>
-          <w:sz w:val="20"/>
-          <w:szCs w:val="20"/>
           <w:u w:val="none"/>
           <w:shd w:fill="auto" w:val="clear"/>
           <w:vertAlign w:val="baseline"/>
           <w:rtl w:val="0"/>
         </w:rPr>
-        <w:t xml:space="preserve">Figura 1 — Título descritivo da figura</w:t>
+        <w:t xml:space="preserve">a</w:t>
       </w:r>
     </w:p>
     <w:tbl>
@@ -3567,9 +3553,6 @@
       </w:pPr>
       <w:r>
         <w:rPr>
-          <w:rFonts w:ascii="Times New Roman" w:cs="Times New Roman" w:eastAsia="Times New Roman" w:hAnsi="Times New Roman"/>
-          <w:b w:val="0"/>
-          <w:bCs w:val="0"/>
           <w:i w:val="0"/>
           <w:iCs w:val="0"/>
           <w:smallCaps w:val="0"/>
@@ -3582,13 +3565,35 @@
           <w:vertAlign w:val="baseline"/>
           <w:rtl w:val="0"/>
         </w:rPr>
-        <w:t xml:space="preserve">Fonte: informe a autoria ou a origem dos dados.</w:t>
+        <w:t xml:space="preserve">Fonte: informe a autoria ou a origem dos dados</w:t>
+      </w:r>
+      <w:r>
+        <w:rPr>
+          <w:rFonts w:ascii="Times New Roman" w:cs="Times New Roman" w:eastAsia="Times New Roman" w:hAnsi="Times New Roman"/>
+          <w:b w:val="0"/>
+          <w:bCs w:val="0"/>
+          <w:i w:val="0"/>
+          <w:iCs w:val="0"/>
+          <w:smallCaps w:val="0"/>
+          <w:strike w:val="0"/>
+          <w:color w:val="000000"/>
+          <w:sz w:val="20"/>
+          <w:szCs w:val="20"/>
+          <w:u w:val="none"/>
+          <w:shd w:fill="auto" w:val="clear"/>
+          <w:vertAlign w:val="baseline"/>
+          <w:rtl w:val="0"/>
+        </w:rPr>
+        <w:t xml:space="preserve">.</w:t>
       </w:r>
     </w:p>
     <w:p>
       <w:pPr>
         <w:pStyle w:val="Heading1"/>
         <w:keepNext w:val="1"/>
+        <w:spacing w:after="240" w:before="240" w:line="360" w:lineRule="auto"/>
+        <w:ind w:firstLine="0"/>
+        <w:jc w:val="left"/>
         <w:rPr/>
       </w:pPr>
       <w:r>
@@ -3605,19 +3610,16 @@
     </w:p>
     <w:p>
       <w:pPr>
-        <w:spacing w:after="120" w:line="360" w:lineRule="auto"/>
+        <w:spacing w:after="0" w:before="0" w:line="360" w:lineRule="auto"/>
         <w:ind w:firstLine="709"/>
         <w:jc w:val="both"/>
         <w:rPr/>
       </w:pPr>
       <w:r>
         <w:rPr>
-          <w:rFonts w:ascii="Times New Roman" w:cs="Times New Roman" w:eastAsia="Times New Roman" w:hAnsi="Times New Roman"/>
           <w:i w:val="1"/>
           <w:iCs w:val="1"/>
           <w:color w:val="595959"/>
-          <w:sz w:val="24"/>
-          <w:szCs w:val="24"/>
           <w:rtl w:val="0"/>
         </w:rPr>
         <w:t xml:space="preserve">Interprete os resultados à luz dos objetivos e da literatura. Explicite convergências, divergências, limitações, incertezas e implicações geológicas. Evite apenas repetir a seção de resultados.</w:t>
@@ -3632,6 +3634,9 @@
       <w:pPr>
         <w:pStyle w:val="Heading2"/>
         <w:keepNext w:val="1"/>
+        <w:spacing w:after="240" w:before="240" w:line="360" w:lineRule="auto"/>
+        <w:ind w:firstLine="0"/>
+        <w:jc w:val="left"/>
         <w:rPr/>
       </w:pPr>
       <w:r>
@@ -3648,19 +3653,16 @@
     </w:p>
     <w:p>
       <w:pPr>
-        <w:spacing w:after="120" w:line="360" w:lineRule="auto"/>
+        <w:spacing w:after="0" w:before="0" w:line="360" w:lineRule="auto"/>
         <w:ind w:firstLine="709"/>
         <w:jc w:val="both"/>
         <w:rPr/>
       </w:pPr>
       <w:r>
         <w:rPr>
-          <w:rFonts w:ascii="Times New Roman" w:cs="Times New Roman" w:eastAsia="Times New Roman" w:hAnsi="Times New Roman"/>
           <w:i w:val="1"/>
           <w:iCs w:val="1"/>
           <w:color w:val="595959"/>
-          <w:sz w:val="24"/>
-          <w:szCs w:val="24"/>
           <w:rtl w:val="0"/>
         </w:rPr>
         <w:t xml:space="preserve">Discuta a qualidade dos dados, representatividade espacial e temporal, limitações analíticas e alternativas interpretativas.</w:t>
@@ -3675,6 +3677,9 @@
       <w:pPr>
         <w:pStyle w:val="Heading1"/>
         <w:keepNext w:val="1"/>
+        <w:spacing w:after="240" w:before="240" w:line="360" w:lineRule="auto"/>
+        <w:ind w:firstLine="0"/>
+        <w:jc w:val="left"/>
         <w:rPr/>
       </w:pPr>
       <w:r>
@@ -3691,19 +3696,16 @@
     </w:p>
     <w:p>
       <w:pPr>
-        <w:spacing w:after="120" w:line="360" w:lineRule="auto"/>
+        <w:spacing w:after="0" w:before="0" w:line="360" w:lineRule="auto"/>
         <w:ind w:firstLine="709"/>
         <w:jc w:val="both"/>
         <w:rPr/>
       </w:pPr>
       <w:r>
         <w:rPr>
-          <w:rFonts w:ascii="Times New Roman" w:cs="Times New Roman" w:eastAsia="Times New Roman" w:hAnsi="Times New Roman"/>
           <w:i w:val="1"/>
           <w:iCs w:val="1"/>
           <w:color w:val="595959"/>
-          <w:sz w:val="24"/>
-          <w:szCs w:val="24"/>
           <w:rtl w:val="0"/>
         </w:rPr>
         <w:t xml:space="preserve">Retome os objetivos e apresente conclusões sustentadas pelos resultados. Não inclua dados novos. Recomendações para trabalhos futuros podem ser apresentadas ao final.</w:t>

</xml_diff>

<commit_message>
Atualizacao automatica 2026-09-19 11:50:29
</commit_message>
<xml_diff>
--- a/docs/template-tcc-geologia-ufsc.docx
+++ b/docs/template-tcc-geologia-ufsc.docx
@@ -1692,7 +1692,7 @@
     </w:p>
     <w:sdt>
       <w:sdtPr>
-        <w:id w:val="1911466230"/>
+        <w:id w:val="-2001283760"/>
         <w:docPartObj>
           <w:docPartGallery w:val="Table of Contents"/>
           <w:docPartUnique w:val="1"/>
@@ -2436,33 +2436,6 @@
         </w:rPr>
         <w:t xml:space="preserve">Ao reduzir a influência dos contrastes de amplitude, esse atributo evidencia a geometria e a configuração dos refletores, permitindo que feições anteriormente pouco perceptíveis sejam visualizadas com maior clareza (Chopra &amp; Marfurt, 2007). Dessa forma, o cosseno da fase instantânea contribui para realçar a continuidade lateral dos refletores, as mudanças no padrão de acamamento e os limites entre sequências sísmicas, auxiliando a interpretação estratigráfica e estrutural dos dados (Alvarenga, 2016).</w:t>
       </w:r>
-    </w:p>
-    <w:p>
-      <w:pPr>
-        <w:rPr/>
-      </w:pPr>
-      <w:r>
-        <w:rPr>
-          <w:rtl w:val="0"/>
-        </w:rPr>
-      </w:r>
-    </w:p>
-    <w:p>
-      <w:pPr>
-        <w:rPr/>
-      </w:pPr>
-      <w:r>
-        <w:rPr>
-          <w:rtl w:val="0"/>
-        </w:rPr>
-      </w:r>
-    </w:p>
-    <w:p>
-      <w:pPr>
-        <w:pStyle w:val="Heading2"/>
-        <w:keepNext w:val="1"/>
-        <w:rPr/>
-      </w:pPr>
       <w:r>
         <w:rPr>
           <w:rtl w:val="0"/>
@@ -2483,8 +2456,75 @@
           <w:color w:val="000000"/>
           <w:rtl w:val="0"/>
         </w:rPr>
-        <w:t xml:space="preserve">2.2 Contexto geológico regional</w:t>
-      </w:r>
+        <w:t xml:space="preserve">2.2 </w:t>
+      </w:r>
+      <w:r>
+        <w:rPr>
+          <w:rtl w:val="0"/>
+        </w:rPr>
+        <w:t xml:space="preserve">Sismoestratigrafia</w:t>
+      </w:r>
+    </w:p>
+    <w:p>
+      <w:pPr>
+        <w:spacing w:after="240" w:before="240" w:lineRule="auto"/>
+        <w:ind w:firstLine="720"/>
+        <w:jc w:val="both"/>
+        <w:rPr/>
+      </w:pPr>
+      <w:r>
+        <w:rPr>
+          <w:rtl w:val="0"/>
+        </w:rPr>
+        <w:t xml:space="preserve">A sismoestratigrafia consiste em um método de interpretação de dados sísmicos voltado à análise das relações estratigráficas e das geometrias deposicionais presentes em subsuperfície. A partir da configuração, continuidade e terminação dos refletores sísmicos, esse método auxilia na identificação de unidades deposicionais, superfícies estratigráficas e possíveis mudanças no padrão de sedimentação (Severiano Ribeiro, 2001).</w:t>
+      </w:r>
+    </w:p>
+    <w:p>
+      <w:pPr>
+        <w:spacing w:after="240" w:before="240" w:lineRule="auto"/>
+        <w:ind w:firstLine="720"/>
+        <w:jc w:val="both"/>
+        <w:rPr/>
+      </w:pPr>
+      <w:r>
+        <w:rPr>
+          <w:rtl w:val="0"/>
+        </w:rPr>
+        <w:t xml:space="preserve">Um princípio essencial da interpretação sismoestratigráfica é que as reflexões sísmicas resultam, predominantemente, de contrastes de impedância acústica entre materiais geológicos. Assim, os refletores podem representar superfícies físicas associadas a eventos ou intervalos temporalmente correlacionáveis, sem que correspondam, obrigatoriamente, a mudanças litológicas. Essas superfícies podem ser classificadas como superfícies estratais ou discordâncias. As superfícies estratais, em geral, acompanham os planos de acamamento e apresentam reduzida variação temporal ao longo de sua extensão. Já as discordâncias possuem maior expressão cronoestratigráfica, pois correspondem a superfícies relacionadas à erosão ou à ausência de deposição, separando estratos mais antigos daqueles depositados posteriormente (Severiano Ribeiro, 2001; Vail &amp; Mitchum Jr., 1977).</w:t>
+      </w:r>
+    </w:p>
+    <w:p>
+      <w:pPr>
+        <w:spacing w:after="240" w:before="240" w:lineRule="auto"/>
+        <w:ind w:firstLine="720"/>
+        <w:jc w:val="both"/>
+        <w:rPr/>
+      </w:pPr>
+      <w:r>
+        <w:rPr>
+          <w:rtl w:val="0"/>
+        </w:rPr>
+        <w:t xml:space="preserve">As discordâncias são particularmente relevantes para a subdivisão do preenchimento sedimentar das bacias, uma vez que delimitam pacotes de estratos geneticamente distintos. Desse modo, permitem reconhecer sequências deposicionais, definidas como sucessões relativamente concordantes de estratos geneticamente relacionados, limitadas no topo e na base por discordâncias ou por suas concordâncias correlativas (Mitchum Jr. et al., 1977). Esses limites podem ser interpretados pela observação da angularidade e dos padrões de terminação dos refletores contra as superfícies limítrofes.</w:t>
+      </w:r>
+    </w:p>
+    <w:p>
+      <w:pPr>
+        <w:spacing w:after="240" w:before="240" w:lineRule="auto"/>
+        <w:ind w:firstLine="720"/>
+        <w:jc w:val="both"/>
+        <w:rPr/>
+      </w:pPr>
+      <w:r>
+        <w:rPr>
+          <w:rtl w:val="0"/>
+        </w:rPr>
+        <w:t xml:space="preserve">Além de contribuírem para o reconhecimento dos limites de sequências, as terminações de refletores permitem caracterizar diferentes superfícies dentro das unidades sísmicas. O truncamento erosivo ocorre quando refletores são interrompidos em seu topo por uma superfície erosiva mais jovem, indicando remoção parcial de estratos preexistentes. Por sua vez, terminações associadas a falhas, deslizamentos gravitacionais ou outras rupturas tectônicas são classificadas como truncamentos estruturais. Outros padrões, como onlap, downlap e toplap, também podem indicar relações deposicionais, variações no espaço de acomodação e mudanças nas condições de sedimentação, contribuindo para a interpretação da evolução estratigráfica da bacia.</w:t>
+      </w:r>
+    </w:p>
+    <w:p>
+      <w:pPr>
+        <w:rPr/>
+      </w:pPr>
       <w:r>
         <w:rPr>
           <w:rtl w:val="0"/>
@@ -2498,15 +2538,6 @@
         <w:jc w:val="both"/>
         <w:rPr/>
       </w:pPr>
-      <w:r>
-        <w:rPr>
-          <w:i w:val="1"/>
-          <w:iCs w:val="1"/>
-          <w:color w:val="595959"/>
-          <w:rtl w:val="0"/>
-        </w:rPr>
-        <w:t xml:space="preserve">Apresente unidades litoestratigráficas, evolução tectônica, idades, estruturas e trabalhos prévios relevantes.</w:t>
-      </w:r>
       <w:r>
         <w:rPr>
           <w:rtl w:val="0"/>
@@ -3731,20 +3762,21 @@
     </w:p>
     <w:p>
       <w:pPr>
-        <w:spacing w:after="360" w:lineRule="auto"/>
+        <w:spacing w:after="360" w:before="0" w:line="360" w:lineRule="auto"/>
+        <w:ind w:firstLine="0"/>
         <w:jc w:val="center"/>
-        <w:rPr/>
-      </w:pPr>
-      <w:r>
-        <w:rPr>
-          <w:rFonts w:ascii="Times New Roman" w:cs="Times New Roman" w:eastAsia="Times New Roman" w:hAnsi="Times New Roman"/>
+        <w:rPr>
           <w:b w:val="1"/>
           <w:bCs w:val="1"/>
-          <w:i w:val="0"/>
-          <w:iCs w:val="0"/>
-          <w:color w:val="000000"/>
-          <w:sz w:val="24"/>
-          <w:szCs w:val="24"/>
+        </w:rPr>
+      </w:pPr>
+      <w:r>
+        <w:rPr>
+          <w:b w:val="1"/>
+          <w:bCs w:val="1"/>
+          <w:i w:val="0"/>
+          <w:iCs w:val="0"/>
+          <w:color w:val="000000"/>
           <w:rtl w:val="0"/>
         </w:rPr>
         <w:t xml:space="preserve">REFERÊNCIAS</w:t>
@@ -3757,51 +3789,317 @@
     </w:p>
     <w:p>
       <w:pPr>
-        <w:spacing w:after="120" w:line="360" w:lineRule="auto"/>
-        <w:ind w:firstLine="709"/>
-        <w:jc w:val="both"/>
-        <w:rPr/>
-      </w:pPr>
-      <w:r>
-        <w:rPr>
-          <w:rFonts w:ascii="Times New Roman" w:cs="Times New Roman" w:eastAsia="Times New Roman" w:hAnsi="Times New Roman"/>
-          <w:i w:val="1"/>
-          <w:iCs w:val="1"/>
-          <w:color w:val="595959"/>
-          <w:sz w:val="24"/>
-          <w:szCs w:val="24"/>
-          <w:rtl w:val="0"/>
-        </w:rPr>
-        <w:t xml:space="preserve">Insira somente as referências citadas no texto e aplique o padrão bibliográfico vigente exigido pelo curso e pela Biblioteca Universitária da UFSC. Use um gerenciador como Zotero ou Mendeley para reduzir inconsistências.</w:t>
-      </w:r>
-      <w:r>
-        <w:rPr>
-          <w:rtl w:val="0"/>
-        </w:rPr>
-      </w:r>
-    </w:p>
-    <w:p>
-      <w:pPr>
-        <w:spacing w:after="120" w:line="360" w:lineRule="auto"/>
-        <w:jc w:val="both"/>
-        <w:rPr/>
-      </w:pPr>
-      <w:r>
-        <w:rPr>
-          <w:rFonts w:ascii="Times New Roman" w:cs="Times New Roman" w:eastAsia="Times New Roman" w:hAnsi="Times New Roman"/>
-          <w:i w:val="0"/>
-          <w:iCs w:val="0"/>
-          <w:color w:val="000000"/>
-          <w:sz w:val="24"/>
-          <w:szCs w:val="24"/>
-          <w:rtl w:val="0"/>
-        </w:rPr>
-        <w:t xml:space="preserve">SOBRENOME, Nome. Título da obra. Local: Editora, ano.</w:t>
-      </w:r>
-      <w:r>
-        <w:rPr>
-          <w:rtl w:val="0"/>
-        </w:rPr>
+        <w:spacing w:after="120" w:before="0" w:line="240" w:lineRule="auto"/>
+        <w:ind w:left="0" w:firstLine="0"/>
+        <w:jc w:val="left"/>
+        <w:rPr>
+          <w:i w:val="1"/>
+          <w:iCs w:val="1"/>
+          <w:color w:val="595959"/>
+        </w:rPr>
+      </w:pPr>
+      <w:r>
+        <w:rPr>
+          <w:i w:val="1"/>
+          <w:iCs w:val="1"/>
+          <w:color w:val="595959"/>
+          <w:rtl w:val="0"/>
+        </w:rPr>
+        <w:t xml:space="preserve">ALVARENGA, R. S. Análise sismoestratigráfica de bacias rifte: definição de sismofácies e arcabouço tectono-estratigráfico. 2016. Tese (Doutorado em Geociências) — Universidade Federal do Rio Grande do Sul, Porto Alegre, 2016.</w:t>
+      </w:r>
+    </w:p>
+    <w:p>
+      <w:pPr>
+        <w:spacing w:after="120" w:before="0" w:line="240" w:lineRule="auto"/>
+        <w:ind w:left="0" w:firstLine="0"/>
+        <w:jc w:val="left"/>
+        <w:rPr>
+          <w:i w:val="1"/>
+          <w:iCs w:val="1"/>
+          <w:color w:val="595959"/>
+        </w:rPr>
+      </w:pPr>
+      <w:r>
+        <w:rPr>
+          <w:i w:val="1"/>
+          <w:iCs w:val="1"/>
+          <w:color w:val="595959"/>
+          <w:rtl w:val="0"/>
+        </w:rPr>
+        <w:t xml:space="preserve">CARDONA, S. et al. Fabric development and pore-throat reduction in a mass-transport deposit in the Jubilee Gas Field, Eastern Gulf of Mexico: consequences for the sealing capacity of MTDs. In: LAMARCHE, G. et al. (org.). Submarine mass movements and their consequences. Cham: Springer, 2016. p. 27–37. DOI: 10.1007/978-3-319-20979-1_3.</w:t>
+      </w:r>
+    </w:p>
+    <w:p>
+      <w:pPr>
+        <w:spacing w:after="120" w:before="0" w:line="240" w:lineRule="auto"/>
+        <w:ind w:left="0" w:firstLine="0"/>
+        <w:jc w:val="left"/>
+        <w:rPr>
+          <w:i w:val="1"/>
+          <w:iCs w:val="1"/>
+          <w:color w:val="595959"/>
+        </w:rPr>
+      </w:pPr>
+      <w:r>
+        <w:rPr>
+          <w:i w:val="1"/>
+          <w:iCs w:val="1"/>
+          <w:color w:val="595959"/>
+          <w:rtl w:val="0"/>
+        </w:rPr>
+        <w:t xml:space="preserve">CHOPRA, S. &amp; MARFURT, K. J. Seismic attributes for prospect identification and reservoir characterization. Tulsa: Society of Exploration Geophysicists; European Association of Geoscientists and Engineers, 2007. (Geophysical Developments, v. 11). DOI: 10.1190/1.9781560801900.</w:t>
+      </w:r>
+    </w:p>
+    <w:p>
+      <w:pPr>
+        <w:spacing w:after="120" w:before="0" w:line="240" w:lineRule="auto"/>
+        <w:ind w:left="0" w:firstLine="0"/>
+        <w:jc w:val="left"/>
+        <w:rPr>
+          <w:i w:val="1"/>
+          <w:iCs w:val="1"/>
+          <w:color w:val="595959"/>
+        </w:rPr>
+      </w:pPr>
+      <w:r>
+        <w:rPr>
+          <w:i w:val="1"/>
+          <w:iCs w:val="1"/>
+          <w:color w:val="595959"/>
+          <w:rtl w:val="0"/>
+        </w:rPr>
+        <w:t xml:space="preserve">CLARE, M. A. et al. A consistent global approach for the morphometric characterization of subaqueous landslides. Geological Society, London, Special Publications, v. 477, p. 455–477, 2018. DOI: 10.1144/SP477.15.</w:t>
+      </w:r>
+    </w:p>
+    <w:p>
+      <w:pPr>
+        <w:spacing w:after="120" w:before="0" w:line="240" w:lineRule="auto"/>
+        <w:ind w:left="0" w:firstLine="0"/>
+        <w:jc w:val="left"/>
+        <w:rPr>
+          <w:i w:val="1"/>
+          <w:iCs w:val="1"/>
+          <w:color w:val="595959"/>
+        </w:rPr>
+      </w:pPr>
+      <w:r>
+        <w:rPr>
+          <w:i w:val="1"/>
+          <w:iCs w:val="1"/>
+          <w:color w:val="595959"/>
+          <w:rtl w:val="0"/>
+        </w:rPr>
+        <w:t xml:space="preserve">KEAREY, P. et al. Geofísica de exploração. São Paulo: Oficina de Textos, 2009.</w:t>
+      </w:r>
+    </w:p>
+    <w:p>
+      <w:pPr>
+        <w:spacing w:after="120" w:before="0" w:line="240" w:lineRule="auto"/>
+        <w:ind w:left="0" w:firstLine="0"/>
+        <w:jc w:val="left"/>
+        <w:rPr>
+          <w:i w:val="1"/>
+          <w:iCs w:val="1"/>
+          <w:color w:val="595959"/>
+        </w:rPr>
+      </w:pPr>
+      <w:r>
+        <w:rPr>
+          <w:i w:val="1"/>
+          <w:iCs w:val="1"/>
+          <w:color w:val="595959"/>
+          <w:rtl w:val="0"/>
+        </w:rPr>
+        <w:t xml:space="preserve">KNELLER, B. et al. Mass-transport and slope accommodation: implications for turbidite sandstone reservoirs. AAPG Bulletin, v. 100, n. 2, p. 213–235, 2016. DOI: 10.1306/09011514210.</w:t>
+      </w:r>
+    </w:p>
+    <w:p>
+      <w:pPr>
+        <w:spacing w:after="120" w:before="0" w:line="240" w:lineRule="auto"/>
+        <w:ind w:left="0" w:firstLine="0"/>
+        <w:jc w:val="left"/>
+        <w:rPr>
+          <w:i w:val="1"/>
+          <w:iCs w:val="1"/>
+          <w:color w:val="595959"/>
+        </w:rPr>
+      </w:pPr>
+      <w:r>
+        <w:rPr>
+          <w:i w:val="1"/>
+          <w:iCs w:val="1"/>
+          <w:color w:val="595959"/>
+          <w:rtl w:val="0"/>
+        </w:rPr>
+        <w:t xml:space="preserve">MECKEL III, L. D. Reservoir characteristics and classification of sand-prone submarine mass-transport deposits. In: SHIPP, R. C. et al. (org.). Mass-transport deposits in deepwater settings. Tulsa: SEPM Society for Sedimentary Geology, 2011. p. 423–452. (SEPM Special Publication, v. 96).</w:t>
+      </w:r>
+    </w:p>
+    <w:p>
+      <w:pPr>
+        <w:spacing w:after="120" w:before="0" w:line="240" w:lineRule="auto"/>
+        <w:ind w:left="0" w:firstLine="0"/>
+        <w:jc w:val="left"/>
+        <w:rPr>
+          <w:i w:val="1"/>
+          <w:iCs w:val="1"/>
+          <w:color w:val="595959"/>
+        </w:rPr>
+      </w:pPr>
+      <w:r>
+        <w:rPr>
+          <w:i w:val="1"/>
+          <w:iCs w:val="1"/>
+          <w:color w:val="595959"/>
+          <w:rtl w:val="0"/>
+        </w:rPr>
+        <w:t xml:space="preserve">MENESES, A. R. dos S. Estudo teórico de atributos sísmicos de reflexão. 2010. Trabalho de Graduação — Universidade Federal da Bahia, Salvador, 2010.</w:t>
+      </w:r>
+    </w:p>
+    <w:p>
+      <w:pPr>
+        <w:spacing w:after="120" w:before="0" w:line="240" w:lineRule="auto"/>
+        <w:ind w:left="0" w:firstLine="0"/>
+        <w:jc w:val="left"/>
+        <w:rPr>
+          <w:i w:val="1"/>
+          <w:iCs w:val="1"/>
+          <w:color w:val="595959"/>
+        </w:rPr>
+      </w:pPr>
+      <w:r>
+        <w:rPr>
+          <w:i w:val="1"/>
+          <w:iCs w:val="1"/>
+          <w:color w:val="595959"/>
+          <w:rtl w:val="0"/>
+        </w:rPr>
+        <w:t xml:space="preserve">MITCHUM JR., R. M. et al. Seismic stratigraphy and global changes of sea level, part 6: stratigraphic interpretation of seismic reflection patterns in depositional sequences. In: PAYTON, C. E. (org.). Seismic stratigraphy: applications to hydrocarbon exploration. Tulsa: American Association of Petroleum Geologists, 1977. p. 117–133. (AAPG Memoir, v. 26). DOI: 10.1306/M26490C8.</w:t>
+      </w:r>
+    </w:p>
+    <w:p>
+      <w:pPr>
+        <w:spacing w:after="120" w:before="0" w:line="240" w:lineRule="auto"/>
+        <w:ind w:left="0" w:firstLine="0"/>
+        <w:jc w:val="left"/>
+        <w:rPr>
+          <w:i w:val="1"/>
+          <w:iCs w:val="1"/>
+          <w:color w:val="595959"/>
+        </w:rPr>
+      </w:pPr>
+      <w:r>
+        <w:rPr>
+          <w:i w:val="1"/>
+          <w:iCs w:val="1"/>
+          <w:color w:val="595959"/>
+          <w:rtl w:val="0"/>
+        </w:rPr>
+        <w:t xml:space="preserve">POPE, E. L. et al. Which earthquakes trigger damaging submarine mass movements: insights from a global record of submarine cable breaks? Marine Geology, v. 384, p. 131–146, 2016. DOI: 10.1016/j.margeo.2016.01.009.</w:t>
+      </w:r>
+    </w:p>
+    <w:p>
+      <w:pPr>
+        <w:spacing w:after="120" w:before="0" w:line="240" w:lineRule="auto"/>
+        <w:ind w:left="0" w:firstLine="0"/>
+        <w:jc w:val="left"/>
+        <w:rPr>
+          <w:i w:val="1"/>
+          <w:iCs w:val="1"/>
+          <w:color w:val="595959"/>
+        </w:rPr>
+      </w:pPr>
+      <w:r>
+        <w:rPr>
+          <w:i w:val="1"/>
+          <w:iCs w:val="1"/>
+          <w:color w:val="595959"/>
+          <w:rtl w:val="0"/>
+        </w:rPr>
+        <w:t xml:space="preserve">SEVERIANO RIBEIRO, H. J. P. (org.). Estratigrafia de sequências: fundamentos e aplicações. São Leopoldo: Editora Unisinos, 2001. 428 p.</w:t>
+      </w:r>
+    </w:p>
+    <w:p>
+      <w:pPr>
+        <w:spacing w:after="120" w:before="0" w:line="240" w:lineRule="auto"/>
+        <w:ind w:left="0" w:firstLine="0"/>
+        <w:jc w:val="left"/>
+        <w:rPr>
+          <w:i w:val="1"/>
+          <w:iCs w:val="1"/>
+          <w:color w:val="595959"/>
+        </w:rPr>
+      </w:pPr>
+      <w:r>
+        <w:rPr>
+          <w:i w:val="1"/>
+          <w:iCs w:val="1"/>
+          <w:color w:val="595959"/>
+          <w:rtl w:val="0"/>
+        </w:rPr>
+        <w:t xml:space="preserve">TÓTH, T. Single and multichannel seismics. In: GUPTA, H. K. (org.). Encyclopedia of solid earth geophysics. Dordrecht: Springer, 2011. p. 1366–1373.</w:t>
+      </w:r>
+    </w:p>
+    <w:p>
+      <w:pPr>
+        <w:spacing w:after="120" w:before="0" w:line="240" w:lineRule="auto"/>
+        <w:ind w:left="0" w:firstLine="0"/>
+        <w:jc w:val="left"/>
+        <w:rPr>
+          <w:i w:val="1"/>
+          <w:iCs w:val="1"/>
+          <w:color w:val="595959"/>
+        </w:rPr>
+      </w:pPr>
+      <w:r>
+        <w:rPr>
+          <w:i w:val="1"/>
+          <w:iCs w:val="1"/>
+          <w:color w:val="595959"/>
+          <w:rtl w:val="0"/>
+        </w:rPr>
+        <w:t xml:space="preserve">VAIL, P. R. &amp; MITCHUM JR., R. M. Seismic stratigraphy and global changes of sea level, part 1: overview. In: PAYTON, C. E. (org.). Seismic stratigraphy: applications to hydrocarbon exploration. Tulsa: American Association of Petroleum Geologists, 1977. p. 51–52. (AAPG Memoir, v. 26).</w:t>
+      </w:r>
+    </w:p>
+    <w:p>
+      <w:pPr>
+        <w:spacing w:after="120" w:before="0" w:line="240" w:lineRule="auto"/>
+        <w:ind w:left="0" w:firstLine="0"/>
+        <w:jc w:val="left"/>
+        <w:rPr>
+          <w:i w:val="1"/>
+          <w:iCs w:val="1"/>
+          <w:color w:val="595959"/>
+        </w:rPr>
+      </w:pPr>
+      <w:r>
+        <w:rPr>
+          <w:i w:val="1"/>
+          <w:iCs w:val="1"/>
+          <w:color w:val="595959"/>
+          <w:rtl w:val="0"/>
+        </w:rPr>
+        <w:t xml:space="preserve">VANNESTE, M. et al. Seafloor instabilities and sediment deformation processes: the need for integrated, multi-disciplinary investigations. Marine Geology, v. 352, p. 183–214, 2014. DOI: 10.1016/j.margeo.2014.01.005.</w:t>
+      </w:r>
+    </w:p>
+    <w:p>
+      <w:pPr>
+        <w:spacing w:after="120" w:before="0" w:line="240" w:lineRule="auto"/>
+        <w:ind w:left="0" w:firstLine="0"/>
+        <w:jc w:val="left"/>
+        <w:rPr>
+          <w:i w:val="1"/>
+          <w:iCs w:val="1"/>
+          <w:color w:val="595959"/>
+        </w:rPr>
+      </w:pPr>
+      <w:r>
+        <w:rPr>
+          <w:i w:val="1"/>
+          <w:iCs w:val="1"/>
+          <w:color w:val="595959"/>
+          <w:rtl w:val="0"/>
+        </w:rPr>
+        <w:t xml:space="preserve">YILMAZ, Ö. Seismic data analysis: processing, inversion, and interpretation of seismic data. Tulsa: Society of Exploration Geophysicists, 2001. (Investigations in Geophysics, v. 10). DOI: 10.1190/1.9781560801580.</w:t>
       </w:r>
     </w:p>
     <w:p>

</xml_diff>

<commit_message>
Atualizacao automatica 2026-09-19 12:24:40
</commit_message>
<xml_diff>
--- a/docs/template-tcc-geologia-ufsc.docx
+++ b/docs/template-tcc-geologia-ufsc.docx
@@ -13,12 +13,12 @@
           <wp:inline distB="0" distT="0" distL="114300" distR="114300">
             <wp:extent cx="900000" cy="1236424"/>
             <wp:effectExtent b="0" l="0" r="0" t="0"/>
-            <wp:docPr descr="Símbolo da Universidade Federal de Santa Catarina" id="1" name="image1.png"/>
+            <wp:docPr descr="Símbolo da Universidade Federal de Santa Catarina" id="1" name="image2.png"/>
             <a:graphic>
               <a:graphicData uri="http://schemas.openxmlformats.org/drawingml/2006/picture">
                 <pic:pic>
                   <pic:nvPicPr>
-                    <pic:cNvPr descr="Símbolo da Universidade Federal de Santa Catarina" id="0" name="image1.png"/>
+                    <pic:cNvPr descr="Símbolo da Universidade Federal de Santa Catarina" id="0" name="image2.png"/>
                     <pic:cNvPicPr preferRelativeResize="0"/>
                   </pic:nvPicPr>
                   <pic:blipFill>
@@ -172,6 +172,149 @@
       </w:pPr>
       <w:r>
         <w:rPr>
+          <w:b w:val="1"/>
+          <w:bCs w:val="1"/>
+          <w:rtl w:val="0"/>
+        </w:rPr>
+        <w:t xml:space="preserve">MARIA EULÁLIA ALBERTON</w:t>
+      </w:r>
+      <w:r>
+        <w:rPr>
+          <w:rtl w:val="0"/>
+        </w:rPr>
+      </w:r>
+    </w:p>
+    <w:p>
+      <w:pPr>
+        <w:rPr/>
+      </w:pPr>
+      <w:r>
+        <w:rPr>
+          <w:rtl w:val="0"/>
+        </w:rPr>
+        <w:br w:type="textWrapping"/>
+        <w:br w:type="textWrapping"/>
+        <w:br w:type="textWrapping"/>
+      </w:r>
+    </w:p>
+    <w:p>
+      <w:pPr>
+        <w:spacing w:after="0" w:lineRule="auto"/>
+        <w:jc w:val="center"/>
+        <w:rPr>
+          <w:b w:val="1"/>
+          <w:bCs w:val="1"/>
+        </w:rPr>
+      </w:pPr>
+      <w:r>
+        <w:rPr>
+          <w:b w:val="1"/>
+          <w:bCs w:val="1"/>
+          <w:rtl w:val="0"/>
+        </w:rPr>
+        <w:t xml:space="preserve">CARACTERIZAÇÃO DE DEPÓSITOS DE MOVIMENTO DE MASSA NA PORÇÃO NORTE DA BACIA DE SANTOS</w:t>
+      </w:r>
+    </w:p>
+    <w:p>
+      <w:pPr>
+        <w:spacing w:after="0" w:lineRule="auto"/>
+        <w:jc w:val="center"/>
+        <w:rPr/>
+      </w:pPr>
+      <w:r>
+        <w:rPr>
+          <w:rFonts w:ascii="Times New Roman" w:cs="Times New Roman" w:eastAsia="Times New Roman" w:hAnsi="Times New Roman"/>
+          <w:b w:val="0"/>
+          <w:bCs w:val="0"/>
+          <w:i w:val="0"/>
+          <w:iCs w:val="0"/>
+          <w:color w:val="000000"/>
+          <w:sz w:val="24"/>
+          <w:szCs w:val="24"/>
+          <w:rtl w:val="0"/>
+        </w:rPr>
+        <w:t xml:space="preserve">Subtítulo se houver</w:t>
+      </w:r>
+      <w:r>
+        <w:rPr>
+          <w:rtl w:val="0"/>
+        </w:rPr>
+      </w:r>
+    </w:p>
+    <w:p>
+      <w:pPr>
+        <w:rPr/>
+      </w:pPr>
+      <w:r>
+        <w:rPr>
+          <w:rtl w:val="0"/>
+        </w:rPr>
+        <w:br w:type="textWrapping"/>
+        <w:br w:type="textWrapping"/>
+        <w:br w:type="textWrapping"/>
+        <w:br w:type="textWrapping"/>
+      </w:r>
+    </w:p>
+    <w:p>
+      <w:pPr>
+        <w:spacing w:after="0" w:lineRule="auto"/>
+        <w:jc w:val="center"/>
+        <w:rPr/>
+      </w:pPr>
+      <w:r>
+        <w:rPr>
+          <w:rFonts w:ascii="Times New Roman" w:cs="Times New Roman" w:eastAsia="Times New Roman" w:hAnsi="Times New Roman"/>
+          <w:b w:val="0"/>
+          <w:bCs w:val="0"/>
+          <w:i w:val="0"/>
+          <w:iCs w:val="0"/>
+          <w:color w:val="000000"/>
+          <w:sz w:val="24"/>
+          <w:szCs w:val="24"/>
+          <w:rtl w:val="0"/>
+        </w:rPr>
+        <w:t xml:space="preserve">Florianópolis</w:t>
+      </w:r>
+      <w:r>
+        <w:rPr>
+          <w:rtl w:val="0"/>
+        </w:rPr>
+      </w:r>
+    </w:p>
+    <w:p>
+      <w:pPr>
+        <w:spacing w:after="0" w:lineRule="auto"/>
+        <w:jc w:val="center"/>
+        <w:rPr/>
+      </w:pPr>
+      <w:r>
+        <w:rPr>
+          <w:rtl w:val="0"/>
+        </w:rPr>
+        <w:t xml:space="preserve">2026</w:t>
+      </w:r>
+    </w:p>
+    <w:p>
+      <w:pPr>
+        <w:rPr/>
+      </w:pPr>
+      <w:r>
+        <w:br w:type="page"/>
+      </w:r>
+      <w:r>
+        <w:rPr>
+          <w:rtl w:val="0"/>
+        </w:rPr>
+      </w:r>
+    </w:p>
+    <w:p>
+      <w:pPr>
+        <w:spacing w:after="0" w:lineRule="auto"/>
+        <w:jc w:val="center"/>
+        <w:rPr/>
+      </w:pPr>
+      <w:r>
+        <w:rPr>
           <w:rFonts w:ascii="Times New Roman" w:cs="Times New Roman" w:eastAsia="Times New Roman" w:hAnsi="Times New Roman"/>
           <w:b w:val="1"/>
           <w:bCs w:val="1"/>
@@ -200,7 +343,6 @@
         </w:rPr>
         <w:br w:type="textWrapping"/>
         <w:br w:type="textWrapping"/>
-        <w:br w:type="textWrapping"/>
       </w:r>
     </w:p>
     <w:p>
@@ -264,6 +406,137 @@
           <w:rtl w:val="0"/>
         </w:rPr>
         <w:br w:type="textWrapping"/>
+      </w:r>
+    </w:p>
+    <w:p>
+      <w:pPr>
+        <w:spacing w:line="240" w:lineRule="auto"/>
+        <w:ind w:left="4252" w:firstLine="0"/>
+        <w:jc w:val="both"/>
+        <w:rPr/>
+      </w:pPr>
+      <w:r>
+        <w:rPr>
+          <w:rFonts w:ascii="Times New Roman" w:cs="Times New Roman" w:eastAsia="Times New Roman" w:hAnsi="Times New Roman"/>
+          <w:color w:val="000000"/>
+          <w:sz w:val="20"/>
+          <w:szCs w:val="20"/>
+          <w:rtl w:val="0"/>
+        </w:rPr>
+        <w:t xml:space="preserve">Trabalho de Conclusão de Curso submetido ao Curso de Graduação em Geologia do Centro de Filosofia e Ciências Humanas da Universidade Federal de Santa Catarina como requisito parcial para a obtenção do título de Bacharel em Geologia.</w:t>
+      </w:r>
+      <w:r>
+        <w:rPr>
+          <w:rtl w:val="0"/>
+        </w:rPr>
+      </w:r>
+    </w:p>
+    <w:p>
+      <w:pPr>
+        <w:spacing w:line="240" w:lineRule="auto"/>
+        <w:ind w:left="4252" w:firstLine="0"/>
+        <w:rPr/>
+      </w:pPr>
+      <w:r>
+        <w:rPr>
+          <w:rFonts w:ascii="Times New Roman" w:cs="Times New Roman" w:eastAsia="Times New Roman" w:hAnsi="Times New Roman"/>
+          <w:color w:val="000000"/>
+          <w:sz w:val="20"/>
+          <w:szCs w:val="20"/>
+          <w:rtl w:val="0"/>
+        </w:rPr>
+        <w:t xml:space="preserve">Orientador: Prof.</w:t>
+      </w:r>
+      <w:r>
+        <w:rPr>
+          <w:sz w:val="20"/>
+          <w:szCs w:val="20"/>
+          <w:rtl w:val="0"/>
+        </w:rPr>
+        <w:t xml:space="preserve"> Antonio Henrique da Fontoura Klein</w:t>
+      </w:r>
+      <w:r>
+        <w:rPr>
+          <w:rFonts w:ascii="Times New Roman" w:cs="Times New Roman" w:eastAsia="Times New Roman" w:hAnsi="Times New Roman"/>
+          <w:color w:val="000000"/>
+          <w:sz w:val="20"/>
+          <w:szCs w:val="20"/>
+          <w:rtl w:val="0"/>
+        </w:rPr>
+        <w:t xml:space="preserve">, Dr.</w:t>
+      </w:r>
+      <w:r>
+        <w:rPr>
+          <w:rtl w:val="0"/>
+        </w:rPr>
+      </w:r>
+    </w:p>
+    <w:p>
+      <w:pPr>
+        <w:spacing w:line="240" w:lineRule="auto"/>
+        <w:ind w:left="4252" w:firstLine="0"/>
+        <w:rPr/>
+      </w:pPr>
+      <w:r>
+        <w:rPr>
+          <w:rFonts w:ascii="Times New Roman" w:cs="Times New Roman" w:eastAsia="Times New Roman" w:hAnsi="Times New Roman"/>
+          <w:color w:val="000000"/>
+          <w:sz w:val="20"/>
+          <w:szCs w:val="20"/>
+          <w:rtl w:val="0"/>
+        </w:rPr>
+        <w:t xml:space="preserve">Coorientador: </w:t>
+      </w:r>
+      <w:r>
+        <w:rPr>
+          <w:sz w:val="20"/>
+          <w:szCs w:val="20"/>
+          <w:rtl w:val="0"/>
+        </w:rPr>
+        <w:t xml:space="preserve">Manuel Parcero Oliveira</w:t>
+      </w:r>
+      <w:r>
+        <w:rPr>
+          <w:rFonts w:ascii="Times New Roman" w:cs="Times New Roman" w:eastAsia="Times New Roman" w:hAnsi="Times New Roman"/>
+          <w:color w:val="000000"/>
+          <w:sz w:val="20"/>
+          <w:szCs w:val="20"/>
+          <w:rtl w:val="0"/>
+        </w:rPr>
+        <w:t xml:space="preserve">, </w:t>
+      </w:r>
+      <w:r>
+        <w:rPr>
+          <w:sz w:val="20"/>
+          <w:szCs w:val="20"/>
+          <w:rtl w:val="0"/>
+        </w:rPr>
+        <w:t xml:space="preserve">Msc</w:t>
+      </w:r>
+      <w:r>
+        <w:rPr>
+          <w:rFonts w:ascii="Times New Roman" w:cs="Times New Roman" w:eastAsia="Times New Roman" w:hAnsi="Times New Roman"/>
+          <w:color w:val="000000"/>
+          <w:sz w:val="20"/>
+          <w:szCs w:val="20"/>
+          <w:rtl w:val="0"/>
+        </w:rPr>
+        <w:t xml:space="preserve">. (se houver)</w:t>
+      </w:r>
+      <w:r>
+        <w:rPr>
+          <w:rtl w:val="0"/>
+        </w:rPr>
+      </w:r>
+    </w:p>
+    <w:p>
+      <w:pPr>
+        <w:rPr/>
+      </w:pPr>
+      <w:r>
+        <w:rPr>
+          <w:rtl w:val="0"/>
+        </w:rPr>
         <w:br w:type="textWrapping"/>
         <w:br w:type="textWrapping"/>
         <w:br w:type="textWrapping"/>
@@ -336,7 +609,7 @@
     </w:p>
     <w:p>
       <w:pPr>
-        <w:spacing w:after="0" w:lineRule="auto"/>
+        <w:spacing w:after="360" w:lineRule="auto"/>
         <w:jc w:val="center"/>
         <w:rPr/>
       </w:pPr>
@@ -352,24 +625,50 @@
           <w:szCs w:val="24"/>
           <w:rtl w:val="0"/>
         </w:rPr>
-        <w:t xml:space="preserve">NOME COMPLETO DO AUTOR</w:t>
-      </w:r>
-      <w:r>
-        <w:rPr>
-          <w:rtl w:val="0"/>
-        </w:rPr>
-      </w:r>
-    </w:p>
-    <w:p>
-      <w:pPr>
-        <w:rPr/>
-      </w:pPr>
-      <w:r>
-        <w:rPr>
-          <w:rtl w:val="0"/>
-        </w:rPr>
-        <w:br w:type="textWrapping"/>
-        <w:br w:type="textWrapping"/>
+        <w:t xml:space="preserve">FICHA CATALOGRÁFICA</w:t>
+      </w:r>
+      <w:r>
+        <w:rPr>
+          <w:rtl w:val="0"/>
+        </w:rPr>
+      </w:r>
+    </w:p>
+    <w:p>
+      <w:pPr>
+        <w:spacing w:after="120" w:line="360" w:lineRule="auto"/>
+        <w:ind w:firstLine="709"/>
+        <w:jc w:val="both"/>
+        <w:rPr/>
+      </w:pPr>
+      <w:r>
+        <w:rPr>
+          <w:rFonts w:ascii="Times New Roman" w:cs="Times New Roman" w:eastAsia="Times New Roman" w:hAnsi="Times New Roman"/>
+          <w:i w:val="1"/>
+          <w:iCs w:val="1"/>
+          <w:color w:val="595959"/>
+          <w:sz w:val="24"/>
+          <w:szCs w:val="24"/>
+          <w:rtl w:val="0"/>
+        </w:rPr>
+        <w:t xml:space="preserve">Substitua esta página pela ficha catalográfica emitida pelo sistema da Biblioteca Universitária da UFSC. Se a ficha for fornecida em PDF ou imagem, insira-a ocupando a área útil desta página.</w:t>
+      </w:r>
+      <w:r>
+        <w:rPr>
+          <w:rtl w:val="0"/>
+        </w:rPr>
+      </w:r>
+    </w:p>
+    <w:p>
+      <w:pPr>
+        <w:rPr/>
+      </w:pPr>
+      <w:r>
+        <w:br w:type="page"/>
+      </w:r>
+      <w:r>
+        <w:rPr>
+          <w:rtl w:val="0"/>
+        </w:rPr>
       </w:r>
     </w:p>
     <w:p>
@@ -390,7 +689,79 @@
           <w:szCs w:val="24"/>
           <w:rtl w:val="0"/>
         </w:rPr>
+        <w:t xml:space="preserve">NOME COMPLETO DO AUTOR</w:t>
+      </w:r>
+      <w:r>
+        <w:rPr>
+          <w:rtl w:val="0"/>
+        </w:rPr>
+      </w:r>
+    </w:p>
+    <w:p>
+      <w:pPr>
+        <w:rPr/>
+      </w:pPr>
+      <w:r>
+        <w:rPr>
+          <w:rtl w:val="0"/>
+        </w:rPr>
+        <w:br w:type="textWrapping"/>
+      </w:r>
+    </w:p>
+    <w:p>
+      <w:pPr>
+        <w:spacing w:after="0" w:lineRule="auto"/>
+        <w:jc w:val="center"/>
+        <w:rPr/>
+      </w:pPr>
+      <w:r>
+        <w:rPr>
+          <w:rFonts w:ascii="Times New Roman" w:cs="Times New Roman" w:eastAsia="Times New Roman" w:hAnsi="Times New Roman"/>
+          <w:b w:val="1"/>
+          <w:bCs w:val="1"/>
+          <w:i w:val="0"/>
+          <w:iCs w:val="0"/>
+          <w:color w:val="000000"/>
+          <w:sz w:val="24"/>
+          <w:szCs w:val="24"/>
+          <w:rtl w:val="0"/>
+        </w:rPr>
         <w:t xml:space="preserve">TÍTULO DO TRABALHO DE CONCLUSÃO DE CURSO</w:t>
+      </w:r>
+      <w:r>
+        <w:rPr>
+          <w:rtl w:val="0"/>
+        </w:rPr>
+      </w:r>
+    </w:p>
+    <w:p>
+      <w:pPr>
+        <w:rPr/>
+      </w:pPr>
+      <w:r>
+        <w:rPr>
+          <w:rtl w:val="0"/>
+        </w:rPr>
+        <w:br w:type="textWrapping"/>
+      </w:r>
+    </w:p>
+    <w:p>
+      <w:pPr>
+        <w:spacing w:after="120" w:line="360" w:lineRule="auto"/>
+        <w:jc w:val="both"/>
+        <w:rPr/>
+      </w:pPr>
+      <w:r>
+        <w:rPr>
+          <w:rFonts w:ascii="Times New Roman" w:cs="Times New Roman" w:eastAsia="Times New Roman" w:hAnsi="Times New Roman"/>
+          <w:i w:val="0"/>
+          <w:iCs w:val="0"/>
+          <w:color w:val="000000"/>
+          <w:sz w:val="24"/>
+          <w:szCs w:val="24"/>
+          <w:rtl w:val="0"/>
+        </w:rPr>
+        <w:t xml:space="preserve">Este Trabalho de Conclusão de Curso foi julgado adequado para a obtenção do título de Bacharel em Geologia e aprovado em sua forma final pelo Curso de Graduação em Geologia da Universidade Federal de Santa Catarina.</w:t>
       </w:r>
       <w:r>
         <w:rPr>
@@ -416,102 +787,22 @@
           <w:szCs w:val="24"/>
           <w:rtl w:val="0"/>
         </w:rPr>
-        <w:t xml:space="preserve">Subtítulo se houver</w:t>
-      </w:r>
-      <w:r>
-        <w:rPr>
-          <w:rtl w:val="0"/>
-        </w:rPr>
-      </w:r>
-    </w:p>
-    <w:p>
-      <w:pPr>
-        <w:rPr/>
-      </w:pPr>
-      <w:r>
-        <w:rPr>
-          <w:rtl w:val="0"/>
-        </w:rPr>
-        <w:br w:type="textWrapping"/>
-      </w:r>
-    </w:p>
-    <w:p>
-      <w:pPr>
-        <w:spacing w:line="240" w:lineRule="auto"/>
-        <w:ind w:left="4252" w:firstLine="0"/>
-        <w:jc w:val="both"/>
-        <w:rPr/>
-      </w:pPr>
-      <w:r>
-        <w:rPr>
-          <w:rFonts w:ascii="Times New Roman" w:cs="Times New Roman" w:eastAsia="Times New Roman" w:hAnsi="Times New Roman"/>
-          <w:color w:val="000000"/>
-          <w:sz w:val="20"/>
-          <w:szCs w:val="20"/>
-          <w:rtl w:val="0"/>
-        </w:rPr>
-        <w:t xml:space="preserve">Trabalho de Conclusão de Curso submetido ao Curso de Graduação em Geologia do Centro de Filosofia e Ciências Humanas da Universidade Federal de Santa Catarina como requisito parcial para a obtenção do título de Bacharel em Geologia.</w:t>
-      </w:r>
-      <w:r>
-        <w:rPr>
-          <w:rtl w:val="0"/>
-        </w:rPr>
-      </w:r>
-    </w:p>
-    <w:p>
-      <w:pPr>
-        <w:spacing w:line="240" w:lineRule="auto"/>
-        <w:ind w:left="4252" w:firstLine="0"/>
-        <w:rPr/>
-      </w:pPr>
-      <w:r>
-        <w:rPr>
-          <w:rFonts w:ascii="Times New Roman" w:cs="Times New Roman" w:eastAsia="Times New Roman" w:hAnsi="Times New Roman"/>
-          <w:color w:val="000000"/>
-          <w:sz w:val="20"/>
-          <w:szCs w:val="20"/>
-          <w:rtl w:val="0"/>
-        </w:rPr>
-        <w:t xml:space="preserve">Orientador: Prof. Nome do orientador, Dr.</w:t>
-      </w:r>
-      <w:r>
-        <w:rPr>
-          <w:rtl w:val="0"/>
-        </w:rPr>
-      </w:r>
-    </w:p>
-    <w:p>
-      <w:pPr>
-        <w:spacing w:line="240" w:lineRule="auto"/>
-        <w:ind w:left="4252" w:firstLine="0"/>
-        <w:rPr/>
-      </w:pPr>
-      <w:r>
-        <w:rPr>
-          <w:rFonts w:ascii="Times New Roman" w:cs="Times New Roman" w:eastAsia="Times New Roman" w:hAnsi="Times New Roman"/>
-          <w:color w:val="000000"/>
-          <w:sz w:val="20"/>
-          <w:szCs w:val="20"/>
-          <w:rtl w:val="0"/>
-        </w:rPr>
-        <w:t xml:space="preserve">Coorientador: Prof. Nome do coorientador, Dr. (se houver)</w:t>
-      </w:r>
-      <w:r>
-        <w:rPr>
-          <w:rtl w:val="0"/>
-        </w:rPr>
-      </w:r>
-    </w:p>
-    <w:p>
-      <w:pPr>
-        <w:rPr/>
-      </w:pPr>
-      <w:r>
-        <w:rPr>
-          <w:rtl w:val="0"/>
-        </w:rPr>
-        <w:br w:type="textWrapping"/>
-        <w:br w:type="textWrapping"/>
+        <w:t xml:space="preserve">Florianópolis, dia de mês de ano.</w:t>
+      </w:r>
+      <w:r>
+        <w:rPr>
+          <w:rtl w:val="0"/>
+        </w:rPr>
+      </w:r>
+    </w:p>
+    <w:p>
+      <w:pPr>
+        <w:rPr/>
+      </w:pPr>
+      <w:r>
+        <w:rPr>
+          <w:rtl w:val="0"/>
+        </w:rPr>
         <w:br w:type="textWrapping"/>
       </w:r>
     </w:p>
@@ -533,17 +824,17 @@
           <w:szCs w:val="24"/>
           <w:rtl w:val="0"/>
         </w:rPr>
-        <w:t xml:space="preserve">Florianópolis</w:t>
-      </w:r>
-      <w:r>
-        <w:rPr>
-          <w:rtl w:val="0"/>
-        </w:rPr>
-      </w:r>
-    </w:p>
-    <w:p>
-      <w:pPr>
-        <w:spacing w:after="0" w:lineRule="auto"/>
+        <w:t xml:space="preserve">________________________________________</w:t>
+      </w:r>
+      <w:r>
+        <w:rPr>
+          <w:rtl w:val="0"/>
+        </w:rPr>
+      </w:r>
+    </w:p>
+    <w:p>
+      <w:pPr>
+        <w:spacing w:after="240" w:lineRule="auto"/>
         <w:jc w:val="center"/>
         <w:rPr/>
       </w:pPr>
@@ -555,11 +846,121 @@
           <w:i w:val="0"/>
           <w:iCs w:val="0"/>
           <w:color w:val="000000"/>
+          <w:sz w:val="20"/>
+          <w:szCs w:val="20"/>
+          <w:rtl w:val="0"/>
+        </w:rPr>
+        <w:t xml:space="preserve">Prof. Nome do orientador, Dr.</w:t>
+        <w:br w:type="textWrapping"/>
+        <w:t xml:space="preserve">Orientador</w:t>
+      </w:r>
+      <w:r>
+        <w:rPr>
+          <w:rtl w:val="0"/>
+        </w:rPr>
+      </w:r>
+    </w:p>
+    <w:p>
+      <w:pPr>
+        <w:spacing w:after="0" w:lineRule="auto"/>
+        <w:jc w:val="center"/>
+        <w:rPr/>
+      </w:pPr>
+      <w:r>
+        <w:rPr>
+          <w:rFonts w:ascii="Times New Roman" w:cs="Times New Roman" w:eastAsia="Times New Roman" w:hAnsi="Times New Roman"/>
+          <w:b w:val="0"/>
+          <w:bCs w:val="0"/>
+          <w:i w:val="0"/>
+          <w:iCs w:val="0"/>
+          <w:color w:val="000000"/>
           <w:sz w:val="24"/>
           <w:szCs w:val="24"/>
           <w:rtl w:val="0"/>
         </w:rPr>
-        <w:t xml:space="preserve">ANO</w:t>
+        <w:t xml:space="preserve">________________________________________</w:t>
+      </w:r>
+      <w:r>
+        <w:rPr>
+          <w:rtl w:val="0"/>
+        </w:rPr>
+      </w:r>
+    </w:p>
+    <w:p>
+      <w:pPr>
+        <w:spacing w:after="240" w:lineRule="auto"/>
+        <w:jc w:val="center"/>
+        <w:rPr/>
+      </w:pPr>
+      <w:r>
+        <w:rPr>
+          <w:rFonts w:ascii="Times New Roman" w:cs="Times New Roman" w:eastAsia="Times New Roman" w:hAnsi="Times New Roman"/>
+          <w:b w:val="0"/>
+          <w:bCs w:val="0"/>
+          <w:i w:val="0"/>
+          <w:iCs w:val="0"/>
+          <w:color w:val="000000"/>
+          <w:sz w:val="20"/>
+          <w:szCs w:val="20"/>
+          <w:rtl w:val="0"/>
+        </w:rPr>
+        <w:t xml:space="preserve">Prof. Nome do primeiro membro, Dr.</w:t>
+        <w:br w:type="textWrapping"/>
+        <w:t xml:space="preserve">Universidade Federal de Santa Catarina</w:t>
+      </w:r>
+      <w:r>
+        <w:rPr>
+          <w:rtl w:val="0"/>
+        </w:rPr>
+      </w:r>
+    </w:p>
+    <w:p>
+      <w:pPr>
+        <w:spacing w:after="0" w:lineRule="auto"/>
+        <w:jc w:val="center"/>
+        <w:rPr/>
+      </w:pPr>
+      <w:r>
+        <w:rPr>
+          <w:rFonts w:ascii="Times New Roman" w:cs="Times New Roman" w:eastAsia="Times New Roman" w:hAnsi="Times New Roman"/>
+          <w:b w:val="0"/>
+          <w:bCs w:val="0"/>
+          <w:i w:val="0"/>
+          <w:iCs w:val="0"/>
+          <w:color w:val="000000"/>
+          <w:sz w:val="24"/>
+          <w:szCs w:val="24"/>
+          <w:rtl w:val="0"/>
+        </w:rPr>
+        <w:t xml:space="preserve">________________________________________</w:t>
+      </w:r>
+      <w:r>
+        <w:rPr>
+          <w:rtl w:val="0"/>
+        </w:rPr>
+      </w:r>
+    </w:p>
+    <w:p>
+      <w:pPr>
+        <w:spacing w:after="240" w:lineRule="auto"/>
+        <w:jc w:val="center"/>
+        <w:rPr/>
+      </w:pPr>
+      <w:r>
+        <w:rPr>
+          <w:rFonts w:ascii="Times New Roman" w:cs="Times New Roman" w:eastAsia="Times New Roman" w:hAnsi="Times New Roman"/>
+          <w:b w:val="0"/>
+          <w:bCs w:val="0"/>
+          <w:i w:val="0"/>
+          <w:iCs w:val="0"/>
+          <w:color w:val="000000"/>
+          <w:sz w:val="20"/>
+          <w:szCs w:val="20"/>
+          <w:rtl w:val="0"/>
+        </w:rPr>
+        <w:t xml:space="preserve">Prof. Nome do segundo membro, Dr.</w:t>
+        <w:br w:type="textWrapping"/>
+        <w:t xml:space="preserve">Instituição</w:t>
       </w:r>
       <w:r>
         <w:rPr>
@@ -598,7 +999,7 @@
           <w:szCs w:val="24"/>
           <w:rtl w:val="0"/>
         </w:rPr>
-        <w:t xml:space="preserve">FICHA CATALOGRÁFICA</w:t>
+        <w:t xml:space="preserve">DEDICATÓRIA</w:t>
       </w:r>
       <w:r>
         <w:rPr>
@@ -623,7 +1024,7 @@
           <w:szCs w:val="24"/>
           <w:rtl w:val="0"/>
         </w:rPr>
-        <w:t xml:space="preserve">Substitua esta página pela ficha catalográfica emitida pelo sistema da Biblioteca Universitária da UFSC. Se a ficha for fornecida em PDF ou imagem, insira-a ocupando a área útil desta página.</w:t>
+        <w:t xml:space="preserve">Elemento opcional. Escreva a dedicatória e remova esta orientação.</w:t>
       </w:r>
       <w:r>
         <w:rPr>
@@ -646,7 +1047,7 @@
     </w:p>
     <w:p>
       <w:pPr>
-        <w:spacing w:after="0" w:lineRule="auto"/>
+        <w:spacing w:after="360" w:lineRule="auto"/>
         <w:jc w:val="center"/>
         <w:rPr/>
       </w:pPr>
@@ -662,28 +1063,55 @@
           <w:szCs w:val="24"/>
           <w:rtl w:val="0"/>
         </w:rPr>
-        <w:t xml:space="preserve">NOME COMPLETO DO AUTOR</w:t>
-      </w:r>
-      <w:r>
-        <w:rPr>
-          <w:rtl w:val="0"/>
-        </w:rPr>
-      </w:r>
-    </w:p>
-    <w:p>
-      <w:pPr>
-        <w:rPr/>
-      </w:pPr>
-      <w:r>
-        <w:rPr>
-          <w:rtl w:val="0"/>
-        </w:rPr>
-        <w:br w:type="textWrapping"/>
-      </w:r>
-    </w:p>
-    <w:p>
-      <w:pPr>
-        <w:spacing w:after="0" w:lineRule="auto"/>
+        <w:t xml:space="preserve">AGRADECIMENTOS</w:t>
+      </w:r>
+      <w:r>
+        <w:rPr>
+          <w:rtl w:val="0"/>
+        </w:rPr>
+      </w:r>
+    </w:p>
+    <w:p>
+      <w:pPr>
+        <w:spacing w:after="120" w:line="360" w:lineRule="auto"/>
+        <w:ind w:firstLine="709"/>
+        <w:jc w:val="both"/>
+        <w:rPr/>
+      </w:pPr>
+      <w:r>
+        <w:rPr>
+          <w:rFonts w:ascii="Times New Roman" w:cs="Times New Roman" w:eastAsia="Times New Roman" w:hAnsi="Times New Roman"/>
+          <w:i w:val="1"/>
+          <w:iCs w:val="1"/>
+          <w:color w:val="595959"/>
+          <w:sz w:val="24"/>
+          <w:szCs w:val="24"/>
+          <w:rtl w:val="0"/>
+        </w:rPr>
+        <w:t xml:space="preserve">Elemento opcional. Registre agradecimentos acadêmicos, institucionais e pessoais. Indique bolsas, projetos, laboratórios e autorizações quando pertinente.</w:t>
+      </w:r>
+      <w:r>
+        <w:rPr>
+          <w:rtl w:val="0"/>
+        </w:rPr>
+      </w:r>
+    </w:p>
+    <w:p>
+      <w:pPr>
+        <w:rPr/>
+      </w:pPr>
+      <w:r>
+        <w:br w:type="page"/>
+      </w:r>
+      <w:r>
+        <w:rPr>
+          <w:rtl w:val="0"/>
+        </w:rPr>
+      </w:r>
+    </w:p>
+    <w:p>
+      <w:pPr>
+        <w:spacing w:after="360" w:lineRule="auto"/>
         <w:jc w:val="center"/>
         <w:rPr/>
       </w:pPr>
@@ -699,241 +1127,32 @@
           <w:szCs w:val="24"/>
           <w:rtl w:val="0"/>
         </w:rPr>
-        <w:t xml:space="preserve">TÍTULO DO TRABALHO DE CONCLUSÃO DE CURSO</w:t>
-      </w:r>
-      <w:r>
-        <w:rPr>
-          <w:rtl w:val="0"/>
-        </w:rPr>
-      </w:r>
-    </w:p>
-    <w:p>
-      <w:pPr>
-        <w:rPr/>
-      </w:pPr>
-      <w:r>
-        <w:rPr>
-          <w:rtl w:val="0"/>
-        </w:rPr>
-        <w:br w:type="textWrapping"/>
+        <w:t xml:space="preserve">EPÍGRAFE</w:t>
+      </w:r>
+      <w:r>
+        <w:rPr>
+          <w:rtl w:val="0"/>
+        </w:rPr>
       </w:r>
     </w:p>
     <w:p>
       <w:pPr>
         <w:spacing w:after="120" w:line="360" w:lineRule="auto"/>
+        <w:ind w:firstLine="709"/>
         <w:jc w:val="both"/>
         <w:rPr/>
       </w:pPr>
       <w:r>
         <w:rPr>
           <w:rFonts w:ascii="Times New Roman" w:cs="Times New Roman" w:eastAsia="Times New Roman" w:hAnsi="Times New Roman"/>
-          <w:i w:val="0"/>
-          <w:iCs w:val="0"/>
-          <w:color w:val="000000"/>
+          <w:i w:val="1"/>
+          <w:iCs w:val="1"/>
+          <w:color w:val="595959"/>
           <w:sz w:val="24"/>
           <w:szCs w:val="24"/>
           <w:rtl w:val="0"/>
         </w:rPr>
-        <w:t xml:space="preserve">Este Trabalho de Conclusão de Curso foi julgado adequado para a obtenção do título de Bacharel em Geologia e aprovado em sua forma final pelo Curso de Graduação em Geologia da Universidade Federal de Santa Catarina.</w:t>
-      </w:r>
-      <w:r>
-        <w:rPr>
-          <w:rtl w:val="0"/>
-        </w:rPr>
-      </w:r>
-    </w:p>
-    <w:p>
-      <w:pPr>
-        <w:spacing w:after="0" w:lineRule="auto"/>
-        <w:jc w:val="center"/>
-        <w:rPr/>
-      </w:pPr>
-      <w:r>
-        <w:rPr>
-          <w:rFonts w:ascii="Times New Roman" w:cs="Times New Roman" w:eastAsia="Times New Roman" w:hAnsi="Times New Roman"/>
-          <w:b w:val="0"/>
-          <w:bCs w:val="0"/>
-          <w:i w:val="0"/>
-          <w:iCs w:val="0"/>
-          <w:color w:val="000000"/>
-          <w:sz w:val="24"/>
-          <w:szCs w:val="24"/>
-          <w:rtl w:val="0"/>
-        </w:rPr>
-        <w:t xml:space="preserve">Florianópolis, dia de mês de ano.</w:t>
-      </w:r>
-      <w:r>
-        <w:rPr>
-          <w:rtl w:val="0"/>
-        </w:rPr>
-      </w:r>
-    </w:p>
-    <w:p>
-      <w:pPr>
-        <w:rPr/>
-      </w:pPr>
-      <w:r>
-        <w:rPr>
-          <w:rtl w:val="0"/>
-        </w:rPr>
-        <w:br w:type="textWrapping"/>
-      </w:r>
-    </w:p>
-    <w:p>
-      <w:pPr>
-        <w:spacing w:after="0" w:lineRule="auto"/>
-        <w:jc w:val="center"/>
-        <w:rPr/>
-      </w:pPr>
-      <w:r>
-        <w:rPr>
-          <w:rFonts w:ascii="Times New Roman" w:cs="Times New Roman" w:eastAsia="Times New Roman" w:hAnsi="Times New Roman"/>
-          <w:b w:val="0"/>
-          <w:bCs w:val="0"/>
-          <w:i w:val="0"/>
-          <w:iCs w:val="0"/>
-          <w:color w:val="000000"/>
-          <w:sz w:val="24"/>
-          <w:szCs w:val="24"/>
-          <w:rtl w:val="0"/>
-        </w:rPr>
-        <w:t xml:space="preserve">________________________________________</w:t>
-      </w:r>
-      <w:r>
-        <w:rPr>
-          <w:rtl w:val="0"/>
-        </w:rPr>
-      </w:r>
-    </w:p>
-    <w:p>
-      <w:pPr>
-        <w:spacing w:after="240" w:lineRule="auto"/>
-        <w:jc w:val="center"/>
-        <w:rPr/>
-      </w:pPr>
-      <w:r>
-        <w:rPr>
-          <w:rFonts w:ascii="Times New Roman" w:cs="Times New Roman" w:eastAsia="Times New Roman" w:hAnsi="Times New Roman"/>
-          <w:b w:val="0"/>
-          <w:bCs w:val="0"/>
-          <w:i w:val="0"/>
-          <w:iCs w:val="0"/>
-          <w:color w:val="000000"/>
-          <w:sz w:val="20"/>
-          <w:szCs w:val="20"/>
-          <w:rtl w:val="0"/>
-        </w:rPr>
-        <w:t xml:space="preserve">Prof. Nome do orientador, Dr.</w:t>
-        <w:br w:type="textWrapping"/>
-        <w:t xml:space="preserve">Orientador</w:t>
-      </w:r>
-      <w:r>
-        <w:rPr>
-          <w:rtl w:val="0"/>
-        </w:rPr>
-      </w:r>
-    </w:p>
-    <w:p>
-      <w:pPr>
-        <w:spacing w:after="0" w:lineRule="auto"/>
-        <w:jc w:val="center"/>
-        <w:rPr/>
-      </w:pPr>
-      <w:r>
-        <w:rPr>
-          <w:rFonts w:ascii="Times New Roman" w:cs="Times New Roman" w:eastAsia="Times New Roman" w:hAnsi="Times New Roman"/>
-          <w:b w:val="0"/>
-          <w:bCs w:val="0"/>
-          <w:i w:val="0"/>
-          <w:iCs w:val="0"/>
-          <w:color w:val="000000"/>
-          <w:sz w:val="24"/>
-          <w:szCs w:val="24"/>
-          <w:rtl w:val="0"/>
-        </w:rPr>
-        <w:t xml:space="preserve">________________________________________</w:t>
-      </w:r>
-      <w:r>
-        <w:rPr>
-          <w:rtl w:val="0"/>
-        </w:rPr>
-      </w:r>
-    </w:p>
-    <w:p>
-      <w:pPr>
-        <w:spacing w:after="240" w:lineRule="auto"/>
-        <w:jc w:val="center"/>
-        <w:rPr/>
-      </w:pPr>
-      <w:r>
-        <w:rPr>
-          <w:rFonts w:ascii="Times New Roman" w:cs="Times New Roman" w:eastAsia="Times New Roman" w:hAnsi="Times New Roman"/>
-          <w:b w:val="0"/>
-          <w:bCs w:val="0"/>
-          <w:i w:val="0"/>
-          <w:iCs w:val="0"/>
-          <w:color w:val="000000"/>
-          <w:sz w:val="20"/>
-          <w:szCs w:val="20"/>
-          <w:rtl w:val="0"/>
-        </w:rPr>
-        <w:t xml:space="preserve">Prof. Nome do primeiro membro, Dr.</w:t>
-        <w:br w:type="textWrapping"/>
-        <w:t xml:space="preserve">Universidade Federal de Santa Catarina</w:t>
-      </w:r>
-      <w:r>
-        <w:rPr>
-          <w:rtl w:val="0"/>
-        </w:rPr>
-      </w:r>
-    </w:p>
-    <w:p>
-      <w:pPr>
-        <w:spacing w:after="0" w:lineRule="auto"/>
-        <w:jc w:val="center"/>
-        <w:rPr/>
-      </w:pPr>
-      <w:r>
-        <w:rPr>
-          <w:rFonts w:ascii="Times New Roman" w:cs="Times New Roman" w:eastAsia="Times New Roman" w:hAnsi="Times New Roman"/>
-          <w:b w:val="0"/>
-          <w:bCs w:val="0"/>
-          <w:i w:val="0"/>
-          <w:iCs w:val="0"/>
-          <w:color w:val="000000"/>
-          <w:sz w:val="24"/>
-          <w:szCs w:val="24"/>
-          <w:rtl w:val="0"/>
-        </w:rPr>
-        <w:t xml:space="preserve">________________________________________</w:t>
-      </w:r>
-      <w:r>
-        <w:rPr>
-          <w:rtl w:val="0"/>
-        </w:rPr>
-      </w:r>
-    </w:p>
-    <w:p>
-      <w:pPr>
-        <w:spacing w:after="240" w:lineRule="auto"/>
-        <w:jc w:val="center"/>
-        <w:rPr/>
-      </w:pPr>
-      <w:r>
-        <w:rPr>
-          <w:rFonts w:ascii="Times New Roman" w:cs="Times New Roman" w:eastAsia="Times New Roman" w:hAnsi="Times New Roman"/>
-          <w:b w:val="0"/>
-          <w:bCs w:val="0"/>
-          <w:i w:val="0"/>
-          <w:iCs w:val="0"/>
-          <w:color w:val="000000"/>
-          <w:sz w:val="20"/>
-          <w:szCs w:val="20"/>
-          <w:rtl w:val="0"/>
-        </w:rPr>
-        <w:t xml:space="preserve">Prof. Nome do segundo membro, Dr.</w:t>
-        <w:br w:type="textWrapping"/>
-        <w:t xml:space="preserve">Instituição</w:t>
+        <w:t xml:space="preserve">Elemento opcional. Insira uma citação curta, com autoria, e remova esta orientação.</w:t>
       </w:r>
       <w:r>
         <w:rPr>
@@ -972,7 +1191,7 @@
           <w:szCs w:val="24"/>
           <w:rtl w:val="0"/>
         </w:rPr>
-        <w:t xml:space="preserve">DEDICATÓRIA</w:t>
+        <w:t xml:space="preserve">RESUMO</w:t>
       </w:r>
       <w:r>
         <w:rPr>
@@ -997,7 +1216,40 @@
           <w:szCs w:val="24"/>
           <w:rtl w:val="0"/>
         </w:rPr>
-        <w:t xml:space="preserve">Elemento opcional. Escreva a dedicatória e remova esta orientação.</w:t>
+        <w:t xml:space="preserve">Apresente objetivo, métodos, resultados principais e conclusão em um único parágrafo. Use redação concisa e evite citações. Verifique o limite de palavras exigido pelo curso.</w:t>
+      </w:r>
+      <w:r>
+        <w:rPr>
+          <w:rtl w:val="0"/>
+        </w:rPr>
+      </w:r>
+    </w:p>
+    <w:p>
+      <w:pPr>
+        <w:spacing w:line="240" w:lineRule="auto"/>
+        <w:rPr/>
+      </w:pPr>
+      <w:r>
+        <w:rPr>
+          <w:rFonts w:ascii="Times New Roman" w:cs="Times New Roman" w:eastAsia="Times New Roman" w:hAnsi="Times New Roman"/>
+          <w:b w:val="1"/>
+          <w:bCs w:val="1"/>
+          <w:color w:val="000000"/>
+          <w:sz w:val="24"/>
+          <w:szCs w:val="24"/>
+          <w:rtl w:val="0"/>
+        </w:rPr>
+        <w:t xml:space="preserve">Palavras-chave: </w:t>
+      </w:r>
+      <w:r>
+        <w:rPr>
+          <w:rFonts w:ascii="Times New Roman" w:cs="Times New Roman" w:eastAsia="Times New Roman" w:hAnsi="Times New Roman"/>
+          <w:color w:val="000000"/>
+          <w:sz w:val="24"/>
+          <w:szCs w:val="24"/>
+          <w:rtl w:val="0"/>
+        </w:rPr>
+        <w:t xml:space="preserve">termo 1; termo 2; termo 3; termo 4.</w:t>
       </w:r>
       <w:r>
         <w:rPr>
@@ -1036,7 +1288,7 @@
           <w:szCs w:val="24"/>
           <w:rtl w:val="0"/>
         </w:rPr>
-        <w:t xml:space="preserve">AGRADECIMENTOS</w:t>
+        <w:t xml:space="preserve">ABSTRACT</w:t>
       </w:r>
       <w:r>
         <w:rPr>
@@ -1061,7 +1313,40 @@
           <w:szCs w:val="24"/>
           <w:rtl w:val="0"/>
         </w:rPr>
-        <w:t xml:space="preserve">Elemento opcional. Registre agradecimentos acadêmicos, institucionais e pessoais. Indique bolsas, projetos, laboratórios e autorizações quando pertinente.</w:t>
+        <w:t xml:space="preserve">Translate the final Portuguese abstract accurately. Preserve the objective, methods, principal results and conclusion.</w:t>
+      </w:r>
+      <w:r>
+        <w:rPr>
+          <w:rtl w:val="0"/>
+        </w:rPr>
+      </w:r>
+    </w:p>
+    <w:p>
+      <w:pPr>
+        <w:spacing w:line="240" w:lineRule="auto"/>
+        <w:rPr/>
+      </w:pPr>
+      <w:r>
+        <w:rPr>
+          <w:rFonts w:ascii="Times New Roman" w:cs="Times New Roman" w:eastAsia="Times New Roman" w:hAnsi="Times New Roman"/>
+          <w:b w:val="1"/>
+          <w:bCs w:val="1"/>
+          <w:color w:val="000000"/>
+          <w:sz w:val="24"/>
+          <w:szCs w:val="24"/>
+          <w:rtl w:val="0"/>
+        </w:rPr>
+        <w:t xml:space="preserve">Keywords: </w:t>
+      </w:r>
+      <w:r>
+        <w:rPr>
+          <w:rFonts w:ascii="Times New Roman" w:cs="Times New Roman" w:eastAsia="Times New Roman" w:hAnsi="Times New Roman"/>
+          <w:color w:val="000000"/>
+          <w:sz w:val="24"/>
+          <w:szCs w:val="24"/>
+          <w:rtl w:val="0"/>
+        </w:rPr>
+        <w:t xml:space="preserve">term 1; term 2; term 3; term 4.</w:t>
       </w:r>
       <w:r>
         <w:rPr>
@@ -1100,7 +1385,7 @@
           <w:szCs w:val="24"/>
           <w:rtl w:val="0"/>
         </w:rPr>
-        <w:t xml:space="preserve">EPÍGRAFE</w:t>
+        <w:t xml:space="preserve">LISTA DE FIGURAS</w:t>
       </w:r>
       <w:r>
         <w:rPr>
@@ -1111,21 +1396,18 @@
     <w:p>
       <w:pPr>
         <w:spacing w:after="120" w:line="360" w:lineRule="auto"/>
-        <w:ind w:firstLine="709"/>
-        <w:jc w:val="both"/>
-        <w:rPr/>
-      </w:pPr>
-      <w:r>
-        <w:rPr>
-          <w:rFonts w:ascii="Times New Roman" w:cs="Times New Roman" w:eastAsia="Times New Roman" w:hAnsi="Times New Roman"/>
-          <w:i w:val="1"/>
-          <w:iCs w:val="1"/>
-          <w:color w:val="595959"/>
-          <w:sz w:val="24"/>
-          <w:szCs w:val="24"/>
-          <w:rtl w:val="0"/>
-        </w:rPr>
-        <w:t xml:space="preserve">Elemento opcional. Insira uma citação curta, com autoria, e remova esta orientação.</w:t>
+        <w:ind w:firstLine="0"/>
+        <w:jc w:val="left"/>
+        <w:rPr/>
+      </w:pPr>
+      <w:r>
+        <w:rPr>
+          <w:i w:val="1"/>
+          <w:iCs w:val="1"/>
+          <w:color w:val="595959"/>
+          <w:rtl w:val="0"/>
+        </w:rPr>
+        <w:t xml:space="preserve">Figura 1 — Esquemas de padrões de configuração dos refletores</w:t>
       </w:r>
       <w:r>
         <w:rPr>
@@ -1164,7 +1446,7 @@
           <w:szCs w:val="24"/>
           <w:rtl w:val="0"/>
         </w:rPr>
-        <w:t xml:space="preserve">RESUMO</w:t>
+        <w:t xml:space="preserve">LISTA DE TABELAS</w:t>
       </w:r>
       <w:r>
         <w:rPr>
@@ -1189,40 +1471,7 @@
           <w:szCs w:val="24"/>
           <w:rtl w:val="0"/>
         </w:rPr>
-        <w:t xml:space="preserve">Apresente objetivo, métodos, resultados principais e conclusão em um único parágrafo. Use redação concisa e evite citações. Verifique o limite de palavras exigido pelo curso.</w:t>
-      </w:r>
-      <w:r>
-        <w:rPr>
-          <w:rtl w:val="0"/>
-        </w:rPr>
-      </w:r>
-    </w:p>
-    <w:p>
-      <w:pPr>
-        <w:spacing w:line="240" w:lineRule="auto"/>
-        <w:rPr/>
-      </w:pPr>
-      <w:r>
-        <w:rPr>
-          <w:rFonts w:ascii="Times New Roman" w:cs="Times New Roman" w:eastAsia="Times New Roman" w:hAnsi="Times New Roman"/>
-          <w:b w:val="1"/>
-          <w:bCs w:val="1"/>
-          <w:color w:val="000000"/>
-          <w:sz w:val="24"/>
-          <w:szCs w:val="24"/>
-          <w:rtl w:val="0"/>
-        </w:rPr>
-        <w:t xml:space="preserve">Palavras-chave: </w:t>
-      </w:r>
-      <w:r>
-        <w:rPr>
-          <w:rFonts w:ascii="Times New Roman" w:cs="Times New Roman" w:eastAsia="Times New Roman" w:hAnsi="Times New Roman"/>
-          <w:color w:val="000000"/>
-          <w:sz w:val="24"/>
-          <w:szCs w:val="24"/>
-          <w:rtl w:val="0"/>
-        </w:rPr>
-        <w:t xml:space="preserve">termo 1; termo 2; termo 3; termo 4.</w:t>
+        <w:t xml:space="preserve">Insira ou atualize a lista automática de tabelas após aplicar legendas a todas as tabelas.</w:t>
       </w:r>
       <w:r>
         <w:rPr>
@@ -1261,7 +1510,7 @@
           <w:szCs w:val="24"/>
           <w:rtl w:val="0"/>
         </w:rPr>
-        <w:t xml:space="preserve">ABSTRACT</w:t>
+        <w:t xml:space="preserve">LISTA DE QUADROS</w:t>
       </w:r>
       <w:r>
         <w:rPr>
@@ -1286,40 +1535,7 @@
           <w:szCs w:val="24"/>
           <w:rtl w:val="0"/>
         </w:rPr>
-        <w:t xml:space="preserve">Translate the final Portuguese abstract accurately. Preserve the objective, methods, principal results and conclusion.</w:t>
-      </w:r>
-      <w:r>
-        <w:rPr>
-          <w:rtl w:val="0"/>
-        </w:rPr>
-      </w:r>
-    </w:p>
-    <w:p>
-      <w:pPr>
-        <w:spacing w:line="240" w:lineRule="auto"/>
-        <w:rPr/>
-      </w:pPr>
-      <w:r>
-        <w:rPr>
-          <w:rFonts w:ascii="Times New Roman" w:cs="Times New Roman" w:eastAsia="Times New Roman" w:hAnsi="Times New Roman"/>
-          <w:b w:val="1"/>
-          <w:bCs w:val="1"/>
-          <w:color w:val="000000"/>
-          <w:sz w:val="24"/>
-          <w:szCs w:val="24"/>
-          <w:rtl w:val="0"/>
-        </w:rPr>
-        <w:t xml:space="preserve">Keywords: </w:t>
-      </w:r>
-      <w:r>
-        <w:rPr>
-          <w:rFonts w:ascii="Times New Roman" w:cs="Times New Roman" w:eastAsia="Times New Roman" w:hAnsi="Times New Roman"/>
-          <w:color w:val="000000"/>
-          <w:sz w:val="24"/>
-          <w:szCs w:val="24"/>
-          <w:rtl w:val="0"/>
-        </w:rPr>
-        <w:t xml:space="preserve">term 1; term 2; term 3; term 4.</w:t>
+        <w:t xml:space="preserve">Liste os quadros textuais utilizados no trabalho, mantendo numeração, título e página.</w:t>
       </w:r>
       <w:r>
         <w:rPr>
@@ -1358,7 +1574,7 @@
           <w:szCs w:val="24"/>
           <w:rtl w:val="0"/>
         </w:rPr>
-        <w:t xml:space="preserve">LISTA DE FIGURAS</w:t>
+        <w:t xml:space="preserve">LISTA DE ABREVIATURAS E SIGLAS</w:t>
       </w:r>
       <w:r>
         <w:rPr>
@@ -1383,7 +1599,9 @@
           <w:szCs w:val="24"/>
           <w:rtl w:val="0"/>
         </w:rPr>
-        <w:t xml:space="preserve">Insira ou atualize a lista automática de figuras após aplicar legendas a todas as imagens, mapas, perfis, fotografias e diagramas.</w:t>
+        <w:t xml:space="preserve">SIGLA — forma por extenso</w:t>
+        <w:br w:type="textWrapping"/>
+        <w:t xml:space="preserve">UFSC — Universidade Federal de Santa Catarina</w:t>
       </w:r>
       <w:r>
         <w:rPr>
@@ -1422,7 +1640,7 @@
           <w:szCs w:val="24"/>
           <w:rtl w:val="0"/>
         </w:rPr>
-        <w:t xml:space="preserve">LISTA DE TABELAS</w:t>
+        <w:t xml:space="preserve">LISTA DE SÍMBOLOS</w:t>
       </w:r>
       <w:r>
         <w:rPr>
@@ -1447,7 +1665,9 @@
           <w:szCs w:val="24"/>
           <w:rtl w:val="0"/>
         </w:rPr>
-        <w:t xml:space="preserve">Insira ou atualize a lista automática de tabelas após aplicar legendas a todas as tabelas.</w:t>
+        <w:t xml:space="preserve">Símbolo — significado e unidade</w:t>
+        <w:br w:type="textWrapping"/>
+        <w:t xml:space="preserve">σ — desvio-padrão</w:t>
       </w:r>
       <w:r>
         <w:rPr>
@@ -1486,202 +1706,6 @@
           <w:szCs w:val="24"/>
           <w:rtl w:val="0"/>
         </w:rPr>
-        <w:t xml:space="preserve">LISTA DE QUADROS</w:t>
-      </w:r>
-      <w:r>
-        <w:rPr>
-          <w:rtl w:val="0"/>
-        </w:rPr>
-      </w:r>
-    </w:p>
-    <w:p>
-      <w:pPr>
-        <w:spacing w:after="120" w:line="360" w:lineRule="auto"/>
-        <w:ind w:firstLine="709"/>
-        <w:jc w:val="both"/>
-        <w:rPr/>
-      </w:pPr>
-      <w:r>
-        <w:rPr>
-          <w:rFonts w:ascii="Times New Roman" w:cs="Times New Roman" w:eastAsia="Times New Roman" w:hAnsi="Times New Roman"/>
-          <w:i w:val="1"/>
-          <w:iCs w:val="1"/>
-          <w:color w:val="595959"/>
-          <w:sz w:val="24"/>
-          <w:szCs w:val="24"/>
-          <w:rtl w:val="0"/>
-        </w:rPr>
-        <w:t xml:space="preserve">Liste os quadros textuais utilizados no trabalho, mantendo numeração, título e página.</w:t>
-      </w:r>
-      <w:r>
-        <w:rPr>
-          <w:rtl w:val="0"/>
-        </w:rPr>
-      </w:r>
-    </w:p>
-    <w:p>
-      <w:pPr>
-        <w:rPr/>
-      </w:pPr>
-      <w:r>
-        <w:br w:type="page"/>
-      </w:r>
-      <w:r>
-        <w:rPr>
-          <w:rtl w:val="0"/>
-        </w:rPr>
-      </w:r>
-    </w:p>
-    <w:p>
-      <w:pPr>
-        <w:spacing w:after="360" w:lineRule="auto"/>
-        <w:jc w:val="center"/>
-        <w:rPr/>
-      </w:pPr>
-      <w:r>
-        <w:rPr>
-          <w:rFonts w:ascii="Times New Roman" w:cs="Times New Roman" w:eastAsia="Times New Roman" w:hAnsi="Times New Roman"/>
-          <w:b w:val="1"/>
-          <w:bCs w:val="1"/>
-          <w:i w:val="0"/>
-          <w:iCs w:val="0"/>
-          <w:color w:val="000000"/>
-          <w:sz w:val="24"/>
-          <w:szCs w:val="24"/>
-          <w:rtl w:val="0"/>
-        </w:rPr>
-        <w:t xml:space="preserve">LISTA DE ABREVIATURAS E SIGLAS</w:t>
-      </w:r>
-      <w:r>
-        <w:rPr>
-          <w:rtl w:val="0"/>
-        </w:rPr>
-      </w:r>
-    </w:p>
-    <w:p>
-      <w:pPr>
-        <w:spacing w:after="120" w:line="360" w:lineRule="auto"/>
-        <w:ind w:firstLine="709"/>
-        <w:jc w:val="both"/>
-        <w:rPr/>
-      </w:pPr>
-      <w:r>
-        <w:rPr>
-          <w:rFonts w:ascii="Times New Roman" w:cs="Times New Roman" w:eastAsia="Times New Roman" w:hAnsi="Times New Roman"/>
-          <w:i w:val="1"/>
-          <w:iCs w:val="1"/>
-          <w:color w:val="595959"/>
-          <w:sz w:val="24"/>
-          <w:szCs w:val="24"/>
-          <w:rtl w:val="0"/>
-        </w:rPr>
-        <w:t xml:space="preserve">SIGLA — forma por extenso</w:t>
-        <w:br w:type="textWrapping"/>
-        <w:t xml:space="preserve">UFSC — Universidade Federal de Santa Catarina</w:t>
-      </w:r>
-      <w:r>
-        <w:rPr>
-          <w:rtl w:val="0"/>
-        </w:rPr>
-      </w:r>
-    </w:p>
-    <w:p>
-      <w:pPr>
-        <w:rPr/>
-      </w:pPr>
-      <w:r>
-        <w:br w:type="page"/>
-      </w:r>
-      <w:r>
-        <w:rPr>
-          <w:rtl w:val="0"/>
-        </w:rPr>
-      </w:r>
-    </w:p>
-    <w:p>
-      <w:pPr>
-        <w:spacing w:after="360" w:lineRule="auto"/>
-        <w:jc w:val="center"/>
-        <w:rPr/>
-      </w:pPr>
-      <w:r>
-        <w:rPr>
-          <w:rFonts w:ascii="Times New Roman" w:cs="Times New Roman" w:eastAsia="Times New Roman" w:hAnsi="Times New Roman"/>
-          <w:b w:val="1"/>
-          <w:bCs w:val="1"/>
-          <w:i w:val="0"/>
-          <w:iCs w:val="0"/>
-          <w:color w:val="000000"/>
-          <w:sz w:val="24"/>
-          <w:szCs w:val="24"/>
-          <w:rtl w:val="0"/>
-        </w:rPr>
-        <w:t xml:space="preserve">LISTA DE SÍMBOLOS</w:t>
-      </w:r>
-      <w:r>
-        <w:rPr>
-          <w:rtl w:val="0"/>
-        </w:rPr>
-      </w:r>
-    </w:p>
-    <w:p>
-      <w:pPr>
-        <w:spacing w:after="120" w:line="360" w:lineRule="auto"/>
-        <w:ind w:firstLine="709"/>
-        <w:jc w:val="both"/>
-        <w:rPr/>
-      </w:pPr>
-      <w:r>
-        <w:rPr>
-          <w:rFonts w:ascii="Times New Roman" w:cs="Times New Roman" w:eastAsia="Times New Roman" w:hAnsi="Times New Roman"/>
-          <w:i w:val="1"/>
-          <w:iCs w:val="1"/>
-          <w:color w:val="595959"/>
-          <w:sz w:val="24"/>
-          <w:szCs w:val="24"/>
-          <w:rtl w:val="0"/>
-        </w:rPr>
-        <w:t xml:space="preserve">Símbolo — significado e unidade</w:t>
-        <w:br w:type="textWrapping"/>
-        <w:t xml:space="preserve">σ — desvio-padrão</w:t>
-      </w:r>
-      <w:r>
-        <w:rPr>
-          <w:rtl w:val="0"/>
-        </w:rPr>
-      </w:r>
-    </w:p>
-    <w:p>
-      <w:pPr>
-        <w:rPr/>
-      </w:pPr>
-      <w:r>
-        <w:br w:type="page"/>
-      </w:r>
-      <w:r>
-        <w:rPr>
-          <w:rtl w:val="0"/>
-        </w:rPr>
-      </w:r>
-    </w:p>
-    <w:p>
-      <w:pPr>
-        <w:spacing w:after="360" w:lineRule="auto"/>
-        <w:jc w:val="center"/>
-        <w:rPr/>
-      </w:pPr>
-      <w:r>
-        <w:rPr>
-          <w:rFonts w:ascii="Times New Roman" w:cs="Times New Roman" w:eastAsia="Times New Roman" w:hAnsi="Times New Roman"/>
-          <w:b w:val="1"/>
-          <w:bCs w:val="1"/>
-          <w:i w:val="0"/>
-          <w:iCs w:val="0"/>
-          <w:color w:val="000000"/>
-          <w:sz w:val="24"/>
-          <w:szCs w:val="24"/>
-          <w:rtl w:val="0"/>
-        </w:rPr>
         <w:t xml:space="preserve">SUMÁRIO</w:t>
       </w:r>
       <w:r>
@@ -1692,7 +1716,7 @@
     </w:p>
     <w:sdt>
       <w:sdtPr>
-        <w:id w:val="-2001283760"/>
+        <w:id w:val="420813045"/>
         <w:docPartObj>
           <w:docPartGallery w:val="Table of Contents"/>
           <w:docPartUnique w:val="1"/>
@@ -2523,12 +2547,16 @@
     </w:p>
     <w:p>
       <w:pPr>
-        <w:rPr/>
-      </w:pPr>
-      <w:r>
-        <w:rPr>
-          <w:rtl w:val="0"/>
-        </w:rPr>
+        <w:pStyle w:val="Heading3"/>
+        <w:rPr/>
+      </w:pPr>
+      <w:bookmarkStart w:colFirst="0" w:colLast="0" w:name="_o1eeu2ym2b2q" w:id="1"/>
+      <w:bookmarkEnd w:id="1"/>
+      <w:r>
+        <w:rPr>
+          <w:rtl w:val="0"/>
+        </w:rPr>
+        <w:t xml:space="preserve">2.2.1 Fácies sísmicas </w:t>
       </w:r>
     </w:p>
     <w:p>
@@ -2542,28 +2570,191 @@
         <w:rPr>
           <w:rtl w:val="0"/>
         </w:rPr>
+        <w:t xml:space="preserve">As fácies sísmicas, também denominadas sismofácies, correspondem a unidades tridimensionais reconhecidas em dados sísmicos por apresentarem um conjunto de reflexões com características distintas das unidades vizinhas. Essas diferenças são observadas por meio de parâmetros como amplitude, continuidade, frequência, configuração interna e geometria dos refletores (Brown Jr. &amp; Fisher, 1980).</w:t>
+      </w:r>
+    </w:p>
+    <w:p>
+      <w:pPr>
+        <w:spacing w:after="0" w:before="0" w:line="360" w:lineRule="auto"/>
+        <w:ind w:firstLine="709"/>
+        <w:jc w:val="both"/>
+        <w:rPr/>
+      </w:pPr>
+      <w:r>
+        <w:rPr>
+          <w:rtl w:val="0"/>
+        </w:rPr>
+        <w:t xml:space="preserve">A delimitação e o mapeamento dessas unidades no interior das sequências deposicionais constituem a análise sismofaciológica. Esse procedimento busca relacionar os padrões sísmicos observados às condições geológicas responsáveis pela deposição dos estratos, permitindo inferir processos sedimentares, ambiente deposicional, energia do meio e possíveis características litológicas dos pacotes sedimentares (Mitchum Jr. et al., 1977).</w:t>
+      </w:r>
+    </w:p>
+    <w:p>
+      <w:pPr>
+        <w:spacing w:after="0" w:before="0" w:line="360" w:lineRule="auto"/>
+        <w:ind w:firstLine="709"/>
+        <w:jc w:val="both"/>
+        <w:rPr/>
+      </w:pPr>
+      <w:r>
+        <w:rPr>
+          <w:rtl w:val="0"/>
+        </w:rPr>
+        <w:t xml:space="preserve">Entre os parâmetros empregados nessa interpretação, destacam-se a amplitude e a continuidade das reflexões. A amplitude está relacionada ao contraste de impedância acústica entre camadas adjacentes e pode fornecer indícios sobre variações litológicas, espaçamento dos estratos e possíveis mudanças nas propriedades físicas das rochas. A continuidade, por sua vez, expressa o grau de persistência lateral dos refletores, podendo estar associada à regularidade do acamamento, à espessura das camadas e às condições de energia durante a sedimentação. Em conjunto, esses atributos contribuem para a caracterização interna das sismofácies e para a interpretação de seu significado deposicional.</w:t>
+      </w:r>
+    </w:p>
+    <w:p>
+      <w:pPr>
+        <w:spacing w:after="0" w:before="0" w:line="360" w:lineRule="auto"/>
+        <w:ind w:firstLine="709"/>
+        <w:jc w:val="both"/>
+        <w:rPr/>
+      </w:pPr>
+      <w:r>
+        <w:rPr>
+          <w:rtl w:val="0"/>
+        </w:rPr>
+        <w:t xml:space="preserve">As configurações internas dos refletores também são fundamentais para a análise das sismofácies. Os padrões podem ser paralelos ou ondulados, divergentes, progradantes, caóticos e transparentes (Figura 1). Reflexões paralelas, subparalelas ou onduladas geralmente indicam deposição relativamente uniforme e equilíbrio entre sedimentação e subsidência. Já os padrões divergentes refletem alterações na taxa de sedimentação e/ou na criação de espaço de acomodação ao longo do tempo.</w:t>
+      </w:r>
+    </w:p>
+    <w:p>
+      <w:pPr>
+        <w:spacing w:after="0" w:before="0" w:line="360" w:lineRule="auto"/>
+        <w:ind w:firstLine="709"/>
+        <w:jc w:val="both"/>
+        <w:rPr/>
+      </w:pPr>
+      <w:r>
+        <w:rPr>
+          <w:rtl w:val="0"/>
+        </w:rPr>
+        <w:t xml:space="preserve">As configurações progradantes evidenciam o avanço lateral de corpos sedimentares, formando clinoformas. Sua geometria pode variar conforme a interação entre aporte sedimentar, variações relativas do nível do mar, energia do ambiente e características do sistema deposicional. Em contraste, padrões caóticos apresentam reflexões descontínuas e sem organização geométrica definida, podendo estar associados a deposição desorganizada, deformação sedimentar ou processos gravitacionais. Por fim, sismofácies transparentes são caracterizadas pela ausência ou baixa definição de refletores internos, o que pode indicar unidades homogêneas, reduzido contraste de impedância acústica ou limitações de resolução sísmica.</w:t>
+      </w:r>
+    </w:p>
+    <w:p>
+      <w:pPr>
+        <w:spacing w:after="0" w:before="0" w:line="360" w:lineRule="auto"/>
+        <w:ind w:firstLine="709"/>
+        <w:jc w:val="both"/>
+        <w:rPr/>
+      </w:pPr>
+      <w:r>
+        <w:rPr>
+          <w:rtl w:val="0"/>
+        </w:rPr>
+      </w:r>
+    </w:p>
+    <w:p>
+      <w:pPr>
+        <w:spacing w:after="0" w:before="0" w:line="360" w:lineRule="auto"/>
+        <w:ind w:firstLine="709"/>
+        <w:jc w:val="both"/>
+        <w:rPr/>
+      </w:pPr>
+      <w:r>
+        <w:rPr/>
+        <w:drawing>
+          <wp:inline distB="114300" distT="114300" distL="114300" distR="114300">
+            <wp:extent cx="4690796" cy="4706302"/>
+            <wp:effectExtent b="0" l="0" r="0" t="0"/>
+            <wp:docPr id="2" name="image1.png"/>
+            <a:graphic>
+              <a:graphicData uri="http://schemas.openxmlformats.org/drawingml/2006/picture">
+                <pic:pic>
+                  <pic:nvPicPr>
+                    <pic:cNvPr id="0" name="image1.png"/>
+                    <pic:cNvPicPr preferRelativeResize="0"/>
+                  </pic:nvPicPr>
+                  <pic:blipFill>
+                    <a:blip r:embed="rId7"/>
+                    <a:srcRect b="0" l="0" r="0" t="0"/>
+                    <a:stretch>
+                      <a:fillRect/>
+                    </a:stretch>
+                  </pic:blipFill>
+                  <pic:spPr>
+                    <a:xfrm>
+                      <a:off x="0" y="0"/>
+                      <a:ext cx="4690796" cy="4706302"/>
+                    </a:xfrm>
+                    <a:prstGeom prst="rect"/>
+                    <a:ln/>
+                  </pic:spPr>
+                </pic:pic>
+              </a:graphicData>
+            </a:graphic>
+          </wp:inline>
+        </w:drawing>
+      </w:r>
+      <w:r>
+        <w:rPr>
+          <w:rtl w:val="0"/>
+        </w:rPr>
+      </w:r>
+    </w:p>
+    <w:p>
+      <w:pPr>
+        <w:spacing w:after="60" w:before="0" w:line="276" w:lineRule="auto"/>
+        <w:ind w:firstLine="0"/>
+        <w:jc w:val="center"/>
+        <w:rPr>
+          <w:sz w:val="20"/>
+          <w:szCs w:val="20"/>
+        </w:rPr>
+      </w:pPr>
+      <w:r>
+        <w:rPr>
+          <w:sz w:val="20"/>
+          <w:szCs w:val="20"/>
+          <w:rtl w:val="0"/>
+        </w:rPr>
+        <w:t xml:space="preserve">Figura 1 — Esquemas de padrões de configuração dos refletores</w:t>
+      </w:r>
+    </w:p>
+    <w:p>
+      <w:pPr>
+        <w:spacing w:after="0" w:before="0" w:line="360" w:lineRule="auto"/>
+        <w:ind w:firstLine="709"/>
+        <w:jc w:val="both"/>
+        <w:rPr/>
+      </w:pPr>
+      <w:r>
+        <w:rPr>
+          <w:rtl w:val="0"/>
+        </w:rPr>
+      </w:r>
+    </w:p>
+    <w:p>
+      <w:pPr>
+        <w:spacing w:after="60" w:before="0" w:line="276" w:lineRule="auto"/>
+        <w:ind w:left="0" w:firstLine="0"/>
+        <w:jc w:val="center"/>
+        <w:rPr>
+          <w:sz w:val="20"/>
+          <w:szCs w:val="20"/>
+        </w:rPr>
+      </w:pPr>
+      <w:r>
+        <w:rPr>
+          <w:sz w:val="20"/>
+          <w:szCs w:val="20"/>
+          <w:rtl w:val="0"/>
+        </w:rPr>
+        <w:t xml:space="preserve">Fonte: adaptado de Mitchum Jr. et al. (1977).</w:t>
       </w:r>
     </w:p>
     <w:p>
       <w:pPr>
         <w:pStyle w:val="Heading2"/>
-        <w:keepNext w:val="1"/>
-        <w:spacing w:after="240" w:before="240" w:line="360" w:lineRule="auto"/>
-        <w:ind w:firstLine="0"/>
-        <w:jc w:val="left"/>
-        <w:rPr/>
-      </w:pPr>
-      <w:r>
-        <w:rPr>
-          <w:color w:val="000000"/>
+        <w:spacing w:after="0" w:lineRule="auto"/>
+        <w:jc w:val="both"/>
+        <w:rPr/>
+      </w:pPr>
+      <w:bookmarkStart w:colFirst="0" w:colLast="0" w:name="_pfgfl1mim8bb" w:id="2"/>
+      <w:bookmarkEnd w:id="2"/>
+      <w:r>
+        <w:rPr>
           <w:rtl w:val="0"/>
         </w:rPr>
         <w:t xml:space="preserve">2.3 Geologia local</w:t>
-      </w:r>
-      <w:r>
-        <w:rPr>
-          <w:rtl w:val="0"/>
-        </w:rPr>
       </w:r>
     </w:p>
     <w:p>
@@ -3465,33 +3656,16 @@
       </w:pPr>
       <w:r>
         <w:rPr>
-          <w:i w:val="0"/>
-          <w:iCs w:val="0"/>
-          <w:smallCaps w:val="0"/>
-          <w:strike w:val="0"/>
-          <w:color w:val="000000"/>
           <w:sz w:val="20"/>
           <w:szCs w:val="20"/>
-          <w:u w:val="none"/>
-          <w:shd w:fill="auto" w:val="clear"/>
-          <w:vertAlign w:val="baseline"/>
-          <w:rtl w:val="0"/>
-        </w:rPr>
-        <w:t xml:space="preserve">Figura 1 — Título descritivo da figur</w:t>
-      </w:r>
-      <w:r>
-        <w:rPr>
-          <w:i w:val="0"/>
-          <w:iCs w:val="0"/>
-          <w:smallCaps w:val="0"/>
-          <w:strike w:val="0"/>
-          <w:color w:val="000000"/>
-          <w:u w:val="none"/>
-          <w:shd w:fill="auto" w:val="clear"/>
-          <w:vertAlign w:val="baseline"/>
-          <w:rtl w:val="0"/>
-        </w:rPr>
-        <w:t xml:space="preserve">a</w:t>
+          <w:rtl w:val="0"/>
+        </w:rPr>
+        <w:t xml:space="preserve">Figura 2 — Título descritivo da figura</w:t>
+      </w:r>
+      <w:r>
+        <w:rPr>
+          <w:rtl w:val="0"/>
+        </w:rPr>
       </w:r>
     </w:p>
     <w:tbl>
@@ -3810,6 +3984,27 @@
     </w:p>
     <w:p>
       <w:pPr>
+        <w:spacing w:after="240" w:before="0" w:line="240" w:lineRule="auto"/>
+        <w:ind w:left="0" w:firstLine="0"/>
+        <w:jc w:val="left"/>
+        <w:rPr>
+          <w:i w:val="1"/>
+          <w:iCs w:val="1"/>
+          <w:color w:val="595959"/>
+        </w:rPr>
+      </w:pPr>
+      <w:r>
+        <w:rPr>
+          <w:i w:val="1"/>
+          <w:iCs w:val="1"/>
+          <w:color w:val="595959"/>
+          <w:rtl w:val="0"/>
+        </w:rPr>
+        <w:t xml:space="preserve">BROWN JR., L. F. &amp; FISHER, W. L. Seismic-stratigraphic interpretation of depositional systems and its role in petroleum exploration: part 1. Austin: American Association of Petroleum Geologists, 1980. (AAPG Continuing Education Course Note Series, v. 16). p. 1–65.</w:t>
+      </w:r>
+    </w:p>
+    <w:p>
+      <w:pPr>
         <w:spacing w:after="120" w:before="0" w:line="240" w:lineRule="auto"/>
         <w:ind w:left="0" w:firstLine="0"/>
         <w:jc w:val="left"/>
@@ -4231,7 +4426,7 @@
       </w:r>
     </w:p>
     <w:sectPr>
-      <w:footerReference r:id="rId7" w:type="default"/>
+      <w:footerReference r:id="rId8" w:type="default"/>
       <w:pgSz w:h="16838" w:w="11906" w:orient="portrait"/>
       <w:pgMar w:bottom="1134" w:top="1701" w:left="1701" w:right="1134" w:header="709" w:footer="709"/>
       <w:pgNumType w:start="1"/>

</xml_diff>

<commit_message>
Atualizacao automatica 2026-09-19 16:14:40
</commit_message>
<xml_diff>
--- a/docs/template-tcc-geologia-ufsc.docx
+++ b/docs/template-tcc-geologia-ufsc.docx
@@ -13,7 +13,7 @@
           <wp:inline distB="0" distT="0" distL="114300" distR="114300">
             <wp:extent cx="900000" cy="1236424"/>
             <wp:effectExtent b="0" l="0" r="0" t="0"/>
-            <wp:docPr descr="Símbolo da Universidade Federal de Santa Catarina" id="1" name="image2.png"/>
+            <wp:docPr descr="Símbolo da Universidade Federal de Santa Catarina" id="2" name="image2.png"/>
             <a:graphic>
               <a:graphicData uri="http://schemas.openxmlformats.org/drawingml/2006/picture">
                 <pic:pic>
@@ -1398,7 +1398,11 @@
         <w:spacing w:after="120" w:line="360" w:lineRule="auto"/>
         <w:ind w:firstLine="0"/>
         <w:jc w:val="left"/>
-        <w:rPr/>
+        <w:rPr>
+          <w:i w:val="1"/>
+          <w:iCs w:val="1"/>
+          <w:color w:val="595959"/>
+        </w:rPr>
       </w:pPr>
       <w:r>
         <w:rPr>
@@ -1409,10 +1413,47 @@
         </w:rPr>
         <w:t xml:space="preserve">Figura 1 — Esquemas de padrões de configuração dos refletores</w:t>
       </w:r>
-      <w:r>
-        <w:rPr>
-          <w:rtl w:val="0"/>
-        </w:rPr>
+    </w:p>
+    <w:p>
+      <w:pPr>
+        <w:spacing w:after="120" w:line="360" w:lineRule="auto"/>
+        <w:ind w:firstLine="0"/>
+        <w:jc w:val="left"/>
+        <w:rPr>
+          <w:i w:val="1"/>
+          <w:iCs w:val="1"/>
+          <w:color w:val="595959"/>
+        </w:rPr>
+      </w:pPr>
+      <w:r>
+        <w:rPr>
+          <w:i w:val="1"/>
+          <w:iCs w:val="1"/>
+          <w:color w:val="595959"/>
+          <w:rtl w:val="0"/>
+        </w:rPr>
+        <w:t xml:space="preserve">Figura 2 — Formas externas das fácies sísmicas</w:t>
+      </w:r>
+    </w:p>
+    <w:p>
+      <w:pPr>
+        <w:spacing w:after="120" w:line="360" w:lineRule="auto"/>
+        <w:ind w:firstLine="0"/>
+        <w:jc w:val="left"/>
+        <w:rPr>
+          <w:i w:val="1"/>
+          <w:iCs w:val="1"/>
+          <w:color w:val="595959"/>
+        </w:rPr>
+      </w:pPr>
+      <w:r>
+        <w:rPr>
+          <w:i w:val="1"/>
+          <w:iCs w:val="1"/>
+          <w:color w:val="595959"/>
+          <w:rtl w:val="0"/>
+        </w:rPr>
+        <w:t xml:space="preserve">Figura 3 — Padrões de configuração interna dos refletores em geometrias de preenchimento</w:t>
       </w:r>
     </w:p>
     <w:p>
@@ -1716,7 +1757,7 @@
     </w:p>
     <w:sdt>
       <w:sdtPr>
-        <w:id w:val="420813045"/>
+        <w:id w:val="-242645079"/>
         <w:docPartObj>
           <w:docPartGallery w:val="Table of Contents"/>
           <w:docPartUnique w:val="1"/>
@@ -1826,12 +1867,162 @@
       </w:pPr>
       <w:r>
         <w:rPr>
-          <w:i w:val="1"/>
-          <w:iCs w:val="1"/>
-          <w:color w:val="595959"/>
-          <w:rtl w:val="0"/>
-        </w:rPr>
-        <w:t xml:space="preserve">Apresente o tema, delimite o problema geológico, sintetize o estado do conhecimento, justifique o estudo e antecipe a abordagem utilizada. A introdução deve conduzir naturalmente aos objetivos.</w:t>
+          <w:rtl w:val="0"/>
+        </w:rPr>
+        <w:t xml:space="preserve">Movimentos de massa submarinos constituem mecanismos frequentes e altamente eficientes de transferência de sedimentos da plataforma continental e do talude para bacias oceânicas profundas, processo conhecido como </w:t>
+      </w:r>
+      <w:r>
+        <w:rPr>
+          <w:i w:val="1"/>
+          <w:iCs w:val="1"/>
+          <w:rtl w:val="0"/>
+        </w:rPr>
+        <w:t xml:space="preserve">sediment bypassing</w:t>
+      </w:r>
+      <w:r>
+        <w:rPr>
+          <w:rtl w:val="0"/>
+        </w:rPr>
+        <w:t xml:space="preserve"> (Hampton </w:t>
+      </w:r>
+      <w:r>
+        <w:rPr>
+          <w:i w:val="1"/>
+          <w:iCs w:val="1"/>
+          <w:rtl w:val="0"/>
+        </w:rPr>
+        <w:t xml:space="preserve">et al</w:t>
+      </w:r>
+      <w:r>
+        <w:rPr>
+          <w:rtl w:val="0"/>
+        </w:rPr>
+        <w:t xml:space="preserve">., 1996). Em um único evento, volumes expressivos de sedimento podem ser mobilizados e transportados por centenas de quilômetros, inclusive em taludes de baixa inclinação, entre 0,5° e 3° (Hampton </w:t>
+      </w:r>
+      <w:r>
+        <w:rPr>
+          <w:i w:val="1"/>
+          <w:iCs w:val="1"/>
+          <w:rtl w:val="0"/>
+        </w:rPr>
+        <w:t xml:space="preserve">et al</w:t>
+      </w:r>
+      <w:r>
+        <w:rPr>
+          <w:rtl w:val="0"/>
+        </w:rPr>
+        <w:t xml:space="preserve">., 1996).</w:t>
+      </w:r>
+    </w:p>
+    <w:p>
+      <w:pPr>
+        <w:spacing w:after="0" w:before="0" w:line="360" w:lineRule="auto"/>
+        <w:ind w:firstLine="709"/>
+        <w:jc w:val="both"/>
+        <w:rPr/>
+      </w:pPr>
+      <w:r>
+        <w:rPr>
+          <w:rtl w:val="0"/>
+        </w:rPr>
+        <w:t xml:space="preserve">A estabilidade do substrato marinho é controlada pela interação entre condições geológicas, tectônicas e oceanográficas, que regulam a atuação dos fatores condicionantes e desencadeadores de instabilidades em determinada área (Hampton </w:t>
+      </w:r>
+      <w:r>
+        <w:rPr>
+          <w:i w:val="1"/>
+          <w:iCs w:val="1"/>
+          <w:rtl w:val="0"/>
+        </w:rPr>
+        <w:t xml:space="preserve">et al</w:t>
+      </w:r>
+      <w:r>
+        <w:rPr>
+          <w:rtl w:val="0"/>
+        </w:rPr>
+        <w:t xml:space="preserve">., 1996). No Brasil, o estudo desses processos ganhou maior destaque a partir dos anos 2000, impulsionado pela expansão da exploração de petróleo em águas profundas e pelos potenciais impactos dos movimentos de massa sobre infraestruturas submarinas e campos petrolíferos (Kowsmann </w:t>
+      </w:r>
+      <w:r>
+        <w:rPr>
+          <w:i w:val="1"/>
+          <w:iCs w:val="1"/>
+          <w:rtl w:val="0"/>
+        </w:rPr>
+        <w:t xml:space="preserve">et al</w:t>
+      </w:r>
+      <w:r>
+        <w:rPr>
+          <w:rtl w:val="0"/>
+        </w:rPr>
+        <w:t xml:space="preserve">., 2015).</w:t>
+      </w:r>
+    </w:p>
+    <w:p>
+      <w:pPr>
+        <w:spacing w:after="0" w:before="0" w:line="360" w:lineRule="auto"/>
+        <w:ind w:firstLine="709"/>
+        <w:jc w:val="both"/>
+        <w:rPr/>
+      </w:pPr>
+      <w:r>
+        <w:rPr>
+          <w:rtl w:val="0"/>
+        </w:rPr>
+        <w:t xml:space="preserve">Nesse contexto, este trabalho propõe a caracterização de depósitos e complexos de movimentos de massa na porção norte da Bacia de Santos. A análise será baseada em parâmetros morfométricos e em critérios de classificação que consideram, </w:t>
+      </w:r>
+      <w:r>
+        <w:rPr>
+          <w:highlight w:val="yellow"/>
+          <w:rtl w:val="0"/>
+        </w:rPr>
+        <w:t xml:space="preserve">principalmente, o número de eventos envolvidos (Clare </w:t>
+      </w:r>
+      <w:r>
+        <w:rPr>
+          <w:i w:val="1"/>
+          <w:iCs w:val="1"/>
+          <w:highlight w:val="yellow"/>
+          <w:rtl w:val="0"/>
+        </w:rPr>
+        <w:t xml:space="preserve">et al</w:t>
+      </w:r>
+      <w:r>
+        <w:rPr>
+          <w:highlight w:val="yellow"/>
+          <w:rtl w:val="0"/>
+        </w:rPr>
+        <w:t xml:space="preserve">., 2018), a relação entre os depósitos e suas áreas-fonte (Moscardelli &amp; Wood, 2008), mecanismo gatilho (referencia a incluir) e o grau de confinamento dos depósitos (Gamboa &amp; Alves, 2016). Além disso, para uma porção da área de estudo, será estimada a espessura do pacote sedimentar potencialmente mobilizável em futuros eventos por meio da técnica </w:t>
+      </w:r>
+      <w:r>
+        <w:rPr>
+          <w:i w:val="1"/>
+          <w:iCs w:val="1"/>
+          <w:highlight w:val="yellow"/>
+          <w:rtl w:val="0"/>
+        </w:rPr>
+        <w:t xml:space="preserve">Horizontal-to-Vertical Spectral Ratio</w:t>
+      </w:r>
+      <w:r>
+        <w:rPr>
+          <w:highlight w:val="yellow"/>
+          <w:rtl w:val="0"/>
+        </w:rPr>
+        <w:t xml:space="preserve"> (HVSR) (Nakamura, 1989), utilizando dados obtidos por sismógrafos de fundo oceânico (</w:t>
+      </w:r>
+      <w:r>
+        <w:rPr>
+          <w:i w:val="1"/>
+          <w:iCs w:val="1"/>
+          <w:highlight w:val="yellow"/>
+          <w:rtl w:val="0"/>
+        </w:rPr>
+        <w:t xml:space="preserve">Ocean Bottom Seismometers</w:t>
+      </w:r>
+      <w:r>
+        <w:rPr>
+          <w:highlight w:val="yellow"/>
+          <w:rtl w:val="0"/>
+        </w:rPr>
+        <w:t xml:space="preserve"> — OBS). </w:t>
       </w:r>
       <w:r>
         <w:rPr>
@@ -1885,20 +2076,25 @@
     </w:p>
     <w:p>
       <w:pPr>
-        <w:spacing w:after="0" w:before="0" w:line="360" w:lineRule="auto"/>
-        <w:ind w:firstLine="709"/>
+        <w:spacing w:after="0" w:line="240" w:lineRule="auto"/>
         <w:jc w:val="both"/>
         <w:rPr/>
       </w:pPr>
       <w:r>
         <w:rPr>
-          <w:i w:val="1"/>
-          <w:iCs w:val="1"/>
-          <w:color w:val="595959"/>
-          <w:rtl w:val="0"/>
-        </w:rPr>
-        <w:t xml:space="preserve">Declare o resultado científico principal que o trabalho pretende alcançar.</w:t>
-      </w:r>
+          <w:rtl w:val="0"/>
+        </w:rPr>
+        <w:t xml:space="preserve">Caracterizar os depósitos de movimento de massa no talude continental na porção norte da Bacia de Santos</w:t>
+      </w:r>
+    </w:p>
+    <w:p>
+      <w:pPr>
+        <w:spacing w:after="0" w:line="240" w:lineRule="auto"/>
+        <w:jc w:val="both"/>
+        <w:rPr>
+          <w:rFonts w:ascii="Arial" w:cs="Arial" w:eastAsia="Arial" w:hAnsi="Arial"/>
+        </w:rPr>
+      </w:pPr>
       <w:r>
         <w:rPr>
           <w:rtl w:val="0"/>
@@ -1929,177 +2125,139 @@
     </w:p>
     <w:p>
       <w:pPr>
-        <w:keepNext w:val="0"/>
-        <w:keepLines w:val="0"/>
-        <w:pageBreakBefore w:val="0"/>
-        <w:widowControl w:val="1"/>
         <w:numPr>
           <w:ilvl w:val="0"/>
           <w:numId w:val="1"/>
         </w:numPr>
-        <w:pBdr>
-          <w:top w:space="0" w:sz="0" w:val="nil"/>
-          <w:left w:space="0" w:sz="0" w:val="nil"/>
-          <w:bottom w:space="0" w:sz="0" w:val="nil"/>
-          <w:right w:space="0" w:sz="0" w:val="nil"/>
-          <w:between w:space="0" w:sz="0" w:val="nil"/>
-        </w:pBdr>
-        <w:shd w:fill="auto" w:val="clear"/>
-        <w:spacing w:after="0" w:before="0" w:line="360" w:lineRule="auto"/>
-        <w:ind w:left="360" w:right="0" w:hanging="360"/>
-        <w:jc w:val="left"/>
+        <w:spacing w:after="0" w:line="240" w:lineRule="auto"/>
+        <w:ind w:left="720" w:hanging="360"/>
+        <w:jc w:val="both"/>
         <w:rPr>
           <w:rFonts w:ascii="Times New Roman" w:cs="Times New Roman" w:eastAsia="Times New Roman" w:hAnsi="Times New Roman"/>
         </w:rPr>
       </w:pPr>
       <w:r>
         <w:rPr>
-          <w:i w:val="1"/>
-          <w:iCs w:val="1"/>
-          <w:smallCaps w:val="0"/>
-          <w:strike w:val="0"/>
-          <w:color w:val="000000"/>
-          <w:u w:val="none"/>
-          <w:shd w:fill="auto" w:val="clear"/>
-          <w:vertAlign w:val="baseline"/>
-          <w:rtl w:val="0"/>
-        </w:rPr>
-        <w:t xml:space="preserve">Caracterizar as unidades geológicas da área de estudo.</w:t>
-      </w:r>
-      <w:r>
-        <w:rPr>
-          <w:rtl w:val="0"/>
-        </w:rPr>
-      </w:r>
-    </w:p>
-    <w:p>
-      <w:pPr>
-        <w:keepNext w:val="0"/>
-        <w:keepLines w:val="0"/>
-        <w:pageBreakBefore w:val="0"/>
-        <w:widowControl w:val="1"/>
+          <w:rtl w:val="0"/>
+        </w:rPr>
+        <w:t xml:space="preserve">Identificar e mapear os depósitos/complexos de movimento de massa na área de estudo;</w:t>
+      </w:r>
+      <w:r>
+        <w:rPr>
+          <w:rtl w:val="0"/>
+        </w:rPr>
+      </w:r>
+    </w:p>
+    <w:p>
+      <w:pPr>
         <w:numPr>
           <w:ilvl w:val="0"/>
           <w:numId w:val="1"/>
         </w:numPr>
-        <w:pBdr>
-          <w:top w:space="0" w:sz="0" w:val="nil"/>
-          <w:left w:space="0" w:sz="0" w:val="nil"/>
-          <w:bottom w:space="0" w:sz="0" w:val="nil"/>
-          <w:right w:space="0" w:sz="0" w:val="nil"/>
-          <w:between w:space="0" w:sz="0" w:val="nil"/>
-        </w:pBdr>
-        <w:shd w:fill="auto" w:val="clear"/>
-        <w:spacing w:after="0" w:before="0" w:line="360" w:lineRule="auto"/>
-        <w:ind w:left="360" w:right="0" w:hanging="360"/>
-        <w:jc w:val="left"/>
+        <w:spacing w:after="0" w:line="240" w:lineRule="auto"/>
+        <w:ind w:left="720" w:hanging="360"/>
+        <w:jc w:val="both"/>
         <w:rPr>
           <w:rFonts w:ascii="Times New Roman" w:cs="Times New Roman" w:eastAsia="Times New Roman" w:hAnsi="Times New Roman"/>
         </w:rPr>
       </w:pPr>
       <w:r>
         <w:rPr>
-          <w:i w:val="1"/>
-          <w:iCs w:val="1"/>
-          <w:smallCaps w:val="0"/>
-          <w:strike w:val="0"/>
-          <w:color w:val="000000"/>
-          <w:u w:val="none"/>
-          <w:shd w:fill="auto" w:val="clear"/>
-          <w:vertAlign w:val="baseline"/>
-          <w:rtl w:val="0"/>
-        </w:rPr>
-        <w:t xml:space="preserve">Descrever os procedimentos de campo, laboratório e gabinete.</w:t>
-      </w:r>
-      <w:r>
-        <w:rPr>
-          <w:rtl w:val="0"/>
-        </w:rPr>
-      </w:r>
-    </w:p>
-    <w:p>
-      <w:pPr>
-        <w:keepNext w:val="0"/>
-        <w:keepLines w:val="0"/>
-        <w:pageBreakBefore w:val="0"/>
-        <w:widowControl w:val="1"/>
+          <w:rtl w:val="0"/>
+        </w:rPr>
+        <w:t xml:space="preserve">Gerar superfícies batimétricas e superfícies de depósitos da área de estudo;</w:t>
+      </w:r>
+      <w:r>
+        <w:rPr>
+          <w:rtl w:val="0"/>
+        </w:rPr>
+      </w:r>
+    </w:p>
+    <w:p>
+      <w:pPr>
         <w:numPr>
           <w:ilvl w:val="0"/>
           <w:numId w:val="1"/>
         </w:numPr>
-        <w:pBdr>
-          <w:top w:space="0" w:sz="0" w:val="nil"/>
-          <w:left w:space="0" w:sz="0" w:val="nil"/>
-          <w:bottom w:space="0" w:sz="0" w:val="nil"/>
-          <w:right w:space="0" w:sz="0" w:val="nil"/>
-          <w:between w:space="0" w:sz="0" w:val="nil"/>
-        </w:pBdr>
-        <w:shd w:fill="auto" w:val="clear"/>
-        <w:spacing w:after="0" w:before="0" w:line="360" w:lineRule="auto"/>
-        <w:ind w:left="360" w:right="0" w:hanging="360"/>
-        <w:jc w:val="left"/>
+        <w:spacing w:after="0" w:line="240" w:lineRule="auto"/>
+        <w:ind w:left="720" w:hanging="360"/>
+        <w:jc w:val="both"/>
         <w:rPr>
           <w:rFonts w:ascii="Times New Roman" w:cs="Times New Roman" w:eastAsia="Times New Roman" w:hAnsi="Times New Roman"/>
         </w:rPr>
       </w:pPr>
       <w:r>
         <w:rPr>
-          <w:i w:val="1"/>
-          <w:iCs w:val="1"/>
-          <w:smallCaps w:val="0"/>
-          <w:strike w:val="0"/>
-          <w:color w:val="000000"/>
-          <w:u w:val="none"/>
-          <w:shd w:fill="auto" w:val="clear"/>
-          <w:vertAlign w:val="baseline"/>
-          <w:rtl w:val="0"/>
-        </w:rPr>
-        <w:t xml:space="preserve">Integrar e interpretar os dados obtidos.</w:t>
-      </w:r>
-      <w:r>
-        <w:rPr>
-          <w:rtl w:val="0"/>
-        </w:rPr>
-      </w:r>
-    </w:p>
-    <w:p>
-      <w:pPr>
-        <w:keepNext w:val="0"/>
-        <w:keepLines w:val="0"/>
-        <w:pageBreakBefore w:val="0"/>
-        <w:widowControl w:val="1"/>
+          <w:rtl w:val="0"/>
+        </w:rPr>
+        <w:t xml:space="preserve">Determinar a morfometria dos depósitos/complexos de movimentos de massa identificados;</w:t>
+      </w:r>
+      <w:r>
+        <w:rPr>
+          <w:rtl w:val="0"/>
+        </w:rPr>
+      </w:r>
+    </w:p>
+    <w:p>
+      <w:pPr>
         <w:numPr>
           <w:ilvl w:val="0"/>
           <w:numId w:val="1"/>
         </w:numPr>
-        <w:pBdr>
-          <w:top w:space="0" w:sz="0" w:val="nil"/>
-          <w:left w:space="0" w:sz="0" w:val="nil"/>
-          <w:bottom w:space="0" w:sz="0" w:val="nil"/>
-          <w:right w:space="0" w:sz="0" w:val="nil"/>
-          <w:between w:space="0" w:sz="0" w:val="nil"/>
-        </w:pBdr>
-        <w:shd w:fill="auto" w:val="clear"/>
-        <w:spacing w:after="0" w:before="0" w:line="360" w:lineRule="auto"/>
-        <w:ind w:left="360" w:right="0" w:hanging="360"/>
-        <w:jc w:val="left"/>
+        <w:spacing w:after="0" w:line="240" w:lineRule="auto"/>
+        <w:ind w:left="720" w:hanging="360"/>
+        <w:jc w:val="both"/>
         <w:rPr>
           <w:rFonts w:ascii="Times New Roman" w:cs="Times New Roman" w:eastAsia="Times New Roman" w:hAnsi="Times New Roman"/>
         </w:rPr>
       </w:pPr>
       <w:r>
         <w:rPr>
-          <w:i w:val="1"/>
-          <w:iCs w:val="1"/>
-          <w:smallCaps w:val="0"/>
-          <w:strike w:val="0"/>
-          <w:color w:val="000000"/>
-          <w:u w:val="none"/>
-          <w:shd w:fill="auto" w:val="clear"/>
-          <w:vertAlign w:val="baseline"/>
-          <w:rtl w:val="0"/>
-        </w:rPr>
-        <w:t xml:space="preserve">Discutir as implicações geológicas dos resultados.</w:t>
+          <w:rtl w:val="0"/>
+        </w:rPr>
+        <w:t xml:space="preserve">Classificar os depósitos/complexos de movimentos de massa.</w:t>
+      </w:r>
+    </w:p>
+    <w:p>
+      <w:pPr>
+        <w:numPr>
+          <w:ilvl w:val="0"/>
+          <w:numId w:val="1"/>
+        </w:numPr>
+        <w:spacing w:after="0" w:line="240" w:lineRule="auto"/>
+        <w:ind w:left="720" w:hanging="360"/>
+        <w:jc w:val="both"/>
+        <w:rPr>
+          <w:highlight w:val="yellow"/>
+        </w:rPr>
+      </w:pPr>
+      <w:r>
+        <w:rPr>
+          <w:highlight w:val="yellow"/>
+          <w:rtl w:val="0"/>
+        </w:rPr>
+        <w:t xml:space="preserve">Correlacionar os depósitos/complexos com idade de sedimentos datados na área de estudo </w:t>
+      </w:r>
+    </w:p>
+    <w:p>
+      <w:pPr>
+        <w:numPr>
+          <w:ilvl w:val="0"/>
+          <w:numId w:val="1"/>
+        </w:numPr>
+        <w:spacing w:after="0" w:line="240" w:lineRule="auto"/>
+        <w:ind w:left="720" w:hanging="360"/>
+        <w:jc w:val="both"/>
+        <w:rPr>
+          <w:highlight w:val="yellow"/>
+        </w:rPr>
+      </w:pPr>
+      <w:r>
+        <w:rPr>
+          <w:highlight w:val="yellow"/>
+          <w:rtl w:val="0"/>
+        </w:rPr>
+        <w:t xml:space="preserve">Obter a espessura do pacote sedimentar que pode ser mobilizado por novos eventos através da Técnica HVSR</w:t>
       </w:r>
       <w:r>
         <w:rPr>
@@ -2633,7 +2791,7 @@
       <w:pPr>
         <w:spacing w:after="0" w:before="0" w:line="360" w:lineRule="auto"/>
         <w:ind w:firstLine="709"/>
-        <w:jc w:val="both"/>
+        <w:jc w:val="center"/>
         <w:rPr/>
       </w:pPr>
       <w:r>
@@ -2646,7 +2804,7 @@
       <w:pPr>
         <w:spacing w:after="0" w:before="0" w:line="360" w:lineRule="auto"/>
         <w:ind w:firstLine="709"/>
-        <w:jc w:val="both"/>
+        <w:jc w:val="center"/>
         <w:rPr/>
       </w:pPr>
       <w:r>
@@ -2655,12 +2813,12 @@
           <wp:inline distB="114300" distT="114300" distL="114300" distR="114300">
             <wp:extent cx="4690796" cy="4706302"/>
             <wp:effectExtent b="0" l="0" r="0" t="0"/>
-            <wp:docPr id="2" name="image1.png"/>
+            <wp:docPr id="4" name="image4.png"/>
             <a:graphic>
               <a:graphicData uri="http://schemas.openxmlformats.org/drawingml/2006/picture">
                 <pic:pic>
                   <pic:nvPicPr>
-                    <pic:cNvPr id="0" name="image1.png"/>
+                    <pic:cNvPr id="0" name="image4.png"/>
                     <pic:cNvPicPr preferRelativeResize="0"/>
                   </pic:nvPicPr>
                   <pic:blipFill>
@@ -2712,7 +2870,7 @@
     <w:p>
       <w:pPr>
         <w:spacing w:after="0" w:before="0" w:line="360" w:lineRule="auto"/>
-        <w:ind w:firstLine="709"/>
+        <w:ind w:left="0" w:firstLine="709"/>
         <w:jc w:val="both"/>
         <w:rPr/>
       </w:pPr>
@@ -2743,6 +2901,250 @@
     </w:p>
     <w:p>
       <w:pPr>
+        <w:keepNext w:val="0"/>
+        <w:keepLines w:val="0"/>
+        <w:spacing w:after="0" w:before="0" w:line="360" w:lineRule="auto"/>
+        <w:ind w:firstLine="709"/>
+        <w:jc w:val="both"/>
+        <w:rPr/>
+      </w:pPr>
+      <w:r>
+        <w:rPr>
+          <w:rtl w:val="0"/>
+        </w:rPr>
+        <w:t xml:space="preserve">2.2.2 Formas externas das fácies sísmicas</w:t>
+      </w:r>
+    </w:p>
+    <w:p>
+      <w:pPr>
+        <w:spacing w:after="0" w:before="0" w:line="360" w:lineRule="auto"/>
+        <w:ind w:firstLine="709"/>
+        <w:jc w:val="both"/>
+        <w:rPr/>
+      </w:pPr>
+      <w:r>
+        <w:rPr>
+          <w:rtl w:val="0"/>
+        </w:rPr>
+        <w:t xml:space="preserve">A geometria externa das fácies sísmicas (Figura 2) auxilia na interpretação dos processos deposicionais e da relação dos depósitos com o relevo preexistente. As formas mais comuns incluem geometrias em lençol, montiformas e preenchimentos de relevo negativo (Mitchum Jr. et al., 1977).</w:t>
+      </w:r>
+    </w:p>
+    <w:p>
+      <w:pPr>
+        <w:spacing w:after="0" w:before="0" w:line="360" w:lineRule="auto"/>
+        <w:ind w:firstLine="709"/>
+        <w:jc w:val="center"/>
+        <w:rPr/>
+      </w:pPr>
+      <w:r>
+        <w:rPr>
+          <w:rtl w:val="0"/>
+        </w:rPr>
+        <w:t xml:space="preserve">As fácies em lençol ou </w:t>
+      </w:r>
+      <w:r>
+        <w:rPr>
+          <w:i w:val="1"/>
+          <w:iCs w:val="1"/>
+          <w:rtl w:val="0"/>
+        </w:rPr>
+        <w:t xml:space="preserve">drapes</w:t>
+      </w:r>
+      <w:r>
+        <w:rPr>
+          <w:rtl w:val="0"/>
+        </w:rPr>
+        <w:t xml:space="preserve"> correspondem a pacotes tabulares, geralmente compostos por refletores paralelos ou subparalelos, que recobrem a topografia subjacente. Já as montiformas apresentam relevo positivo em relação aos estratos adjacentes e podem estar associadas a lobos deposicionais, contornitos e depósitos gravitacionais. Em especial, depósitos de fluxo de detritos podem formar corpos lobados, com margens relativamente íngremes e aspecto montiforme em seção sísmica (Posamentier &amp; Kolla, 2003).</w:t>
+      </w:r>
+    </w:p>
+    <w:p>
+      <w:pPr>
+        <w:spacing w:after="0" w:before="0" w:line="360" w:lineRule="auto"/>
+        <w:ind w:firstLine="709"/>
+        <w:jc w:val="center"/>
+        <w:rPr/>
+      </w:pPr>
+      <w:r>
+        <w:rPr/>
+        <w:drawing>
+          <wp:inline distB="114300" distT="114300" distL="114300" distR="114300">
+            <wp:extent cx="5759775" cy="1295400"/>
+            <wp:effectExtent b="0" l="0" r="0" t="0"/>
+            <wp:docPr id="1" name="image1.png"/>
+            <a:graphic>
+              <a:graphicData uri="http://schemas.openxmlformats.org/drawingml/2006/picture">
+                <pic:pic>
+                  <pic:nvPicPr>
+                    <pic:cNvPr id="0" name="image1.png"/>
+                    <pic:cNvPicPr preferRelativeResize="0"/>
+                  </pic:nvPicPr>
+                  <pic:blipFill>
+                    <a:blip r:embed="rId8"/>
+                    <a:srcRect b="0" l="0" r="0" t="0"/>
+                    <a:stretch>
+                      <a:fillRect/>
+                    </a:stretch>
+                  </pic:blipFill>
+                  <pic:spPr>
+                    <a:xfrm>
+                      <a:off x="0" y="0"/>
+                      <a:ext cx="5759775" cy="1295400"/>
+                    </a:xfrm>
+                    <a:prstGeom prst="rect"/>
+                    <a:ln/>
+                  </pic:spPr>
+                </pic:pic>
+              </a:graphicData>
+            </a:graphic>
+          </wp:inline>
+        </w:drawing>
+      </w:r>
+      <w:r>
+        <w:rPr>
+          <w:rtl w:val="0"/>
+        </w:rPr>
+      </w:r>
+    </w:p>
+    <w:p>
+      <w:pPr>
+        <w:spacing w:after="60" w:before="0" w:line="276" w:lineRule="auto"/>
+        <w:ind w:firstLine="0"/>
+        <w:jc w:val="center"/>
+        <w:rPr>
+          <w:sz w:val="20"/>
+          <w:szCs w:val="20"/>
+        </w:rPr>
+      </w:pPr>
+      <w:r>
+        <w:rPr>
+          <w:sz w:val="20"/>
+          <w:szCs w:val="20"/>
+          <w:rtl w:val="0"/>
+        </w:rPr>
+        <w:t xml:space="preserve">Figura 2 — Formas externas das fácies sísmicas: (A) lençóis ondulados ou drapes; (B) montiformas; (C) geometria de preenchimento</w:t>
+      </w:r>
+    </w:p>
+    <w:p>
+      <w:pPr>
+        <w:spacing w:after="60" w:before="0" w:line="276" w:lineRule="auto"/>
+        <w:ind w:firstLine="0"/>
+        <w:jc w:val="center"/>
+        <w:rPr>
+          <w:sz w:val="20"/>
+          <w:szCs w:val="20"/>
+        </w:rPr>
+      </w:pPr>
+      <w:r>
+        <w:rPr>
+          <w:sz w:val="20"/>
+          <w:szCs w:val="20"/>
+          <w:rtl w:val="0"/>
+        </w:rPr>
+        <w:t xml:space="preserve">Fonte: adaptado de Mitchum Jr. et al. (1977).</w:t>
+      </w:r>
+    </w:p>
+    <w:p>
+      <w:pPr>
+        <w:spacing w:after="0" w:before="0" w:line="360" w:lineRule="auto"/>
+        <w:ind w:firstLine="709"/>
+        <w:jc w:val="center"/>
+        <w:rPr/>
+      </w:pPr>
+      <w:r>
+        <w:rPr>
+          <w:rtl w:val="0"/>
+        </w:rPr>
+        <w:t xml:space="preserve">As geometrias de preenchimento (Figura 3) representam depósitos acumulados em feições negativas, como canais, vales, ravinas ou depressões do assoalho marinho. Esses corpos podem apresentar base erosiva, marcada por truncamentos ou incisões, e preenchimento interno concordante, caótico ou transparente. Em ambientes profundos, depósitos gravitacionais podem ocorrer tanto como preenchimentos canalizados quanto como lobos e lençóis, frequentemente exibindo fácies sísmicas caóticas a transparentes e superfícies basais erosivas (Posamentier &amp; Kolla, 2003). Dessa forma, a identificação dos limites laterais, da geometria externa e das reflexões internas é essencial para distinguir depósitos gravitacionais de outros tipos de preenchimento sedimentar (Mitchum Jr. et al., 1977).</w:t>
+      </w:r>
+    </w:p>
+    <w:p>
+      <w:pPr>
+        <w:spacing w:after="0" w:before="0" w:line="360" w:lineRule="auto"/>
+        <w:ind w:firstLine="709"/>
+        <w:jc w:val="center"/>
+        <w:rPr/>
+      </w:pPr>
+      <w:r>
+        <w:rPr/>
+        <w:drawing>
+          <wp:inline distB="114300" distT="114300" distL="114300" distR="114300">
+            <wp:extent cx="5759775" cy="2959100"/>
+            <wp:effectExtent b="0" l="0" r="0" t="0"/>
+            <wp:docPr id="3" name="image3.png"/>
+            <a:graphic>
+              <a:graphicData uri="http://schemas.openxmlformats.org/drawingml/2006/picture">
+                <pic:pic>
+                  <pic:nvPicPr>
+                    <pic:cNvPr id="0" name="image3.png"/>
+                    <pic:cNvPicPr preferRelativeResize="0"/>
+                  </pic:nvPicPr>
+                  <pic:blipFill>
+                    <a:blip r:embed="rId9"/>
+                    <a:srcRect b="0" l="0" r="0" t="0"/>
+                    <a:stretch>
+                      <a:fillRect/>
+                    </a:stretch>
+                  </pic:blipFill>
+                  <pic:spPr>
+                    <a:xfrm>
+                      <a:off x="0" y="0"/>
+                      <a:ext cx="5759775" cy="2959100"/>
+                    </a:xfrm>
+                    <a:prstGeom prst="rect"/>
+                    <a:ln/>
+                  </pic:spPr>
+                </pic:pic>
+              </a:graphicData>
+            </a:graphic>
+          </wp:inline>
+        </w:drawing>
+      </w:r>
+      <w:r>
+        <w:rPr>
+          <w:rtl w:val="0"/>
+        </w:rPr>
+      </w:r>
+    </w:p>
+    <w:p>
+      <w:pPr>
+        <w:spacing w:after="60" w:before="0" w:line="276" w:lineRule="auto"/>
+        <w:ind w:firstLine="0"/>
+        <w:jc w:val="center"/>
+        <w:rPr>
+          <w:sz w:val="20"/>
+          <w:szCs w:val="20"/>
+        </w:rPr>
+      </w:pPr>
+      <w:r>
+        <w:rPr>
+          <w:sz w:val="20"/>
+          <w:szCs w:val="20"/>
+          <w:rtl w:val="0"/>
+        </w:rPr>
+        <w:t xml:space="preserve">Figura 3 — Padrões de configuração interna dos refletores em geometrias de preenchimento: (A) em onlap; (B) progradante; (C) montiforma “onlapante”; (D) caótico; (E) divergente; (F) complexo</w:t>
+      </w:r>
+    </w:p>
+    <w:p>
+      <w:pPr>
+        <w:spacing w:after="60" w:before="0" w:line="276" w:lineRule="auto"/>
+        <w:ind w:firstLine="0"/>
+        <w:jc w:val="center"/>
+        <w:rPr>
+          <w:sz w:val="20"/>
+          <w:szCs w:val="20"/>
+        </w:rPr>
+      </w:pPr>
+      <w:r>
+        <w:rPr>
+          <w:sz w:val="20"/>
+          <w:szCs w:val="20"/>
+          <w:rtl w:val="0"/>
+        </w:rPr>
+        <w:t xml:space="preserve">Fonte: adaptado de Mitchum Jr. et al. (1977).</w:t>
+      </w:r>
+    </w:p>
+    <w:p>
+      <w:pPr>
         <w:pStyle w:val="Heading2"/>
         <w:spacing w:after="0" w:lineRule="auto"/>
         <w:jc w:val="both"/>
@@ -2754,7 +3156,7 @@
         <w:rPr>
           <w:rtl w:val="0"/>
         </w:rPr>
-        <w:t xml:space="preserve">2.3 Geologia local</w:t>
+        <w:t xml:space="preserve">2.3 Movimentos de Massa </w:t>
       </w:r>
     </w:p>
     <w:p>
@@ -2793,6 +3195,16 @@
           <w:rtl w:val="0"/>
         </w:rPr>
         <w:t xml:space="preserve">3 ÁREA DE ESTUDO</w:t>
+      </w:r>
+    </w:p>
+    <w:p>
+      <w:pPr>
+        <w:rPr/>
+      </w:pPr>
+      <w:r>
+        <w:rPr>
+          <w:rtl w:val="0"/>
+        </w:rPr>
       </w:r>
     </w:p>
     <w:p>
@@ -3660,7 +4072,7 @@
           <w:szCs w:val="20"/>
           <w:rtl w:val="0"/>
         </w:rPr>
-        <w:t xml:space="preserve">Figura 2 — Título descritivo da figura</w:t>
+        <w:t xml:space="preserve">Figura 4 — Título descritivo da figura</w:t>
       </w:r>
       <w:r>
         <w:rPr>
@@ -3963,29 +4375,176 @@
     </w:p>
     <w:p>
       <w:pPr>
-        <w:spacing w:after="120" w:before="0" w:line="240" w:lineRule="auto"/>
-        <w:ind w:left="0" w:firstLine="0"/>
-        <w:jc w:val="left"/>
-        <w:rPr>
-          <w:i w:val="1"/>
-          <w:iCs w:val="1"/>
-          <w:color w:val="595959"/>
-        </w:rPr>
-      </w:pPr>
-      <w:r>
-        <w:rPr>
-          <w:i w:val="1"/>
-          <w:iCs w:val="1"/>
-          <w:color w:val="595959"/>
-          <w:rtl w:val="0"/>
-        </w:rPr>
-        <w:t xml:space="preserve">ALVARENGA, R. S. Análise sismoestratigráfica de bacias rifte: definição de sismofácies e arcabouço tectono-estratigráfico. 2016. Tese (Doutorado em Geociências) — Universidade Federal do Rio Grande do Sul, Porto Alegre, 2016.</w:t>
-      </w:r>
-    </w:p>
-    <w:p>
-      <w:pPr>
         <w:spacing w:after="240" w:before="0" w:line="240" w:lineRule="auto"/>
-        <w:ind w:left="0" w:firstLine="0"/>
+        <w:ind w:firstLine="0"/>
+        <w:jc w:val="left"/>
+        <w:rPr>
+          <w:i w:val="1"/>
+          <w:iCs w:val="1"/>
+          <w:color w:val="595959"/>
+        </w:rPr>
+      </w:pPr>
+      <w:r>
+        <w:rPr>
+          <w:i w:val="1"/>
+          <w:iCs w:val="1"/>
+          <w:color w:val="595959"/>
+          <w:rtl w:val="0"/>
+        </w:rPr>
+        <w:t xml:space="preserve">ALBERTON, M. E. et al. Identificação de potenciais depósitos de fosforita no Terraço do Rio Grande, Bacia de Pelotas. Pesquisas em Geociências, v. 51, n. 4, 2024. DOI: </w:t>
+      </w:r>
+      <w:hyperlink r:id="rId10">
+        <w:r>
+          <w:rPr>
+            <w:i w:val="1"/>
+            <w:iCs w:val="1"/>
+            <w:color w:val="1d4d1d"/>
+            <w:u w:val="single"/>
+            <w:rtl w:val="0"/>
+          </w:rPr>
+          <w:t xml:space="preserve">https://doi.org/10.22456/1807-9806.144416</w:t>
+        </w:r>
+      </w:hyperlink>
+      <w:r>
+        <w:rPr>
+          <w:i w:val="1"/>
+          <w:iCs w:val="1"/>
+          <w:color w:val="595959"/>
+          <w:rtl w:val="0"/>
+        </w:rPr>
+        <w:t xml:space="preserve">.</w:t>
+      </w:r>
+    </w:p>
+    <w:p>
+      <w:pPr>
+        <w:spacing w:after="240" w:before="0" w:line="240" w:lineRule="auto"/>
+        <w:ind w:firstLine="0"/>
+        <w:jc w:val="left"/>
+        <w:rPr>
+          <w:i w:val="1"/>
+          <w:iCs w:val="1"/>
+          <w:color w:val="595959"/>
+        </w:rPr>
+      </w:pPr>
+      <w:r>
+        <w:rPr>
+          <w:i w:val="1"/>
+          <w:iCs w:val="1"/>
+          <w:color w:val="595959"/>
+          <w:rtl w:val="0"/>
+        </w:rPr>
+        <w:t xml:space="preserve">ALVARENGA, R. S. Análise sismoestratigráfica de bacias rifte: definição de sismofácies e arcabouço tectono-estratigráfico. 2016. 179 f. Tese (Doutorado em Geociências) — Universidade Federal do Rio Grande do Sul, Porto Alegre, 2016. Disponível em: </w:t>
+      </w:r>
+      <w:hyperlink r:id="rId11">
+        <w:r>
+          <w:rPr>
+            <w:i w:val="1"/>
+            <w:iCs w:val="1"/>
+            <w:color w:val="1d4d1d"/>
+            <w:u w:val="single"/>
+            <w:rtl w:val="0"/>
+          </w:rPr>
+          <w:t xml:space="preserve">https://lume.ufrgs.br/handle/10183/139096</w:t>
+        </w:r>
+      </w:hyperlink>
+      <w:r>
+        <w:rPr>
+          <w:i w:val="1"/>
+          <w:iCs w:val="1"/>
+          <w:color w:val="595959"/>
+          <w:rtl w:val="0"/>
+        </w:rPr>
+        <w:t xml:space="preserve">. Acesso em: 8 out. 2025.</w:t>
+      </w:r>
+    </w:p>
+    <w:p>
+      <w:pPr>
+        <w:spacing w:after="240" w:before="0" w:line="240" w:lineRule="auto"/>
+        <w:ind w:firstLine="0"/>
+        <w:jc w:val="left"/>
+        <w:rPr>
+          <w:i w:val="1"/>
+          <w:iCs w:val="1"/>
+          <w:color w:val="595959"/>
+        </w:rPr>
+      </w:pPr>
+      <w:r>
+        <w:rPr>
+          <w:i w:val="1"/>
+          <w:iCs w:val="1"/>
+          <w:color w:val="595959"/>
+          <w:rtl w:val="0"/>
+        </w:rPr>
+        <w:t xml:space="preserve">ASSUMPÇÃO, M. et al. Intraplate seismicity in Brazil. In: TALWANI, P. (org.). Intraplate seismicity. Cambridge: Cambridge University Press, 2014. p. 50–71. DOI: </w:t>
+      </w:r>
+      <w:hyperlink r:id="rId12">
+        <w:r>
+          <w:rPr>
+            <w:i w:val="1"/>
+            <w:iCs w:val="1"/>
+            <w:color w:val="1d4d1d"/>
+            <w:u w:val="single"/>
+            <w:rtl w:val="0"/>
+          </w:rPr>
+          <w:t xml:space="preserve">https://doi.org/10.1017/CBO9781139628921.004</w:t>
+        </w:r>
+      </w:hyperlink>
+      <w:r>
+        <w:rPr>
+          <w:i w:val="1"/>
+          <w:iCs w:val="1"/>
+          <w:color w:val="595959"/>
+          <w:rtl w:val="0"/>
+        </w:rPr>
+        <w:t xml:space="preserve">.</w:t>
+      </w:r>
+    </w:p>
+    <w:p>
+      <w:pPr>
+        <w:spacing w:after="240" w:before="0" w:line="240" w:lineRule="auto"/>
+        <w:ind w:firstLine="0"/>
+        <w:jc w:val="left"/>
+        <w:rPr>
+          <w:i w:val="1"/>
+          <w:iCs w:val="1"/>
+          <w:color w:val="595959"/>
+        </w:rPr>
+      </w:pPr>
+      <w:r>
+        <w:rPr>
+          <w:i w:val="1"/>
+          <w:iCs w:val="1"/>
+          <w:color w:val="595959"/>
+          <w:rtl w:val="0"/>
+        </w:rPr>
+        <w:t xml:space="preserve">BORGES, R. G.; LIMA, A. C.; KOWSMANN, R. O. Áreas propensas a escorregamentos no talude continental. In: KOWSMANN, R. O. (org.). Geologia e geomorfologia. Rio de Janeiro: Elsevier, 2015. p. 99–136. DOI: </w:t>
+      </w:r>
+      <w:hyperlink r:id="rId13">
+        <w:r>
+          <w:rPr>
+            <w:i w:val="1"/>
+            <w:iCs w:val="1"/>
+            <w:color w:val="1d4d1d"/>
+            <w:u w:val="single"/>
+            <w:rtl w:val="0"/>
+          </w:rPr>
+          <w:t xml:space="preserve">https://doi.org/10.1016/B978-85-352-6937-6.50013-6</w:t>
+        </w:r>
+      </w:hyperlink>
+      <w:r>
+        <w:rPr>
+          <w:i w:val="1"/>
+          <w:iCs w:val="1"/>
+          <w:color w:val="595959"/>
+          <w:rtl w:val="0"/>
+        </w:rPr>
+        <w:t xml:space="preserve">.</w:t>
+      </w:r>
+    </w:p>
+    <w:p>
+      <w:pPr>
+        <w:spacing w:after="240" w:before="0" w:line="240" w:lineRule="auto"/>
+        <w:ind w:firstLine="0"/>
         <w:jc w:val="left"/>
         <w:rPr>
           <w:i w:val="1"/>
@@ -4005,197 +4564,1247 @@
     </w:p>
     <w:p>
       <w:pPr>
-        <w:spacing w:after="120" w:before="0" w:line="240" w:lineRule="auto"/>
-        <w:ind w:left="0" w:firstLine="0"/>
-        <w:jc w:val="left"/>
-        <w:rPr>
-          <w:i w:val="1"/>
-          <w:iCs w:val="1"/>
-          <w:color w:val="595959"/>
-        </w:rPr>
-      </w:pPr>
-      <w:r>
-        <w:rPr>
-          <w:i w:val="1"/>
-          <w:iCs w:val="1"/>
-          <w:color w:val="595959"/>
-          <w:rtl w:val="0"/>
-        </w:rPr>
-        <w:t xml:space="preserve">CARDONA, S. et al. Fabric development and pore-throat reduction in a mass-transport deposit in the Jubilee Gas Field, Eastern Gulf of Mexico: consequences for the sealing capacity of MTDs. In: LAMARCHE, G. et al. (org.). Submarine mass movements and their consequences. Cham: Springer, 2016. p. 27–37. DOI: 10.1007/978-3-319-20979-1_3.</w:t>
-      </w:r>
-    </w:p>
-    <w:p>
-      <w:pPr>
-        <w:spacing w:after="120" w:before="0" w:line="240" w:lineRule="auto"/>
-        <w:ind w:left="0" w:firstLine="0"/>
-        <w:jc w:val="left"/>
-        <w:rPr>
-          <w:i w:val="1"/>
-          <w:iCs w:val="1"/>
-          <w:color w:val="595959"/>
-        </w:rPr>
-      </w:pPr>
-      <w:r>
-        <w:rPr>
-          <w:i w:val="1"/>
-          <w:iCs w:val="1"/>
-          <w:color w:val="595959"/>
-          <w:rtl w:val="0"/>
-        </w:rPr>
-        <w:t xml:space="preserve">CHOPRA, S. &amp; MARFURT, K. J. Seismic attributes for prospect identification and reservoir characterization. Tulsa: Society of Exploration Geophysicists; European Association of Geoscientists and Engineers, 2007. (Geophysical Developments, v. 11). DOI: 10.1190/1.9781560801900.</w:t>
-      </w:r>
-    </w:p>
-    <w:p>
-      <w:pPr>
-        <w:spacing w:after="120" w:before="0" w:line="240" w:lineRule="auto"/>
-        <w:ind w:left="0" w:firstLine="0"/>
-        <w:jc w:val="left"/>
-        <w:rPr>
-          <w:i w:val="1"/>
-          <w:iCs w:val="1"/>
-          <w:color w:val="595959"/>
-        </w:rPr>
-      </w:pPr>
-      <w:r>
-        <w:rPr>
-          <w:i w:val="1"/>
-          <w:iCs w:val="1"/>
-          <w:color w:val="595959"/>
-          <w:rtl w:val="0"/>
-        </w:rPr>
-        <w:t xml:space="preserve">CLARE, M. A. et al. A consistent global approach for the morphometric characterization of subaqueous landslides. Geological Society, London, Special Publications, v. 477, p. 455–477, 2018. DOI: 10.1144/SP477.15.</w:t>
-      </w:r>
-    </w:p>
-    <w:p>
-      <w:pPr>
-        <w:spacing w:after="120" w:before="0" w:line="240" w:lineRule="auto"/>
-        <w:ind w:left="0" w:firstLine="0"/>
-        <w:jc w:val="left"/>
-        <w:rPr>
-          <w:i w:val="1"/>
-          <w:iCs w:val="1"/>
-          <w:color w:val="595959"/>
-        </w:rPr>
-      </w:pPr>
-      <w:r>
-        <w:rPr>
-          <w:i w:val="1"/>
-          <w:iCs w:val="1"/>
-          <w:color w:val="595959"/>
-          <w:rtl w:val="0"/>
-        </w:rPr>
-        <w:t xml:space="preserve">KEAREY, P. et al. Geofísica de exploração. São Paulo: Oficina de Textos, 2009.</w:t>
-      </w:r>
-    </w:p>
-    <w:p>
-      <w:pPr>
-        <w:spacing w:after="120" w:before="0" w:line="240" w:lineRule="auto"/>
-        <w:ind w:left="0" w:firstLine="0"/>
-        <w:jc w:val="left"/>
-        <w:rPr>
-          <w:i w:val="1"/>
-          <w:iCs w:val="1"/>
-          <w:color w:val="595959"/>
-        </w:rPr>
-      </w:pPr>
-      <w:r>
-        <w:rPr>
-          <w:i w:val="1"/>
-          <w:iCs w:val="1"/>
-          <w:color w:val="595959"/>
-          <w:rtl w:val="0"/>
-        </w:rPr>
-        <w:t xml:space="preserve">KNELLER, B. et al. Mass-transport and slope accommodation: implications for turbidite sandstone reservoirs. AAPG Bulletin, v. 100, n. 2, p. 213–235, 2016. DOI: 10.1306/09011514210.</w:t>
-      </w:r>
-    </w:p>
-    <w:p>
-      <w:pPr>
-        <w:spacing w:after="120" w:before="0" w:line="240" w:lineRule="auto"/>
-        <w:ind w:left="0" w:firstLine="0"/>
-        <w:jc w:val="left"/>
-        <w:rPr>
-          <w:i w:val="1"/>
-          <w:iCs w:val="1"/>
-          <w:color w:val="595959"/>
-        </w:rPr>
-      </w:pPr>
-      <w:r>
-        <w:rPr>
-          <w:i w:val="1"/>
-          <w:iCs w:val="1"/>
-          <w:color w:val="595959"/>
-          <w:rtl w:val="0"/>
-        </w:rPr>
-        <w:t xml:space="preserve">MECKEL III, L. D. Reservoir characteristics and classification of sand-prone submarine mass-transport deposits. In: SHIPP, R. C. et al. (org.). Mass-transport deposits in deepwater settings. Tulsa: SEPM Society for Sedimentary Geology, 2011. p. 423–452. (SEPM Special Publication, v. 96).</w:t>
-      </w:r>
-    </w:p>
-    <w:p>
-      <w:pPr>
-        <w:spacing w:after="120" w:before="0" w:line="240" w:lineRule="auto"/>
-        <w:ind w:left="0" w:firstLine="0"/>
-        <w:jc w:val="left"/>
-        <w:rPr>
-          <w:i w:val="1"/>
-          <w:iCs w:val="1"/>
-          <w:color w:val="595959"/>
-        </w:rPr>
-      </w:pPr>
-      <w:r>
-        <w:rPr>
-          <w:i w:val="1"/>
-          <w:iCs w:val="1"/>
-          <w:color w:val="595959"/>
-          <w:rtl w:val="0"/>
-        </w:rPr>
-        <w:t xml:space="preserve">MENESES, A. R. dos S. Estudo teórico de atributos sísmicos de reflexão. 2010. Trabalho de Graduação — Universidade Federal da Bahia, Salvador, 2010.</w:t>
-      </w:r>
-    </w:p>
-    <w:p>
-      <w:pPr>
-        <w:spacing w:after="120" w:before="0" w:line="240" w:lineRule="auto"/>
-        <w:ind w:left="0" w:firstLine="0"/>
-        <w:jc w:val="left"/>
-        <w:rPr>
-          <w:i w:val="1"/>
-          <w:iCs w:val="1"/>
-          <w:color w:val="595959"/>
-        </w:rPr>
-      </w:pPr>
-      <w:r>
-        <w:rPr>
-          <w:i w:val="1"/>
-          <w:iCs w:val="1"/>
-          <w:color w:val="595959"/>
-          <w:rtl w:val="0"/>
-        </w:rPr>
-        <w:t xml:space="preserve">MITCHUM JR., R. M. et al. Seismic stratigraphy and global changes of sea level, part 6: stratigraphic interpretation of seismic reflection patterns in depositional sequences. In: PAYTON, C. E. (org.). Seismic stratigraphy: applications to hydrocarbon exploration. Tulsa: American Association of Petroleum Geologists, 1977. p. 117–133. (AAPG Memoir, v. 26). DOI: 10.1306/M26490C8.</w:t>
-      </w:r>
-    </w:p>
-    <w:p>
-      <w:pPr>
-        <w:spacing w:after="120" w:before="0" w:line="240" w:lineRule="auto"/>
-        <w:ind w:left="0" w:firstLine="0"/>
-        <w:jc w:val="left"/>
-        <w:rPr>
-          <w:i w:val="1"/>
-          <w:iCs w:val="1"/>
-          <w:color w:val="595959"/>
-        </w:rPr>
-      </w:pPr>
-      <w:r>
-        <w:rPr>
-          <w:i w:val="1"/>
-          <w:iCs w:val="1"/>
-          <w:color w:val="595959"/>
-          <w:rtl w:val="0"/>
-        </w:rPr>
-        <w:t xml:space="preserve">POPE, E. L. et al. Which earthquakes trigger damaging submarine mass movements: insights from a global record of submarine cable breaks? Marine Geology, v. 384, p. 131–146, 2016. DOI: 10.1016/j.margeo.2016.01.009.</w:t>
-      </w:r>
-    </w:p>
-    <w:p>
-      <w:pPr>
-        <w:spacing w:after="120" w:before="0" w:line="240" w:lineRule="auto"/>
-        <w:ind w:left="0" w:firstLine="0"/>
+        <w:spacing w:after="240" w:before="0" w:line="240" w:lineRule="auto"/>
+        <w:ind w:firstLine="0"/>
+        <w:jc w:val="left"/>
+        <w:rPr>
+          <w:i w:val="1"/>
+          <w:iCs w:val="1"/>
+          <w:color w:val="595959"/>
+        </w:rPr>
+      </w:pPr>
+      <w:r>
+        <w:rPr>
+          <w:i w:val="1"/>
+          <w:iCs w:val="1"/>
+          <w:color w:val="595959"/>
+          <w:rtl w:val="0"/>
+        </w:rPr>
+        <w:t xml:space="preserve">BULHÕES, E. &amp; AMORIM, W. N. de. Princípio da SismoCamada Elementar e sua aplicação à Técnica Volume de Amplitudes (tecVA). In: INTERNATIONAL CONGRESS OF THE BRAZILIAN GEOPHYSICAL SOCIETY, 9., 2005, Salvador. Anais [...]. Salvador: Sociedade Brasileira de Geofísica, 2005. DOI: </w:t>
+      </w:r>
+      <w:hyperlink r:id="rId14">
+        <w:r>
+          <w:rPr>
+            <w:i w:val="1"/>
+            <w:iCs w:val="1"/>
+            <w:color w:val="1d4d1d"/>
+            <w:u w:val="single"/>
+            <w:rtl w:val="0"/>
+          </w:rPr>
+          <w:t xml:space="preserve">https://doi.org/10.1190/sbgf2005-275</w:t>
+        </w:r>
+      </w:hyperlink>
+      <w:r>
+        <w:rPr>
+          <w:i w:val="1"/>
+          <w:iCs w:val="1"/>
+          <w:color w:val="595959"/>
+          <w:rtl w:val="0"/>
+        </w:rPr>
+        <w:t xml:space="preserve">.</w:t>
+      </w:r>
+    </w:p>
+    <w:p>
+      <w:pPr>
+        <w:spacing w:after="240" w:before="0" w:line="240" w:lineRule="auto"/>
+        <w:ind w:firstLine="0"/>
+        <w:jc w:val="left"/>
+        <w:rPr>
+          <w:i w:val="1"/>
+          <w:iCs w:val="1"/>
+          <w:color w:val="595959"/>
+        </w:rPr>
+      </w:pPr>
+      <w:r>
+        <w:rPr>
+          <w:i w:val="1"/>
+          <w:iCs w:val="1"/>
+          <w:color w:val="595959"/>
+          <w:rtl w:val="0"/>
+        </w:rPr>
+        <w:t xml:space="preserve">CAPUTO, H. P. Mecânica dos solos e suas aplicações. 6. ed. Rio de Janeiro: Livros Técnicos e Científicos, 1988. p. 112–159.</w:t>
+      </w:r>
+    </w:p>
+    <w:p>
+      <w:pPr>
+        <w:spacing w:after="240" w:before="0" w:line="240" w:lineRule="auto"/>
+        <w:ind w:firstLine="0"/>
+        <w:jc w:val="left"/>
+        <w:rPr>
+          <w:i w:val="1"/>
+          <w:iCs w:val="1"/>
+          <w:color w:val="595959"/>
+        </w:rPr>
+      </w:pPr>
+      <w:r>
+        <w:rPr>
+          <w:i w:val="1"/>
+          <w:iCs w:val="1"/>
+          <w:color w:val="595959"/>
+          <w:rtl w:val="0"/>
+        </w:rPr>
+        <w:t xml:space="preserve">CARDONA, S. et al. Fabric development and pore-throat reduction in a mass-transport deposit in the Jubilee Gas Field, Eastern Gulf of Mexico: consequences for the sealing capacity of MTDs. In: LAMARCHE, G. et al. (org.). Submarine mass movements and their consequences. Cham: Springer, 2016. p. 27–37. DOI: </w:t>
+      </w:r>
+      <w:hyperlink r:id="rId15">
+        <w:r>
+          <w:rPr>
+            <w:i w:val="1"/>
+            <w:iCs w:val="1"/>
+            <w:color w:val="1d4d1d"/>
+            <w:u w:val="single"/>
+            <w:rtl w:val="0"/>
+          </w:rPr>
+          <w:t xml:space="preserve">https://doi.org/10.1007/978-3-319-20979-1_3</w:t>
+        </w:r>
+      </w:hyperlink>
+      <w:r>
+        <w:rPr>
+          <w:i w:val="1"/>
+          <w:iCs w:val="1"/>
+          <w:color w:val="595959"/>
+          <w:rtl w:val="0"/>
+        </w:rPr>
+        <w:t xml:space="preserve">.</w:t>
+      </w:r>
+    </w:p>
+    <w:p>
+      <w:pPr>
+        <w:spacing w:after="240" w:before="0" w:line="240" w:lineRule="auto"/>
+        <w:ind w:firstLine="0"/>
+        <w:jc w:val="left"/>
+        <w:rPr>
+          <w:i w:val="1"/>
+          <w:iCs w:val="1"/>
+          <w:color w:val="595959"/>
+        </w:rPr>
+      </w:pPr>
+      <w:r>
+        <w:rPr>
+          <w:i w:val="1"/>
+          <w:iCs w:val="1"/>
+          <w:color w:val="595959"/>
+          <w:rtl w:val="0"/>
+        </w:rPr>
+        <w:t xml:space="preserve">CHOPRA, S. &amp; MARFURT, K. J. Seismic attributes: a historical perspective. Geophysics, v. 70, n. 5, 2005. DOI: </w:t>
+      </w:r>
+      <w:hyperlink r:id="rId16">
+        <w:r>
+          <w:rPr>
+            <w:i w:val="1"/>
+            <w:iCs w:val="1"/>
+            <w:color w:val="1d4d1d"/>
+            <w:u w:val="single"/>
+            <w:rtl w:val="0"/>
+          </w:rPr>
+          <w:t xml:space="preserve">https://doi.org/10.1190/1.2098670</w:t>
+        </w:r>
+      </w:hyperlink>
+      <w:r>
+        <w:rPr>
+          <w:i w:val="1"/>
+          <w:iCs w:val="1"/>
+          <w:color w:val="595959"/>
+          <w:rtl w:val="0"/>
+        </w:rPr>
+        <w:t xml:space="preserve">.</w:t>
+      </w:r>
+    </w:p>
+    <w:p>
+      <w:pPr>
+        <w:spacing w:after="240" w:before="0" w:line="240" w:lineRule="auto"/>
+        <w:ind w:firstLine="0"/>
+        <w:jc w:val="left"/>
+        <w:rPr>
+          <w:i w:val="1"/>
+          <w:iCs w:val="1"/>
+          <w:color w:val="595959"/>
+        </w:rPr>
+      </w:pPr>
+      <w:r>
+        <w:rPr>
+          <w:i w:val="1"/>
+          <w:iCs w:val="1"/>
+          <w:color w:val="595959"/>
+          <w:rtl w:val="0"/>
+        </w:rPr>
+        <w:t xml:space="preserve">CHOPRA, S. &amp; MARFURT, K. J. Seismic attributes for prospect identification and reservoir characterization. Tulsa: Society of Exploration Geophysicists; European Association of Geoscientists and Engineers, 2007. (Geophysical Developments, v. 11). DOI: </w:t>
+      </w:r>
+      <w:hyperlink r:id="rId17">
+        <w:r>
+          <w:rPr>
+            <w:i w:val="1"/>
+            <w:iCs w:val="1"/>
+            <w:color w:val="1d4d1d"/>
+            <w:u w:val="single"/>
+            <w:rtl w:val="0"/>
+          </w:rPr>
+          <w:t xml:space="preserve">https://doi.org/10.1190/1.9781560801900</w:t>
+        </w:r>
+      </w:hyperlink>
+      <w:r>
+        <w:rPr>
+          <w:i w:val="1"/>
+          <w:iCs w:val="1"/>
+          <w:color w:val="595959"/>
+          <w:rtl w:val="0"/>
+        </w:rPr>
+        <w:t xml:space="preserve">.</w:t>
+      </w:r>
+    </w:p>
+    <w:p>
+      <w:pPr>
+        <w:spacing w:after="240" w:before="0" w:line="240" w:lineRule="auto"/>
+        <w:ind w:firstLine="0"/>
+        <w:jc w:val="left"/>
+        <w:rPr>
+          <w:i w:val="1"/>
+          <w:iCs w:val="1"/>
+          <w:color w:val="595959"/>
+        </w:rPr>
+      </w:pPr>
+      <w:r>
+        <w:rPr>
+          <w:i w:val="1"/>
+          <w:iCs w:val="1"/>
+          <w:color w:val="595959"/>
+          <w:rtl w:val="0"/>
+        </w:rPr>
+        <w:t xml:space="preserve">CLARE, M. A. et al. A consistent global approach for the morphometric characterization of subaqueous landslides. Geological Society, London, Special Publications, v. 477, p. 455–477, 2018. DOI: </w:t>
+      </w:r>
+      <w:hyperlink r:id="rId18">
+        <w:r>
+          <w:rPr>
+            <w:i w:val="1"/>
+            <w:iCs w:val="1"/>
+            <w:color w:val="1d4d1d"/>
+            <w:u w:val="single"/>
+            <w:rtl w:val="0"/>
+          </w:rPr>
+          <w:t xml:space="preserve">https://doi.org/10.1144/SP477.15</w:t>
+        </w:r>
+      </w:hyperlink>
+      <w:r>
+        <w:rPr>
+          <w:i w:val="1"/>
+          <w:iCs w:val="1"/>
+          <w:color w:val="595959"/>
+          <w:rtl w:val="0"/>
+        </w:rPr>
+        <w:t xml:space="preserve">.</w:t>
+      </w:r>
+    </w:p>
+    <w:p>
+      <w:pPr>
+        <w:spacing w:after="240" w:before="0" w:line="240" w:lineRule="auto"/>
+        <w:ind w:firstLine="0"/>
+        <w:jc w:val="left"/>
+        <w:rPr>
+          <w:i w:val="1"/>
+          <w:iCs w:val="1"/>
+          <w:color w:val="595959"/>
+        </w:rPr>
+      </w:pPr>
+      <w:r>
+        <w:rPr>
+          <w:i w:val="1"/>
+          <w:iCs w:val="1"/>
+          <w:color w:val="595959"/>
+          <w:rtl w:val="0"/>
+        </w:rPr>
+        <w:t xml:space="preserve">ELSEVIER. Scopus: a comprehensive abstract and citation database for impact makers. [S. l.], [s. d.]. Disponível em: </w:t>
+      </w:r>
+      <w:hyperlink r:id="rId19">
+        <w:r>
+          <w:rPr>
+            <w:i w:val="1"/>
+            <w:iCs w:val="1"/>
+            <w:color w:val="1d4d1d"/>
+            <w:u w:val="single"/>
+            <w:rtl w:val="0"/>
+          </w:rPr>
+          <w:t xml:space="preserve">https://www.elsevier.com/products/scopus</w:t>
+        </w:r>
+      </w:hyperlink>
+      <w:r>
+        <w:rPr>
+          <w:i w:val="1"/>
+          <w:iCs w:val="1"/>
+          <w:color w:val="595959"/>
+          <w:rtl w:val="0"/>
+        </w:rPr>
+        <w:t xml:space="preserve">. Acesso em: 6 out. 2025.</w:t>
+      </w:r>
+    </w:p>
+    <w:p>
+      <w:pPr>
+        <w:spacing w:after="240" w:before="0" w:line="240" w:lineRule="auto"/>
+        <w:ind w:firstLine="0"/>
+        <w:jc w:val="left"/>
+        <w:rPr>
+          <w:i w:val="1"/>
+          <w:iCs w:val="1"/>
+          <w:color w:val="595959"/>
+        </w:rPr>
+      </w:pPr>
+      <w:r>
+        <w:rPr>
+          <w:i w:val="1"/>
+          <w:iCs w:val="1"/>
+          <w:color w:val="595959"/>
+          <w:rtl w:val="0"/>
+        </w:rPr>
+        <w:t xml:space="preserve">FERNANDEZ, R. O. Bacia de Santos: sumário geológico e setores em oferta. Brasília, DF: Agência Nacional do Petróleo, Gás Natural e Biocombustíveis, 2017. Disponível em: </w:t>
+      </w:r>
+      <w:hyperlink r:id="rId20">
+        <w:r>
+          <w:rPr>
+            <w:i w:val="1"/>
+            <w:iCs w:val="1"/>
+            <w:color w:val="1d4d1d"/>
+            <w:u w:val="single"/>
+            <w:rtl w:val="0"/>
+          </w:rPr>
+          <w:t xml:space="preserve">https://www.gov.br/anp/pt-br/rodadas-anp/rodadas-concluidas/concessao-de-blocos-exploratorios/15a-rodada-licitacoes-blocos/arquivos/areas-oferecidas/sumario_geologico_r15_santos.pdf</w:t>
+        </w:r>
+      </w:hyperlink>
+      <w:r>
+        <w:rPr>
+          <w:i w:val="1"/>
+          <w:iCs w:val="1"/>
+          <w:color w:val="595959"/>
+          <w:rtl w:val="0"/>
+        </w:rPr>
+        <w:t xml:space="preserve">. Acesso em: 1 out. 2025.</w:t>
+      </w:r>
+    </w:p>
+    <w:p>
+      <w:pPr>
+        <w:spacing w:after="240" w:before="0" w:line="240" w:lineRule="auto"/>
+        <w:ind w:firstLine="0"/>
+        <w:jc w:val="left"/>
+        <w:rPr>
+          <w:i w:val="1"/>
+          <w:iCs w:val="1"/>
+          <w:color w:val="595959"/>
+        </w:rPr>
+      </w:pPr>
+      <w:r>
+        <w:rPr>
+          <w:i w:val="1"/>
+          <w:iCs w:val="1"/>
+          <w:color w:val="595959"/>
+          <w:rtl w:val="0"/>
+        </w:rPr>
+        <w:t xml:space="preserve">FIGUEIREDO, A. G. de et al. Geomorfologia e sedimentologia da plataforma continental. In: KOWSMANN, R. O. (org.). Geologia e geomorfologia. Rio de Janeiro: Elsevier, 2015. p. 13–32. DOI: </w:t>
+      </w:r>
+      <w:hyperlink r:id="rId21">
+        <w:r>
+          <w:rPr>
+            <w:i w:val="1"/>
+            <w:iCs w:val="1"/>
+            <w:color w:val="1d4d1d"/>
+            <w:u w:val="single"/>
+            <w:rtl w:val="0"/>
+          </w:rPr>
+          <w:t xml:space="preserve">https://doi.org/10.1016/B978-85-352-6937-6.50009-4</w:t>
+        </w:r>
+      </w:hyperlink>
+      <w:r>
+        <w:rPr>
+          <w:i w:val="1"/>
+          <w:iCs w:val="1"/>
+          <w:color w:val="595959"/>
+          <w:rtl w:val="0"/>
+        </w:rPr>
+        <w:t xml:space="preserve">.</w:t>
+      </w:r>
+    </w:p>
+    <w:p>
+      <w:pPr>
+        <w:spacing w:after="240" w:before="0" w:line="240" w:lineRule="auto"/>
+        <w:ind w:firstLine="0"/>
+        <w:jc w:val="left"/>
+        <w:rPr>
+          <w:i w:val="1"/>
+          <w:iCs w:val="1"/>
+          <w:color w:val="595959"/>
+        </w:rPr>
+      </w:pPr>
+      <w:r>
+        <w:rPr>
+          <w:i w:val="1"/>
+          <w:iCs w:val="1"/>
+          <w:color w:val="595959"/>
+          <w:rtl w:val="0"/>
+        </w:rPr>
+        <w:t xml:space="preserve">GAMBOA, D. &amp; ALVES, T. M. Bi-modal deformation styles in confined mass-transport deposits: examples from a salt minibasin in SE Brazil. Marine Geology, v. 379, p. 176–193, 2016. DOI: </w:t>
+      </w:r>
+      <w:hyperlink r:id="rId22">
+        <w:r>
+          <w:rPr>
+            <w:i w:val="1"/>
+            <w:iCs w:val="1"/>
+            <w:color w:val="1d4d1d"/>
+            <w:u w:val="single"/>
+            <w:rtl w:val="0"/>
+          </w:rPr>
+          <w:t xml:space="preserve">https://doi.org/10.1016/j.margeo.2016.06.003</w:t>
+        </w:r>
+      </w:hyperlink>
+      <w:r>
+        <w:rPr>
+          <w:i w:val="1"/>
+          <w:iCs w:val="1"/>
+          <w:color w:val="595959"/>
+          <w:rtl w:val="0"/>
+        </w:rPr>
+        <w:t xml:space="preserve">.</w:t>
+      </w:r>
+    </w:p>
+    <w:p>
+      <w:pPr>
+        <w:spacing w:after="240" w:before="0" w:line="240" w:lineRule="auto"/>
+        <w:ind w:firstLine="0"/>
+        <w:jc w:val="left"/>
+        <w:rPr>
+          <w:i w:val="1"/>
+          <w:iCs w:val="1"/>
+          <w:color w:val="595959"/>
+        </w:rPr>
+      </w:pPr>
+      <w:r>
+        <w:rPr>
+          <w:i w:val="1"/>
+          <w:iCs w:val="1"/>
+          <w:color w:val="595959"/>
+          <w:rtl w:val="0"/>
+        </w:rPr>
+        <w:t xml:space="preserve">GÜRALP SYSTEMS LIMITED. Ocean bottom seismometers. Aldermaston: Güralp Systems Limited, [s. d.]. Disponível em: </w:t>
+      </w:r>
+      <w:hyperlink r:id="rId23">
+        <w:r>
+          <w:rPr>
+            <w:i w:val="1"/>
+            <w:iCs w:val="1"/>
+            <w:color w:val="1d4d1d"/>
+            <w:u w:val="single"/>
+            <w:rtl w:val="0"/>
+          </w:rPr>
+          <w:t xml:space="preserve">https://www.guralp.com/</w:t>
+        </w:r>
+      </w:hyperlink>
+      <w:r>
+        <w:rPr>
+          <w:i w:val="1"/>
+          <w:iCs w:val="1"/>
+          <w:color w:val="595959"/>
+          <w:rtl w:val="0"/>
+        </w:rPr>
+        <w:t xml:space="preserve">. Acesso em: 30 set. 2025.</w:t>
+      </w:r>
+    </w:p>
+    <w:p>
+      <w:pPr>
+        <w:spacing w:after="240" w:before="0" w:line="240" w:lineRule="auto"/>
+        <w:ind w:firstLine="0"/>
+        <w:jc w:val="left"/>
+        <w:rPr>
+          <w:i w:val="1"/>
+          <w:iCs w:val="1"/>
+          <w:color w:val="595959"/>
+        </w:rPr>
+      </w:pPr>
+      <w:r>
+        <w:rPr>
+          <w:i w:val="1"/>
+          <w:iCs w:val="1"/>
+          <w:color w:val="595959"/>
+          <w:rtl w:val="0"/>
+        </w:rPr>
+        <w:t xml:space="preserve">HAMPTON, M. A.; LEE, H. J.; LOCAT, J. Submarine landslides. Reviews of Geophysics, v. 34, n. 1, p. 33–59, 1996. DOI: </w:t>
+      </w:r>
+      <w:hyperlink r:id="rId24">
+        <w:r>
+          <w:rPr>
+            <w:i w:val="1"/>
+            <w:iCs w:val="1"/>
+            <w:color w:val="1d4d1d"/>
+            <w:u w:val="single"/>
+            <w:rtl w:val="0"/>
+          </w:rPr>
+          <w:t xml:space="preserve">https://doi.org/10.1029/95RG03287</w:t>
+        </w:r>
+      </w:hyperlink>
+      <w:r>
+        <w:rPr>
+          <w:i w:val="1"/>
+          <w:iCs w:val="1"/>
+          <w:color w:val="595959"/>
+          <w:rtl w:val="0"/>
+        </w:rPr>
+        <w:t xml:space="preserve">.</w:t>
+      </w:r>
+    </w:p>
+    <w:p>
+      <w:pPr>
+        <w:spacing w:after="240" w:before="0" w:line="240" w:lineRule="auto"/>
+        <w:ind w:firstLine="0"/>
+        <w:jc w:val="left"/>
+        <w:rPr>
+          <w:i w:val="1"/>
+          <w:iCs w:val="1"/>
+          <w:color w:val="595959"/>
+        </w:rPr>
+      </w:pPr>
+      <w:r>
+        <w:rPr>
+          <w:i w:val="1"/>
+          <w:iCs w:val="1"/>
+          <w:color w:val="595959"/>
+          <w:rtl w:val="0"/>
+        </w:rPr>
+        <w:t xml:space="preserve">HERCOS, C. Z. Os depósitos de movimento de massa submarinos nas bacias marginais do sudeste brasileiro: tipos, ocorrências, idades, feições diagnósticas. In: CONGRESSO INTERNACIONAL DA SOCIEDADE BRASILEIRA DE GEOFÍSICA, 17., 2021, Rio de Janeiro. Anais [...]. Rio de Janeiro: Sociedade Brasileira de Geofísica, 2021. Disponível em: </w:t>
+      </w:r>
+      <w:hyperlink r:id="rId25">
+        <w:r>
+          <w:rPr>
+            <w:i w:val="1"/>
+            <w:iCs w:val="1"/>
+            <w:color w:val="1d4d1d"/>
+            <w:u w:val="single"/>
+            <w:rtl w:val="0"/>
+          </w:rPr>
+          <w:t xml:space="preserve">https://sbgf.org.br/mysbgf/eventos/expanded_abstracts/17th_CISBGf/920211118142805III_SBGGM_DRA_CIZIA_MARIA_MARGEM_CONTINENTAL.pdf</w:t>
+        </w:r>
+      </w:hyperlink>
+      <w:r>
+        <w:rPr>
+          <w:i w:val="1"/>
+          <w:iCs w:val="1"/>
+          <w:color w:val="595959"/>
+          <w:rtl w:val="0"/>
+        </w:rPr>
+        <w:t xml:space="preserve">. Acesso em: 19 set. 2025.</w:t>
+      </w:r>
+    </w:p>
+    <w:p>
+      <w:pPr>
+        <w:spacing w:after="240" w:before="0" w:line="240" w:lineRule="auto"/>
+        <w:ind w:firstLine="0"/>
+        <w:jc w:val="left"/>
+        <w:rPr>
+          <w:i w:val="1"/>
+          <w:iCs w:val="1"/>
+          <w:color w:val="595959"/>
+        </w:rPr>
+      </w:pPr>
+      <w:r>
+        <w:rPr>
+          <w:i w:val="1"/>
+          <w:iCs w:val="1"/>
+          <w:color w:val="595959"/>
+          <w:rtl w:val="0"/>
+        </w:rPr>
+        <w:t xml:space="preserve">KEAREY, P.; BROOKS, M.; HILL, I. Geofísica de exploração. São Paulo: Oficina de Textos, 2009.</w:t>
+      </w:r>
+    </w:p>
+    <w:p>
+      <w:pPr>
+        <w:spacing w:after="240" w:before="0" w:line="240" w:lineRule="auto"/>
+        <w:ind w:firstLine="0"/>
+        <w:jc w:val="left"/>
+        <w:rPr>
+          <w:i w:val="1"/>
+          <w:iCs w:val="1"/>
+          <w:color w:val="595959"/>
+        </w:rPr>
+      </w:pPr>
+      <w:r>
+        <w:rPr>
+          <w:i w:val="1"/>
+          <w:iCs w:val="1"/>
+          <w:color w:val="595959"/>
+          <w:rtl w:val="0"/>
+        </w:rPr>
+        <w:t xml:space="preserve">KNELLER, B. et al. Mass-transport and slope accommodation: implications for turbidite sandstone reservoirs. AAPG Bulletin, v. 100, n. 2, p. 213–235, 2016. DOI: </w:t>
+      </w:r>
+      <w:hyperlink r:id="rId26">
+        <w:r>
+          <w:rPr>
+            <w:i w:val="1"/>
+            <w:iCs w:val="1"/>
+            <w:color w:val="1d4d1d"/>
+            <w:u w:val="single"/>
+            <w:rtl w:val="0"/>
+          </w:rPr>
+          <w:t xml:space="preserve">https://doi.org/10.1306/09011514210</w:t>
+        </w:r>
+      </w:hyperlink>
+      <w:r>
+        <w:rPr>
+          <w:i w:val="1"/>
+          <w:iCs w:val="1"/>
+          <w:color w:val="595959"/>
+          <w:rtl w:val="0"/>
+        </w:rPr>
+        <w:t xml:space="preserve">.</w:t>
+      </w:r>
+    </w:p>
+    <w:p>
+      <w:pPr>
+        <w:spacing w:after="240" w:before="0" w:line="240" w:lineRule="auto"/>
+        <w:ind w:firstLine="0"/>
+        <w:jc w:val="left"/>
+        <w:rPr>
+          <w:i w:val="1"/>
+          <w:iCs w:val="1"/>
+          <w:color w:val="595959"/>
+        </w:rPr>
+      </w:pPr>
+      <w:r>
+        <w:rPr>
+          <w:i w:val="1"/>
+          <w:iCs w:val="1"/>
+          <w:color w:val="595959"/>
+          <w:rtl w:val="0"/>
+        </w:rPr>
+        <w:t xml:space="preserve">KOWSMANN, R. O.; LIMA, A. C.; VICALVI, M. A. Feições indicadoras de instabilidade geológica no talude continental e no platô de São Paulo. In: KOWSMANN, R. O. (org.). Geologia e geomorfologia. Rio de Janeiro: Elsevier, 2015. p. 71–97. DOI: </w:t>
+      </w:r>
+      <w:hyperlink r:id="rId27">
+        <w:r>
+          <w:rPr>
+            <w:i w:val="1"/>
+            <w:iCs w:val="1"/>
+            <w:color w:val="1d4d1d"/>
+            <w:u w:val="single"/>
+            <w:rtl w:val="0"/>
+          </w:rPr>
+          <w:t xml:space="preserve">https://doi.org/10.1016/B978-85-352-6937-6.50012-4</w:t>
+        </w:r>
+      </w:hyperlink>
+      <w:r>
+        <w:rPr>
+          <w:i w:val="1"/>
+          <w:iCs w:val="1"/>
+          <w:color w:val="595959"/>
+          <w:rtl w:val="0"/>
+        </w:rPr>
+        <w:t xml:space="preserve">.</w:t>
+      </w:r>
+    </w:p>
+    <w:p>
+      <w:pPr>
+        <w:spacing w:after="240" w:before="0" w:line="240" w:lineRule="auto"/>
+        <w:ind w:firstLine="0"/>
+        <w:jc w:val="left"/>
+        <w:rPr>
+          <w:i w:val="1"/>
+          <w:iCs w:val="1"/>
+          <w:color w:val="595959"/>
+        </w:rPr>
+      </w:pPr>
+      <w:r>
+        <w:rPr>
+          <w:i w:val="1"/>
+          <w:iCs w:val="1"/>
+          <w:color w:val="595959"/>
+          <w:rtl w:val="0"/>
+        </w:rPr>
+        <w:t xml:space="preserve">KRYLOV, A. A. et al. Peculiarities of the HVSR method application to seismic records obtained by ocean-bottom seismographs in the Arctic. Journal of Marine Science and Engineering, v. 8, n. 12, 2020. DOI: </w:t>
+      </w:r>
+      <w:hyperlink r:id="rId28">
+        <w:r>
+          <w:rPr>
+            <w:i w:val="1"/>
+            <w:iCs w:val="1"/>
+            <w:color w:val="1d4d1d"/>
+            <w:u w:val="single"/>
+            <w:rtl w:val="0"/>
+          </w:rPr>
+          <w:t xml:space="preserve">https://doi.org/10.3390/jmse8120968</w:t>
+        </w:r>
+      </w:hyperlink>
+      <w:r>
+        <w:rPr>
+          <w:i w:val="1"/>
+          <w:iCs w:val="1"/>
+          <w:color w:val="595959"/>
+          <w:rtl w:val="0"/>
+        </w:rPr>
+        <w:t xml:space="preserve">.</w:t>
+      </w:r>
+    </w:p>
+    <w:p>
+      <w:pPr>
+        <w:spacing w:after="240" w:before="0" w:line="240" w:lineRule="auto"/>
+        <w:ind w:firstLine="0"/>
+        <w:jc w:val="left"/>
+        <w:rPr>
+          <w:i w:val="1"/>
+          <w:iCs w:val="1"/>
+          <w:color w:val="595959"/>
+        </w:rPr>
+      </w:pPr>
+      <w:r>
+        <w:rPr>
+          <w:i w:val="1"/>
+          <w:iCs w:val="1"/>
+          <w:color w:val="595959"/>
+          <w:rtl w:val="0"/>
+        </w:rPr>
+        <w:t xml:space="preserve">LEE, H. J. et al. Submarine mass movements on continental margins. In: NITTROUER, C. A. et al. (org.). Continental margin sedimentation: from sediment transport to sequence stratigraphy. Oxford: Blackwell, 2007. p. 213–274. DOI: </w:t>
+      </w:r>
+      <w:hyperlink r:id="rId29">
+        <w:r>
+          <w:rPr>
+            <w:i w:val="1"/>
+            <w:iCs w:val="1"/>
+            <w:color w:val="1d4d1d"/>
+            <w:u w:val="single"/>
+            <w:rtl w:val="0"/>
+          </w:rPr>
+          <w:t xml:space="preserve">https://doi.org/10.1002/9781444304398.ch5</w:t>
+        </w:r>
+      </w:hyperlink>
+      <w:r>
+        <w:rPr>
+          <w:i w:val="1"/>
+          <w:iCs w:val="1"/>
+          <w:color w:val="595959"/>
+          <w:rtl w:val="0"/>
+        </w:rPr>
+        <w:t xml:space="preserve">.</w:t>
+      </w:r>
+    </w:p>
+    <w:p>
+      <w:pPr>
+        <w:spacing w:after="240" w:before="0" w:line="240" w:lineRule="auto"/>
+        <w:ind w:firstLine="0"/>
+        <w:jc w:val="left"/>
+        <w:rPr>
+          <w:i w:val="1"/>
+          <w:iCs w:val="1"/>
+          <w:color w:val="595959"/>
+        </w:rPr>
+      </w:pPr>
+      <w:r>
+        <w:rPr>
+          <w:i w:val="1"/>
+          <w:iCs w:val="1"/>
+          <w:color w:val="595959"/>
+          <w:rtl w:val="0"/>
+        </w:rPr>
+        <w:t xml:space="preserve">MECKEL III, L. D. Reservoir characteristics and classification of sand-prone submarine mass-transport deposits. In: SHIPP, R. C.; WEIMER, P.; POSAMENTIER, H. W. (org.). Mass-transport deposits in deepwater settings. Tulsa: SEPM Society for Sedimentary Geology, 2011. p. 423–452. DOI: </w:t>
+      </w:r>
+      <w:hyperlink r:id="rId30">
+        <w:r>
+          <w:rPr>
+            <w:i w:val="1"/>
+            <w:iCs w:val="1"/>
+            <w:color w:val="1d4d1d"/>
+            <w:u w:val="single"/>
+            <w:rtl w:val="0"/>
+          </w:rPr>
+          <w:t xml:space="preserve">https://doi.org/10.2110/sepmsp.096.423</w:t>
+        </w:r>
+      </w:hyperlink>
+      <w:r>
+        <w:rPr>
+          <w:i w:val="1"/>
+          <w:iCs w:val="1"/>
+          <w:color w:val="595959"/>
+          <w:rtl w:val="0"/>
+        </w:rPr>
+        <w:t xml:space="preserve">.</w:t>
+      </w:r>
+    </w:p>
+    <w:p>
+      <w:pPr>
+        <w:spacing w:after="240" w:before="0" w:line="240" w:lineRule="auto"/>
+        <w:ind w:firstLine="0"/>
+        <w:jc w:val="left"/>
+        <w:rPr>
+          <w:i w:val="1"/>
+          <w:iCs w:val="1"/>
+          <w:color w:val="595959"/>
+        </w:rPr>
+      </w:pPr>
+      <w:r>
+        <w:rPr>
+          <w:i w:val="1"/>
+          <w:iCs w:val="1"/>
+          <w:color w:val="595959"/>
+          <w:rtl w:val="0"/>
+        </w:rPr>
+        <w:t xml:space="preserve">MENESES, A. R. dos S. Estudo teórico de atributos sísmicos em dados sísmicos de reflexão. 2010. 86 f. Trabalho de Conclusão de Curso — Universidade Federal da Bahia, Salvador, 2010. Disponível em: </w:t>
+      </w:r>
+      <w:hyperlink r:id="rId31">
+        <w:r>
+          <w:rPr>
+            <w:i w:val="1"/>
+            <w:iCs w:val="1"/>
+            <w:color w:val="1d4d1d"/>
+            <w:u w:val="single"/>
+            <w:rtl w:val="0"/>
+          </w:rPr>
+          <w:t xml:space="preserve">http://www.cpgg.ufba.br/gr-geof/geo213/trabalhos-graducao/Adson-Meneses.pdf</w:t>
+        </w:r>
+      </w:hyperlink>
+      <w:r>
+        <w:rPr>
+          <w:i w:val="1"/>
+          <w:iCs w:val="1"/>
+          <w:color w:val="595959"/>
+          <w:rtl w:val="0"/>
+        </w:rPr>
+        <w:t xml:space="preserve">. Acesso em: 8 out. 2025.</w:t>
+      </w:r>
+    </w:p>
+    <w:p>
+      <w:pPr>
+        <w:spacing w:after="240" w:before="0" w:line="240" w:lineRule="auto"/>
+        <w:ind w:firstLine="0"/>
+        <w:jc w:val="left"/>
+        <w:rPr>
+          <w:i w:val="1"/>
+          <w:iCs w:val="1"/>
+          <w:color w:val="595959"/>
+        </w:rPr>
+      </w:pPr>
+      <w:r>
+        <w:rPr>
+          <w:i w:val="1"/>
+          <w:iCs w:val="1"/>
+          <w:color w:val="595959"/>
+          <w:rtl w:val="0"/>
+        </w:rPr>
+        <w:t xml:space="preserve">MIO, E. de; CHANG, H. K.; CORRÊA, F. S. Integração de métodos geofísicos na modelagem crustal da Bacia de Santos. Revista Brasileira de Geofísica, v. 23, n. 3, p. 275–284, 2005. DOI: </w:t>
+      </w:r>
+      <w:hyperlink r:id="rId32">
+        <w:r>
+          <w:rPr>
+            <w:i w:val="1"/>
+            <w:iCs w:val="1"/>
+            <w:color w:val="1d4d1d"/>
+            <w:u w:val="single"/>
+            <w:rtl w:val="0"/>
+          </w:rPr>
+          <w:t xml:space="preserve">https://doi.org/10.1590/S0102-261X2005000300006</w:t>
+        </w:r>
+      </w:hyperlink>
+      <w:r>
+        <w:rPr>
+          <w:i w:val="1"/>
+          <w:iCs w:val="1"/>
+          <w:color w:val="595959"/>
+          <w:rtl w:val="0"/>
+        </w:rPr>
+        <w:t xml:space="preserve">.</w:t>
+      </w:r>
+    </w:p>
+    <w:p>
+      <w:pPr>
+        <w:spacing w:after="240" w:before="0" w:line="240" w:lineRule="auto"/>
+        <w:ind w:firstLine="0"/>
+        <w:jc w:val="left"/>
+        <w:rPr>
+          <w:i w:val="1"/>
+          <w:iCs w:val="1"/>
+          <w:color w:val="595959"/>
+        </w:rPr>
+      </w:pPr>
+      <w:r>
+        <w:rPr>
+          <w:i w:val="1"/>
+          <w:iCs w:val="1"/>
+          <w:color w:val="595959"/>
+          <w:rtl w:val="0"/>
+        </w:rPr>
+        <w:t xml:space="preserve">MITCHUM JR., R. M. et al. Seismic stratigraphy and global changes of sea level, part 6: stratigraphic interpretation of seismic reflection patterns in depositional sequences. In: PAYTON, C. E. (org.). Seismic stratigraphy: applications to hydrocarbon exploration. Tulsa: American Association of Petroleum Geologists, 1977. p. 117–133. (AAPG Memoir, v. 26). DOI: </w:t>
+      </w:r>
+      <w:hyperlink r:id="rId33">
+        <w:r>
+          <w:rPr>
+            <w:i w:val="1"/>
+            <w:iCs w:val="1"/>
+            <w:color w:val="1d4d1d"/>
+            <w:u w:val="single"/>
+            <w:rtl w:val="0"/>
+          </w:rPr>
+          <w:t xml:space="preserve">https://doi.org/10.1306/M26490C8</w:t>
+        </w:r>
+      </w:hyperlink>
+      <w:r>
+        <w:rPr>
+          <w:i w:val="1"/>
+          <w:iCs w:val="1"/>
+          <w:color w:val="595959"/>
+          <w:rtl w:val="0"/>
+        </w:rPr>
+        <w:t xml:space="preserve">.</w:t>
+      </w:r>
+    </w:p>
+    <w:p>
+      <w:pPr>
+        <w:spacing w:after="240" w:before="0" w:line="240" w:lineRule="auto"/>
+        <w:ind w:firstLine="0"/>
+        <w:jc w:val="left"/>
+        <w:rPr>
+          <w:i w:val="1"/>
+          <w:iCs w:val="1"/>
+          <w:color w:val="595959"/>
+        </w:rPr>
+      </w:pPr>
+      <w:r>
+        <w:rPr>
+          <w:i w:val="1"/>
+          <w:iCs w:val="1"/>
+          <w:color w:val="595959"/>
+          <w:rtl w:val="0"/>
+        </w:rPr>
+        <w:t xml:space="preserve">MOSCARDELLI, L. &amp; WOOD, L. New classification system for mass transport complexes in offshore Trinidad. Basin Research, v. 20, n. 1, p. 73–98, 2008. DOI: </w:t>
+      </w:r>
+      <w:hyperlink r:id="rId34">
+        <w:r>
+          <w:rPr>
+            <w:i w:val="1"/>
+            <w:iCs w:val="1"/>
+            <w:color w:val="1d4d1d"/>
+            <w:u w:val="single"/>
+            <w:rtl w:val="0"/>
+          </w:rPr>
+          <w:t xml:space="preserve">https://doi.org/10.1111/j.1365-2117.2007.00340.x</w:t>
+        </w:r>
+      </w:hyperlink>
+      <w:r>
+        <w:rPr>
+          <w:i w:val="1"/>
+          <w:iCs w:val="1"/>
+          <w:color w:val="595959"/>
+          <w:rtl w:val="0"/>
+        </w:rPr>
+        <w:t xml:space="preserve">.</w:t>
+      </w:r>
+    </w:p>
+    <w:p>
+      <w:pPr>
+        <w:spacing w:after="240" w:before="0" w:line="240" w:lineRule="auto"/>
+        <w:ind w:firstLine="0"/>
+        <w:jc w:val="left"/>
+        <w:rPr>
+          <w:i w:val="1"/>
+          <w:iCs w:val="1"/>
+          <w:color w:val="595959"/>
+        </w:rPr>
+      </w:pPr>
+      <w:r>
+        <w:rPr>
+          <w:i w:val="1"/>
+          <w:iCs w:val="1"/>
+          <w:color w:val="595959"/>
+          <w:rtl w:val="0"/>
+        </w:rPr>
+        <w:t xml:space="preserve">MOSCARDELLI, L. &amp; WOOD, L. Morphometry of mass-transport deposits as a predictive tool. Geological Society of America Bulletin, v. 128, n. 1–2, p. 47–80, 2016. DOI: </w:t>
+      </w:r>
+      <w:hyperlink r:id="rId35">
+        <w:r>
+          <w:rPr>
+            <w:i w:val="1"/>
+            <w:iCs w:val="1"/>
+            <w:color w:val="1d4d1d"/>
+            <w:u w:val="single"/>
+            <w:rtl w:val="0"/>
+          </w:rPr>
+          <w:t xml:space="preserve">https://doi.org/10.1130/B31221.1</w:t>
+        </w:r>
+      </w:hyperlink>
+      <w:r>
+        <w:rPr>
+          <w:i w:val="1"/>
+          <w:iCs w:val="1"/>
+          <w:color w:val="595959"/>
+          <w:rtl w:val="0"/>
+        </w:rPr>
+        <w:t xml:space="preserve">.</w:t>
+      </w:r>
+    </w:p>
+    <w:p>
+      <w:pPr>
+        <w:spacing w:after="240" w:before="0" w:line="240" w:lineRule="auto"/>
+        <w:ind w:firstLine="0"/>
+        <w:jc w:val="left"/>
+        <w:rPr>
+          <w:i w:val="1"/>
+          <w:iCs w:val="1"/>
+          <w:color w:val="595959"/>
+        </w:rPr>
+      </w:pPr>
+      <w:r>
+        <w:rPr>
+          <w:i w:val="1"/>
+          <w:iCs w:val="1"/>
+          <w:color w:val="595959"/>
+          <w:rtl w:val="0"/>
+        </w:rPr>
+        <w:t xml:space="preserve">NAKAMURA, Y. A method for dynamic characteristics estimation of subsurface using microtremor on the ground surface. Quarterly Report of Railway Technical Research Institute, v. 30, n. 1, p. 25–33, 1989. Disponível em: </w:t>
+      </w:r>
+      <w:hyperlink r:id="rId36">
+        <w:r>
+          <w:rPr>
+            <w:i w:val="1"/>
+            <w:iCs w:val="1"/>
+            <w:color w:val="1d4d1d"/>
+            <w:u w:val="single"/>
+            <w:rtl w:val="0"/>
+          </w:rPr>
+          <w:t xml:space="preserve">https://basin.earth.ncu.edu.tw/download/courses/seminar_MSc/2010/0224-1_A%20Method%20for%20Dynamic%20Characteristics%20Estimation%20of%20Subsurface%20using%20Microtremor%20on%20the%20Ground%20Surface.pdf</w:t>
+        </w:r>
+      </w:hyperlink>
+      <w:r>
+        <w:rPr>
+          <w:i w:val="1"/>
+          <w:iCs w:val="1"/>
+          <w:color w:val="595959"/>
+          <w:rtl w:val="0"/>
+        </w:rPr>
+        <w:t xml:space="preserve">. Acesso em: 8 out. 2025.</w:t>
+      </w:r>
+    </w:p>
+    <w:p>
+      <w:pPr>
+        <w:spacing w:after="240" w:before="0" w:line="240" w:lineRule="auto"/>
+        <w:ind w:firstLine="0"/>
+        <w:jc w:val="left"/>
+        <w:rPr>
+          <w:i w:val="1"/>
+          <w:iCs w:val="1"/>
+          <w:color w:val="595959"/>
+        </w:rPr>
+      </w:pPr>
+      <w:r>
+        <w:rPr>
+          <w:i w:val="1"/>
+          <w:iCs w:val="1"/>
+          <w:color w:val="595959"/>
+          <w:rtl w:val="0"/>
+        </w:rPr>
+        <w:t xml:space="preserve">OKADA, H. &amp; SUTO, K. The microtremor survey method. Tulsa: Society of Exploration Geophysicists, 2003. DOI: </w:t>
+      </w:r>
+      <w:hyperlink r:id="rId37">
+        <w:r>
+          <w:rPr>
+            <w:i w:val="1"/>
+            <w:iCs w:val="1"/>
+            <w:color w:val="1d4d1d"/>
+            <w:u w:val="single"/>
+            <w:rtl w:val="0"/>
+          </w:rPr>
+          <w:t xml:space="preserve">https://doi.org/10.1190/1.9781560801740</w:t>
+        </w:r>
+      </w:hyperlink>
+      <w:r>
+        <w:rPr>
+          <w:i w:val="1"/>
+          <w:iCs w:val="1"/>
+          <w:color w:val="595959"/>
+          <w:rtl w:val="0"/>
+        </w:rPr>
+        <w:t xml:space="preserve">.</w:t>
+      </w:r>
+    </w:p>
+    <w:p>
+      <w:pPr>
+        <w:spacing w:after="240" w:before="0" w:line="240" w:lineRule="auto"/>
+        <w:ind w:firstLine="0"/>
+        <w:jc w:val="left"/>
+        <w:rPr>
+          <w:i w:val="1"/>
+          <w:iCs w:val="1"/>
+          <w:color w:val="595959"/>
+        </w:rPr>
+      </w:pPr>
+      <w:r>
+        <w:rPr>
+          <w:i w:val="1"/>
+          <w:iCs w:val="1"/>
+          <w:color w:val="595959"/>
+          <w:rtl w:val="0"/>
+        </w:rPr>
+        <w:t xml:space="preserve">PEREIRA, V.; BASILIO, M. P.; SANTOS, C. H. T. PyBibX: a Python library for bibliometric and scientometric analysis powered with artificial intelligence tools. Data Technologies and Applications, v. 59, n. 2, p. 302–337, 2025. DOI: </w:t>
+      </w:r>
+      <w:hyperlink r:id="rId38">
+        <w:r>
+          <w:rPr>
+            <w:i w:val="1"/>
+            <w:iCs w:val="1"/>
+            <w:color w:val="1d4d1d"/>
+            <w:u w:val="single"/>
+            <w:rtl w:val="0"/>
+          </w:rPr>
+          <w:t xml:space="preserve">https://doi.org/10.1108/DTA-08-2023-0461</w:t>
+        </w:r>
+      </w:hyperlink>
+      <w:r>
+        <w:rPr>
+          <w:i w:val="1"/>
+          <w:iCs w:val="1"/>
+          <w:color w:val="595959"/>
+          <w:rtl w:val="0"/>
+        </w:rPr>
+        <w:t xml:space="preserve">.</w:t>
+      </w:r>
+    </w:p>
+    <w:p>
+      <w:pPr>
+        <w:spacing w:after="240" w:before="0" w:line="240" w:lineRule="auto"/>
+        <w:ind w:firstLine="0"/>
+        <w:jc w:val="left"/>
+        <w:rPr>
+          <w:i w:val="1"/>
+          <w:iCs w:val="1"/>
+          <w:color w:val="595959"/>
+        </w:rPr>
+      </w:pPr>
+      <w:r>
+        <w:rPr>
+          <w:i w:val="1"/>
+          <w:iCs w:val="1"/>
+          <w:color w:val="595959"/>
+          <w:rtl w:val="0"/>
+        </w:rPr>
+        <w:t xml:space="preserve">POPE, E. L.; TALLING, P. J.; CARTER, L. Which earthquakes trigger damaging submarine mass movements: insights from a global record of submarine cable breaks? Marine Geology, v. 384, p. 131–146, 2017. DOI: </w:t>
+      </w:r>
+      <w:hyperlink r:id="rId39">
+        <w:r>
+          <w:rPr>
+            <w:i w:val="1"/>
+            <w:iCs w:val="1"/>
+            <w:color w:val="1d4d1d"/>
+            <w:u w:val="single"/>
+            <w:rtl w:val="0"/>
+          </w:rPr>
+          <w:t xml:space="preserve">https://doi.org/10.1016/j.margeo.2016.01.009</w:t>
+        </w:r>
+      </w:hyperlink>
+      <w:r>
+        <w:rPr>
+          <w:i w:val="1"/>
+          <w:iCs w:val="1"/>
+          <w:color w:val="595959"/>
+          <w:rtl w:val="0"/>
+        </w:rPr>
+        <w:t xml:space="preserve">.</w:t>
+      </w:r>
+    </w:p>
+    <w:p>
+      <w:pPr>
+        <w:spacing w:after="240" w:before="0" w:line="240" w:lineRule="auto"/>
+        <w:ind w:firstLine="0"/>
+        <w:jc w:val="left"/>
+        <w:rPr>
+          <w:i w:val="1"/>
+          <w:iCs w:val="1"/>
+          <w:color w:val="595959"/>
+        </w:rPr>
+      </w:pPr>
+      <w:r>
+        <w:rPr>
+          <w:i w:val="1"/>
+          <w:iCs w:val="1"/>
+          <w:color w:val="595959"/>
+          <w:rtl w:val="0"/>
+        </w:rPr>
+        <w:t xml:space="preserve">POSAMENTIER, H. W. &amp; KOLLA, V. Seismic geomorphology and stratigraphy of depositional elements in deep-water settings. Journal of Sedimentary Research, v. 73, n. 3, p. 367–388, 2003. DOI: </w:t>
+      </w:r>
+      <w:hyperlink r:id="rId40">
+        <w:r>
+          <w:rPr>
+            <w:i w:val="1"/>
+            <w:iCs w:val="1"/>
+            <w:color w:val="1d4d1d"/>
+            <w:u w:val="single"/>
+            <w:rtl w:val="0"/>
+          </w:rPr>
+          <w:t xml:space="preserve">https://doi.org/10.1306/111302730367</w:t>
+        </w:r>
+      </w:hyperlink>
+      <w:r>
+        <w:rPr>
+          <w:i w:val="1"/>
+          <w:iCs w:val="1"/>
+          <w:color w:val="595959"/>
+          <w:rtl w:val="0"/>
+        </w:rPr>
+        <w:t xml:space="preserve">.</w:t>
+      </w:r>
+    </w:p>
+    <w:p>
+      <w:pPr>
+        <w:spacing w:after="240" w:before="0" w:line="240" w:lineRule="auto"/>
+        <w:ind w:firstLine="0"/>
+        <w:jc w:val="left"/>
+        <w:rPr>
+          <w:i w:val="1"/>
+          <w:iCs w:val="1"/>
+          <w:color w:val="595959"/>
+        </w:rPr>
+      </w:pPr>
+      <w:r>
+        <w:rPr>
+          <w:i w:val="1"/>
+          <w:iCs w:val="1"/>
+          <w:color w:val="595959"/>
+          <w:rtl w:val="0"/>
+        </w:rPr>
+        <w:t xml:space="preserve">POSAMENTIER, H. W. &amp; MARTINSEN, O. J. The character and genesis of submarine mass-transport deposits: insights from outcrop and 3D seismic data. In: SHIPP, R. C.; WEIMER, P.; POSAMENTIER, H. W. (org.). Mass-transport deposits in deepwater settings. Tulsa: SEPM Society for Sedimentary Geology, 2011. p. 7–38.</w:t>
+      </w:r>
+    </w:p>
+    <w:p>
+      <w:pPr>
+        <w:spacing w:after="240" w:before="0" w:line="240" w:lineRule="auto"/>
+        <w:ind w:firstLine="0"/>
+        <w:jc w:val="left"/>
+        <w:rPr>
+          <w:i w:val="1"/>
+          <w:iCs w:val="1"/>
+          <w:color w:val="595959"/>
+        </w:rPr>
+      </w:pPr>
+      <w:r>
+        <w:rPr>
+          <w:i w:val="1"/>
+          <w:iCs w:val="1"/>
+          <w:color w:val="595959"/>
+          <w:rtl w:val="0"/>
+        </w:rPr>
+        <w:t xml:space="preserve">PREISSLER, A. G. Geomorfologia sísmica de feições deposicionais e erosionais do sistema deltaico Eridanos (Plioceno do Setor Holandês do Mar do Norte). 2016. 71 f. Dissertação (Mestrado) — Universidade do Vale do Rio dos Sinos, São Leopoldo, 2016. Disponível em: </w:t>
+      </w:r>
+      <w:hyperlink r:id="rId41">
+        <w:r>
+          <w:rPr>
+            <w:i w:val="1"/>
+            <w:iCs w:val="1"/>
+            <w:color w:val="1d4d1d"/>
+            <w:u w:val="single"/>
+            <w:rtl w:val="0"/>
+          </w:rPr>
+          <w:t xml:space="preserve">http://www.repositorio.jesuita.org.br/handle/UNISINOS/10129</w:t>
+        </w:r>
+      </w:hyperlink>
+      <w:r>
+        <w:rPr>
+          <w:i w:val="1"/>
+          <w:iCs w:val="1"/>
+          <w:color w:val="595959"/>
+          <w:rtl w:val="0"/>
+        </w:rPr>
+        <w:t xml:space="preserve">. Acesso em: 29 set. 2025.</w:t>
+      </w:r>
+    </w:p>
+    <w:p>
+      <w:pPr>
+        <w:spacing w:after="240" w:before="0" w:line="240" w:lineRule="auto"/>
+        <w:ind w:firstLine="0"/>
         <w:jc w:val="left"/>
         <w:rPr>
           <w:i w:val="1"/>
@@ -4215,8 +5824,134 @@
     </w:p>
     <w:p>
       <w:pPr>
-        <w:spacing w:after="120" w:before="0" w:line="240" w:lineRule="auto"/>
-        <w:ind w:left="0" w:firstLine="0"/>
+        <w:spacing w:after="240" w:before="0" w:line="240" w:lineRule="auto"/>
+        <w:ind w:firstLine="0"/>
+        <w:jc w:val="left"/>
+        <w:rPr>
+          <w:i w:val="1"/>
+          <w:iCs w:val="1"/>
+          <w:color w:val="595959"/>
+        </w:rPr>
+      </w:pPr>
+      <w:r>
+        <w:rPr>
+          <w:i w:val="1"/>
+          <w:iCs w:val="1"/>
+          <w:color w:val="595959"/>
+          <w:rtl w:val="0"/>
+        </w:rPr>
+        <w:t xml:space="preserve">SILVEIRA, I. C. A. et al. Caracterização da oceanografia física do talude continental e região oceânica da Bacia de Campos. In: Meteorologia e oceanografia. [S. l.]: Elsevier, 2016. p. 135–189. DOI: </w:t>
+      </w:r>
+      <w:hyperlink r:id="rId42">
+        <w:r>
+          <w:rPr>
+            <w:i w:val="1"/>
+            <w:iCs w:val="1"/>
+            <w:color w:val="1d4d1d"/>
+            <w:u w:val="single"/>
+            <w:rtl w:val="0"/>
+          </w:rPr>
+          <w:t xml:space="preserve">https://doi.org/10.1016/B978-85-352-6208-7.50011-8</w:t>
+        </w:r>
+      </w:hyperlink>
+      <w:r>
+        <w:rPr>
+          <w:i w:val="1"/>
+          <w:iCs w:val="1"/>
+          <w:color w:val="595959"/>
+          <w:rtl w:val="0"/>
+        </w:rPr>
+        <w:t xml:space="preserve">.</w:t>
+      </w:r>
+    </w:p>
+    <w:p>
+      <w:pPr>
+        <w:spacing w:after="240" w:before="0" w:line="240" w:lineRule="auto"/>
+        <w:ind w:firstLine="0"/>
+        <w:jc w:val="left"/>
+        <w:rPr>
+          <w:i w:val="1"/>
+          <w:iCs w:val="1"/>
+          <w:color w:val="595959"/>
+        </w:rPr>
+      </w:pPr>
+      <w:r>
+        <w:rPr>
+          <w:i w:val="1"/>
+          <w:iCs w:val="1"/>
+          <w:color w:val="595959"/>
+          <w:rtl w:val="0"/>
+        </w:rPr>
+        <w:t xml:space="preserve">SRISAWAD, S. &amp; LERTSTTISPHAN, K. Bibliometric analysis of references selection that influence citations among articles of Thai multidisciplinary journals. Journal of Scientometric Research, v. 10, n. 3, p. 288–296, 2021. DOI: </w:t>
+      </w:r>
+      <w:hyperlink r:id="rId43">
+        <w:r>
+          <w:rPr>
+            <w:i w:val="1"/>
+            <w:iCs w:val="1"/>
+            <w:color w:val="1d4d1d"/>
+            <w:u w:val="single"/>
+            <w:rtl w:val="0"/>
+          </w:rPr>
+          <w:t xml:space="preserve">https://doi.org/10.5530/jscires.10.3.45</w:t>
+        </w:r>
+      </w:hyperlink>
+      <w:r>
+        <w:rPr>
+          <w:i w:val="1"/>
+          <w:iCs w:val="1"/>
+          <w:color w:val="595959"/>
+          <w:rtl w:val="0"/>
+        </w:rPr>
+        <w:t xml:space="preserve">.</w:t>
+      </w:r>
+    </w:p>
+    <w:p>
+      <w:pPr>
+        <w:spacing w:after="240" w:before="0" w:line="240" w:lineRule="auto"/>
+        <w:ind w:firstLine="0"/>
+        <w:jc w:val="left"/>
+        <w:rPr>
+          <w:i w:val="1"/>
+          <w:iCs w:val="1"/>
+          <w:color w:val="595959"/>
+        </w:rPr>
+      </w:pPr>
+      <w:r>
+        <w:rPr>
+          <w:i w:val="1"/>
+          <w:iCs w:val="1"/>
+          <w:color w:val="595959"/>
+          <w:rtl w:val="0"/>
+        </w:rPr>
+        <w:t xml:space="preserve">TALLING, P. J. et al. Large submarine landslides on continental slopes: geohazards, methane release, and climate change. Oceanography, v. 27, n. 2, p. 32–45, 2014. DOI: </w:t>
+      </w:r>
+      <w:hyperlink r:id="rId44">
+        <w:r>
+          <w:rPr>
+            <w:i w:val="1"/>
+            <w:iCs w:val="1"/>
+            <w:color w:val="1d4d1d"/>
+            <w:u w:val="single"/>
+            <w:rtl w:val="0"/>
+          </w:rPr>
+          <w:t xml:space="preserve">https://doi.org/10.5670/oceanog.2014.38</w:t>
+        </w:r>
+      </w:hyperlink>
+      <w:r>
+        <w:rPr>
+          <w:i w:val="1"/>
+          <w:iCs w:val="1"/>
+          <w:color w:val="595959"/>
+          <w:rtl w:val="0"/>
+        </w:rPr>
+        <w:t xml:space="preserve">.</w:t>
+      </w:r>
+    </w:p>
+    <w:p>
+      <w:pPr>
+        <w:spacing w:after="240" w:before="0" w:line="240" w:lineRule="auto"/>
+        <w:ind w:firstLine="0"/>
         <w:jc w:val="left"/>
         <w:rPr>
           <w:i w:val="1"/>
@@ -4236,8 +5971,8 @@
     </w:p>
     <w:p>
       <w:pPr>
-        <w:spacing w:after="120" w:before="0" w:line="240" w:lineRule="auto"/>
-        <w:ind w:left="0" w:firstLine="0"/>
+        <w:spacing w:after="240" w:before="0" w:line="240" w:lineRule="auto"/>
+        <w:ind w:firstLine="0"/>
         <w:jc w:val="left"/>
         <w:rPr>
           <w:i w:val="1"/>
@@ -4257,57 +5992,128 @@
     </w:p>
     <w:p>
       <w:pPr>
-        <w:spacing w:after="120" w:before="0" w:line="240" w:lineRule="auto"/>
-        <w:ind w:left="0" w:firstLine="0"/>
-        <w:jc w:val="left"/>
-        <w:rPr>
-          <w:i w:val="1"/>
-          <w:iCs w:val="1"/>
-          <w:color w:val="595959"/>
-        </w:rPr>
-      </w:pPr>
-      <w:r>
-        <w:rPr>
-          <w:i w:val="1"/>
-          <w:iCs w:val="1"/>
-          <w:color w:val="595959"/>
-          <w:rtl w:val="0"/>
-        </w:rPr>
-        <w:t xml:space="preserve">VANNESTE, M. et al. Seafloor instabilities and sediment deformation processes: the need for integrated, multi-disciplinary investigations. Marine Geology, v. 352, p. 183–214, 2014. DOI: 10.1016/j.margeo.2014.01.005.</w:t>
-      </w:r>
-    </w:p>
-    <w:p>
-      <w:pPr>
-        <w:spacing w:after="120" w:before="0" w:line="240" w:lineRule="auto"/>
-        <w:ind w:left="0" w:firstLine="0"/>
-        <w:jc w:val="left"/>
-        <w:rPr>
-          <w:i w:val="1"/>
-          <w:iCs w:val="1"/>
-          <w:color w:val="595959"/>
-        </w:rPr>
-      </w:pPr>
-      <w:r>
-        <w:rPr>
-          <w:i w:val="1"/>
-          <w:iCs w:val="1"/>
-          <w:color w:val="595959"/>
-          <w:rtl w:val="0"/>
-        </w:rPr>
-        <w:t xml:space="preserve">YILMAZ, Ö. Seismic data analysis: processing, inversion, and interpretation of seismic data. Tulsa: Society of Exploration Geophysicists, 2001. (Investigations in Geophysics, v. 10). DOI: 10.1190/1.9781560801580.</w:t>
-      </w:r>
-    </w:p>
-    <w:p>
-      <w:pPr>
-        <w:rPr/>
-      </w:pPr>
-      <w:r>
-        <w:br w:type="page"/>
-      </w:r>
-      <w:r>
-        <w:rPr>
-          <w:rtl w:val="0"/>
-        </w:rPr>
+        <w:spacing w:after="240" w:before="0" w:line="240" w:lineRule="auto"/>
+        <w:ind w:firstLine="0"/>
+        <w:jc w:val="left"/>
+        <w:rPr>
+          <w:i w:val="1"/>
+          <w:iCs w:val="1"/>
+          <w:color w:val="595959"/>
+        </w:rPr>
+      </w:pPr>
+      <w:r>
+        <w:rPr>
+          <w:i w:val="1"/>
+          <w:iCs w:val="1"/>
+          <w:color w:val="595959"/>
+          <w:rtl w:val="0"/>
+        </w:rPr>
+        <w:t xml:space="preserve">VANNESTE, M. et al. Seafloor instabilities and sediment deformation processes: the need for integrated, multi-disciplinary investigations. Marine Geology, v. 352, p. 183–214, 2014. DOI: </w:t>
+      </w:r>
+      <w:hyperlink r:id="rId45">
+        <w:r>
+          <w:rPr>
+            <w:i w:val="1"/>
+            <w:iCs w:val="1"/>
+            <w:color w:val="1d4d1d"/>
+            <w:u w:val="single"/>
+            <w:rtl w:val="0"/>
+          </w:rPr>
+          <w:t xml:space="preserve">https://doi.org/10.1016/j.margeo.2014.01.005</w:t>
+        </w:r>
+      </w:hyperlink>
+      <w:r>
+        <w:rPr>
+          <w:i w:val="1"/>
+          <w:iCs w:val="1"/>
+          <w:color w:val="595959"/>
+          <w:rtl w:val="0"/>
+        </w:rPr>
+        <w:t xml:space="preserve">.</w:t>
+      </w:r>
+    </w:p>
+    <w:p>
+      <w:pPr>
+        <w:spacing w:after="240" w:before="0" w:line="240" w:lineRule="auto"/>
+        <w:ind w:firstLine="0"/>
+        <w:jc w:val="left"/>
+        <w:rPr>
+          <w:i w:val="1"/>
+          <w:iCs w:val="1"/>
+          <w:color w:val="595959"/>
+        </w:rPr>
+      </w:pPr>
+      <w:r>
+        <w:rPr>
+          <w:i w:val="1"/>
+          <w:iCs w:val="1"/>
+          <w:color w:val="595959"/>
+          <w:rtl w:val="0"/>
+        </w:rPr>
+        <w:t xml:space="preserve">VANTASSEL, J. P.; COX, B. R.; BRANNON, D. M. HVSRweb: an open-source, web-based application for horizontal-to-vertical spectral ratio processing. In: INTERNATIONAL FOUNDATIONS CONGRESS AND EQUIPMENT EXPO, 2021, Dallas. Proceedings [...]. Dallas: ASCE, 2021. p. 51–60. DOI: </w:t>
+      </w:r>
+      <w:hyperlink r:id="rId46">
+        <w:r>
+          <w:rPr>
+            <w:i w:val="1"/>
+            <w:iCs w:val="1"/>
+            <w:color w:val="1d4d1d"/>
+            <w:u w:val="single"/>
+            <w:rtl w:val="0"/>
+          </w:rPr>
+          <w:t xml:space="preserve">https://doi.org/10.48550/arXiv.2106.06050</w:t>
+        </w:r>
+      </w:hyperlink>
+      <w:r>
+        <w:rPr>
+          <w:i w:val="1"/>
+          <w:iCs w:val="1"/>
+          <w:color w:val="595959"/>
+          <w:rtl w:val="0"/>
+        </w:rPr>
+        <w:t xml:space="preserve">.</w:t>
+      </w:r>
+    </w:p>
+    <w:p>
+      <w:pPr>
+        <w:spacing w:after="240" w:before="0" w:line="240" w:lineRule="auto"/>
+        <w:ind w:firstLine="0"/>
+        <w:jc w:val="left"/>
+        <w:rPr>
+          <w:i w:val="1"/>
+          <w:iCs w:val="1"/>
+          <w:color w:val="595959"/>
+        </w:rPr>
+      </w:pPr>
+      <w:r>
+        <w:rPr>
+          <w:i w:val="1"/>
+          <w:iCs w:val="1"/>
+          <w:color w:val="595959"/>
+          <w:rtl w:val="0"/>
+        </w:rPr>
+        <w:t xml:space="preserve">YILMAZ, Ö. Seismic data analysis: processing, inversion, and interpretation of seismic data. Tulsa: Society of Exploration Geophysicists, 2001. (Investigations in Geophysics, v. 10). DOI: </w:t>
+      </w:r>
+      <w:hyperlink r:id="rId47">
+        <w:r>
+          <w:rPr>
+            <w:i w:val="1"/>
+            <w:iCs w:val="1"/>
+            <w:color w:val="1d4d1d"/>
+            <w:u w:val="single"/>
+            <w:rtl w:val="0"/>
+          </w:rPr>
+          <w:t xml:space="preserve">https://doi.org/10.1190/1.9781560801580</w:t>
+        </w:r>
+      </w:hyperlink>
+      <w:r>
+        <w:rPr>
+          <w:i w:val="1"/>
+          <w:iCs w:val="1"/>
+          <w:color w:val="595959"/>
+          <w:rtl w:val="0"/>
+        </w:rPr>
+        <w:t xml:space="preserve">.</w:t>
       </w:r>
     </w:p>
     <w:p>
@@ -4426,7 +6232,7 @@
       </w:r>
     </w:p>
     <w:sectPr>
-      <w:footerReference r:id="rId8" w:type="default"/>
+      <w:footerReference r:id="rId48" w:type="default"/>
       <w:pgSz w:h="16838" w:w="11906" w:orient="portrait"/>
       <w:pgMar w:bottom="1134" w:top="1701" w:left="1701" w:right="1134" w:header="709" w:footer="709"/>
       <w:pgNumType w:start="1"/>

</xml_diff>

<commit_message>
Atualizacao automatica 2026-09-19 16:20:38
</commit_message>
<xml_diff>
--- a/docs/template-tcc-geologia-ufsc.docx
+++ b/docs/template-tcc-geologia-ufsc.docx
@@ -13,12 +13,12 @@
           <wp:inline distB="0" distT="0" distL="114300" distR="114300">
             <wp:extent cx="900000" cy="1236424"/>
             <wp:effectExtent b="0" l="0" r="0" t="0"/>
-            <wp:docPr descr="Símbolo da Universidade Federal de Santa Catarina" id="2" name="image2.png"/>
+            <wp:docPr descr="Símbolo da Universidade Federal de Santa Catarina" id="2" name="image3.png"/>
             <a:graphic>
               <a:graphicData uri="http://schemas.openxmlformats.org/drawingml/2006/picture">
                 <pic:pic>
                   <pic:nvPicPr>
-                    <pic:cNvPr descr="Símbolo da Universidade Federal de Santa Catarina" id="0" name="image2.png"/>
+                    <pic:cNvPr descr="Símbolo da Universidade Federal de Santa Catarina" id="0" name="image3.png"/>
                     <pic:cNvPicPr preferRelativeResize="0"/>
                   </pic:nvPicPr>
                   <pic:blipFill>
@@ -1757,7 +1757,7 @@
     </w:p>
     <w:sdt>
       <w:sdtPr>
-        <w:id w:val="-242645079"/>
+        <w:id w:val="1760348490"/>
         <w:docPartObj>
           <w:docPartGallery w:val="Table of Contents"/>
           <w:docPartUnique w:val="1"/>
@@ -1990,7 +1990,7 @@
           <w:highlight w:val="yellow"/>
           <w:rtl w:val="0"/>
         </w:rPr>
-        <w:t xml:space="preserve">., 2018), a relação entre os depósitos e suas áreas-fonte (Moscardelli &amp; Wood, 2008), mecanismo gatilho (referencia a incluir) e o grau de confinamento dos depósitos (Gamboa &amp; Alves, 2016). Além disso, para uma porção da área de estudo, será estimada a espessura do pacote sedimentar potencialmente mobilizável em futuros eventos por meio da técnica </w:t>
+        <w:t xml:space="preserve">., 2018), a relação entre os depósitos e suas áreas-fonte (Moscardelli &amp; Wood, 2008), o mecanismo gatilho e o grau de confinamento dos depósitos (Gamboa &amp; Alves, 2016). Além disso, para uma porção da área de estudo, será estimada a espessura do pacote sedimentar potencialmente mobilizável em futuros eventos por meio da técnica </w:t>
       </w:r>
       <w:r>
         <w:rPr>
@@ -2970,12 +2970,12 @@
           <wp:inline distB="114300" distT="114300" distL="114300" distR="114300">
             <wp:extent cx="5759775" cy="1295400"/>
             <wp:effectExtent b="0" l="0" r="0" t="0"/>
-            <wp:docPr id="1" name="image1.png"/>
+            <wp:docPr id="1" name="image2.png"/>
             <a:graphic>
               <a:graphicData uri="http://schemas.openxmlformats.org/drawingml/2006/picture">
                 <pic:pic>
                   <pic:nvPicPr>
-                    <pic:cNvPr id="0" name="image1.png"/>
+                    <pic:cNvPr id="0" name="image2.png"/>
                     <pic:cNvPicPr preferRelativeResize="0"/>
                   </pic:nvPicPr>
                   <pic:blipFill>
@@ -3070,12 +3070,12 @@
           <wp:inline distB="114300" distT="114300" distL="114300" distR="114300">
             <wp:extent cx="5759775" cy="2959100"/>
             <wp:effectExtent b="0" l="0" r="0" t="0"/>
-            <wp:docPr id="3" name="image3.png"/>
+            <wp:docPr id="3" name="image1.png"/>
             <a:graphic>
               <a:graphicData uri="http://schemas.openxmlformats.org/drawingml/2006/picture">
                 <pic:pic>
                   <pic:nvPicPr>
-                    <pic:cNvPr id="0" name="image3.png"/>
+                    <pic:cNvPr id="0" name="image1.png"/>
                     <pic:cNvPicPr preferRelativeResize="0"/>
                   </pic:nvPicPr>
                   <pic:blipFill>

</xml_diff>

<commit_message>
Atualizacao automatica 2026-09-19 16:26:10
</commit_message>
<xml_diff>
--- a/docs/template-tcc-geologia-ufsc.docx
+++ b/docs/template-tcc-geologia-ufsc.docx
@@ -1757,7 +1757,7 @@
     </w:p>
     <w:sdt>
       <w:sdtPr>
-        <w:id w:val="1760348490"/>
+        <w:id w:val="1910794727"/>
         <w:docPartObj>
           <w:docPartGallery w:val="Table of Contents"/>
           <w:docPartUnique w:val="1"/>
@@ -3047,7 +3047,7 @@
       <w:pPr>
         <w:spacing w:after="0" w:before="0" w:line="360" w:lineRule="auto"/>
         <w:ind w:firstLine="709"/>
-        <w:jc w:val="center"/>
+        <w:jc w:val="both"/>
         <w:rPr/>
       </w:pPr>
       <w:r>

</xml_diff>

<commit_message>
Atualizacao automatica 2026-09-19 16:28:01
</commit_message>
<xml_diff>
--- a/docs/template-tcc-geologia-ufsc.docx
+++ b/docs/template-tcc-geologia-ufsc.docx
@@ -13,12 +13,12 @@
           <wp:inline distB="0" distT="0" distL="114300" distR="114300">
             <wp:extent cx="900000" cy="1236424"/>
             <wp:effectExtent b="0" l="0" r="0" t="0"/>
-            <wp:docPr descr="Símbolo da Universidade Federal de Santa Catarina" id="2" name="image3.png"/>
+            <wp:docPr descr="Símbolo da Universidade Federal de Santa Catarina" id="2" name="image2.png"/>
             <a:graphic>
               <a:graphicData uri="http://schemas.openxmlformats.org/drawingml/2006/picture">
                 <pic:pic>
                   <pic:nvPicPr>
-                    <pic:cNvPr descr="Símbolo da Universidade Federal de Santa Catarina" id="0" name="image3.png"/>
+                    <pic:cNvPr descr="Símbolo da Universidade Federal de Santa Catarina" id="0" name="image2.png"/>
                     <pic:cNvPicPr preferRelativeResize="0"/>
                   </pic:nvPicPr>
                   <pic:blipFill>
@@ -1757,7 +1757,7 @@
     </w:p>
     <w:sdt>
       <w:sdtPr>
-        <w:id w:val="1910794727"/>
+        <w:id w:val="1808857844"/>
         <w:docPartObj>
           <w:docPartGallery w:val="Table of Contents"/>
           <w:docPartUnique w:val="1"/>
@@ -2789,21 +2789,9 @@
     </w:p>
     <w:p>
       <w:pPr>
-        <w:spacing w:after="0" w:before="0" w:line="360" w:lineRule="auto"/>
-        <w:ind w:firstLine="709"/>
-        <w:jc w:val="center"/>
-        <w:rPr/>
-      </w:pPr>
-      <w:r>
-        <w:rPr>
-          <w:rtl w:val="0"/>
-        </w:rPr>
-      </w:r>
-    </w:p>
-    <w:p>
-      <w:pPr>
-        <w:spacing w:after="0" w:before="0" w:line="360" w:lineRule="auto"/>
-        <w:ind w:firstLine="709"/>
+        <w:keepNext w:val="1"/>
+        <w:spacing w:after="60" w:before="120" w:line="240" w:lineRule="auto"/>
+        <w:ind w:left="0" w:firstLine="0"/>
         <w:jc w:val="center"/>
         <w:rPr/>
       </w:pPr>
@@ -2813,12 +2801,12 @@
           <wp:inline distB="114300" distT="114300" distL="114300" distR="114300">
             <wp:extent cx="4690796" cy="4706302"/>
             <wp:effectExtent b="0" l="0" r="0" t="0"/>
-            <wp:docPr id="4" name="image4.png"/>
+            <wp:docPr id="4" name="image3.png"/>
             <a:graphic>
               <a:graphicData uri="http://schemas.openxmlformats.org/drawingml/2006/picture">
                 <pic:pic>
                   <pic:nvPicPr>
-                    <pic:cNvPr id="0" name="image4.png"/>
+                    <pic:cNvPr id="0" name="image3.png"/>
                     <pic:cNvPicPr preferRelativeResize="0"/>
                   </pic:nvPicPr>
                   <pic:blipFill>
@@ -2850,8 +2838,9 @@
     </w:p>
     <w:p>
       <w:pPr>
-        <w:spacing w:after="60" w:before="0" w:line="276" w:lineRule="auto"/>
-        <w:ind w:firstLine="0"/>
+        <w:keepNext w:val="1"/>
+        <w:spacing w:after="0" w:before="0" w:line="240" w:lineRule="auto"/>
+        <w:ind w:left="0" w:firstLine="0"/>
         <w:jc w:val="center"/>
         <w:rPr>
           <w:sz w:val="20"/>
@@ -2882,7 +2871,8 @@
     </w:p>
     <w:p>
       <w:pPr>
-        <w:spacing w:after="60" w:before="0" w:line="276" w:lineRule="auto"/>
+        <w:keepNext w:val="0"/>
+        <w:spacing w:after="120" w:before="0" w:line="240" w:lineRule="auto"/>
         <w:ind w:left="0" w:firstLine="0"/>
         <w:jc w:val="center"/>
         <w:rPr>
@@ -2901,8 +2891,24 @@
     </w:p>
     <w:p>
       <w:pPr>
-        <w:keepNext w:val="0"/>
-        <w:keepLines w:val="0"/>
+        <w:pStyle w:val="Heading3"/>
+        <w:keepNext w:val="1"/>
+        <w:spacing w:after="120" w:before="240" w:lineRule="auto"/>
+        <w:ind w:firstLine="0"/>
+        <w:jc w:val="left"/>
+        <w:rPr/>
+      </w:pPr>
+      <w:bookmarkStart w:colFirst="0" w:colLast="0" w:name="_meybu3i0zoza" w:id="2"/>
+      <w:bookmarkEnd w:id="2"/>
+      <w:r>
+        <w:rPr>
+          <w:rtl w:val="0"/>
+        </w:rPr>
+        <w:t xml:space="preserve">2.2.2 Formas externas das fácies sísmicas</w:t>
+      </w:r>
+    </w:p>
+    <w:p>
+      <w:pPr>
         <w:spacing w:after="0" w:before="0" w:line="360" w:lineRule="auto"/>
         <w:ind w:firstLine="709"/>
         <w:jc w:val="both"/>
@@ -2912,7 +2918,7 @@
         <w:rPr>
           <w:rtl w:val="0"/>
         </w:rPr>
-        <w:t xml:space="preserve">2.2.2 Formas externas das fácies sísmicas</w:t>
+        <w:t xml:space="preserve">A geometria externa das fácies sísmicas (Figura 2) auxilia na interpretação dos processos deposicionais e da relação dos depósitos com o relevo preexistente. As formas mais comuns incluem geometrias em lençol, montiformas e preenchimentos de relevo negativo (Mitchum Jr. et al., 1977).</w:t>
       </w:r>
     </w:p>
     <w:p>
@@ -2926,41 +2932,14 @@
         <w:rPr>
           <w:rtl w:val="0"/>
         </w:rPr>
-        <w:t xml:space="preserve">A geometria externa das fácies sísmicas (Figura 2) auxilia na interpretação dos processos deposicionais e da relação dos depósitos com o relevo preexistente. As formas mais comuns incluem geometrias em lençol, montiformas e preenchimentos de relevo negativo (Mitchum Jr. et al., 1977).</w:t>
-      </w:r>
-    </w:p>
-    <w:p>
-      <w:pPr>
-        <w:spacing w:after="0" w:before="0" w:line="360" w:lineRule="auto"/>
-        <w:ind w:firstLine="709"/>
-        <w:jc w:val="center"/>
-        <w:rPr/>
-      </w:pPr>
-      <w:r>
-        <w:rPr>
-          <w:rtl w:val="0"/>
-        </w:rPr>
-        <w:t xml:space="preserve">As fácies em lençol ou </w:t>
-      </w:r>
-      <w:r>
-        <w:rPr>
-          <w:i w:val="1"/>
-          <w:iCs w:val="1"/>
-          <w:rtl w:val="0"/>
-        </w:rPr>
-        <w:t xml:space="preserve">drapes</w:t>
-      </w:r>
-      <w:r>
-        <w:rPr>
-          <w:rtl w:val="0"/>
-        </w:rPr>
-        <w:t xml:space="preserve"> correspondem a pacotes tabulares, geralmente compostos por refletores paralelos ou subparalelos, que recobrem a topografia subjacente. Já as montiformas apresentam relevo positivo em relação aos estratos adjacentes e podem estar associadas a lobos deposicionais, contornitos e depósitos gravitacionais. Em especial, depósitos de fluxo de detritos podem formar corpos lobados, com margens relativamente íngremes e aspecto montiforme em seção sísmica (Posamentier &amp; Kolla, 2003).</w:t>
-      </w:r>
-    </w:p>
-    <w:p>
-      <w:pPr>
-        <w:spacing w:after="0" w:before="0" w:line="360" w:lineRule="auto"/>
-        <w:ind w:firstLine="709"/>
+        <w:t xml:space="preserve">As fácies em lençol ou drapes correspondem a pacotes tabulares, geralmente compostos por refletores paralelos ou subparalelos, que recobrem a topografia subjacente. Já as montiformas apresentam relevo positivo em relação aos estratos adjacentes e podem estar associadas a lobos deposicionais, contornitos e depósitos gravitacionais. Em especial, depósitos de fluxo de detritos podem formar corpos lobados, com margens relativamente íngremes e aspecto montiforme em seção sísmica (Posamentier &amp; Kolla, 2003).</w:t>
+      </w:r>
+    </w:p>
+    <w:p>
+      <w:pPr>
+        <w:keepNext w:val="1"/>
+        <w:spacing w:after="60" w:before="120" w:line="240" w:lineRule="auto"/>
+        <w:ind w:left="0" w:firstLine="0"/>
         <w:jc w:val="center"/>
         <w:rPr/>
       </w:pPr>
@@ -2970,12 +2949,12 @@
           <wp:inline distB="114300" distT="114300" distL="114300" distR="114300">
             <wp:extent cx="5759775" cy="1295400"/>
             <wp:effectExtent b="0" l="0" r="0" t="0"/>
-            <wp:docPr id="1" name="image2.png"/>
+            <wp:docPr id="1" name="image1.png"/>
             <a:graphic>
               <a:graphicData uri="http://schemas.openxmlformats.org/drawingml/2006/picture">
                 <pic:pic>
                   <pic:nvPicPr>
-                    <pic:cNvPr id="0" name="image2.png"/>
+                    <pic:cNvPr id="0" name="image1.png"/>
                     <pic:cNvPicPr preferRelativeResize="0"/>
                   </pic:nvPicPr>
                   <pic:blipFill>
@@ -3007,8 +2986,9 @@
     </w:p>
     <w:p>
       <w:pPr>
-        <w:spacing w:after="60" w:before="0" w:line="276" w:lineRule="auto"/>
-        <w:ind w:firstLine="0"/>
+        <w:keepNext w:val="1"/>
+        <w:spacing w:after="0" w:before="0" w:line="240" w:lineRule="auto"/>
+        <w:ind w:left="0" w:firstLine="0"/>
         <w:jc w:val="center"/>
         <w:rPr>
           <w:sz w:val="20"/>
@@ -3026,8 +3006,9 @@
     </w:p>
     <w:p>
       <w:pPr>
-        <w:spacing w:after="60" w:before="0" w:line="276" w:lineRule="auto"/>
-        <w:ind w:firstLine="0"/>
+        <w:keepNext w:val="0"/>
+        <w:spacing w:after="120" w:before="0" w:line="240" w:lineRule="auto"/>
+        <w:ind w:left="0" w:firstLine="0"/>
         <w:jc w:val="center"/>
         <w:rPr>
           <w:sz w:val="20"/>
@@ -3059,8 +3040,9 @@
     </w:p>
     <w:p>
       <w:pPr>
-        <w:spacing w:after="0" w:before="0" w:line="360" w:lineRule="auto"/>
-        <w:ind w:firstLine="709"/>
+        <w:keepNext w:val="1"/>
+        <w:spacing w:after="60" w:before="120" w:line="240" w:lineRule="auto"/>
+        <w:ind w:left="0" w:firstLine="0"/>
         <w:jc w:val="center"/>
         <w:rPr/>
       </w:pPr>
@@ -3068,14 +3050,14 @@
         <w:rPr/>
         <w:drawing>
           <wp:inline distB="114300" distT="114300" distL="114300" distR="114300">
-            <wp:extent cx="5759775" cy="2959100"/>
+            <wp:extent cx="5444561" cy="2798774"/>
             <wp:effectExtent b="0" l="0" r="0" t="0"/>
-            <wp:docPr id="3" name="image1.png"/>
+            <wp:docPr id="3" name="image4.png"/>
             <a:graphic>
               <a:graphicData uri="http://schemas.openxmlformats.org/drawingml/2006/picture">
                 <pic:pic>
                   <pic:nvPicPr>
-                    <pic:cNvPr id="0" name="image1.png"/>
+                    <pic:cNvPr id="0" name="image4.png"/>
                     <pic:cNvPicPr preferRelativeResize="0"/>
                   </pic:nvPicPr>
                   <pic:blipFill>
@@ -3088,7 +3070,7 @@
                   <pic:spPr>
                     <a:xfrm>
                       <a:off x="0" y="0"/>
-                      <a:ext cx="5759775" cy="2959100"/>
+                      <a:ext cx="5444561" cy="2798774"/>
                     </a:xfrm>
                     <a:prstGeom prst="rect"/>
                     <a:ln/>
@@ -3107,8 +3089,9 @@
     </w:p>
     <w:p>
       <w:pPr>
-        <w:spacing w:after="60" w:before="0" w:line="276" w:lineRule="auto"/>
-        <w:ind w:firstLine="0"/>
+        <w:keepNext w:val="1"/>
+        <w:spacing w:after="0" w:before="0" w:line="240" w:lineRule="auto"/>
+        <w:ind w:left="0" w:firstLine="0"/>
         <w:jc w:val="center"/>
         <w:rPr>
           <w:sz w:val="20"/>
@@ -3126,8 +3109,9 @@
     </w:p>
     <w:p>
       <w:pPr>
-        <w:spacing w:after="60" w:before="0" w:line="276" w:lineRule="auto"/>
-        <w:ind w:firstLine="0"/>
+        <w:keepNext w:val="0"/>
+        <w:spacing w:after="120" w:before="0" w:line="240" w:lineRule="auto"/>
+        <w:ind w:left="0" w:firstLine="0"/>
         <w:jc w:val="center"/>
         <w:rPr>
           <w:sz w:val="20"/>
@@ -3150,8 +3134,8 @@
         <w:jc w:val="both"/>
         <w:rPr/>
       </w:pPr>
-      <w:bookmarkStart w:colFirst="0" w:colLast="0" w:name="_pfgfl1mim8bb" w:id="2"/>
-      <w:bookmarkEnd w:id="2"/>
+      <w:bookmarkStart w:colFirst="0" w:colLast="0" w:name="_pfgfl1mim8bb" w:id="3"/>
+      <w:bookmarkEnd w:id="3"/>
       <w:r>
         <w:rPr>
           <w:rtl w:val="0"/>

</xml_diff>

<commit_message>
Atualizacao automatica 2026-09-19 17:14:41
</commit_message>
<xml_diff>
--- a/docs/template-tcc-geologia-ufsc.docx
+++ b/docs/template-tcc-geologia-ufsc.docx
@@ -13,12 +13,12 @@
           <wp:inline distB="0" distT="0" distL="114300" distR="114300">
             <wp:extent cx="900000" cy="1236424"/>
             <wp:effectExtent b="0" l="0" r="0" t="0"/>
-            <wp:docPr descr="Símbolo da Universidade Federal de Santa Catarina" id="2" name="image2.png"/>
+            <wp:docPr descr="Símbolo da Universidade Federal de Santa Catarina" id="3" name="image3.png"/>
             <a:graphic>
               <a:graphicData uri="http://schemas.openxmlformats.org/drawingml/2006/picture">
                 <pic:pic>
                   <pic:nvPicPr>
-                    <pic:cNvPr descr="Símbolo da Universidade Federal de Santa Catarina" id="0" name="image2.png"/>
+                    <pic:cNvPr descr="Símbolo da Universidade Federal de Santa Catarina" id="0" name="image3.png"/>
                     <pic:cNvPicPr preferRelativeResize="0"/>
                   </pic:nvPicPr>
                   <pic:blipFill>
@@ -1461,6 +1461,17 @@
         <w:rPr/>
       </w:pPr>
       <w:r>
+        <w:rPr>
+          <w:rtl w:val="0"/>
+        </w:rPr>
+        <w:t xml:space="preserve">Figura 4 — Classificação dos movimentos de massa de acordo com a velocidade, o comportamento do material e o grau de interação entre os grãos</w:t>
+      </w:r>
+    </w:p>
+    <w:p>
+      <w:pPr>
+        <w:rPr/>
+      </w:pPr>
+      <w:r>
         <w:br w:type="page"/>
       </w:r>
       <w:r>
@@ -1757,7 +1768,7 @@
     </w:p>
     <w:sdt>
       <w:sdtPr>
-        <w:id w:val="1808857844"/>
+        <w:id w:val="505136989"/>
         <w:docPartObj>
           <w:docPartGallery w:val="Table of Contents"/>
           <w:docPartUnique w:val="1"/>
@@ -1939,7 +1950,7 @@
         <w:rPr>
           <w:rtl w:val="0"/>
         </w:rPr>
-        <w:t xml:space="preserve">., 1996). No Brasil, o estudo desses processos ganhou maior destaque a partir dos anos 2000, impulsionado pela expansão da exploração de petróleo em águas profundas e pelos potenciais impactos dos movimentos de massa sobre infraestruturas submarinas e campos petrolíferos (Kowsmann </w:t>
+        <w:t xml:space="preserve">., 1996). Mesmo eventos de menor escala podem danificar plataformas de petróleo, dutos e cabos submarinos (Tappin </w:t>
       </w:r>
       <w:r>
         <w:rPr>
@@ -1953,7 +1964,35 @@
         <w:rPr>
           <w:rtl w:val="0"/>
         </w:rPr>
-        <w:t xml:space="preserve">., 2015).</w:t>
+        <w:t xml:space="preserve">., 2001). </w:t>
+      </w:r>
+    </w:p>
+    <w:p>
+      <w:pPr>
+        <w:spacing w:after="0" w:before="0" w:line="360" w:lineRule="auto"/>
+        <w:ind w:firstLine="709"/>
+        <w:jc w:val="both"/>
+        <w:rPr/>
+      </w:pPr>
+      <w:r>
+        <w:rPr>
+          <w:rtl w:val="0"/>
+        </w:rPr>
+        <w:t xml:space="preserve">Nas últimas décadas, as pesquisas sobre movimentos de massa submarinos foram intensificadas para compreender seus mecanismos de ruptura, processos de transporte e riscos associados. Esse avanço foi favorecido pelo aprimoramento das tecnologias de aquisição de dados </w:t>
+      </w:r>
+      <w:r>
+        <w:rPr>
+          <w:i w:val="1"/>
+          <w:iCs w:val="1"/>
+          <w:rtl w:val="0"/>
+        </w:rPr>
+        <w:t xml:space="preserve">offshore</w:t>
+      </w:r>
+      <w:r>
+        <w:rPr>
+          <w:rtl w:val="0"/>
+        </w:rPr>
+        <w:t xml:space="preserve"> e pela expansão das atividades de exploração de recursos marinhos. No Brasil, os estudos ganharam maior destaque a partir dos anos 2000, em razão do avanço da exploração de petróleo em águas profundas e dos potenciais impactos desses processos sobre infraestruturas submarinas e campos petrolíferos (Borges et al., 2015; Kowsmann et al., 2015). </w:t>
       </w:r>
     </w:p>
     <w:p>
@@ -2127,7 +2166,7 @@
       <w:pPr>
         <w:numPr>
           <w:ilvl w:val="0"/>
-          <w:numId w:val="1"/>
+          <w:numId w:val="3"/>
         </w:numPr>
         <w:spacing w:after="0" w:line="240" w:lineRule="auto"/>
         <w:ind w:left="720" w:hanging="360"/>
@@ -2152,7 +2191,7 @@
       <w:pPr>
         <w:numPr>
           <w:ilvl w:val="0"/>
-          <w:numId w:val="1"/>
+          <w:numId w:val="3"/>
         </w:numPr>
         <w:spacing w:after="0" w:line="240" w:lineRule="auto"/>
         <w:ind w:left="720" w:hanging="360"/>
@@ -2177,7 +2216,7 @@
       <w:pPr>
         <w:numPr>
           <w:ilvl w:val="0"/>
-          <w:numId w:val="1"/>
+          <w:numId w:val="3"/>
         </w:numPr>
         <w:spacing w:after="0" w:line="240" w:lineRule="auto"/>
         <w:ind w:left="720" w:hanging="360"/>
@@ -2202,7 +2241,7 @@
       <w:pPr>
         <w:numPr>
           <w:ilvl w:val="0"/>
-          <w:numId w:val="1"/>
+          <w:numId w:val="3"/>
         </w:numPr>
         <w:spacing w:after="0" w:line="240" w:lineRule="auto"/>
         <w:ind w:left="720" w:hanging="360"/>
@@ -2222,7 +2261,7 @@
       <w:pPr>
         <w:numPr>
           <w:ilvl w:val="0"/>
-          <w:numId w:val="1"/>
+          <w:numId w:val="3"/>
         </w:numPr>
         <w:spacing w:after="0" w:line="240" w:lineRule="auto"/>
         <w:ind w:left="720" w:hanging="360"/>
@@ -2243,7 +2282,7 @@
       <w:pPr>
         <w:numPr>
           <w:ilvl w:val="0"/>
-          <w:numId w:val="1"/>
+          <w:numId w:val="3"/>
         </w:numPr>
         <w:spacing w:after="0" w:line="240" w:lineRule="auto"/>
         <w:ind w:left="720" w:hanging="360"/>
@@ -2801,12 +2840,12 @@
           <wp:inline distB="114300" distT="114300" distL="114300" distR="114300">
             <wp:extent cx="4690796" cy="4706302"/>
             <wp:effectExtent b="0" l="0" r="0" t="0"/>
-            <wp:docPr id="4" name="image3.png"/>
+            <wp:docPr id="5" name="image4.png"/>
             <a:graphic>
               <a:graphicData uri="http://schemas.openxmlformats.org/drawingml/2006/picture">
                 <pic:pic>
                   <pic:nvPicPr>
-                    <pic:cNvPr id="0" name="image3.png"/>
+                    <pic:cNvPr id="0" name="image4.png"/>
                     <pic:cNvPicPr preferRelativeResize="0"/>
                   </pic:nvPicPr>
                   <pic:blipFill>
@@ -2949,12 +2988,12 @@
           <wp:inline distB="114300" distT="114300" distL="114300" distR="114300">
             <wp:extent cx="5759775" cy="1295400"/>
             <wp:effectExtent b="0" l="0" r="0" t="0"/>
-            <wp:docPr id="1" name="image1.png"/>
+            <wp:docPr id="1" name="image2.png"/>
             <a:graphic>
               <a:graphicData uri="http://schemas.openxmlformats.org/drawingml/2006/picture">
                 <pic:pic>
                   <pic:nvPicPr>
-                    <pic:cNvPr id="0" name="image1.png"/>
+                    <pic:cNvPr id="0" name="image2.png"/>
                     <pic:cNvPicPr preferRelativeResize="0"/>
                   </pic:nvPicPr>
                   <pic:blipFill>
@@ -3052,12 +3091,12 @@
           <wp:inline distB="114300" distT="114300" distL="114300" distR="114300">
             <wp:extent cx="5444561" cy="2798774"/>
             <wp:effectExtent b="0" l="0" r="0" t="0"/>
-            <wp:docPr id="3" name="image4.png"/>
+            <wp:docPr id="4" name="image1.png"/>
             <a:graphic>
               <a:graphicData uri="http://schemas.openxmlformats.org/drawingml/2006/picture">
                 <pic:pic>
                   <pic:nvPicPr>
-                    <pic:cNvPr id="0" name="image4.png"/>
+                    <pic:cNvPr id="0" name="image1.png"/>
                     <pic:cNvPicPr preferRelativeResize="0"/>
                   </pic:nvPicPr>
                   <pic:blipFill>
@@ -3130,48 +3169,1289 @@
     <w:p>
       <w:pPr>
         <w:pStyle w:val="Heading2"/>
-        <w:spacing w:after="0" w:lineRule="auto"/>
-        <w:jc w:val="both"/>
-        <w:rPr/>
+        <w:jc w:val="left"/>
+        <w:rPr>
+          <w:b w:val="0"/>
+          <w:bCs w:val="0"/>
+        </w:rPr>
       </w:pPr>
       <w:bookmarkStart w:colFirst="0" w:colLast="0" w:name="_pfgfl1mim8bb" w:id="3"/>
       <w:bookmarkEnd w:id="3"/>
       <w:r>
         <w:rPr>
-          <w:rtl w:val="0"/>
-        </w:rPr>
-        <w:t xml:space="preserve">2.3 Movimentos de Massa </w:t>
-      </w:r>
-    </w:p>
-    <w:p>
-      <w:pPr>
-        <w:spacing w:after="0" w:before="0" w:line="360" w:lineRule="auto"/>
-        <w:ind w:firstLine="709"/>
-        <w:jc w:val="both"/>
-        <w:rPr/>
-      </w:pPr>
-      <w:r>
-        <w:rPr>
-          <w:i w:val="1"/>
-          <w:iCs w:val="1"/>
-          <w:color w:val="595959"/>
-          <w:rtl w:val="0"/>
-        </w:rPr>
-        <w:t xml:space="preserve">Descreva as unidades e relações observadas na escala do estudo. Separe observações de interpretações quando necessário.</w:t>
-      </w:r>
-      <w:r>
-        <w:rPr>
-          <w:rtl w:val="0"/>
-        </w:rPr>
-      </w:r>
-    </w:p>
-    <w:p>
-      <w:pPr>
-        <w:pStyle w:val="Heading1"/>
-        <w:keepNext w:val="1"/>
-        <w:spacing w:after="240" w:before="240" w:line="360" w:lineRule="auto"/>
-        <w:ind w:firstLine="0"/>
+          <w:b w:val="0"/>
+          <w:bCs w:val="0"/>
+          <w:rtl w:val="0"/>
+        </w:rPr>
+        <w:t xml:space="preserve">2.3 Movimentos de massa submarinos</w:t>
+      </w:r>
+    </w:p>
+    <w:p>
+      <w:pPr>
+        <w:spacing w:after="120" w:line="360" w:lineRule="auto"/>
+        <w:ind w:left="0" w:firstLine="709"/>
+        <w:jc w:val="both"/>
+        <w:rPr/>
+      </w:pPr>
+      <w:r>
+        <w:rPr>
+          <w:rtl w:val="0"/>
+        </w:rPr>
+        <w:t xml:space="preserve">Os movimentos de massa submarinos correspondem à remobilização e ao deslocamento de sedimentos ou rochas ao longo do fundo marinho sob a ação da gravidade. Esses processos ocorrem quando as forças responsáveis pelo deslocamento do material superam sua resistência ao cisalhamento, provocando a ruptura do pacote sedimentar e seu transporte em direção às porções mais profundas da bacia. Embora apresentem princípios mecânicos semelhantes aos movimentos de massa subaéreos, sua ocorrência no ambiente marinho envolve condições particulares, como a saturação dos sedimentos, o desenvolvimento de excesso de poropressão e a interação entre a massa deslocada e a água (Hampton </w:t>
+      </w:r>
+      <w:r>
+        <w:rPr>
+          <w:i w:val="1"/>
+          <w:iCs w:val="1"/>
+          <w:rtl w:val="0"/>
+        </w:rPr>
+        <w:t xml:space="preserve">et al</w:t>
+      </w:r>
+      <w:r>
+        <w:rPr>
+          <w:rtl w:val="0"/>
+        </w:rPr>
+        <w:t xml:space="preserve">., 1996).</w:t>
+      </w:r>
+    </w:p>
+    <w:p>
+      <w:pPr>
+        <w:spacing w:after="120" w:line="360" w:lineRule="auto"/>
+        <w:ind w:left="0" w:firstLine="709"/>
+        <w:jc w:val="both"/>
+        <w:rPr/>
+      </w:pPr>
+      <w:r>
+        <w:rPr>
+          <w:rtl w:val="0"/>
+        </w:rPr>
+        <w:t xml:space="preserve">Nas margens continentais, os movimentos de massa desempenham um papel importante na redistribuição dos sedimentos. Em um único evento, grandes volumes de material podem ser removidos da plataforma ou do talude e transportados para regiões mais profundas, atravessando extensos trechos da margem com deposição limitada durante o percurso. Esse processo, denominado </w:t>
+      </w:r>
+      <w:r>
+        <w:rPr>
+          <w:i w:val="1"/>
+          <w:iCs w:val="1"/>
+          <w:rtl w:val="0"/>
+        </w:rPr>
+        <w:t xml:space="preserve">sediment bypassing</w:t>
+      </w:r>
+      <w:r>
+        <w:rPr>
+          <w:rtl w:val="0"/>
+        </w:rPr>
+        <w:t xml:space="preserve">, contribui para a transferência de sedimentos em direção ao sopé continental e às bacias oceânicas profundas. Um aspecto particularmente relevante é que movimentos de grandes dimensões não se restringem a áreas muito inclinadas, sendo registrados também em taludes com gradientes inferiores a 2°, que seriam considerados estáveis em muitos ambientes continentais (Hampton </w:t>
+      </w:r>
+      <w:r>
+        <w:rPr>
+          <w:i w:val="1"/>
+          <w:iCs w:val="1"/>
+          <w:rtl w:val="0"/>
+        </w:rPr>
+        <w:t xml:space="preserve">et al</w:t>
+      </w:r>
+      <w:r>
+        <w:rPr>
+          <w:rtl w:val="0"/>
+        </w:rPr>
+        <w:t xml:space="preserve">., 1996; Talling </w:t>
+      </w:r>
+      <w:r>
+        <w:rPr>
+          <w:i w:val="1"/>
+          <w:iCs w:val="1"/>
+          <w:rtl w:val="0"/>
+        </w:rPr>
+        <w:t xml:space="preserve">et al</w:t>
+      </w:r>
+      <w:r>
+        <w:rPr>
+          <w:rtl w:val="0"/>
+        </w:rPr>
+        <w:t xml:space="preserve">., 2014). </w:t>
+      </w:r>
+    </w:p>
+    <w:p>
+      <w:pPr>
+        <w:spacing w:after="120" w:line="360" w:lineRule="auto"/>
+        <w:ind w:left="0" w:firstLine="709"/>
+        <w:jc w:val="both"/>
+        <w:rPr/>
+      </w:pPr>
+      <w:r>
+        <w:rPr>
+          <w:rtl w:val="0"/>
+        </w:rPr>
+        <w:t xml:space="preserve">Os movimentos de massa podem ser classificados de acordo com o comportamento do material durante o deslocamento, considerando aspectos como velocidade, grau de deformação interna e interação entre os grãos. Como apresentado na Figura 4, esses processos formam um contínuo que se estende desde o rastejo, caracterizado pelo movimento lento e pela manutenção dos contatos entre as partículas, até processos mais rápidos e desagregados, como os fluxos de detritos, as correntes de turbidez e as quedas. Ao longo dessa evolução, ocorre o aumento da velocidade e da deformação interna, acompanhado pela redução progressiva da coesão da massa transportada. Uma mesma massa também pode modificar seu comportamento durante o percurso, evoluindo de um deslizamento relativamente coerente para um fluxo de detritos e, com a incorporação de água e a diluição do material, gerar uma corrente de turbidez (Posamentier &amp; Martinsen, 2011).</w:t>
+      </w:r>
+    </w:p>
+    <w:p>
+      <w:pPr>
+        <w:spacing w:after="120" w:before="0" w:line="240" w:lineRule="auto"/>
+        <w:ind w:left="0" w:firstLine="0"/>
+        <w:jc w:val="center"/>
+        <w:rPr/>
+      </w:pPr>
+      <w:r>
+        <w:rPr/>
+        <w:drawing>
+          <wp:inline distB="114300" distT="114300" distL="114300" distR="114300">
+            <wp:extent cx="5344478" cy="4946954"/>
+            <wp:effectExtent b="0" l="0" r="0" t="0"/>
+            <wp:docPr id="2" name="image5.png"/>
+            <a:graphic>
+              <a:graphicData uri="http://schemas.openxmlformats.org/drawingml/2006/picture">
+                <pic:pic>
+                  <pic:nvPicPr>
+                    <pic:cNvPr id="0" name="image5.png"/>
+                    <pic:cNvPicPr preferRelativeResize="0"/>
+                  </pic:nvPicPr>
+                  <pic:blipFill>
+                    <a:blip r:embed="rId10"/>
+                    <a:srcRect b="0" l="0" r="0" t="0"/>
+                    <a:stretch>
+                      <a:fillRect/>
+                    </a:stretch>
+                  </pic:blipFill>
+                  <pic:spPr>
+                    <a:xfrm>
+                      <a:off x="0" y="0"/>
+                      <a:ext cx="5344478" cy="4946954"/>
+                    </a:xfrm>
+                    <a:prstGeom prst="rect"/>
+                    <a:ln/>
+                  </pic:spPr>
+                </pic:pic>
+              </a:graphicData>
+            </a:graphic>
+          </wp:inline>
+        </w:drawing>
+      </w:r>
+      <w:r>
+        <w:rPr>
+          <w:rtl w:val="0"/>
+        </w:rPr>
+      </w:r>
+    </w:p>
+    <w:p>
+      <w:pPr>
+        <w:spacing w:after="120" w:before="0" w:line="240" w:lineRule="auto"/>
+        <w:ind w:left="0" w:firstLine="0"/>
+        <w:jc w:val="center"/>
+        <w:rPr>
+          <w:sz w:val="20"/>
+          <w:szCs w:val="20"/>
+        </w:rPr>
+      </w:pPr>
+      <w:r>
+        <w:rPr>
+          <w:sz w:val="20"/>
+          <w:szCs w:val="20"/>
+          <w:rtl w:val="0"/>
+        </w:rPr>
+        <w:t xml:space="preserve">Figura 4 — Classificação dos movimentos de massa de acordo com a velocidade, o comportamento do material e o grau de interação entre os grãos</w:t>
+      </w:r>
+    </w:p>
+    <w:p>
+      <w:pPr>
+        <w:spacing w:after="120" w:before="0" w:line="240" w:lineRule="auto"/>
+        <w:ind w:left="0" w:firstLine="0"/>
+        <w:jc w:val="center"/>
+        <w:rPr>
+          <w:sz w:val="20"/>
+          <w:szCs w:val="20"/>
+        </w:rPr>
+      </w:pPr>
+      <w:r>
+        <w:rPr>
+          <w:sz w:val="20"/>
+          <w:szCs w:val="20"/>
+          <w:rtl w:val="0"/>
+        </w:rPr>
+        <w:t xml:space="preserve">Fonte: traduzido e adaptado de Posamentier &amp; Martinsen (2011).</w:t>
+      </w:r>
+    </w:p>
+    <w:p>
+      <w:pPr>
+        <w:spacing w:after="120" w:line="360" w:lineRule="auto"/>
+        <w:ind w:left="0" w:firstLine="709"/>
+        <w:jc w:val="both"/>
+        <w:rPr/>
+      </w:pPr>
+      <w:r>
+        <w:rPr>
+          <w:rtl w:val="0"/>
+        </w:rPr>
+        <w:t xml:space="preserve">Além de modificarem a morfologia do fundo marinho, esses processos influenciam a organização do registro sedimentar em águas profundas. Em algumas sucessões, os depósitos associados aos movimentos de massa representam uma parcela expressiva da seção estratigráfica, podendo interferir na distribuição e na conectividade dos reservatórios, bem como atuar como barreiras ao fluxo de fluidos. Também constituem riscos geológicos importantes, pois podem danificar cabos submarinos, plataformas e outras estruturas instaladas no fundo do mar, além de, em determinados casos, desencadear tsunamis (Posamentier &amp; Martinsen, 2011).</w:t>
+      </w:r>
+    </w:p>
+    <w:p>
+      <w:pPr>
+        <w:spacing w:after="120" w:line="360" w:lineRule="auto"/>
+        <w:ind w:left="0" w:firstLine="709"/>
+        <w:jc w:val="both"/>
+        <w:rPr/>
+      </w:pPr>
+      <w:r>
+        <w:rPr>
+          <w:rtl w:val="0"/>
+        </w:rPr>
+        <w:t xml:space="preserve">Os movimentos de massa não devem ser entendidos como processos isolados ou necessariamente constantes durante todo o deslocamento. Eles fazem parte de um contínuo, no qual o comportamento da massa pode se modificar progressivamente. Um material inicialmente deslocado como um bloco relativamente coerente pode sofrer deformação interna, fragmentar-se e, com a incorporação de água, evoluir para um fluxo de detritos. Em alguns casos, a desagregação e a diluição da massa podem resultar na formação de uma corrente de turbidez. Dessa forma, diferentes mecanismos de transporte podem ocorrer durante um mesmo evento e produzir depósitos com características internas variadas (Posamentier &amp; Martinsen, 2011; Scarselli, 2020).</w:t>
+      </w:r>
+    </w:p>
+    <w:p>
+      <w:pPr>
+        <w:spacing w:after="120" w:line="360" w:lineRule="auto"/>
+        <w:ind w:left="0" w:firstLine="709"/>
+        <w:jc w:val="both"/>
+        <w:rPr/>
+      </w:pPr>
+      <w:r>
+        <w:rPr>
+          <w:rtl w:val="0"/>
+        </w:rPr>
+        <w:t xml:space="preserve">Nesse contexto, é necessário diferenciar o movimento de massa do produto sedimentar resultante. O termo depósito de transporte de massa, ou </w:t>
+      </w:r>
+      <w:r>
+        <w:rPr>
+          <w:i w:val="1"/>
+          <w:iCs w:val="1"/>
+          <w:rtl w:val="0"/>
+        </w:rPr>
+        <w:t xml:space="preserve">mass-transport deposit</w:t>
+      </w:r>
+      <w:r>
+        <w:rPr>
+          <w:rtl w:val="0"/>
+        </w:rPr>
+        <w:t xml:space="preserve"> (MTD), refere-se ao corpo sedimentar formado pela deposição do material transportado gravitacionalmente. Em sentido estrito, esse termo é aplicado aos depósitos originados pelo deslocamento </w:t>
+      </w:r>
+      <w:r>
+        <w:rPr>
+          <w:i w:val="1"/>
+          <w:iCs w:val="1"/>
+          <w:rtl w:val="0"/>
+        </w:rPr>
+        <w:t xml:space="preserve">en masse</w:t>
+      </w:r>
+      <w:r>
+        <w:rPr>
+          <w:rtl w:val="0"/>
+        </w:rPr>
+        <w:t xml:space="preserve">, no qual os grãos mantêm algum grau de interação entre si e o principal mecanismo de sustentação do material não é a turbulência do fluido. Por essa razão, Posamentier &amp; Martinsen (2011) não incluem os turbiditos entre os MTDs, embora reconheçam que um mesmo evento possa produzir tanto depósitos de transporte de massa quanto depósitos relacionados a correntes de turbidez.</w:t>
+      </w:r>
+    </w:p>
+    <w:p>
+      <w:pPr>
+        <w:spacing w:after="120" w:line="360" w:lineRule="auto"/>
+        <w:ind w:left="0" w:firstLine="709"/>
+        <w:jc w:val="both"/>
+        <w:rPr/>
+      </w:pPr>
+      <w:r>
+        <w:rPr>
+          <w:rtl w:val="0"/>
+        </w:rPr>
+        <w:t xml:space="preserve">A distinção entre os termos MTD e complexo de transporte de massa, ou </w:t>
+      </w:r>
+      <w:r>
+        <w:rPr>
+          <w:i w:val="1"/>
+          <w:iCs w:val="1"/>
+          <w:rtl w:val="0"/>
+        </w:rPr>
+        <w:t xml:space="preserve">mass-transport complex</w:t>
+      </w:r>
+      <w:r>
+        <w:rPr>
+          <w:rtl w:val="0"/>
+        </w:rPr>
+        <w:t xml:space="preserve"> (MTC), não é uniforme na literatura. Alguns autores utilizam as duas expressões como sinônimos, enquanto outros empregam MTD para indicar um depósito individual, formado durante um único evento, e MTC para designar um corpo composto pelo empilhamento ou pela amalgamação de dois ou mais MTDs. Essa variação terminológica dificulta a comparação entre diferentes estudos, principalmente quando a resolução dos dados sísmicos não permite determinar se o corpo foi formado por um ou por vários episódios de transporte (Ortiz-Karpf, 2016).</w:t>
+      </w:r>
+    </w:p>
+    <w:p>
+      <w:pPr>
+        <w:spacing w:after="120" w:line="360" w:lineRule="auto"/>
+        <w:ind w:left="0" w:firstLine="709"/>
+        <w:jc w:val="both"/>
+        <w:rPr/>
+      </w:pPr>
+      <w:r>
+        <w:rPr>
+          <w:rtl w:val="0"/>
+        </w:rPr>
+        <w:t xml:space="preserve">Para evitar essa ambiguidade, neste trabalho o termo MTD será adotado como denominação padrão para as unidades interpretadas como produtos de movimentos de massa. O termo MTC será empregado somente quando houver evidências claras de que a unidade é composta por depósitos relacionados a mais de um evento. Essas evidências podem incluir a identificação de corpos internamente individualizados, superfícies que separem diferentes unidades ou relações de empilhamento e amalgamação que indiquem episódios sucessivos de ruptura, transporte e deposição. Quando não for possível demonstrar a ocorrência de múltiplos eventos, a unidade será tratada como MTD, mesmo que apresente grande extensão ou elevada espessura.</w:t>
+      </w:r>
+    </w:p>
+    <w:p>
+      <w:pPr>
+        <w:pStyle w:val="Heading3"/>
         <w:jc w:val="left"/>
+        <w:rPr>
+          <w:b w:val="0"/>
+          <w:bCs w:val="0"/>
+        </w:rPr>
+      </w:pPr>
+      <w:bookmarkStart w:colFirst="0" w:colLast="0" w:name="_a2mvyzh9o22m" w:id="4"/>
+      <w:bookmarkEnd w:id="4"/>
+      <w:r>
+        <w:rPr>
+          <w:b w:val="0"/>
+          <w:bCs w:val="0"/>
+          <w:rtl w:val="0"/>
+        </w:rPr>
+        <w:t xml:space="preserve">2.3.1 Mecanismos de ruptura</w:t>
+      </w:r>
+    </w:p>
+    <w:p>
+      <w:pPr>
+        <w:spacing w:after="120" w:line="360" w:lineRule="auto"/>
+        <w:ind w:left="0" w:firstLine="709"/>
+        <w:jc w:val="both"/>
+        <w:rPr/>
+      </w:pPr>
+      <w:r>
+        <w:rPr>
+          <w:rtl w:val="0"/>
+        </w:rPr>
+        <w:t xml:space="preserve">Os movimentos de massa submarinos ocorrem quando as tensões que favorecem o deslocamento do material ao longo do talude superam a resistência ao cisalhamento dos sedimentos ou das rochas. A gravidade constitui a principal força responsável pelo movimento, mas outros processos, como terremotos, erosão e acúmulo de sedimentos, podem aumentar as tensões atuantes ou reduzir a resistência do material. A estabilidade do talude depende, portanto, do equilíbrio entre as forças resistentes e as forças que favorecem o deslocamento (Hampton et al., 1996).</w:t>
+      </w:r>
+    </w:p>
+    <w:p>
+      <w:pPr>
+        <w:pStyle w:val="Heading4"/>
+        <w:jc w:val="left"/>
+        <w:rPr>
+          <w:rFonts w:ascii="Times New Roman" w:cs="Times New Roman" w:eastAsia="Times New Roman" w:hAnsi="Times New Roman"/>
+          <w:b w:val="0"/>
+          <w:bCs w:val="0"/>
+        </w:rPr>
+      </w:pPr>
+      <w:bookmarkStart w:colFirst="0" w:colLast="0" w:name="_s033fpnlnvlq" w:id="5"/>
+      <w:bookmarkEnd w:id="5"/>
+      <w:r>
+        <w:rPr>
+          <w:rFonts w:ascii="Times New Roman" w:cs="Times New Roman" w:eastAsia="Times New Roman" w:hAnsi="Times New Roman"/>
+          <w:b w:val="0"/>
+          <w:bCs w:val="0"/>
+          <w:rtl w:val="0"/>
+        </w:rPr>
+        <w:t xml:space="preserve">Fator de segurança</w:t>
+      </w:r>
+    </w:p>
+    <w:p>
+      <w:pPr>
+        <w:spacing w:after="120" w:line="360" w:lineRule="auto"/>
+        <w:ind w:left="0" w:firstLine="709"/>
+        <w:jc w:val="both"/>
+        <w:rPr/>
+      </w:pPr>
+      <w:r>
+        <w:rPr>
+          <w:rtl w:val="0"/>
+        </w:rPr>
+        <w:t xml:space="preserve">A condição de estabilidade pode ser inicialmente avaliada por meio do fator de segurança (FS), definido pela razão entre a resistência disponível ao cisalhamento e a tensão cisalhante mobilizada ao longo de uma superfície potencial de ruptura:</w:t>
+      </w:r>
+    </w:p>
+    <w:p>
+      <w:pPr>
+        <w:spacing w:after="120" w:before="120" w:line="360" w:lineRule="auto"/>
+        <w:ind w:left="0" w:firstLine="0"/>
+        <w:jc w:val="center"/>
+        <w:rPr/>
+      </w:pPr>
+      <w:r>
+        <w:rPr>
+          <w:rtl w:val="0"/>
+        </w:rPr>
+        <w:t xml:space="preserve">FS = τf / τm    (1)</w:t>
+      </w:r>
+    </w:p>
+    <w:p>
+      <w:pPr>
+        <w:spacing w:after="120" w:line="360" w:lineRule="auto"/>
+        <w:ind w:left="0" w:firstLine="709"/>
+        <w:jc w:val="both"/>
+        <w:rPr/>
+      </w:pPr>
+      <w:r>
+        <w:rPr>
+          <w:rtl w:val="0"/>
+        </w:rPr>
+        <w:t xml:space="preserve">em que:</w:t>
+      </w:r>
+    </w:p>
+    <w:p>
+      <w:pPr>
+        <w:numPr>
+          <w:ilvl w:val="0"/>
+          <w:numId w:val="4"/>
+        </w:numPr>
+        <w:spacing w:after="120" w:line="360" w:lineRule="auto"/>
+        <w:ind w:left="0" w:firstLine="709"/>
+        <w:jc w:val="both"/>
+        <w:rPr/>
+      </w:pPr>
+      <w:r>
+        <w:rPr>
+          <w:rtl w:val="0"/>
+        </w:rPr>
+        <w:t xml:space="preserve">FS é o fator de segurança;</w:t>
+      </w:r>
+    </w:p>
+    <w:p>
+      <w:pPr>
+        <w:numPr>
+          <w:ilvl w:val="0"/>
+          <w:numId w:val="4"/>
+        </w:numPr>
+        <w:spacing w:after="120" w:line="360" w:lineRule="auto"/>
+        <w:ind w:left="0" w:firstLine="709"/>
+        <w:jc w:val="both"/>
+        <w:rPr/>
+      </w:pPr>
+      <w:r>
+        <w:rPr>
+          <w:rtl w:val="0"/>
+        </w:rPr>
+        <w:t xml:space="preserve">τf é a resistência ao cisalhamento do material;</w:t>
+      </w:r>
+    </w:p>
+    <w:p>
+      <w:pPr>
+        <w:numPr>
+          <w:ilvl w:val="0"/>
+          <w:numId w:val="4"/>
+        </w:numPr>
+        <w:spacing w:after="120" w:line="360" w:lineRule="auto"/>
+        <w:ind w:left="0" w:firstLine="709"/>
+        <w:jc w:val="both"/>
+        <w:rPr/>
+      </w:pPr>
+      <w:r>
+        <w:rPr>
+          <w:rtl w:val="0"/>
+        </w:rPr>
+        <w:t xml:space="preserve">τm é a tensão cisalhante mobilizada ao longo da superfície potencial de ruptura.</w:t>
+      </w:r>
+    </w:p>
+    <w:p>
+      <w:pPr>
+        <w:spacing w:after="120" w:line="360" w:lineRule="auto"/>
+        <w:ind w:left="0" w:firstLine="709"/>
+        <w:jc w:val="both"/>
+        <w:rPr/>
+      </w:pPr>
+      <w:r>
+        <w:rPr>
+          <w:rtl w:val="0"/>
+        </w:rPr>
+        <w:t xml:space="preserve">Quando FS &gt; 1, a resistência disponível é superior à tensão mobilizada e o talude é considerado estável. Quando FS = 1, o sistema encontra-se na condição limite de equilíbrio. Valores de FS &lt; 1 indicam que as tensões atuantes superaram a resistência do material, levando à ruptura. Embora essa relação seja simplificada, ela permite compreender como diferentes processos ambientais e geológicos podem modificar a estabilidade do talude.</w:t>
+      </w:r>
+    </w:p>
+    <w:p>
+      <w:pPr>
+        <w:pStyle w:val="Heading4"/>
+        <w:jc w:val="left"/>
+        <w:rPr>
+          <w:rFonts w:ascii="Times New Roman" w:cs="Times New Roman" w:eastAsia="Times New Roman" w:hAnsi="Times New Roman"/>
+          <w:b w:val="0"/>
+          <w:bCs w:val="0"/>
+        </w:rPr>
+      </w:pPr>
+      <w:bookmarkStart w:colFirst="0" w:colLast="0" w:name="_m5qkttbybalp" w:id="6"/>
+      <w:bookmarkEnd w:id="6"/>
+      <w:r>
+        <w:rPr>
+          <w:rFonts w:ascii="Times New Roman" w:cs="Times New Roman" w:eastAsia="Times New Roman" w:hAnsi="Times New Roman"/>
+          <w:b w:val="0"/>
+          <w:bCs w:val="0"/>
+          <w:rtl w:val="0"/>
+        </w:rPr>
+        <w:t xml:space="preserve">Critério de ruptura de Mohr-Coulomb</w:t>
+      </w:r>
+    </w:p>
+    <w:p>
+      <w:pPr>
+        <w:spacing w:after="120" w:line="360" w:lineRule="auto"/>
+        <w:ind w:left="0" w:firstLine="709"/>
+        <w:jc w:val="both"/>
+        <w:rPr/>
+      </w:pPr>
+      <w:r>
+        <w:rPr>
+          <w:rtl w:val="0"/>
+        </w:rPr>
+        <w:t xml:space="preserve">Um dos modelos mais empregados na análise da estabilidade de taludes é o critério de ruptura de Mohr-Coulomb. Segundo esse critério, a resistência ao cisalhamento do sedimento é determinada pela coesão do material e pelo atrito desenvolvido entre suas partículas:</w:t>
+      </w:r>
+    </w:p>
+    <w:p>
+      <w:pPr>
+        <w:spacing w:after="120" w:before="120" w:line="360" w:lineRule="auto"/>
+        <w:ind w:left="0" w:firstLine="0"/>
+        <w:jc w:val="center"/>
+        <w:rPr/>
+      </w:pPr>
+      <w:r>
+        <w:rPr>
+          <w:rtl w:val="0"/>
+        </w:rPr>
+        <w:t xml:space="preserve">τf = c′ + σ′n tan φ′    (2)</w:t>
+      </w:r>
+    </w:p>
+    <w:p>
+      <w:pPr>
+        <w:spacing w:after="120" w:line="360" w:lineRule="auto"/>
+        <w:ind w:left="0" w:firstLine="709"/>
+        <w:jc w:val="both"/>
+        <w:rPr/>
+      </w:pPr>
+      <w:r>
+        <w:rPr>
+          <w:rtl w:val="0"/>
+        </w:rPr>
+        <w:t xml:space="preserve">em que:</w:t>
+      </w:r>
+    </w:p>
+    <w:p>
+      <w:pPr>
+        <w:numPr>
+          <w:ilvl w:val="0"/>
+          <w:numId w:val="1"/>
+        </w:numPr>
+        <w:spacing w:after="120" w:line="360" w:lineRule="auto"/>
+        <w:ind w:left="0" w:firstLine="709"/>
+        <w:jc w:val="both"/>
+        <w:rPr/>
+      </w:pPr>
+      <w:r>
+        <w:rPr>
+          <w:rtl w:val="0"/>
+        </w:rPr>
+        <w:t xml:space="preserve">τf é a resistência ao cisalhamento;</w:t>
+      </w:r>
+    </w:p>
+    <w:p>
+      <w:pPr>
+        <w:numPr>
+          <w:ilvl w:val="0"/>
+          <w:numId w:val="1"/>
+        </w:numPr>
+        <w:spacing w:after="120" w:line="360" w:lineRule="auto"/>
+        <w:ind w:left="0" w:firstLine="709"/>
+        <w:jc w:val="both"/>
+        <w:rPr/>
+      </w:pPr>
+      <w:r>
+        <w:rPr>
+          <w:rtl w:val="0"/>
+        </w:rPr>
+        <w:t xml:space="preserve">c′ é a coesão efetiva do material;</w:t>
+      </w:r>
+    </w:p>
+    <w:p>
+      <w:pPr>
+        <w:numPr>
+          <w:ilvl w:val="0"/>
+          <w:numId w:val="1"/>
+        </w:numPr>
+        <w:spacing w:after="120" w:line="360" w:lineRule="auto"/>
+        <w:ind w:left="0" w:firstLine="709"/>
+        <w:jc w:val="both"/>
+        <w:rPr/>
+      </w:pPr>
+      <w:r>
+        <w:rPr>
+          <w:rtl w:val="0"/>
+        </w:rPr>
+        <w:t xml:space="preserve">σ′n é a tensão normal efetiva atuante sobre a superfície de ruptura;</w:t>
+      </w:r>
+    </w:p>
+    <w:p>
+      <w:pPr>
+        <w:numPr>
+          <w:ilvl w:val="0"/>
+          <w:numId w:val="1"/>
+        </w:numPr>
+        <w:spacing w:after="120" w:line="360" w:lineRule="auto"/>
+        <w:ind w:left="0" w:firstLine="709"/>
+        <w:jc w:val="both"/>
+        <w:rPr/>
+      </w:pPr>
+      <w:r>
+        <w:rPr>
+          <w:rtl w:val="0"/>
+        </w:rPr>
+        <w:t xml:space="preserve">φ′ é o ângulo de atrito interno efetivo;</w:t>
+      </w:r>
+    </w:p>
+    <w:p>
+      <w:pPr>
+        <w:numPr>
+          <w:ilvl w:val="0"/>
+          <w:numId w:val="1"/>
+        </w:numPr>
+        <w:spacing w:after="120" w:line="360" w:lineRule="auto"/>
+        <w:ind w:left="0" w:firstLine="709"/>
+        <w:jc w:val="both"/>
+        <w:rPr/>
+      </w:pPr>
+      <w:r>
+        <w:rPr>
+          <w:rtl w:val="0"/>
+        </w:rPr>
+        <w:t xml:space="preserve">tan φ′ representa o coeficiente de atrito interno.</w:t>
+      </w:r>
+    </w:p>
+    <w:p>
+      <w:pPr>
+        <w:spacing w:after="120" w:line="360" w:lineRule="auto"/>
+        <w:ind w:left="0" w:firstLine="709"/>
+        <w:jc w:val="both"/>
+        <w:rPr/>
+      </w:pPr>
+      <w:r>
+        <w:rPr>
+          <w:rtl w:val="0"/>
+        </w:rPr>
+        <w:t xml:space="preserve">A coesão está relacionada às forças que mantêm as partículas unidas, como cimentação e interações físico-químicas. O ângulo de atrito interno representa a resistência produzida pelo atrito e pelo imbricamento entre os grãos. Em sedimentos marinhos inconsolidados, a resistência é frequentemente controlada pela tensão efetiva e pelo atrito interno, embora camadas cimentadas ou sedimentos coesivos também possam apresentar uma parcela significativa de coesão.</w:t>
+      </w:r>
+    </w:p>
+    <w:p>
+      <w:pPr>
+        <w:pStyle w:val="Heading4"/>
+        <w:jc w:val="left"/>
+        <w:rPr>
+          <w:rFonts w:ascii="Times New Roman" w:cs="Times New Roman" w:eastAsia="Times New Roman" w:hAnsi="Times New Roman"/>
+          <w:b w:val="0"/>
+          <w:bCs w:val="0"/>
+        </w:rPr>
+      </w:pPr>
+      <w:bookmarkStart w:colFirst="0" w:colLast="0" w:name="_o97v7vltv7hk" w:id="7"/>
+      <w:bookmarkEnd w:id="7"/>
+      <w:r>
+        <w:rPr>
+          <w:rFonts w:ascii="Times New Roman" w:cs="Times New Roman" w:eastAsia="Times New Roman" w:hAnsi="Times New Roman"/>
+          <w:b w:val="0"/>
+          <w:bCs w:val="0"/>
+          <w:rtl w:val="0"/>
+        </w:rPr>
+        <w:t xml:space="preserve">Tensão efetiva e poropressão</w:t>
+      </w:r>
+    </w:p>
+    <w:p>
+      <w:pPr>
+        <w:spacing w:after="120" w:line="360" w:lineRule="auto"/>
+        <w:ind w:left="0" w:firstLine="709"/>
+        <w:jc w:val="both"/>
+        <w:rPr/>
+      </w:pPr>
+      <w:r>
+        <w:rPr>
+          <w:rtl w:val="0"/>
+        </w:rPr>
+        <w:t xml:space="preserve">Como os sedimentos marinhos estão saturados, parte da tensão total aplicada ao pacote sedimentar é sustentada pelo fluido presente nos poros. De acordo com o princípio da tensão efetiva de Terzaghi, a tensão normal efetiva pode ser expressa por:</w:t>
+      </w:r>
+    </w:p>
+    <w:p>
+      <w:pPr>
+        <w:spacing w:after="120" w:before="120" w:line="360" w:lineRule="auto"/>
+        <w:ind w:left="0" w:firstLine="0"/>
+        <w:jc w:val="center"/>
+        <w:rPr/>
+      </w:pPr>
+      <w:r>
+        <w:rPr>
+          <w:rFonts w:ascii="Cardo" w:cs="Cardo" w:eastAsia="Cardo" w:hAnsi="Cardo"/>
+          <w:rtl w:val="0"/>
+        </w:rPr>
+        <w:t xml:space="preserve">σ′n = σn − u    (3)</w:t>
+      </w:r>
+    </w:p>
+    <w:p>
+      <w:pPr>
+        <w:spacing w:after="120" w:line="360" w:lineRule="auto"/>
+        <w:ind w:left="0" w:firstLine="709"/>
+        <w:jc w:val="both"/>
+        <w:rPr/>
+      </w:pPr>
+      <w:r>
+        <w:rPr>
+          <w:rtl w:val="0"/>
+        </w:rPr>
+        <w:t xml:space="preserve">em que:</w:t>
+      </w:r>
+    </w:p>
+    <w:p>
+      <w:pPr>
+        <w:numPr>
+          <w:ilvl w:val="0"/>
+          <w:numId w:val="2"/>
+        </w:numPr>
+        <w:spacing w:after="120" w:line="360" w:lineRule="auto"/>
+        <w:ind w:left="0" w:firstLine="709"/>
+        <w:jc w:val="both"/>
+        <w:rPr/>
+      </w:pPr>
+      <w:r>
+        <w:rPr>
+          <w:rtl w:val="0"/>
+        </w:rPr>
+        <w:t xml:space="preserve">σ′n é a tensão normal efetiva;</w:t>
+      </w:r>
+    </w:p>
+    <w:p>
+      <w:pPr>
+        <w:numPr>
+          <w:ilvl w:val="0"/>
+          <w:numId w:val="2"/>
+        </w:numPr>
+        <w:spacing w:after="120" w:line="360" w:lineRule="auto"/>
+        <w:ind w:left="0" w:firstLine="709"/>
+        <w:jc w:val="both"/>
+        <w:rPr/>
+      </w:pPr>
+      <w:r>
+        <w:rPr>
+          <w:rtl w:val="0"/>
+        </w:rPr>
+        <w:t xml:space="preserve">σn é a tensão normal total;</w:t>
+      </w:r>
+    </w:p>
+    <w:p>
+      <w:pPr>
+        <w:numPr>
+          <w:ilvl w:val="0"/>
+          <w:numId w:val="2"/>
+        </w:numPr>
+        <w:spacing w:after="120" w:line="360" w:lineRule="auto"/>
+        <w:ind w:left="0" w:firstLine="709"/>
+        <w:jc w:val="both"/>
+        <w:rPr/>
+      </w:pPr>
+      <w:r>
+        <w:rPr>
+          <w:rtl w:val="0"/>
+        </w:rPr>
+        <w:t xml:space="preserve">u é a pressão do fluido nos poros, ou poropressão.</w:t>
+      </w:r>
+    </w:p>
+    <w:p>
+      <w:pPr>
+        <w:spacing w:after="120" w:line="360" w:lineRule="auto"/>
+        <w:ind w:left="0" w:firstLine="709"/>
+        <w:jc w:val="both"/>
+        <w:rPr/>
+      </w:pPr>
+      <w:r>
+        <w:rPr>
+          <w:rtl w:val="0"/>
+        </w:rPr>
+        <w:t xml:space="preserve">Substituindo a Equação 3 no critério de Mohr-Coulomb, obtém-se:</w:t>
+      </w:r>
+    </w:p>
+    <w:p>
+      <w:pPr>
+        <w:spacing w:after="120" w:before="120" w:line="360" w:lineRule="auto"/>
+        <w:ind w:left="0" w:firstLine="0"/>
+        <w:jc w:val="center"/>
+        <w:rPr/>
+      </w:pPr>
+      <w:r>
+        <w:rPr>
+          <w:rFonts w:ascii="Cardo" w:cs="Cardo" w:eastAsia="Cardo" w:hAnsi="Cardo"/>
+          <w:rtl w:val="0"/>
+        </w:rPr>
+        <w:t xml:space="preserve">τf = c′ + (σn − u) tan φ′    (4)</w:t>
+      </w:r>
+    </w:p>
+    <w:p>
+      <w:pPr>
+        <w:spacing w:after="120" w:line="360" w:lineRule="auto"/>
+        <w:ind w:left="0" w:firstLine="709"/>
+        <w:jc w:val="both"/>
+        <w:rPr/>
+      </w:pPr>
+      <w:r>
+        <w:rPr>
+          <w:rtl w:val="0"/>
+        </w:rPr>
+        <w:t xml:space="preserve">Com isso, o fator de segurança pode ser representado de forma simplificada por:</w:t>
+      </w:r>
+    </w:p>
+    <w:p>
+      <w:pPr>
+        <w:spacing w:after="120" w:before="120" w:line="360" w:lineRule="auto"/>
+        <w:ind w:left="0" w:firstLine="0"/>
+        <w:jc w:val="center"/>
+        <w:rPr/>
+      </w:pPr>
+      <w:r>
+        <w:rPr>
+          <w:rFonts w:ascii="Cardo" w:cs="Cardo" w:eastAsia="Cardo" w:hAnsi="Cardo"/>
+          <w:rtl w:val="0"/>
+        </w:rPr>
+        <w:t xml:space="preserve">FS = [c′ + (σn − u) tan φ′] / τm    (5)</w:t>
+      </w:r>
+    </w:p>
+    <w:p>
+      <w:pPr>
+        <w:spacing w:after="120" w:line="360" w:lineRule="auto"/>
+        <w:ind w:left="0" w:firstLine="709"/>
+        <w:jc w:val="both"/>
+        <w:rPr/>
+      </w:pPr>
+      <w:r>
+        <w:rPr>
+          <w:rtl w:val="0"/>
+        </w:rPr>
+        <w:t xml:space="preserve">As equações mostram que o aumento da poropressão reduz a tensão efetiva e, consequentemente, a resistência ao cisalhamento. Quando a poropressão se aproxima da tensão normal total, a tensão efetiva tende a valores muito baixos e o sedimento perde grande parte de sua resistência. Nessas condições, mesmo um pequeno aumento da tensão cisalhante pode provocar a ruptura. Por essa razão, o excesso de poropressão é considerado um dos principais elementos envolvidos na instabilidade dos taludes submarinos (Hampton et al., 1996; Talling et al., 2014).</w:t>
+      </w:r>
+    </w:p>
+    <w:p>
+      <w:pPr>
+        <w:pStyle w:val="Heading4"/>
+        <w:jc w:val="left"/>
+        <w:rPr>
+          <w:rFonts w:ascii="Times New Roman" w:cs="Times New Roman" w:eastAsia="Times New Roman" w:hAnsi="Times New Roman"/>
+          <w:b w:val="0"/>
+          <w:bCs w:val="0"/>
+        </w:rPr>
+      </w:pPr>
+      <w:bookmarkStart w:colFirst="0" w:colLast="0" w:name="_ighlknxj0qpm" w:id="8"/>
+      <w:bookmarkEnd w:id="8"/>
+      <w:r>
+        <w:rPr>
+          <w:rFonts w:ascii="Times New Roman" w:cs="Times New Roman" w:eastAsia="Times New Roman" w:hAnsi="Times New Roman"/>
+          <w:b w:val="0"/>
+          <w:bCs w:val="0"/>
+          <w:rtl w:val="0"/>
+        </w:rPr>
+        <w:t xml:space="preserve">2.3.1.1 Fatores condicionantes e mecanismos de gatilho </w:t>
+      </w:r>
+    </w:p>
+    <w:p>
+      <w:pPr>
+        <w:spacing w:after="120" w:line="360" w:lineRule="auto"/>
+        <w:ind w:left="0" w:firstLine="709"/>
+        <w:jc w:val="both"/>
+        <w:rPr/>
+      </w:pPr>
+      <w:r>
+        <w:rPr>
+          <w:rtl w:val="0"/>
+        </w:rPr>
+        <w:t xml:space="preserve">Os processos que influenciam a estabilidade de um talude podem ser separados em fatores condicionantes e mecanismos de gatilho. Os fatores condicionantes atuam durante períodos relativamente longos, deixando o pacote sedimentar progressivamente mais suscetível à ruptura. Entre eles estão a presença de camadas fracas, a baixa permeabilidade, a elevada porosidade, a rápida acumulação sedimentar e a deformação tectônica.</w:t>
+      </w:r>
+    </w:p>
+    <w:p>
+      <w:pPr>
+        <w:spacing w:after="120" w:line="360" w:lineRule="auto"/>
+        <w:ind w:left="0" w:firstLine="709"/>
+        <w:jc w:val="both"/>
+        <w:rPr/>
+      </w:pPr>
+      <w:r>
+        <w:rPr>
+          <w:rtl w:val="0"/>
+        </w:rPr>
+        <w:t xml:space="preserve">Os gatilhos correspondem a perturbações de curta duração que levam um talude já suscetível a ultrapassar o limite de estabilidade. Um mesmo processo, entretanto, pode atuar como condicionante ou como gatilho, dependendo de sua intensidade e duração. A ruptura também pode resultar da combinação de diferentes processos, sem que seja possível atribuí-la a um único mecanismo (Lee et al., 2007; Scarselli, 2020).</w:t>
+      </w:r>
+    </w:p>
+    <w:p>
+      <w:pPr>
+        <w:pStyle w:val="Heading4"/>
+        <w:jc w:val="left"/>
+        <w:rPr>
+          <w:rFonts w:ascii="Times New Roman" w:cs="Times New Roman" w:eastAsia="Times New Roman" w:hAnsi="Times New Roman"/>
+          <w:b w:val="0"/>
+          <w:bCs w:val="0"/>
+        </w:rPr>
+      </w:pPr>
+      <w:bookmarkStart w:colFirst="0" w:colLast="0" w:name="_poexuqct3yzg" w:id="9"/>
+      <w:bookmarkEnd w:id="9"/>
+      <w:r>
+        <w:rPr>
+          <w:rFonts w:ascii="Times New Roman" w:cs="Times New Roman" w:eastAsia="Times New Roman" w:hAnsi="Times New Roman"/>
+          <w:b w:val="0"/>
+          <w:bCs w:val="0"/>
+          <w:rtl w:val="0"/>
+        </w:rPr>
+        <w:t xml:space="preserve">Sedimentação rápida</w:t>
+      </w:r>
+    </w:p>
+    <w:p>
+      <w:pPr>
+        <w:spacing w:after="120" w:line="360" w:lineRule="auto"/>
+        <w:ind w:left="0" w:firstLine="709"/>
+        <w:jc w:val="both"/>
+        <w:rPr/>
+      </w:pPr>
+      <w:r>
+        <w:rPr>
+          <w:rtl w:val="0"/>
+        </w:rPr>
+        <w:t xml:space="preserve">Quando a acumulação sedimentar ocorre mais rapidamente do que a drenagem dos fluidos, a água presente nos poros não consegue ser expulsa na mesma velocidade em que a carga aumenta. Parte da nova carga passa a ser sustentada pelo fluido, gerando excesso de poropressão e mantendo reduzida a tensão efetiva. Ao mesmo tempo, o aumento da espessura do pacote eleva as tensões gravitacionais atuantes no talude. A combinação entre aumento da carga e baixa resistência pode levar o sedimento à ruptura (Lee et al., 2007; Talling et al., 2014).</w:t>
+      </w:r>
+    </w:p>
+    <w:p>
+      <w:pPr>
+        <w:spacing w:after="120" w:line="360" w:lineRule="auto"/>
+        <w:ind w:left="0" w:firstLine="709"/>
+        <w:jc w:val="both"/>
+        <w:rPr/>
+      </w:pPr>
+      <w:r>
+        <w:rPr>
+          <w:rtl w:val="0"/>
+        </w:rPr>
+        <w:t xml:space="preserve">A eficiência desse mecanismo depende da taxa de deposição, da permeabilidade, da compressibilidade e da capacidade de drenagem dos sedimentos. Por isso, a sedimentação rápida é particularmente importante em deltas, leques submarinos e margens que recebem grande aporte sedimentar. Em áreas caracterizadas por baixas taxas de sedimentação, entretanto, esse processo dificilmente explica a ruptura de forma isolada, sendo necessária a presença de camadas fracas ou de outros mecanismos de instabilidade (Urlaub et al., 2015).</w:t>
+      </w:r>
+    </w:p>
+    <w:p>
+      <w:pPr>
+        <w:pStyle w:val="Heading4"/>
+        <w:jc w:val="left"/>
+        <w:rPr>
+          <w:rFonts w:ascii="Times New Roman" w:cs="Times New Roman" w:eastAsia="Times New Roman" w:hAnsi="Times New Roman"/>
+          <w:b w:val="0"/>
+          <w:bCs w:val="0"/>
+        </w:rPr>
+      </w:pPr>
+      <w:bookmarkStart w:colFirst="0" w:colLast="0" w:name="_9n80vwatxpxv" w:id="10"/>
+      <w:bookmarkEnd w:id="10"/>
+      <w:r>
+        <w:rPr>
+          <w:rFonts w:ascii="Times New Roman" w:cs="Times New Roman" w:eastAsia="Times New Roman" w:hAnsi="Times New Roman"/>
+          <w:b w:val="0"/>
+          <w:bCs w:val="0"/>
+          <w:rtl w:val="0"/>
+        </w:rPr>
+        <w:t xml:space="preserve">Abalos sísmicos</w:t>
+      </w:r>
+    </w:p>
+    <w:p>
+      <w:pPr>
+        <w:spacing w:after="120" w:line="360" w:lineRule="auto"/>
+        <w:ind w:left="0" w:firstLine="709"/>
+        <w:jc w:val="both"/>
+        <w:rPr/>
+      </w:pPr>
+      <w:r>
+        <w:rPr>
+          <w:rtl w:val="0"/>
+        </w:rPr>
+        <w:t xml:space="preserve">Os terremotos produzem acelerações horizontais e verticais que aumentam temporariamente as tensões de cisalhamento no pacote sedimentar. Como o carregamento é cíclico e ocorre em um intervalo curto, a poropressão gerada durante o abalo pode não se dissipar, reduzindo a tensão efetiva e a resistência do material.</w:t>
+      </w:r>
+    </w:p>
+    <w:p>
+      <w:pPr>
+        <w:spacing w:after="120" w:line="360" w:lineRule="auto"/>
+        <w:ind w:left="0" w:firstLine="709"/>
+        <w:jc w:val="both"/>
+        <w:rPr/>
+      </w:pPr>
+      <w:r>
+        <w:rPr>
+          <w:rtl w:val="0"/>
+        </w:rPr>
+        <w:t xml:space="preserve">Em sedimentos arenosos ou siltosos pouco consolidados, o carregamento cíclico pode causar liquefação, condição na qual os grãos perdem parte do contato entre si e a carga passa a ser sustentada principalmente pela água intersticial. Em materiais coesivos, a perturbação pode provocar remoldamento e perda de resistência. A capacidade de um terremoto desencadear a ruptura depende de fatores como magnitude, duração, distância da fonte sísmica e propriedades geotécnicas dos sedimentos (Hampton et al., 1996; Sultan et al., 2004).</w:t>
+      </w:r>
+    </w:p>
+    <w:p>
+      <w:pPr>
+        <w:pStyle w:val="Heading4"/>
+        <w:jc w:val="left"/>
+        <w:rPr>
+          <w:rFonts w:ascii="Times New Roman" w:cs="Times New Roman" w:eastAsia="Times New Roman" w:hAnsi="Times New Roman"/>
+          <w:b w:val="0"/>
+          <w:bCs w:val="0"/>
+        </w:rPr>
+      </w:pPr>
+      <w:bookmarkStart w:colFirst="0" w:colLast="0" w:name="_31vrup95l38p" w:id="11"/>
+      <w:bookmarkEnd w:id="11"/>
+      <w:r>
+        <w:rPr>
+          <w:rFonts w:ascii="Times New Roman" w:cs="Times New Roman" w:eastAsia="Times New Roman" w:hAnsi="Times New Roman"/>
+          <w:b w:val="0"/>
+          <w:bCs w:val="0"/>
+          <w:rtl w:val="0"/>
+        </w:rPr>
+        <w:t xml:space="preserve">Erosão e aumento da inclinação</w:t>
+      </w:r>
+    </w:p>
+    <w:p>
+      <w:pPr>
+        <w:spacing w:after="120" w:line="360" w:lineRule="auto"/>
+        <w:ind w:left="0" w:firstLine="709"/>
+        <w:jc w:val="both"/>
+        <w:rPr/>
+      </w:pPr>
+      <w:r>
+        <w:rPr>
+          <w:rtl w:val="0"/>
+        </w:rPr>
+        <w:t xml:space="preserve">A erosão causada por correntes de fundo, correntes de turbidez ou fluxos de detritos é comum nas margens de canais e cânions submarinos. A remoção de sedimentos na base de uma encosta reduz o suporte do pacote localizado acima e aumenta localmente a inclinação do talude. Como consequência, ocorre aumento da tensão cisalhante associada à gravidade.</w:t>
+      </w:r>
+    </w:p>
+    <w:p>
+      <w:pPr>
+        <w:spacing w:after="120" w:line="360" w:lineRule="auto"/>
+        <w:ind w:left="0" w:firstLine="709"/>
+        <w:jc w:val="both"/>
+        <w:rPr/>
+      </w:pPr>
+      <w:r>
+        <w:rPr>
+          <w:rtl w:val="0"/>
+        </w:rPr>
+        <w:t xml:space="preserve">A incisão de canais e cânions também pode gerar paredes íngremes e favorecer rupturas retrogressivas. Nesses casos, a erosão pode atuar lentamente como fator condicionante ou funcionar como gatilho quando a remoção do suporte basal ocorre de maneira rápida (Lee et al., 2007; Scarselli, 2020).</w:t>
+      </w:r>
+    </w:p>
+    <w:p>
+      <w:pPr>
+        <w:pStyle w:val="Heading4"/>
+        <w:jc w:val="left"/>
+        <w:rPr>
+          <w:rFonts w:ascii="Times New Roman" w:cs="Times New Roman" w:eastAsia="Times New Roman" w:hAnsi="Times New Roman"/>
+          <w:b w:val="0"/>
+          <w:bCs w:val="0"/>
+        </w:rPr>
+      </w:pPr>
+      <w:bookmarkStart w:colFirst="0" w:colLast="0" w:name="_fqj3k2wvxmec" w:id="12"/>
+      <w:bookmarkEnd w:id="12"/>
+      <w:r>
+        <w:rPr>
+          <w:rFonts w:ascii="Times New Roman" w:cs="Times New Roman" w:eastAsia="Times New Roman" w:hAnsi="Times New Roman"/>
+          <w:b w:val="0"/>
+          <w:bCs w:val="0"/>
+          <w:rtl w:val="0"/>
+        </w:rPr>
+        <w:t xml:space="preserve">Diapirismo e deformação tectônica</w:t>
+      </w:r>
+    </w:p>
+    <w:p>
+      <w:pPr>
+        <w:spacing w:after="120" w:line="360" w:lineRule="auto"/>
+        <w:ind w:left="0" w:firstLine="709"/>
+        <w:jc w:val="both"/>
+        <w:rPr/>
+      </w:pPr>
+      <w:r>
+        <w:rPr>
+          <w:rtl w:val="0"/>
+        </w:rPr>
+        <w:t xml:space="preserve">A movimentação de camadas evaporíticas, denominada halocinese, produz estruturas como diápiros, domos e muralhas de sal. O crescimento dessas estruturas deforma os estratos sobrejacentes, modifica a geometria do fundo marinho e pode aumentar localmente a inclinação do talude. Essa deformação também favorece o desenvolvimento de falhas e fraturas, que podem funcionar como superfícies de fraqueza ou como caminhos para a migração de fluidos.</w:t>
+      </w:r>
+    </w:p>
+    <w:p>
+      <w:pPr>
+        <w:spacing w:after="120" w:line="360" w:lineRule="auto"/>
+        <w:ind w:left="0" w:firstLine="709"/>
+        <w:jc w:val="both"/>
+        <w:rPr/>
+      </w:pPr>
+      <w:r>
+        <w:rPr>
+          <w:rtl w:val="0"/>
+        </w:rPr>
+        <w:t xml:space="preserve">A tectônica salífera pode, portanto, atuar de diferentes formas: aumentando as tensões gravitacionais, criando superfícies inclinadas, fraturando o pacote sedimentar e favorecendo o desenvolvimento de sobrepressão. Em geral, o diapirismo representa um fator condicionante de longa duração, mas fases de movimentação mais intensa podem contribuir diretamente para a ruptura (Kowsmann et al., 2002).</w:t>
+      </w:r>
+    </w:p>
+    <w:p>
+      <w:pPr>
+        <w:pStyle w:val="Heading4"/>
+        <w:jc w:val="left"/>
+        <w:rPr>
+          <w:rFonts w:ascii="Times New Roman" w:cs="Times New Roman" w:eastAsia="Times New Roman" w:hAnsi="Times New Roman"/>
+          <w:b w:val="0"/>
+          <w:bCs w:val="0"/>
+        </w:rPr>
+      </w:pPr>
+      <w:bookmarkStart w:colFirst="0" w:colLast="0" w:name="_6t4xwbhkdwji" w:id="13"/>
+      <w:bookmarkEnd w:id="13"/>
+      <w:r>
+        <w:rPr>
+          <w:rFonts w:ascii="Times New Roman" w:cs="Times New Roman" w:eastAsia="Times New Roman" w:hAnsi="Times New Roman"/>
+          <w:b w:val="0"/>
+          <w:bCs w:val="0"/>
+          <w:rtl w:val="0"/>
+        </w:rPr>
+        <w:t xml:space="preserve">Migração de fluidos e gases</w:t>
+      </w:r>
+    </w:p>
+    <w:p>
+      <w:pPr>
+        <w:spacing w:after="120" w:line="360" w:lineRule="auto"/>
+        <w:ind w:left="0" w:firstLine="709"/>
+        <w:jc w:val="both"/>
+        <w:rPr/>
+      </w:pPr>
+      <w:r>
+        <w:rPr>
+          <w:rtl w:val="0"/>
+        </w:rPr>
+        <w:t xml:space="preserve">Fluidos sobrepressurizados podem migrar verticalmente através de falhas e fraturas ou lateralmente por camadas permeáveis. Quando ficam retidos sob unidades de baixa permeabilidade, provocam aumento da poropressão e redução da resistência ao cisalhamento. Chaminés de gás, vulcões de lama e pockmarks podem indicar a presença de sistemas de migração de fluidos.</w:t>
+      </w:r>
+    </w:p>
+    <w:p>
+      <w:pPr>
+        <w:spacing w:after="120" w:line="360" w:lineRule="auto"/>
+        <w:ind w:left="0" w:firstLine="709"/>
+        <w:jc w:val="both"/>
+        <w:rPr/>
+      </w:pPr>
+      <w:r>
+        <w:rPr>
+          <w:rtl w:val="0"/>
+        </w:rPr>
+        <w:t xml:space="preserve">Entretanto, essas feições não comprovam isoladamente que os fluidos tenham causado o movimento de massa. Em algumas situações, os condutos podem facilitar a drenagem e promover a dissipação da sobrepressão. Assim, a relação entre migração de fluidos e instabilidade deve ser analisada considerando a geometria, a atividade e a evolução do sistema.</w:t>
+      </w:r>
+    </w:p>
+    <w:p>
+      <w:pPr>
+        <w:pStyle w:val="Heading4"/>
+        <w:jc w:val="left"/>
+        <w:rPr>
+          <w:rFonts w:ascii="Times New Roman" w:cs="Times New Roman" w:eastAsia="Times New Roman" w:hAnsi="Times New Roman"/>
+          <w:b w:val="0"/>
+          <w:bCs w:val="0"/>
+        </w:rPr>
+      </w:pPr>
+      <w:bookmarkStart w:colFirst="0" w:colLast="0" w:name="_3nk1e2ooya3z" w:id="14"/>
+      <w:bookmarkEnd w:id="14"/>
+      <w:r>
+        <w:rPr>
+          <w:rFonts w:ascii="Times New Roman" w:cs="Times New Roman" w:eastAsia="Times New Roman" w:hAnsi="Times New Roman"/>
+          <w:b w:val="0"/>
+          <w:bCs w:val="0"/>
+          <w:rtl w:val="0"/>
+        </w:rPr>
+        <w:t xml:space="preserve">Dissociação de hidratos de gás</w:t>
+      </w:r>
+    </w:p>
+    <w:p>
+      <w:pPr>
+        <w:spacing w:after="120" w:line="360" w:lineRule="auto"/>
+        <w:ind w:left="0" w:firstLine="709"/>
+        <w:jc w:val="both"/>
+        <w:rPr/>
+      </w:pPr>
+      <w:r>
+        <w:rPr>
+          <w:rtl w:val="0"/>
+        </w:rPr>
+        <w:t xml:space="preserve">Os hidratos de gás são estáveis sob determinadas condições de pressão e temperatura. Mudanças no nível do mar, na temperatura da água de fundo ou no soterramento podem provocar sua dissociação, liberando água e gás no interior do sedimento. Essa liberação pode aumentar a poropressão e reduzir a resistência do pacote sedimentar.</w:t>
+      </w:r>
+    </w:p>
+    <w:p>
+      <w:pPr>
+        <w:spacing w:after="120" w:line="360" w:lineRule="auto"/>
+        <w:ind w:left="0" w:firstLine="709"/>
+        <w:jc w:val="both"/>
+        <w:rPr/>
+      </w:pPr>
+      <w:r>
+        <w:rPr>
+          <w:rtl w:val="0"/>
+        </w:rPr>
+        <w:t xml:space="preserve">Embora seja um mecanismo possível, a associação espacial entre depósitos de movimentos de massa e a zona de estabilidade dos hidratos não é suficiente para demonstrar uma relação causal. A atuação desse processo deve ser avaliada de acordo com a profundidade da água, a concentração de hidratos e as mudanças de pressão e temperatura ocorridas no período da ruptura (Sultan et al., 2004; Talling et al., 2014).</w:t>
+      </w:r>
+    </w:p>
+    <w:p>
+      <w:pPr>
+        <w:pStyle w:val="Heading4"/>
+        <w:jc w:val="left"/>
+        <w:rPr>
+          <w:rFonts w:ascii="Times New Roman" w:cs="Times New Roman" w:eastAsia="Times New Roman" w:hAnsi="Times New Roman"/>
+          <w:b w:val="0"/>
+          <w:bCs w:val="0"/>
+        </w:rPr>
+      </w:pPr>
+      <w:bookmarkStart w:colFirst="0" w:colLast="0" w:name="_2reljg3yjt3t" w:id="15"/>
+      <w:bookmarkEnd w:id="15"/>
+      <w:r>
+        <w:rPr>
+          <w:rFonts w:ascii="Times New Roman" w:cs="Times New Roman" w:eastAsia="Times New Roman" w:hAnsi="Times New Roman"/>
+          <w:b w:val="0"/>
+          <w:bCs w:val="0"/>
+          <w:rtl w:val="0"/>
+        </w:rPr>
+        <w:t xml:space="preserve">Ondas e carregamento hidrodinâmico</w:t>
+      </w:r>
+    </w:p>
+    <w:p>
+      <w:pPr>
+        <w:spacing w:after="120" w:line="360" w:lineRule="auto"/>
+        <w:ind w:left="0" w:firstLine="709"/>
+        <w:jc w:val="both"/>
+        <w:rPr/>
+      </w:pPr>
+      <w:r>
+        <w:rPr>
+          <w:rtl w:val="0"/>
+        </w:rPr>
+        <w:t xml:space="preserve">Ondas de tempestade e tsunamis produzem variações cíclicas de pressão sobre o fundo marinho. Essas variações geram tensões de cisalhamento e podem causar excesso de poropressão em sedimentos pouco consolidados. Sua influência é mais significativa na plataforma e no talude superior, diminuindo com o aumento da profundidade.</w:t>
+      </w:r>
+    </w:p>
+    <w:p>
+      <w:pPr>
+        <w:spacing w:after="120" w:line="360" w:lineRule="auto"/>
+        <w:ind w:left="0" w:firstLine="709"/>
+        <w:jc w:val="both"/>
+        <w:rPr/>
+      </w:pPr>
+      <w:r>
+        <w:rPr>
+          <w:rtl w:val="0"/>
+        </w:rPr>
+        <w:t xml:space="preserve">As ondas internas, formadas em massas de água estratificadas, também podem afetar áreas mais profundas. Elas podem favorecer a erosão do fundo e impor esforços repetidos sobre os sedimentos, contribuindo para a instabilidade quando o talude já apresenta baixa resistência (Hampton et al., 1996; Scarselli, 2020).</w:t>
+      </w:r>
+    </w:p>
+    <w:p>
+      <w:pPr>
+        <w:spacing w:after="120" w:line="360" w:lineRule="auto"/>
+        <w:ind w:left="0" w:firstLine="709"/>
+        <w:jc w:val="both"/>
+        <w:rPr/>
+      </w:pPr>
+      <w:r>
+        <w:rPr>
+          <w:rtl w:val="0"/>
+        </w:rPr>
+        <w:t xml:space="preserve">Em síntese, os movimentos de massa submarinos geralmente resultam de uma sucessão de processos. As características litológicas e estratigráficas condicionam a resistência do talude; a sedimentação, a deformação tectônica ou a migração de fluidos aproximam o sistema da condição de ruptura; e um evento de curta duração, como um terremoto ou uma fase erosiva, pode atuar como gatilho final. Portanto, a presença de determinado processo no contexto geológico não é suficiente para estabelecer, por si só, uma relação causal com o movimento de massa.</w:t>
+      </w:r>
+    </w:p>
+    <w:p>
+      <w:pPr>
+        <w:spacing w:after="120" w:line="360" w:lineRule="auto"/>
+        <w:ind w:left="0" w:firstLine="709"/>
+        <w:jc w:val="both"/>
+        <w:rPr/>
+      </w:pPr>
+      <w:r>
+        <w:rPr>
+          <w:rtl w:val="0"/>
+        </w:rPr>
+      </w:r>
+    </w:p>
+    <w:p>
+      <w:pPr>
+        <w:spacing w:after="120" w:line="360" w:lineRule="auto"/>
+        <w:ind w:left="0" w:firstLine="709"/>
+        <w:jc w:val="both"/>
+        <w:rPr/>
+      </w:pPr>
+      <w:r>
+        <w:rPr>
+          <w:rtl w:val="0"/>
+        </w:rPr>
+      </w:r>
+    </w:p>
+    <w:p>
+      <w:pPr>
+        <w:spacing w:after="120" w:line="360" w:lineRule="auto"/>
+        <w:ind w:left="0" w:firstLine="709"/>
+        <w:jc w:val="both"/>
         <w:rPr/>
       </w:pPr>
       <w:r>
@@ -3183,49 +4463,36 @@
     </w:p>
     <w:p>
       <w:pPr>
-        <w:rPr/>
-      </w:pPr>
-      <w:r>
-        <w:rPr>
-          <w:rtl w:val="0"/>
-        </w:rPr>
-      </w:r>
-    </w:p>
-    <w:p>
-      <w:pPr>
-        <w:pStyle w:val="Heading1"/>
-        <w:keepNext w:val="1"/>
-        <w:spacing w:after="240" w:before="240" w:line="360" w:lineRule="auto"/>
-        <w:ind w:firstLine="0"/>
-        <w:jc w:val="left"/>
-        <w:rPr/>
-      </w:pPr>
-      <w:r>
-        <w:rPr>
-          <w:rtl w:val="0"/>
-        </w:rPr>
-        <w:t xml:space="preserve">4</w:t>
-      </w:r>
-      <w:r>
-        <w:rPr>
-          <w:color w:val="000000"/>
-          <w:rtl w:val="0"/>
-        </w:rPr>
-        <w:t xml:space="preserve"> MATERIAIS E MÉTODOS</w:t>
-      </w:r>
-      <w:r>
-        <w:rPr>
-          <w:rtl w:val="0"/>
-        </w:rPr>
-      </w:r>
-    </w:p>
-    <w:p>
-      <w:pPr>
-        <w:pStyle w:val="Heading2"/>
-        <w:keepNext w:val="1"/>
-        <w:spacing w:after="240" w:before="240" w:line="360" w:lineRule="auto"/>
-        <w:ind w:firstLine="0"/>
-        <w:jc w:val="left"/>
+        <w:spacing w:after="120" w:line="360" w:lineRule="auto"/>
+        <w:ind w:left="0" w:firstLine="709"/>
+        <w:jc w:val="both"/>
+        <w:rPr/>
+      </w:pPr>
+      <w:r>
+        <w:rPr>
+          <w:rtl w:val="0"/>
+        </w:rPr>
+      </w:r>
+    </w:p>
+    <w:p>
+      <w:pPr>
+        <w:spacing w:after="120" w:line="360" w:lineRule="auto"/>
+        <w:ind w:left="0" w:firstLine="709"/>
+        <w:jc w:val="both"/>
+        <w:rPr/>
+      </w:pPr>
+      <w:r>
+        <w:rPr>
+          <w:rtl w:val="0"/>
+        </w:rPr>
+        <w:t xml:space="preserve">4 MATERIAIS E MÉTODOS</w:t>
+      </w:r>
+    </w:p>
+    <w:p>
+      <w:pPr>
+        <w:spacing w:after="120" w:line="360" w:lineRule="auto"/>
+        <w:ind w:left="0" w:firstLine="709"/>
+        <w:jc w:val="both"/>
         <w:rPr/>
       </w:pPr>
       <w:r>
@@ -3237,24 +4504,16 @@
     </w:p>
     <w:p>
       <w:pPr>
-        <w:spacing w:after="0" w:before="0" w:line="360" w:lineRule="auto"/>
-        <w:ind w:firstLine="709"/>
-        <w:jc w:val="both"/>
-        <w:rPr/>
-      </w:pPr>
-      <w:r>
-        <w:rPr>
-          <w:i w:val="1"/>
-          <w:iCs w:val="1"/>
-          <w:color w:val="595959"/>
+        <w:spacing w:after="120" w:line="360" w:lineRule="auto"/>
+        <w:ind w:left="0" w:firstLine="709"/>
+        <w:jc w:val="both"/>
+        <w:rPr/>
+      </w:pPr>
+      <w:r>
+        <w:rPr>
           <w:rtl w:val="0"/>
         </w:rPr>
         <w:t xml:space="preserve">Indique bases consultadas, critérios de seleção, mapas, imagens, modelos digitais de elevação, dados geoquímicos e demais produtos utilizados.</w:t>
-      </w:r>
-      <w:r>
-        <w:rPr>
-          <w:rtl w:val="0"/>
-        </w:rPr>
       </w:r>
     </w:p>
     <w:p>
@@ -4056,7 +5315,7 @@
           <w:szCs w:val="20"/>
           <w:rtl w:val="0"/>
         </w:rPr>
-        <w:t xml:space="preserve">Figura 4 — Título descritivo da figura</w:t>
+        <w:t xml:space="preserve">Figura 5 — Título descritivo da figura</w:t>
       </w:r>
       <w:r>
         <w:rPr>
@@ -4377,7 +5636,7 @@
         </w:rPr>
         <w:t xml:space="preserve">ALBERTON, M. E. et al. Identificação de potenciais depósitos de fosforita no Terraço do Rio Grande, Bacia de Pelotas. Pesquisas em Geociências, v. 51, n. 4, 2024. DOI: </w:t>
       </w:r>
-      <w:hyperlink r:id="rId10">
+      <w:hyperlink r:id="rId11">
         <w:r>
           <w:rPr>
             <w:i w:val="1"/>
@@ -4419,7 +5678,7 @@
         </w:rPr>
         <w:t xml:space="preserve">ALVARENGA, R. S. Análise sismoestratigráfica de bacias rifte: definição de sismofácies e arcabouço tectono-estratigráfico. 2016. 179 f. Tese (Doutorado em Geociências) — Universidade Federal do Rio Grande do Sul, Porto Alegre, 2016. Disponível em: </w:t>
       </w:r>
-      <w:hyperlink r:id="rId11">
+      <w:hyperlink r:id="rId12">
         <w:r>
           <w:rPr>
             <w:i w:val="1"/>
@@ -4461,7 +5720,7 @@
         </w:rPr>
         <w:t xml:space="preserve">ASSUMPÇÃO, M. et al. Intraplate seismicity in Brazil. In: TALWANI, P. (org.). Intraplate seismicity. Cambridge: Cambridge University Press, 2014. p. 50–71. DOI: </w:t>
       </w:r>
-      <w:hyperlink r:id="rId12">
+      <w:hyperlink r:id="rId13">
         <w:r>
           <w:rPr>
             <w:i w:val="1"/>
@@ -4503,7 +5762,7 @@
         </w:rPr>
         <w:t xml:space="preserve">BORGES, R. G.; LIMA, A. C.; KOWSMANN, R. O. Áreas propensas a escorregamentos no talude continental. In: KOWSMANN, R. O. (org.). Geologia e geomorfologia. Rio de Janeiro: Elsevier, 2015. p. 99–136. DOI: </w:t>
       </w:r>
-      <w:hyperlink r:id="rId13">
+      <w:hyperlink r:id="rId14">
         <w:r>
           <w:rPr>
             <w:i w:val="1"/>
@@ -4566,7 +5825,7 @@
         </w:rPr>
         <w:t xml:space="preserve">BULHÕES, E. &amp; AMORIM, W. N. de. Princípio da SismoCamada Elementar e sua aplicação à Técnica Volume de Amplitudes (tecVA). In: INTERNATIONAL CONGRESS OF THE BRAZILIAN GEOPHYSICAL SOCIETY, 9., 2005, Salvador. Anais [...]. Salvador: Sociedade Brasileira de Geofísica, 2005. DOI: </w:t>
       </w:r>
-      <w:hyperlink r:id="rId14">
+      <w:hyperlink r:id="rId15">
         <w:r>
           <w:rPr>
             <w:i w:val="1"/>
@@ -4629,7 +5888,7 @@
         </w:rPr>
         <w:t xml:space="preserve">CARDONA, S. et al. Fabric development and pore-throat reduction in a mass-transport deposit in the Jubilee Gas Field, Eastern Gulf of Mexico: consequences for the sealing capacity of MTDs. In: LAMARCHE, G. et al. (org.). Submarine mass movements and their consequences. Cham: Springer, 2016. p. 27–37. DOI: </w:t>
       </w:r>
-      <w:hyperlink r:id="rId15">
+      <w:hyperlink r:id="rId16">
         <w:r>
           <w:rPr>
             <w:i w:val="1"/>
@@ -4671,7 +5930,7 @@
         </w:rPr>
         <w:t xml:space="preserve">CHOPRA, S. &amp; MARFURT, K. J. Seismic attributes: a historical perspective. Geophysics, v. 70, n. 5, 2005. DOI: </w:t>
       </w:r>
-      <w:hyperlink r:id="rId16">
+      <w:hyperlink r:id="rId17">
         <w:r>
           <w:rPr>
             <w:i w:val="1"/>
@@ -4713,7 +5972,7 @@
         </w:rPr>
         <w:t xml:space="preserve">CHOPRA, S. &amp; MARFURT, K. J. Seismic attributes for prospect identification and reservoir characterization. Tulsa: Society of Exploration Geophysicists; European Association of Geoscientists and Engineers, 2007. (Geophysical Developments, v. 11). DOI: </w:t>
       </w:r>
-      <w:hyperlink r:id="rId17">
+      <w:hyperlink r:id="rId18">
         <w:r>
           <w:rPr>
             <w:i w:val="1"/>
@@ -4755,7 +6014,7 @@
         </w:rPr>
         <w:t xml:space="preserve">CLARE, M. A. et al. A consistent global approach for the morphometric characterization of subaqueous landslides. Geological Society, London, Special Publications, v. 477, p. 455–477, 2018. DOI: </w:t>
       </w:r>
-      <w:hyperlink r:id="rId18">
+      <w:hyperlink r:id="rId19">
         <w:r>
           <w:rPr>
             <w:i w:val="1"/>
@@ -4797,7 +6056,7 @@
         </w:rPr>
         <w:t xml:space="preserve">ELSEVIER. Scopus: a comprehensive abstract and citation database for impact makers. [S. l.], [s. d.]. Disponível em: </w:t>
       </w:r>
-      <w:hyperlink r:id="rId19">
+      <w:hyperlink r:id="rId20">
         <w:r>
           <w:rPr>
             <w:i w:val="1"/>
@@ -4839,7 +6098,7 @@
         </w:rPr>
         <w:t xml:space="preserve">FERNANDEZ, R. O. Bacia de Santos: sumário geológico e setores em oferta. Brasília, DF: Agência Nacional do Petróleo, Gás Natural e Biocombustíveis, 2017. Disponível em: </w:t>
       </w:r>
-      <w:hyperlink r:id="rId20">
+      <w:hyperlink r:id="rId21">
         <w:r>
           <w:rPr>
             <w:i w:val="1"/>
@@ -4881,7 +6140,7 @@
         </w:rPr>
         <w:t xml:space="preserve">FIGUEIREDO, A. G. de et al. Geomorfologia e sedimentologia da plataforma continental. In: KOWSMANN, R. O. (org.). Geologia e geomorfologia. Rio de Janeiro: Elsevier, 2015. p. 13–32. DOI: </w:t>
       </w:r>
-      <w:hyperlink r:id="rId21">
+      <w:hyperlink r:id="rId22">
         <w:r>
           <w:rPr>
             <w:i w:val="1"/>
@@ -4923,7 +6182,7 @@
         </w:rPr>
         <w:t xml:space="preserve">GAMBOA, D. &amp; ALVES, T. M. Bi-modal deformation styles in confined mass-transport deposits: examples from a salt minibasin in SE Brazil. Marine Geology, v. 379, p. 176–193, 2016. DOI: </w:t>
       </w:r>
-      <w:hyperlink r:id="rId22">
+      <w:hyperlink r:id="rId23">
         <w:r>
           <w:rPr>
             <w:i w:val="1"/>
@@ -4965,7 +6224,7 @@
         </w:rPr>
         <w:t xml:space="preserve">GÜRALP SYSTEMS LIMITED. Ocean bottom seismometers. Aldermaston: Güralp Systems Limited, [s. d.]. Disponível em: </w:t>
       </w:r>
-      <w:hyperlink r:id="rId23">
+      <w:hyperlink r:id="rId24">
         <w:r>
           <w:rPr>
             <w:i w:val="1"/>
@@ -5007,7 +6266,7 @@
         </w:rPr>
         <w:t xml:space="preserve">HAMPTON, M. A.; LEE, H. J.; LOCAT, J. Submarine landslides. Reviews of Geophysics, v. 34, n. 1, p. 33–59, 1996. DOI: </w:t>
       </w:r>
-      <w:hyperlink r:id="rId24">
+      <w:hyperlink r:id="rId25">
         <w:r>
           <w:rPr>
             <w:i w:val="1"/>
@@ -5049,7 +6308,7 @@
         </w:rPr>
         <w:t xml:space="preserve">HERCOS, C. Z. Os depósitos de movimento de massa submarinos nas bacias marginais do sudeste brasileiro: tipos, ocorrências, idades, feições diagnósticas. In: CONGRESSO INTERNACIONAL DA SOCIEDADE BRASILEIRA DE GEOFÍSICA, 17., 2021, Rio de Janeiro. Anais [...]. Rio de Janeiro: Sociedade Brasileira de Geofísica, 2021. Disponível em: </w:t>
       </w:r>
-      <w:hyperlink r:id="rId25">
+      <w:hyperlink r:id="rId26">
         <w:r>
           <w:rPr>
             <w:i w:val="1"/>
@@ -5112,7 +6371,7 @@
         </w:rPr>
         <w:t xml:space="preserve">KNELLER, B. et al. Mass-transport and slope accommodation: implications for turbidite sandstone reservoirs. AAPG Bulletin, v. 100, n. 2, p. 213–235, 2016. DOI: </w:t>
       </w:r>
-      <w:hyperlink r:id="rId26">
+      <w:hyperlink r:id="rId27">
         <w:r>
           <w:rPr>
             <w:i w:val="1"/>
@@ -5154,7 +6413,7 @@
         </w:rPr>
         <w:t xml:space="preserve">KOWSMANN, R. O.; LIMA, A. C.; VICALVI, M. A. Feições indicadoras de instabilidade geológica no talude continental e no platô de São Paulo. In: KOWSMANN, R. O. (org.). Geologia e geomorfologia. Rio de Janeiro: Elsevier, 2015. p. 71–97. DOI: </w:t>
       </w:r>
-      <w:hyperlink r:id="rId27">
+      <w:hyperlink r:id="rId28">
         <w:r>
           <w:rPr>
             <w:i w:val="1"/>
@@ -5196,7 +6455,7 @@
         </w:rPr>
         <w:t xml:space="preserve">KRYLOV, A. A. et al. Peculiarities of the HVSR method application to seismic records obtained by ocean-bottom seismographs in the Arctic. Journal of Marine Science and Engineering, v. 8, n. 12, 2020. DOI: </w:t>
       </w:r>
-      <w:hyperlink r:id="rId28">
+      <w:hyperlink r:id="rId29">
         <w:r>
           <w:rPr>
             <w:i w:val="1"/>
@@ -5238,7 +6497,7 @@
         </w:rPr>
         <w:t xml:space="preserve">LEE, H. J. et al. Submarine mass movements on continental margins. In: NITTROUER, C. A. et al. (org.). Continental margin sedimentation: from sediment transport to sequence stratigraphy. Oxford: Blackwell, 2007. p. 213–274. DOI: </w:t>
       </w:r>
-      <w:hyperlink r:id="rId29">
+      <w:hyperlink r:id="rId30">
         <w:r>
           <w:rPr>
             <w:i w:val="1"/>
@@ -5280,7 +6539,7 @@
         </w:rPr>
         <w:t xml:space="preserve">MECKEL III, L. D. Reservoir characteristics and classification of sand-prone submarine mass-transport deposits. In: SHIPP, R. C.; WEIMER, P.; POSAMENTIER, H. W. (org.). Mass-transport deposits in deepwater settings. Tulsa: SEPM Society for Sedimentary Geology, 2011. p. 423–452. DOI: </w:t>
       </w:r>
-      <w:hyperlink r:id="rId30">
+      <w:hyperlink r:id="rId31">
         <w:r>
           <w:rPr>
             <w:i w:val="1"/>
@@ -5322,7 +6581,7 @@
         </w:rPr>
         <w:t xml:space="preserve">MENESES, A. R. dos S. Estudo teórico de atributos sísmicos em dados sísmicos de reflexão. 2010. 86 f. Trabalho de Conclusão de Curso — Universidade Federal da Bahia, Salvador, 2010. Disponível em: </w:t>
       </w:r>
-      <w:hyperlink r:id="rId31">
+      <w:hyperlink r:id="rId32">
         <w:r>
           <w:rPr>
             <w:i w:val="1"/>
@@ -5364,7 +6623,7 @@
         </w:rPr>
         <w:t xml:space="preserve">MIO, E. de; CHANG, H. K.; CORRÊA, F. S. Integração de métodos geofísicos na modelagem crustal da Bacia de Santos. Revista Brasileira de Geofísica, v. 23, n. 3, p. 275–284, 2005. DOI: </w:t>
       </w:r>
-      <w:hyperlink r:id="rId32">
+      <w:hyperlink r:id="rId33">
         <w:r>
           <w:rPr>
             <w:i w:val="1"/>
@@ -5406,7 +6665,7 @@
         </w:rPr>
         <w:t xml:space="preserve">MITCHUM JR., R. M. et al. Seismic stratigraphy and global changes of sea level, part 6: stratigraphic interpretation of seismic reflection patterns in depositional sequences. In: PAYTON, C. E. (org.). Seismic stratigraphy: applications to hydrocarbon exploration. Tulsa: American Association of Petroleum Geologists, 1977. p. 117–133. (AAPG Memoir, v. 26). DOI: </w:t>
       </w:r>
-      <w:hyperlink r:id="rId33">
+      <w:hyperlink r:id="rId34">
         <w:r>
           <w:rPr>
             <w:i w:val="1"/>
@@ -5448,7 +6707,7 @@
         </w:rPr>
         <w:t xml:space="preserve">MOSCARDELLI, L. &amp; WOOD, L. New classification system for mass transport complexes in offshore Trinidad. Basin Research, v. 20, n. 1, p. 73–98, 2008. DOI: </w:t>
       </w:r>
-      <w:hyperlink r:id="rId34">
+      <w:hyperlink r:id="rId35">
         <w:r>
           <w:rPr>
             <w:i w:val="1"/>
@@ -5490,7 +6749,7 @@
         </w:rPr>
         <w:t xml:space="preserve">MOSCARDELLI, L. &amp; WOOD, L. Morphometry of mass-transport deposits as a predictive tool. Geological Society of America Bulletin, v. 128, n. 1–2, p. 47–80, 2016. DOI: </w:t>
       </w:r>
-      <w:hyperlink r:id="rId35">
+      <w:hyperlink r:id="rId36">
         <w:r>
           <w:rPr>
             <w:i w:val="1"/>
@@ -5532,7 +6791,7 @@
         </w:rPr>
         <w:t xml:space="preserve">NAKAMURA, Y. A method for dynamic characteristics estimation of subsurface using microtremor on the ground surface. Quarterly Report of Railway Technical Research Institute, v. 30, n. 1, p. 25–33, 1989. Disponível em: </w:t>
       </w:r>
-      <w:hyperlink r:id="rId36">
+      <w:hyperlink r:id="rId37">
         <w:r>
           <w:rPr>
             <w:i w:val="1"/>
@@ -5574,7 +6833,7 @@
         </w:rPr>
         <w:t xml:space="preserve">OKADA, H. &amp; SUTO, K. The microtremor survey method. Tulsa: Society of Exploration Geophysicists, 2003. DOI: </w:t>
       </w:r>
-      <w:hyperlink r:id="rId37">
+      <w:hyperlink r:id="rId38">
         <w:r>
           <w:rPr>
             <w:i w:val="1"/>
@@ -5616,7 +6875,7 @@
         </w:rPr>
         <w:t xml:space="preserve">PEREIRA, V.; BASILIO, M. P.; SANTOS, C. H. T. PyBibX: a Python library for bibliometric and scientometric analysis powered with artificial intelligence tools. Data Technologies and Applications, v. 59, n. 2, p. 302–337, 2025. DOI: </w:t>
       </w:r>
-      <w:hyperlink r:id="rId38">
+      <w:hyperlink r:id="rId39">
         <w:r>
           <w:rPr>
             <w:i w:val="1"/>
@@ -5658,7 +6917,7 @@
         </w:rPr>
         <w:t xml:space="preserve">POPE, E. L.; TALLING, P. J.; CARTER, L. Which earthquakes trigger damaging submarine mass movements: insights from a global record of submarine cable breaks? Marine Geology, v. 384, p. 131–146, 2017. DOI: </w:t>
       </w:r>
-      <w:hyperlink r:id="rId39">
+      <w:hyperlink r:id="rId40">
         <w:r>
           <w:rPr>
             <w:i w:val="1"/>
@@ -5700,7 +6959,7 @@
         </w:rPr>
         <w:t xml:space="preserve">POSAMENTIER, H. W. &amp; KOLLA, V. Seismic geomorphology and stratigraphy of depositional elements in deep-water settings. Journal of Sedimentary Research, v. 73, n. 3, p. 367–388, 2003. DOI: </w:t>
       </w:r>
-      <w:hyperlink r:id="rId40">
+      <w:hyperlink r:id="rId41">
         <w:r>
           <w:rPr>
             <w:i w:val="1"/>
@@ -5763,7 +7022,7 @@
         </w:rPr>
         <w:t xml:space="preserve">PREISSLER, A. G. Geomorfologia sísmica de feições deposicionais e erosionais do sistema deltaico Eridanos (Plioceno do Setor Holandês do Mar do Norte). 2016. 71 f. Dissertação (Mestrado) — Universidade do Vale do Rio dos Sinos, São Leopoldo, 2016. Disponível em: </w:t>
       </w:r>
-      <w:hyperlink r:id="rId41">
+      <w:hyperlink r:id="rId42">
         <w:r>
           <w:rPr>
             <w:i w:val="1"/>
@@ -5826,7 +7085,7 @@
         </w:rPr>
         <w:t xml:space="preserve">SILVEIRA, I. C. A. et al. Caracterização da oceanografia física do talude continental e região oceânica da Bacia de Campos. In: Meteorologia e oceanografia. [S. l.]: Elsevier, 2016. p. 135–189. DOI: </w:t>
       </w:r>
-      <w:hyperlink r:id="rId42">
+      <w:hyperlink r:id="rId43">
         <w:r>
           <w:rPr>
             <w:i w:val="1"/>
@@ -5868,7 +7127,7 @@
         </w:rPr>
         <w:t xml:space="preserve">SRISAWAD, S. &amp; LERTSTTISPHAN, K. Bibliometric analysis of references selection that influence citations among articles of Thai multidisciplinary journals. Journal of Scientometric Research, v. 10, n. 3, p. 288–296, 2021. DOI: </w:t>
       </w:r>
-      <w:hyperlink r:id="rId43">
+      <w:hyperlink r:id="rId44">
         <w:r>
           <w:rPr>
             <w:i w:val="1"/>
@@ -5910,7 +7169,7 @@
         </w:rPr>
         <w:t xml:space="preserve">TALLING, P. J. et al. Large submarine landslides on continental slopes: geohazards, methane release, and climate change. Oceanography, v. 27, n. 2, p. 32–45, 2014. DOI: </w:t>
       </w:r>
-      <w:hyperlink r:id="rId44">
+      <w:hyperlink r:id="rId45">
         <w:r>
           <w:rPr>
             <w:i w:val="1"/>
@@ -5994,7 +7253,7 @@
         </w:rPr>
         <w:t xml:space="preserve">VANNESTE, M. et al. Seafloor instabilities and sediment deformation processes: the need for integrated, multi-disciplinary investigations. Marine Geology, v. 352, p. 183–214, 2014. DOI: </w:t>
       </w:r>
-      <w:hyperlink r:id="rId45">
+      <w:hyperlink r:id="rId46">
         <w:r>
           <w:rPr>
             <w:i w:val="1"/>
@@ -6036,7 +7295,7 @@
         </w:rPr>
         <w:t xml:space="preserve">VANTASSEL, J. P.; COX, B. R.; BRANNON, D. M. HVSRweb: an open-source, web-based application for horizontal-to-vertical spectral ratio processing. In: INTERNATIONAL FOUNDATIONS CONGRESS AND EQUIPMENT EXPO, 2021, Dallas. Proceedings [...]. Dallas: ASCE, 2021. p. 51–60. DOI: </w:t>
       </w:r>
-      <w:hyperlink r:id="rId46">
+      <w:hyperlink r:id="rId47">
         <w:r>
           <w:rPr>
             <w:i w:val="1"/>
@@ -6078,7 +7337,7 @@
         </w:rPr>
         <w:t xml:space="preserve">YILMAZ, Ö. Seismic data analysis: processing, inversion, and interpretation of seismic data. Tulsa: Society of Exploration Geophysicists, 2001. (Investigations in Geophysics, v. 10). DOI: </w:t>
       </w:r>
-      <w:hyperlink r:id="rId47">
+      <w:hyperlink r:id="rId48">
         <w:r>
           <w:rPr>
             <w:i w:val="1"/>
@@ -6216,7 +7475,7 @@
       </w:r>
     </w:p>
     <w:sectPr>
-      <w:footerReference r:id="rId48" w:type="default"/>
+      <w:footerReference r:id="rId49" w:type="default"/>
       <w:pgSz w:h="16838" w:w="11906" w:orient="portrait"/>
       <w:pgMar w:bottom="1134" w:top="1701" w:left="1701" w:right="1134" w:header="709" w:footer="709"/>
       <w:pgNumType w:start="1"/>
@@ -6303,6 +7562,226 @@
       <w:lvlText w:val="●"/>
       <w:lvlJc w:val="left"/>
       <w:pPr>
+        <w:ind w:left="720" w:hanging="360"/>
+      </w:pPr>
+      <w:rPr>
+        <w:u w:val="none"/>
+      </w:rPr>
+    </w:lvl>
+    <w:lvl w:ilvl="1">
+      <w:start w:val="1"/>
+      <w:numFmt w:val="bullet"/>
+      <w:lvlText w:val="○"/>
+      <w:lvlJc w:val="left"/>
+      <w:pPr>
+        <w:ind w:left="1440" w:hanging="360"/>
+      </w:pPr>
+      <w:rPr>
+        <w:u w:val="none"/>
+      </w:rPr>
+    </w:lvl>
+    <w:lvl w:ilvl="2">
+      <w:start w:val="1"/>
+      <w:numFmt w:val="bullet"/>
+      <w:lvlText w:val="■"/>
+      <w:lvlJc w:val="left"/>
+      <w:pPr>
+        <w:ind w:left="2160" w:hanging="360"/>
+      </w:pPr>
+      <w:rPr>
+        <w:u w:val="none"/>
+      </w:rPr>
+    </w:lvl>
+    <w:lvl w:ilvl="3">
+      <w:start w:val="1"/>
+      <w:numFmt w:val="bullet"/>
+      <w:lvlText w:val="●"/>
+      <w:lvlJc w:val="left"/>
+      <w:pPr>
+        <w:ind w:left="2880" w:hanging="360"/>
+      </w:pPr>
+      <w:rPr>
+        <w:u w:val="none"/>
+      </w:rPr>
+    </w:lvl>
+    <w:lvl w:ilvl="4">
+      <w:start w:val="1"/>
+      <w:numFmt w:val="bullet"/>
+      <w:lvlText w:val="○"/>
+      <w:lvlJc w:val="left"/>
+      <w:pPr>
+        <w:ind w:left="3600" w:hanging="360"/>
+      </w:pPr>
+      <w:rPr>
+        <w:u w:val="none"/>
+      </w:rPr>
+    </w:lvl>
+    <w:lvl w:ilvl="5">
+      <w:start w:val="1"/>
+      <w:numFmt w:val="bullet"/>
+      <w:lvlText w:val="■"/>
+      <w:lvlJc w:val="left"/>
+      <w:pPr>
+        <w:ind w:left="4320" w:hanging="360"/>
+      </w:pPr>
+      <w:rPr>
+        <w:u w:val="none"/>
+      </w:rPr>
+    </w:lvl>
+    <w:lvl w:ilvl="6">
+      <w:start w:val="1"/>
+      <w:numFmt w:val="bullet"/>
+      <w:lvlText w:val="●"/>
+      <w:lvlJc w:val="left"/>
+      <w:pPr>
+        <w:ind w:left="5040" w:hanging="360"/>
+      </w:pPr>
+      <w:rPr>
+        <w:u w:val="none"/>
+      </w:rPr>
+    </w:lvl>
+    <w:lvl w:ilvl="7">
+      <w:start w:val="1"/>
+      <w:numFmt w:val="bullet"/>
+      <w:lvlText w:val="○"/>
+      <w:lvlJc w:val="left"/>
+      <w:pPr>
+        <w:ind w:left="5760" w:hanging="360"/>
+      </w:pPr>
+      <w:rPr>
+        <w:u w:val="none"/>
+      </w:rPr>
+    </w:lvl>
+    <w:lvl w:ilvl="8">
+      <w:start w:val="1"/>
+      <w:numFmt w:val="bullet"/>
+      <w:lvlText w:val="■"/>
+      <w:lvlJc w:val="left"/>
+      <w:pPr>
+        <w:ind w:left="6480" w:hanging="360"/>
+      </w:pPr>
+      <w:rPr>
+        <w:u w:val="none"/>
+      </w:rPr>
+    </w:lvl>
+  </w:abstractNum>
+  <w:abstractNum w:abstractNumId="2">
+    <w:lvl w:ilvl="0">
+      <w:start w:val="1"/>
+      <w:numFmt w:val="bullet"/>
+      <w:lvlText w:val="●"/>
+      <w:lvlJc w:val="left"/>
+      <w:pPr>
+        <w:ind w:left="720" w:hanging="360"/>
+      </w:pPr>
+      <w:rPr>
+        <w:u w:val="none"/>
+      </w:rPr>
+    </w:lvl>
+    <w:lvl w:ilvl="1">
+      <w:start w:val="1"/>
+      <w:numFmt w:val="bullet"/>
+      <w:lvlText w:val="○"/>
+      <w:lvlJc w:val="left"/>
+      <w:pPr>
+        <w:ind w:left="1440" w:hanging="360"/>
+      </w:pPr>
+      <w:rPr>
+        <w:u w:val="none"/>
+      </w:rPr>
+    </w:lvl>
+    <w:lvl w:ilvl="2">
+      <w:start w:val="1"/>
+      <w:numFmt w:val="bullet"/>
+      <w:lvlText w:val="■"/>
+      <w:lvlJc w:val="left"/>
+      <w:pPr>
+        <w:ind w:left="2160" w:hanging="360"/>
+      </w:pPr>
+      <w:rPr>
+        <w:u w:val="none"/>
+      </w:rPr>
+    </w:lvl>
+    <w:lvl w:ilvl="3">
+      <w:start w:val="1"/>
+      <w:numFmt w:val="bullet"/>
+      <w:lvlText w:val="●"/>
+      <w:lvlJc w:val="left"/>
+      <w:pPr>
+        <w:ind w:left="2880" w:hanging="360"/>
+      </w:pPr>
+      <w:rPr>
+        <w:u w:val="none"/>
+      </w:rPr>
+    </w:lvl>
+    <w:lvl w:ilvl="4">
+      <w:start w:val="1"/>
+      <w:numFmt w:val="bullet"/>
+      <w:lvlText w:val="○"/>
+      <w:lvlJc w:val="left"/>
+      <w:pPr>
+        <w:ind w:left="3600" w:hanging="360"/>
+      </w:pPr>
+      <w:rPr>
+        <w:u w:val="none"/>
+      </w:rPr>
+    </w:lvl>
+    <w:lvl w:ilvl="5">
+      <w:start w:val="1"/>
+      <w:numFmt w:val="bullet"/>
+      <w:lvlText w:val="■"/>
+      <w:lvlJc w:val="left"/>
+      <w:pPr>
+        <w:ind w:left="4320" w:hanging="360"/>
+      </w:pPr>
+      <w:rPr>
+        <w:u w:val="none"/>
+      </w:rPr>
+    </w:lvl>
+    <w:lvl w:ilvl="6">
+      <w:start w:val="1"/>
+      <w:numFmt w:val="bullet"/>
+      <w:lvlText w:val="●"/>
+      <w:lvlJc w:val="left"/>
+      <w:pPr>
+        <w:ind w:left="5040" w:hanging="360"/>
+      </w:pPr>
+      <w:rPr>
+        <w:u w:val="none"/>
+      </w:rPr>
+    </w:lvl>
+    <w:lvl w:ilvl="7">
+      <w:start w:val="1"/>
+      <w:numFmt w:val="bullet"/>
+      <w:lvlText w:val="○"/>
+      <w:lvlJc w:val="left"/>
+      <w:pPr>
+        <w:ind w:left="5760" w:hanging="360"/>
+      </w:pPr>
+      <w:rPr>
+        <w:u w:val="none"/>
+      </w:rPr>
+    </w:lvl>
+    <w:lvl w:ilvl="8">
+      <w:start w:val="1"/>
+      <w:numFmt w:val="bullet"/>
+      <w:lvlText w:val="■"/>
+      <w:lvlJc w:val="left"/>
+      <w:pPr>
+        <w:ind w:left="6480" w:hanging="360"/>
+      </w:pPr>
+      <w:rPr>
+        <w:u w:val="none"/>
+      </w:rPr>
+    </w:lvl>
+  </w:abstractNum>
+  <w:abstractNum w:abstractNumId="3">
+    <w:lvl w:ilvl="0">
+      <w:start w:val="1"/>
+      <w:numFmt w:val="bullet"/>
+      <w:lvlText w:val="●"/>
+      <w:lvlJc w:val="left"/>
+      <w:pPr>
         <w:ind w:left="360" w:hanging="360"/>
       </w:pPr>
       <w:rPr>
@@ -6390,8 +7869,127 @@
       <w:rPr/>
     </w:lvl>
   </w:abstractNum>
+  <w:abstractNum w:abstractNumId="4">
+    <w:lvl w:ilvl="0">
+      <w:start w:val="1"/>
+      <w:numFmt w:val="bullet"/>
+      <w:lvlText w:val="●"/>
+      <w:lvlJc w:val="left"/>
+      <w:pPr>
+        <w:ind w:left="720" w:hanging="360"/>
+      </w:pPr>
+      <w:rPr>
+        <w:u w:val="none"/>
+      </w:rPr>
+    </w:lvl>
+    <w:lvl w:ilvl="1">
+      <w:start w:val="1"/>
+      <w:numFmt w:val="bullet"/>
+      <w:lvlText w:val="○"/>
+      <w:lvlJc w:val="left"/>
+      <w:pPr>
+        <w:ind w:left="1440" w:hanging="360"/>
+      </w:pPr>
+      <w:rPr>
+        <w:u w:val="none"/>
+      </w:rPr>
+    </w:lvl>
+    <w:lvl w:ilvl="2">
+      <w:start w:val="1"/>
+      <w:numFmt w:val="bullet"/>
+      <w:lvlText w:val="■"/>
+      <w:lvlJc w:val="left"/>
+      <w:pPr>
+        <w:ind w:left="2160" w:hanging="360"/>
+      </w:pPr>
+      <w:rPr>
+        <w:u w:val="none"/>
+      </w:rPr>
+    </w:lvl>
+    <w:lvl w:ilvl="3">
+      <w:start w:val="1"/>
+      <w:numFmt w:val="bullet"/>
+      <w:lvlText w:val="●"/>
+      <w:lvlJc w:val="left"/>
+      <w:pPr>
+        <w:ind w:left="2880" w:hanging="360"/>
+      </w:pPr>
+      <w:rPr>
+        <w:u w:val="none"/>
+      </w:rPr>
+    </w:lvl>
+    <w:lvl w:ilvl="4">
+      <w:start w:val="1"/>
+      <w:numFmt w:val="bullet"/>
+      <w:lvlText w:val="○"/>
+      <w:lvlJc w:val="left"/>
+      <w:pPr>
+        <w:ind w:left="3600" w:hanging="360"/>
+      </w:pPr>
+      <w:rPr>
+        <w:u w:val="none"/>
+      </w:rPr>
+    </w:lvl>
+    <w:lvl w:ilvl="5">
+      <w:start w:val="1"/>
+      <w:numFmt w:val="bullet"/>
+      <w:lvlText w:val="■"/>
+      <w:lvlJc w:val="left"/>
+      <w:pPr>
+        <w:ind w:left="4320" w:hanging="360"/>
+      </w:pPr>
+      <w:rPr>
+        <w:u w:val="none"/>
+      </w:rPr>
+    </w:lvl>
+    <w:lvl w:ilvl="6">
+      <w:start w:val="1"/>
+      <w:numFmt w:val="bullet"/>
+      <w:lvlText w:val="●"/>
+      <w:lvlJc w:val="left"/>
+      <w:pPr>
+        <w:ind w:left="5040" w:hanging="360"/>
+      </w:pPr>
+      <w:rPr>
+        <w:u w:val="none"/>
+      </w:rPr>
+    </w:lvl>
+    <w:lvl w:ilvl="7">
+      <w:start w:val="1"/>
+      <w:numFmt w:val="bullet"/>
+      <w:lvlText w:val="○"/>
+      <w:lvlJc w:val="left"/>
+      <w:pPr>
+        <w:ind w:left="5760" w:hanging="360"/>
+      </w:pPr>
+      <w:rPr>
+        <w:u w:val="none"/>
+      </w:rPr>
+    </w:lvl>
+    <w:lvl w:ilvl="8">
+      <w:start w:val="1"/>
+      <w:numFmt w:val="bullet"/>
+      <w:lvlText w:val="■"/>
+      <w:lvlJc w:val="left"/>
+      <w:pPr>
+        <w:ind w:left="6480" w:hanging="360"/>
+      </w:pPr>
+      <w:rPr>
+        <w:u w:val="none"/>
+      </w:rPr>
+    </w:lvl>
+  </w:abstractNum>
   <w:num w:numId="1">
     <w:abstractNumId w:val="1"/>
+  </w:num>
+  <w:num w:numId="2">
+    <w:abstractNumId w:val="2"/>
+  </w:num>
+  <w:num w:numId="3">
+    <w:abstractNumId w:val="3"/>
+  </w:num>
+  <w:num w:numId="4">
+    <w:abstractNumId w:val="4"/>
   </w:num>
 </w:numbering>
 </file>

</xml_diff>

<commit_message>
Atualizacao automatica 2026-09-19 17:18:41
</commit_message>
<xml_diff>
--- a/docs/template-tcc-geologia-ufsc.docx
+++ b/docs/template-tcc-geologia-ufsc.docx
@@ -13,12 +13,12 @@
           <wp:inline distB="0" distT="0" distL="114300" distR="114300">
             <wp:extent cx="900000" cy="1236424"/>
             <wp:effectExtent b="0" l="0" r="0" t="0"/>
-            <wp:docPr descr="Símbolo da Universidade Federal de Santa Catarina" id="3" name="image3.png"/>
+            <wp:docPr descr="Símbolo da Universidade Federal de Santa Catarina" id="3" name="image1.png"/>
             <a:graphic>
               <a:graphicData uri="http://schemas.openxmlformats.org/drawingml/2006/picture">
                 <pic:pic>
                   <pic:nvPicPr>
-                    <pic:cNvPr descr="Símbolo da Universidade Federal de Santa Catarina" id="0" name="image3.png"/>
+                    <pic:cNvPr descr="Símbolo da Universidade Federal de Santa Catarina" id="0" name="image1.png"/>
                     <pic:cNvPicPr preferRelativeResize="0"/>
                   </pic:nvPicPr>
                   <pic:blipFill>
@@ -1768,7 +1768,7 @@
     </w:p>
     <w:sdt>
       <w:sdtPr>
-        <w:id w:val="505136989"/>
+        <w:id w:val="894447759"/>
         <w:docPartObj>
           <w:docPartGallery w:val="Table of Contents"/>
           <w:docPartUnique w:val="1"/>
@@ -2988,12 +2988,12 @@
           <wp:inline distB="114300" distT="114300" distL="114300" distR="114300">
             <wp:extent cx="5759775" cy="1295400"/>
             <wp:effectExtent b="0" l="0" r="0" t="0"/>
-            <wp:docPr id="1" name="image2.png"/>
+            <wp:docPr id="1" name="image5.png"/>
             <a:graphic>
               <a:graphicData uri="http://schemas.openxmlformats.org/drawingml/2006/picture">
                 <pic:pic>
                   <pic:nvPicPr>
-                    <pic:cNvPr id="0" name="image2.png"/>
+                    <pic:cNvPr id="0" name="image5.png"/>
                     <pic:cNvPicPr preferRelativeResize="0"/>
                   </pic:nvPicPr>
                   <pic:blipFill>
@@ -3091,12 +3091,12 @@
           <wp:inline distB="114300" distT="114300" distL="114300" distR="114300">
             <wp:extent cx="5444561" cy="2798774"/>
             <wp:effectExtent b="0" l="0" r="0" t="0"/>
-            <wp:docPr id="4" name="image1.png"/>
+            <wp:docPr id="4" name="image2.png"/>
             <a:graphic>
               <a:graphicData uri="http://schemas.openxmlformats.org/drawingml/2006/picture">
                 <pic:pic>
                   <pic:nvPicPr>
-                    <pic:cNvPr id="0" name="image1.png"/>
+                    <pic:cNvPr id="0" name="image2.png"/>
                     <pic:cNvPicPr preferRelativeResize="0"/>
                   </pic:nvPicPr>
                   <pic:blipFill>
@@ -3297,12 +3297,12 @@
           <wp:inline distB="114300" distT="114300" distL="114300" distR="114300">
             <wp:extent cx="5344478" cy="4946954"/>
             <wp:effectExtent b="0" l="0" r="0" t="0"/>
-            <wp:docPr id="2" name="image5.png"/>
+            <wp:docPr id="2" name="image3.png"/>
             <a:graphic>
               <a:graphicData uri="http://schemas.openxmlformats.org/drawingml/2006/picture">
                 <pic:pic>
                   <pic:nvPicPr>
-                    <pic:cNvPr id="0" name="image5.png"/>
+                    <pic:cNvPr id="0" name="image3.png"/>
                     <pic:cNvPicPr preferRelativeResize="0"/>
                   </pic:nvPicPr>
                   <pic:blipFill>
@@ -6873,6 +6873,27 @@
           <w:color w:val="595959"/>
           <w:rtl w:val="0"/>
         </w:rPr>
+        <w:t xml:space="preserve">ORTIZ KARPF, A. L. Bathymetric and substrate controls on submarine mass-transport emplacement processes and channel-levee complex evolution. 2016. Tese (Doutorado) — University of Leeds, Leeds, 2016.</w:t>
+      </w:r>
+    </w:p>
+    <w:p>
+      <w:pPr>
+        <w:spacing w:after="240" w:before="0" w:line="240" w:lineRule="auto"/>
+        <w:ind w:firstLine="0"/>
+        <w:jc w:val="left"/>
+        <w:rPr>
+          <w:i w:val="1"/>
+          <w:iCs w:val="1"/>
+          <w:color w:val="595959"/>
+        </w:rPr>
+      </w:pPr>
+      <w:r>
+        <w:rPr>
+          <w:i w:val="1"/>
+          <w:iCs w:val="1"/>
+          <w:color w:val="595959"/>
+          <w:rtl w:val="0"/>
+        </w:rPr>
         <w:t xml:space="preserve">PEREIRA, V.; BASILIO, M. P.; SANTOS, C. H. T. PyBibX: a Python library for bibliometric and scientometric analysis powered with artificial intelligence tools. Data Technologies and Applications, v. 59, n. 2, p. 302–337, 2025. DOI: </w:t>
       </w:r>
       <w:hyperlink r:id="rId39">
@@ -7062,6 +7083,27 @@
           <w:color w:val="595959"/>
           <w:rtl w:val="0"/>
         </w:rPr>
+        <w:t xml:space="preserve">SCARSELLI, N. Submarine landslides: architecture, controlling factors and environments: a summary. In: SCARSELLI, N. et al. (org.). Regional geology and tectonics. 2. ed. [S. l.]: Elsevier, 2020. v. 1, p. 417–439. DOI: https://doi.org/10.1016/B978-0-444-64134-2.00015-8.</w:t>
+      </w:r>
+    </w:p>
+    <w:p>
+      <w:pPr>
+        <w:spacing w:after="240" w:before="0" w:line="240" w:lineRule="auto"/>
+        <w:ind w:firstLine="0"/>
+        <w:jc w:val="left"/>
+        <w:rPr>
+          <w:i w:val="1"/>
+          <w:iCs w:val="1"/>
+          <w:color w:val="595959"/>
+        </w:rPr>
+      </w:pPr>
+      <w:r>
+        <w:rPr>
+          <w:i w:val="1"/>
+          <w:iCs w:val="1"/>
+          <w:color w:val="595959"/>
+          <w:rtl w:val="0"/>
+        </w:rPr>
         <w:t xml:space="preserve">SEVERIANO RIBEIRO, H. J. P. (org.). Estratigrafia de sequências: fundamentos e aplicações. São Leopoldo: Editora Unisinos, 2001. 428 p.</w:t>
       </w:r>
     </w:p>
@@ -7167,6 +7209,27 @@
           <w:color w:val="595959"/>
           <w:rtl w:val="0"/>
         </w:rPr>
+        <w:t xml:space="preserve">SULTAN, N. et al. Triggering mechanisms of slope instability processes and sediment failures on continental margins: a geotechnical approach. Marine Geology, v. 213, n. 1–4, p. 291–321, 2004. DOI: https://doi.org/10.1016/j.margeo.2004.10.011.</w:t>
+      </w:r>
+    </w:p>
+    <w:p>
+      <w:pPr>
+        <w:spacing w:after="240" w:before="0" w:line="240" w:lineRule="auto"/>
+        <w:ind w:firstLine="0"/>
+        <w:jc w:val="left"/>
+        <w:rPr>
+          <w:i w:val="1"/>
+          <w:iCs w:val="1"/>
+          <w:color w:val="595959"/>
+        </w:rPr>
+      </w:pPr>
+      <w:r>
+        <w:rPr>
+          <w:i w:val="1"/>
+          <w:iCs w:val="1"/>
+          <w:color w:val="595959"/>
+          <w:rtl w:val="0"/>
+        </w:rPr>
         <w:t xml:space="preserve">TALLING, P. J. et al. Large submarine landslides on continental slopes: geohazards, methane release, and climate change. Oceanography, v. 27, n. 2, p. 32–45, 2014. DOI: </w:t>
       </w:r>
       <w:hyperlink r:id="rId45">
@@ -7209,7 +7272,49 @@
           <w:color w:val="595959"/>
           <w:rtl w:val="0"/>
         </w:rPr>
+        <w:t xml:space="preserve">TERZAGHI, K. Erdbaumechanik auf bodenphysikalischer Grundlage. Leipzig; Wien: Franz Deuticke, 1925.</w:t>
+      </w:r>
+    </w:p>
+    <w:p>
+      <w:pPr>
+        <w:spacing w:after="240" w:before="0" w:line="240" w:lineRule="auto"/>
+        <w:ind w:firstLine="0"/>
+        <w:jc w:val="left"/>
+        <w:rPr>
+          <w:i w:val="1"/>
+          <w:iCs w:val="1"/>
+          <w:color w:val="595959"/>
+        </w:rPr>
+      </w:pPr>
+      <w:r>
+        <w:rPr>
+          <w:i w:val="1"/>
+          <w:iCs w:val="1"/>
+          <w:color w:val="595959"/>
+          <w:rtl w:val="0"/>
+        </w:rPr>
         <w:t xml:space="preserve">TÓTH, T. Single and multichannel seismics. In: GUPTA, H. K. (org.). Encyclopedia of solid earth geophysics. Dordrecht: Springer, 2011. p. 1366–1373.</w:t>
+      </w:r>
+    </w:p>
+    <w:p>
+      <w:pPr>
+        <w:spacing w:after="240" w:before="0" w:line="240" w:lineRule="auto"/>
+        <w:ind w:firstLine="0"/>
+        <w:jc w:val="left"/>
+        <w:rPr>
+          <w:i w:val="1"/>
+          <w:iCs w:val="1"/>
+          <w:color w:val="595959"/>
+        </w:rPr>
+      </w:pPr>
+      <w:r>
+        <w:rPr>
+          <w:i w:val="1"/>
+          <w:iCs w:val="1"/>
+          <w:color w:val="595959"/>
+          <w:rtl w:val="0"/>
+        </w:rPr>
+        <w:t xml:space="preserve">URLAUB, M. et al. What causes large submarine landslides on low gradient (&lt;2°) continental slopes with slow (~0,15 m/ka) sediment accumulation? Journal of Geophysical Research: Solid Earth, v. 120, n. 10, p. 6722–6739, 2015. DOI: https://doi.org/10.1002/2015JB012347.</w:t>
       </w:r>
     </w:p>
     <w:p>

</xml_diff>

<commit_message>
Padroniza Docs e sincroniza fundamentacao teorica
</commit_message>
<xml_diff>
--- a/docs/template-tcc-geologia-ufsc.docx
+++ b/docs/template-tcc-geologia-ufsc.docx
@@ -13,12 +13,12 @@
           <wp:inline distB="0" distT="0" distL="114300" distR="114300">
             <wp:extent cx="900000" cy="1236424"/>
             <wp:effectExtent b="0" l="0" r="0" t="0"/>
-            <wp:docPr descr="Símbolo da Universidade Federal de Santa Catarina" id="3" name="image1.png"/>
+            <wp:docPr descr="Símbolo da Universidade Federal de Santa Catarina" id="3" name="image4.png"/>
             <a:graphic>
               <a:graphicData uri="http://schemas.openxmlformats.org/drawingml/2006/picture">
                 <pic:pic>
                   <pic:nvPicPr>
-                    <pic:cNvPr descr="Símbolo da Universidade Federal de Santa Catarina" id="0" name="image1.png"/>
+                    <pic:cNvPr descr="Símbolo da Universidade Federal de Santa Catarina" id="0" name="image4.png"/>
                     <pic:cNvPicPr preferRelativeResize="0"/>
                   </pic:nvPicPr>
                   <pic:blipFill>
@@ -1768,7 +1768,7 @@
     </w:p>
     <w:sdt>
       <w:sdtPr>
-        <w:id w:val="894447759"/>
+        <w:id w:val="-894479202"/>
         <w:docPartObj>
           <w:docPartGallery w:val="Table of Contents"/>
           <w:docPartUnique w:val="1"/>
@@ -1854,11 +1854,14 @@
         <w:spacing w:after="240" w:before="240" w:line="360" w:lineRule="auto"/>
         <w:ind w:firstLine="0"/>
         <w:jc w:val="left"/>
-        <w:rPr/>
+        <w:rPr>
+          <w:highlight w:val="white"/>
+        </w:rPr>
       </w:pPr>
       <w:r>
         <w:rPr>
           <w:color w:val="000000"/>
+          <w:highlight w:val="white"/>
           <w:rtl w:val="0"/>
         </w:rPr>
         <w:t xml:space="preserve">1 INTRODUÇÃO</w:t>
@@ -1874,10 +1877,13 @@
         <w:spacing w:after="0" w:before="0" w:line="360" w:lineRule="auto"/>
         <w:ind w:firstLine="709"/>
         <w:jc w:val="both"/>
-        <w:rPr/>
-      </w:pPr>
-      <w:r>
-        <w:rPr>
+        <w:rPr>
+          <w:highlight w:val="white"/>
+        </w:rPr>
+      </w:pPr>
+      <w:r>
+        <w:rPr>
+          <w:highlight w:val="white"/>
           <w:rtl w:val="0"/>
         </w:rPr>
         <w:t xml:space="preserve">Movimentos de massa submarinos constituem mecanismos frequentes e altamente eficientes de transferência de sedimentos da plataforma continental e do talude para bacias oceânicas profundas, processo conhecido como </w:t>
@@ -1886,12 +1892,14 @@
         <w:rPr>
           <w:i w:val="1"/>
           <w:iCs w:val="1"/>
+          <w:highlight w:val="white"/>
           <w:rtl w:val="0"/>
         </w:rPr>
         <w:t xml:space="preserve">sediment bypassing</w:t>
       </w:r>
       <w:r>
         <w:rPr>
+          <w:highlight w:val="white"/>
           <w:rtl w:val="0"/>
         </w:rPr>
         <w:t xml:space="preserve"> (Hampton </w:t>
@@ -1900,12 +1908,14 @@
         <w:rPr>
           <w:i w:val="1"/>
           <w:iCs w:val="1"/>
+          <w:highlight w:val="white"/>
           <w:rtl w:val="0"/>
         </w:rPr>
         <w:t xml:space="preserve">et al</w:t>
       </w:r>
       <w:r>
         <w:rPr>
+          <w:highlight w:val="white"/>
           <w:rtl w:val="0"/>
         </w:rPr>
         <w:t xml:space="preserve">., 1996). Em um único evento, volumes expressivos de sedimento podem ser mobilizados e transportados por centenas de quilômetros, inclusive em taludes de baixa inclinação, entre 0,5° e 3° (Hampton </w:t>
@@ -1914,12 +1924,14 @@
         <w:rPr>
           <w:i w:val="1"/>
           <w:iCs w:val="1"/>
+          <w:highlight w:val="white"/>
           <w:rtl w:val="0"/>
         </w:rPr>
         <w:t xml:space="preserve">et al</w:t>
       </w:r>
       <w:r>
         <w:rPr>
+          <w:highlight w:val="white"/>
           <w:rtl w:val="0"/>
         </w:rPr>
         <w:t xml:space="preserve">., 1996).</w:t>
@@ -1930,10 +1942,13 @@
         <w:spacing w:after="0" w:before="0" w:line="360" w:lineRule="auto"/>
         <w:ind w:firstLine="709"/>
         <w:jc w:val="both"/>
-        <w:rPr/>
-      </w:pPr>
-      <w:r>
-        <w:rPr>
+        <w:rPr>
+          <w:highlight w:val="white"/>
+        </w:rPr>
+      </w:pPr>
+      <w:r>
+        <w:rPr>
+          <w:highlight w:val="white"/>
           <w:rtl w:val="0"/>
         </w:rPr>
         <w:t xml:space="preserve">A estabilidade do substrato marinho é controlada pela interação entre condições geológicas, tectônicas e oceanográficas, que regulam a atuação dos fatores condicionantes e desencadeadores de instabilidades em determinada área (Hampton </w:t>
@@ -1942,12 +1957,14 @@
         <w:rPr>
           <w:i w:val="1"/>
           <w:iCs w:val="1"/>
+          <w:highlight w:val="white"/>
           <w:rtl w:val="0"/>
         </w:rPr>
         <w:t xml:space="preserve">et al</w:t>
       </w:r>
       <w:r>
         <w:rPr>
+          <w:highlight w:val="white"/>
           <w:rtl w:val="0"/>
         </w:rPr>
         <w:t xml:space="preserve">., 1996). Mesmo eventos de menor escala podem danificar plataformas de petróleo, dutos e cabos submarinos (Tappin </w:t>
@@ -1956,12 +1973,14 @@
         <w:rPr>
           <w:i w:val="1"/>
           <w:iCs w:val="1"/>
+          <w:highlight w:val="white"/>
           <w:rtl w:val="0"/>
         </w:rPr>
         <w:t xml:space="preserve">et al</w:t>
       </w:r>
       <w:r>
         <w:rPr>
+          <w:highlight w:val="white"/>
           <w:rtl w:val="0"/>
         </w:rPr>
         <w:t xml:space="preserve">., 2001). </w:t>
@@ -1972,10 +1991,13 @@
         <w:spacing w:after="0" w:before="0" w:line="360" w:lineRule="auto"/>
         <w:ind w:firstLine="709"/>
         <w:jc w:val="both"/>
-        <w:rPr/>
-      </w:pPr>
-      <w:r>
-        <w:rPr>
+        <w:rPr>
+          <w:highlight w:val="white"/>
+        </w:rPr>
+      </w:pPr>
+      <w:r>
+        <w:rPr>
+          <w:highlight w:val="white"/>
           <w:rtl w:val="0"/>
         </w:rPr>
         <w:t xml:space="preserve">Nas últimas décadas, as pesquisas sobre movimentos de massa submarinos foram intensificadas para compreender seus mecanismos de ruptura, processos de transporte e riscos associados. Esse avanço foi favorecido pelo aprimoramento das tecnologias de aquisição de dados </w:t>
@@ -1984,12 +2006,14 @@
         <w:rPr>
           <w:i w:val="1"/>
           <w:iCs w:val="1"/>
+          <w:highlight w:val="white"/>
           <w:rtl w:val="0"/>
         </w:rPr>
         <w:t xml:space="preserve">offshore</w:t>
       </w:r>
       <w:r>
         <w:rPr>
+          <w:highlight w:val="white"/>
           <w:rtl w:val="0"/>
         </w:rPr>
         <w:t xml:space="preserve"> e pela expansão das atividades de exploração de recursos marinhos. No Brasil, os estudos ganharam maior destaque a partir dos anos 2000, em razão do avanço da exploração de petróleo em águas profundas e dos potenciais impactos desses processos sobre infraestruturas submarinas e campos petrolíferos (Borges et al., 2015; Kowsmann et al., 2015). </w:t>
@@ -2000,33 +2024,29 @@
         <w:spacing w:after="0" w:before="0" w:line="360" w:lineRule="auto"/>
         <w:ind w:firstLine="709"/>
         <w:jc w:val="both"/>
-        <w:rPr/>
-      </w:pPr>
-      <w:r>
-        <w:rPr>
-          <w:rtl w:val="0"/>
-        </w:rPr>
-        <w:t xml:space="preserve">Nesse contexto, este trabalho propõe a caracterização de depósitos e complexos de movimentos de massa na porção norte da Bacia de Santos. A análise será baseada em parâmetros morfométricos e em critérios de classificação que consideram, </w:t>
-      </w:r>
-      <w:r>
-        <w:rPr>
-          <w:highlight w:val="yellow"/>
-          <w:rtl w:val="0"/>
-        </w:rPr>
-        <w:t xml:space="preserve">principalmente, o número de eventos envolvidos (Clare </w:t>
-      </w:r>
-      <w:r>
-        <w:rPr>
-          <w:i w:val="1"/>
-          <w:iCs w:val="1"/>
-          <w:highlight w:val="yellow"/>
+        <w:rPr>
+          <w:highlight w:val="white"/>
+        </w:rPr>
+      </w:pPr>
+      <w:r>
+        <w:rPr>
+          <w:highlight w:val="white"/>
+          <w:rtl w:val="0"/>
+        </w:rPr>
+        <w:t xml:space="preserve">Nesse contexto, este trabalho propõe a caracterização de depósitos e complexos de movimentos de massa na porção norte da Bacia de Santos. A análise será baseada em parâmetros morfométricos e em critérios de classificação que consideram, principalmente, o número de eventos envolvidos (Clare </w:t>
+      </w:r>
+      <w:r>
+        <w:rPr>
+          <w:i w:val="1"/>
+          <w:iCs w:val="1"/>
+          <w:highlight w:val="white"/>
           <w:rtl w:val="0"/>
         </w:rPr>
         <w:t xml:space="preserve">et al</w:t>
       </w:r>
       <w:r>
         <w:rPr>
-          <w:highlight w:val="yellow"/>
+          <w:highlight w:val="white"/>
           <w:rtl w:val="0"/>
         </w:rPr>
         <w:t xml:space="preserve">., 2018), a relação entre os depósitos e suas áreas-fonte (Moscardelli &amp; Wood, 2008), o mecanismo gatilho e o grau de confinamento dos depósitos (Gamboa &amp; Alves, 2016). Além disso, para uma porção da área de estudo, será estimada a espessura do pacote sedimentar potencialmente mobilizável em futuros eventos por meio da técnica </w:t>
@@ -2035,14 +2055,14 @@
         <w:rPr>
           <w:i w:val="1"/>
           <w:iCs w:val="1"/>
-          <w:highlight w:val="yellow"/>
+          <w:highlight w:val="white"/>
           <w:rtl w:val="0"/>
         </w:rPr>
         <w:t xml:space="preserve">Horizontal-to-Vertical Spectral Ratio</w:t>
       </w:r>
       <w:r>
         <w:rPr>
-          <w:highlight w:val="yellow"/>
+          <w:highlight w:val="white"/>
           <w:rtl w:val="0"/>
         </w:rPr>
         <w:t xml:space="preserve"> (HVSR) (Nakamura, 1989), utilizando dados obtidos por sismógrafos de fundo oceânico (</w:t>
@@ -2051,22 +2071,17 @@
         <w:rPr>
           <w:i w:val="1"/>
           <w:iCs w:val="1"/>
-          <w:highlight w:val="yellow"/>
+          <w:highlight w:val="white"/>
           <w:rtl w:val="0"/>
         </w:rPr>
         <w:t xml:space="preserve">Ocean Bottom Seismometers</w:t>
       </w:r>
       <w:r>
         <w:rPr>
-          <w:highlight w:val="yellow"/>
+          <w:highlight w:val="white"/>
           <w:rtl w:val="0"/>
         </w:rPr>
         <w:t xml:space="preserve"> — OBS). </w:t>
-      </w:r>
-      <w:r>
-        <w:rPr>
-          <w:rtl w:val="0"/>
-        </w:rPr>
       </w:r>
     </w:p>
     <w:p>
@@ -2076,11 +2091,14 @@
         <w:spacing w:after="240" w:before="240" w:line="360" w:lineRule="auto"/>
         <w:ind w:firstLine="0"/>
         <w:jc w:val="left"/>
-        <w:rPr/>
+        <w:rPr>
+          <w:highlight w:val="white"/>
+        </w:rPr>
       </w:pPr>
       <w:r>
         <w:rPr>
           <w:color w:val="000000"/>
+          <w:highlight w:val="white"/>
           <w:rtl w:val="0"/>
         </w:rPr>
         <w:t xml:space="preserve">1.1 Objetivos</w:t>
@@ -2098,11 +2116,14 @@
         <w:spacing w:after="240" w:before="240" w:line="360" w:lineRule="auto"/>
         <w:ind w:firstLine="0"/>
         <w:jc w:val="left"/>
-        <w:rPr/>
+        <w:rPr>
+          <w:highlight w:val="white"/>
+        </w:rPr>
       </w:pPr>
       <w:r>
         <w:rPr>
           <w:color w:val="000000"/>
+          <w:highlight w:val="white"/>
           <w:rtl w:val="0"/>
         </w:rPr>
         <w:t xml:space="preserve">1.1.1 Objetivo geral</w:t>
@@ -2117,10 +2138,13 @@
       <w:pPr>
         <w:spacing w:after="0" w:line="240" w:lineRule="auto"/>
         <w:jc w:val="both"/>
-        <w:rPr/>
-      </w:pPr>
-      <w:r>
-        <w:rPr>
+        <w:rPr>
+          <w:highlight w:val="white"/>
+        </w:rPr>
+      </w:pPr>
+      <w:r>
+        <w:rPr>
+          <w:highlight w:val="white"/>
           <w:rtl w:val="0"/>
         </w:rPr>
         <w:t xml:space="preserve">Caracterizar os depósitos de movimento de massa no talude continental na porção norte da Bacia de Santos</w:t>
@@ -2132,6 +2156,7 @@
         <w:jc w:val="both"/>
         <w:rPr>
           <w:rFonts w:ascii="Arial" w:cs="Arial" w:eastAsia="Arial" w:hAnsi="Arial"/>
+          <w:highlight w:val="white"/>
         </w:rPr>
       </w:pPr>
       <w:r>
@@ -2147,11 +2172,14 @@
         <w:spacing w:after="240" w:before="240" w:line="360" w:lineRule="auto"/>
         <w:ind w:firstLine="0"/>
         <w:jc w:val="left"/>
-        <w:rPr/>
+        <w:rPr>
+          <w:highlight w:val="white"/>
+        </w:rPr>
       </w:pPr>
       <w:r>
         <w:rPr>
           <w:color w:val="000000"/>
+          <w:highlight w:val="white"/>
           <w:rtl w:val="0"/>
         </w:rPr>
         <w:t xml:space="preserve">1.1.2 Objetivos específicos</w:t>
@@ -2173,10 +2201,12 @@
         <w:jc w:val="both"/>
         <w:rPr>
           <w:rFonts w:ascii="Times New Roman" w:cs="Times New Roman" w:eastAsia="Times New Roman" w:hAnsi="Times New Roman"/>
-        </w:rPr>
-      </w:pPr>
-      <w:r>
-        <w:rPr>
+          <w:highlight w:val="white"/>
+        </w:rPr>
+      </w:pPr>
+      <w:r>
+        <w:rPr>
+          <w:highlight w:val="white"/>
           <w:rtl w:val="0"/>
         </w:rPr>
         <w:t xml:space="preserve">Identificar e mapear os depósitos/complexos de movimento de massa na área de estudo;</w:t>
@@ -2198,10 +2228,12 @@
         <w:jc w:val="both"/>
         <w:rPr>
           <w:rFonts w:ascii="Times New Roman" w:cs="Times New Roman" w:eastAsia="Times New Roman" w:hAnsi="Times New Roman"/>
-        </w:rPr>
-      </w:pPr>
-      <w:r>
-        <w:rPr>
+          <w:highlight w:val="white"/>
+        </w:rPr>
+      </w:pPr>
+      <w:r>
+        <w:rPr>
+          <w:highlight w:val="white"/>
           <w:rtl w:val="0"/>
         </w:rPr>
         <w:t xml:space="preserve">Gerar superfícies batimétricas e superfícies de depósitos da área de estudo;</w:t>
@@ -2223,10 +2255,12 @@
         <w:jc w:val="both"/>
         <w:rPr>
           <w:rFonts w:ascii="Times New Roman" w:cs="Times New Roman" w:eastAsia="Times New Roman" w:hAnsi="Times New Roman"/>
-        </w:rPr>
-      </w:pPr>
-      <w:r>
-        <w:rPr>
+          <w:highlight w:val="white"/>
+        </w:rPr>
+      </w:pPr>
+      <w:r>
+        <w:rPr>
+          <w:highlight w:val="white"/>
           <w:rtl w:val="0"/>
         </w:rPr>
         <w:t xml:space="preserve">Determinar a morfometria dos depósitos/complexos de movimentos de massa identificados;</w:t>
@@ -2248,10 +2282,12 @@
         <w:jc w:val="both"/>
         <w:rPr>
           <w:rFonts w:ascii="Times New Roman" w:cs="Times New Roman" w:eastAsia="Times New Roman" w:hAnsi="Times New Roman"/>
-        </w:rPr>
-      </w:pPr>
-      <w:r>
-        <w:rPr>
+          <w:highlight w:val="white"/>
+        </w:rPr>
+      </w:pPr>
+      <w:r>
+        <w:rPr>
+          <w:highlight w:val="white"/>
           <w:rtl w:val="0"/>
         </w:rPr>
         <w:t xml:space="preserve">Classificar os depósitos/complexos de movimentos de massa.</w:t>
@@ -2267,12 +2303,12 @@
         <w:ind w:left="720" w:hanging="360"/>
         <w:jc w:val="both"/>
         <w:rPr>
-          <w:highlight w:val="yellow"/>
-        </w:rPr>
-      </w:pPr>
-      <w:r>
-        <w:rPr>
-          <w:highlight w:val="yellow"/>
+          <w:highlight w:val="white"/>
+        </w:rPr>
+      </w:pPr>
+      <w:r>
+        <w:rPr>
+          <w:highlight w:val="white"/>
           <w:rtl w:val="0"/>
         </w:rPr>
         <w:t xml:space="preserve">Correlacionar os depósitos/complexos com idade de sedimentos datados na área de estudo </w:t>
@@ -2288,12 +2324,12 @@
         <w:ind w:left="720" w:hanging="360"/>
         <w:jc w:val="both"/>
         <w:rPr>
-          <w:highlight w:val="yellow"/>
-        </w:rPr>
-      </w:pPr>
-      <w:r>
-        <w:rPr>
-          <w:highlight w:val="yellow"/>
+          <w:highlight w:val="white"/>
+        </w:rPr>
+      </w:pPr>
+      <w:r>
+        <w:rPr>
+          <w:highlight w:val="white"/>
           <w:rtl w:val="0"/>
         </w:rPr>
         <w:t xml:space="preserve">Obter a espessura do pacote sedimentar que pode ser mobilizado por novos eventos através da Técnica HVSR</w:t>
@@ -2311,11 +2347,14 @@
         <w:spacing w:after="240" w:before="240" w:line="360" w:lineRule="auto"/>
         <w:ind w:firstLine="0"/>
         <w:jc w:val="left"/>
-        <w:rPr/>
+        <w:rPr>
+          <w:highlight w:val="white"/>
+        </w:rPr>
       </w:pPr>
       <w:r>
         <w:rPr>
           <w:color w:val="000000"/>
+          <w:highlight w:val="white"/>
           <w:rtl w:val="0"/>
         </w:rPr>
         <w:t xml:space="preserve">1.2 Justificativa</w:t>
@@ -2334,10 +2373,13 @@
         <w:spacing w:after="0" w:before="0" w:line="360" w:lineRule="auto"/>
         <w:ind w:firstLine="709"/>
         <w:jc w:val="both"/>
-        <w:rPr/>
-      </w:pPr>
-      <w:r>
-        <w:rPr>
+        <w:rPr>
+          <w:highlight w:val="white"/>
+        </w:rPr>
+      </w:pPr>
+      <w:r>
+        <w:rPr>
+          <w:highlight w:val="white"/>
           <w:rtl w:val="0"/>
         </w:rPr>
         <w:t xml:space="preserve">Apesar de serem menos estudados quando comparado aos deslizamentos terrestres, os movimentos de massa em ambiente marinho também são importantes em termos sociais, econômicos e ecológicos (Clare </w:t>
@@ -2346,12 +2388,14 @@
         <w:rPr>
           <w:i w:val="1"/>
           <w:iCs w:val="1"/>
+          <w:highlight w:val="white"/>
           <w:rtl w:val="0"/>
         </w:rPr>
         <w:t xml:space="preserve">et al</w:t>
       </w:r>
       <w:r>
         <w:rPr>
+          <w:highlight w:val="white"/>
           <w:rtl w:val="0"/>
         </w:rPr>
         <w:t xml:space="preserve">., 2018), uma vez que são fontes potenciais a gerar danos (Vanneste </w:t>
@@ -2360,12 +2404,14 @@
         <w:rPr>
           <w:i w:val="1"/>
           <w:iCs w:val="1"/>
+          <w:highlight w:val="white"/>
           <w:rtl w:val="0"/>
         </w:rPr>
         <w:t xml:space="preserve">et al</w:t>
       </w:r>
       <w:r>
         <w:rPr>
+          <w:highlight w:val="white"/>
           <w:rtl w:val="0"/>
         </w:rPr>
         <w:t xml:space="preserve">., 2014). Frequentemente, esses deslizamentos submarinos geram fluxos de dezenas a centenas de quilômetros, capazes de danificar a infraestrutura estratégica no fundo do mar, como cabos de telecomunicações, plataformas de produção e dutos de hidrocarbonetos (Pope </w:t>
@@ -2374,12 +2420,14 @@
         <w:rPr>
           <w:i w:val="1"/>
           <w:iCs w:val="1"/>
+          <w:highlight w:val="white"/>
           <w:rtl w:val="0"/>
         </w:rPr>
         <w:t xml:space="preserve">et al</w:t>
       </w:r>
       <w:r>
         <w:rPr>
+          <w:highlight w:val="white"/>
           <w:rtl w:val="0"/>
         </w:rPr>
         <w:t xml:space="preserve">., 2016), os quais estão presentes na região norte da Bacia de Santos. </w:t>
@@ -2393,10 +2441,13 @@
         <w:spacing w:after="0" w:before="0" w:line="360" w:lineRule="auto"/>
         <w:ind w:firstLine="709"/>
         <w:jc w:val="both"/>
-        <w:rPr/>
-      </w:pPr>
-      <w:r>
-        <w:rPr>
+        <w:rPr>
+          <w:highlight w:val="white"/>
+        </w:rPr>
+      </w:pPr>
+      <w:r>
+        <w:rPr>
+          <w:highlight w:val="white"/>
           <w:rtl w:val="0"/>
         </w:rPr>
         <w:t xml:space="preserve">Sob soterramento, os depósitos de deslizamentos subaquáticos são elementos importantes nos sistemas petrolíferos, pois influenciam a distribuição dos reservatórios (Kneller </w:t>
@@ -2405,12 +2456,14 @@
         <w:rPr>
           <w:i w:val="1"/>
           <w:iCs w:val="1"/>
+          <w:highlight w:val="white"/>
           <w:rtl w:val="0"/>
         </w:rPr>
         <w:t xml:space="preserve">et al</w:t>
       </w:r>
       <w:r>
         <w:rPr>
+          <w:highlight w:val="white"/>
           <w:rtl w:val="0"/>
         </w:rPr>
         <w:t xml:space="preserve">., 2016), podem atuar como selos (Cardona </w:t>
@@ -2419,12 +2472,14 @@
         <w:rPr>
           <w:i w:val="1"/>
           <w:iCs w:val="1"/>
+          <w:highlight w:val="white"/>
           <w:rtl w:val="0"/>
         </w:rPr>
         <w:t xml:space="preserve">et al</w:t>
       </w:r>
       <w:r>
         <w:rPr>
+          <w:highlight w:val="white"/>
           <w:rtl w:val="0"/>
         </w:rPr>
         <w:t xml:space="preserve">., 2016) e também como potenciais reservatórios (Meckel, 2011).</w:t>
@@ -2439,11 +2494,12 @@
         <w:ind w:firstLine="709"/>
         <w:jc w:val="both"/>
         <w:rPr>
-          <w:highlight w:val="yellow"/>
-        </w:rPr>
-      </w:pPr>
-      <w:r>
-        <w:rPr>
+          <w:highlight w:val="white"/>
+        </w:rPr>
+      </w:pPr>
+      <w:r>
+        <w:rPr>
+          <w:highlight w:val="white"/>
           <w:rtl w:val="0"/>
         </w:rPr>
         <w:t xml:space="preserve">Um dos maiores desafios de estudos sobre transportes de massa submarinos é a sua natureza, em mar aberto e longe da costa, o que dificulta a aquisição dos dados bem como a falta de informação consistente, por vezes, de baixa resolução (Clare </w:t>
@@ -2452,20 +2508,17 @@
         <w:rPr>
           <w:i w:val="1"/>
           <w:iCs w:val="1"/>
+          <w:highlight w:val="white"/>
           <w:rtl w:val="0"/>
         </w:rPr>
         <w:t xml:space="preserve">et al</w:t>
       </w:r>
       <w:r>
         <w:rPr>
+          <w:highlight w:val="white"/>
           <w:rtl w:val="0"/>
         </w:rPr>
         <w:t xml:space="preserve">., 2018). Assim, convergir conhecimentos da atividade sismoestratigráfica e sismológica, visando a identificação e caracterização de movimentos de massa, dará suporte para avançar no entendimento de processos atuantes na margem continental sudeste e, consequentemente, no planejamento de ações da indústria do petróleo na implantação e monitoramento de infraestrutura de exploração e produção de hidrocarbonetos.</w:t>
-      </w:r>
-      <w:r>
-        <w:rPr>
-          <w:rtl w:val="0"/>
-        </w:rPr>
       </w:r>
     </w:p>
     <w:p>
@@ -2475,17 +2528,21 @@
         <w:spacing w:after="240" w:before="240" w:line="360" w:lineRule="auto"/>
         <w:ind w:firstLine="0"/>
         <w:jc w:val="left"/>
-        <w:rPr/>
+        <w:rPr>
+          <w:highlight w:val="white"/>
+        </w:rPr>
       </w:pPr>
       <w:r>
         <w:rPr>
           <w:color w:val="000000"/>
+          <w:highlight w:val="white"/>
           <w:rtl w:val="0"/>
         </w:rPr>
         <w:t xml:space="preserve">2 </w:t>
       </w:r>
       <w:r>
         <w:rPr>
+          <w:highlight w:val="white"/>
           <w:rtl w:val="0"/>
         </w:rPr>
         <w:t xml:space="preserve">FUNDAMENTAÇÃO TEÓRICA</w:t>
@@ -2498,17 +2555,21 @@
         <w:spacing w:after="240" w:before="240" w:line="360" w:lineRule="auto"/>
         <w:ind w:firstLine="0"/>
         <w:jc w:val="left"/>
-        <w:rPr/>
+        <w:rPr>
+          <w:highlight w:val="white"/>
+        </w:rPr>
       </w:pPr>
       <w:r>
         <w:rPr>
           <w:color w:val="000000"/>
+          <w:highlight w:val="white"/>
           <w:rtl w:val="0"/>
         </w:rPr>
         <w:t xml:space="preserve">2.1 </w:t>
       </w:r>
       <w:r>
         <w:rPr>
+          <w:highlight w:val="white"/>
           <w:rtl w:val="0"/>
         </w:rPr>
         <w:t xml:space="preserve">Sísmica de reflexão</w:t>
@@ -2519,10 +2580,13 @@
         <w:spacing w:after="0" w:before="0" w:line="360" w:lineRule="auto"/>
         <w:ind w:firstLine="709"/>
         <w:jc w:val="both"/>
-        <w:rPr/>
-      </w:pPr>
-      <w:r>
-        <w:rPr>
+        <w:rPr>
+          <w:highlight w:val="white"/>
+        </w:rPr>
+      </w:pPr>
+      <w:r>
+        <w:rPr>
+          <w:highlight w:val="white"/>
           <w:rtl w:val="0"/>
         </w:rPr>
         <w:t xml:space="preserve">A sísmica de reflexão é um dos métodos geofísicos mais efetivos para mapear a geologia de uma determinada área, principalmente em ambientes submersos, utilizando fontes artificiais. Esse método baseia-se no princípio de que, quando um pulso sísmico é provocado próximo à superfície da coluna d’água por uma fonte artificial, ondas mecânicas se propagam em direção ao interior da Terra até encontrarem interfaces que delimitam camadas litológicas com diferentes impedâncias acústicas, nas quais parte de sua energia é refletida (Tóth, 2011).</w:t>
@@ -2533,10 +2597,13 @@
         <w:spacing w:after="0" w:before="0" w:line="360" w:lineRule="auto"/>
         <w:ind w:firstLine="709"/>
         <w:jc w:val="both"/>
-        <w:rPr/>
-      </w:pPr>
-      <w:r>
-        <w:rPr>
+        <w:rPr>
+          <w:highlight w:val="white"/>
+        </w:rPr>
+      </w:pPr>
+      <w:r>
+        <w:rPr>
+          <w:highlight w:val="white"/>
           <w:rtl w:val="0"/>
         </w:rPr>
         <w:t xml:space="preserve">A impedância acústica (Z) é uma propriedade que pode ser determinada pelo produto entre a densidade (ρ) do meio e a velocidade de propagação (c) da onda, considerando-se uma onda plana com incidência normal à interface. Assim, a impedância acústica de um meio pode ser expressa pela relação: Z = ρc (Yilmaz, 2001). O fenômeno físico da reflexão das ondas acústicas ocorre quando existem contrastes representativos de impedância entre os meios atravessados pelo sinal emitido (Tóth, 2011). Nessas interfaces, parte da energia da onda retorna em direção à superfície, enquanto outra parte é transmitida e continua sua propagação até encontrar uma nova camada com impedância acústica distinta, repetindo-se sucessivamente os processos de reflexão e transmissão.</w:t>
@@ -2547,10 +2614,13 @@
         <w:spacing w:after="0" w:before="0" w:line="360" w:lineRule="auto"/>
         <w:ind w:firstLine="709"/>
         <w:jc w:val="both"/>
-        <w:rPr/>
-      </w:pPr>
-      <w:r>
-        <w:rPr>
+        <w:rPr>
+          <w:highlight w:val="white"/>
+        </w:rPr>
+      </w:pPr>
+      <w:r>
+        <w:rPr>
+          <w:highlight w:val="white"/>
           <w:rtl w:val="0"/>
         </w:rPr>
         <w:t xml:space="preserve">A técnica baseia-se na análise dos intervalos de tempo decorridos entre a emissão dos sinais pela fonte artificial e a chegada das ondas refletidas aos receptores, bem como de suas amplitudes. Esse intervalo é denominado tempo duplo de percurso, ou </w:t>
@@ -2559,12 +2629,14 @@
         <w:rPr>
           <w:i w:val="1"/>
           <w:iCs w:val="1"/>
+          <w:highlight w:val="white"/>
           <w:rtl w:val="0"/>
         </w:rPr>
         <w:t xml:space="preserve">two-way travel time</w:t>
       </w:r>
       <w:r>
         <w:rPr>
+          <w:highlight w:val="white"/>
           <w:rtl w:val="0"/>
         </w:rPr>
         <w:t xml:space="preserve"> (TWT), pois corresponde ao tempo necessário para que a onda se desloque da fonte até uma determinada interface e retorne à superfície. Dessa forma, os refletores presentes nas seções sísmicas são inicialmente posicionados em função do tempo, geralmente expresso em segundos ou milissegundos, e não diretamente em profundidade. A conversão do tempo em profundidade depende do conhecimento ou da estimativa das velocidades de propagação das ondas nos diferentes materiais atravessados (Yilmaz, 2001).</w:t>
@@ -2575,10 +2647,13 @@
         <w:spacing w:after="0" w:before="0" w:line="360" w:lineRule="auto"/>
         <w:ind w:firstLine="709"/>
         <w:jc w:val="both"/>
-        <w:rPr/>
-      </w:pPr>
-      <w:r>
-        <w:rPr>
+        <w:rPr>
+          <w:highlight w:val="white"/>
+        </w:rPr>
+      </w:pPr>
+      <w:r>
+        <w:rPr>
+          <w:highlight w:val="white"/>
           <w:rtl w:val="0"/>
         </w:rPr>
         <w:t xml:space="preserve">Cada receptor registra, ao longo do tempo, as variações de amplitude das ondas que retornam à superfície. Esse registro individual é denominado traço sísmico e representa a resposta do meio geológico ao pulso emitido em uma determinada posição. A organização de vários traços sísmicos lado a lado forma uma seção sísmica, na qual a continuidade, a geometria e a amplitude das reflexões permitem identificar e interpretar interfaces e estruturas geológicas em subsuperfície (Kearey, 2009; Yilmaz, 2001). Assim, o método de sísmica de reflexão fundamenta-se no processamento e na posterior interpretação das reflexões registradas na superfície (Kearey, 2009).</w:t>
@@ -2591,12 +2666,15 @@
         <w:spacing w:after="240" w:before="240" w:line="360" w:lineRule="auto"/>
         <w:ind w:firstLine="0"/>
         <w:jc w:val="left"/>
-        <w:rPr/>
+        <w:rPr>
+          <w:highlight w:val="white"/>
+        </w:rPr>
       </w:pPr>
       <w:bookmarkStart w:colFirst="0" w:colLast="0" w:name="_1rbldzm8syoo" w:id="0"/>
       <w:bookmarkEnd w:id="0"/>
       <w:r>
         <w:rPr>
+          <w:highlight w:val="white"/>
           <w:rtl w:val="0"/>
         </w:rPr>
         <w:t xml:space="preserve">2.1.1 Cosseno de fase instantânea</w:t>
@@ -2607,10 +2685,13 @@
         <w:spacing w:after="0" w:before="0" w:line="360" w:lineRule="auto"/>
         <w:ind w:firstLine="709"/>
         <w:jc w:val="both"/>
-        <w:rPr/>
-      </w:pPr>
-      <w:r>
-        <w:rPr>
+        <w:rPr>
+          <w:highlight w:val="white"/>
+        </w:rPr>
+      </w:pPr>
+      <w:r>
+        <w:rPr>
+          <w:highlight w:val="white"/>
           <w:rtl w:val="0"/>
         </w:rPr>
         <w:t xml:space="preserve">O atributo sísmico cosseno da fase instantânea é obtido a partir do cálculo do cosseno da fase instantânea do sinal sísmico, conforme a seguinte equação:</w:t>
@@ -2621,10 +2702,13 @@
         <w:spacing w:after="0" w:before="0" w:line="360" w:lineRule="auto"/>
         <w:ind w:firstLine="0"/>
         <w:jc w:val="center"/>
-        <w:rPr/>
-      </w:pPr>
-      <w:r>
-        <w:rPr>
+        <w:rPr>
+          <w:highlight w:val="white"/>
+        </w:rPr>
+      </w:pPr>
+      <w:r>
+        <w:rPr>
+          <w:highlight w:val="white"/>
           <w:rtl w:val="0"/>
         </w:rPr>
         <w:t xml:space="preserve">C(t) = cos(φ(t))    (1)</w:t>
@@ -2635,10 +2719,13 @@
         <w:spacing w:after="0" w:before="0" w:line="360" w:lineRule="auto"/>
         <w:ind w:firstLine="709"/>
         <w:jc w:val="both"/>
-        <w:rPr/>
-      </w:pPr>
-      <w:r>
-        <w:rPr>
+        <w:rPr>
+          <w:highlight w:val="white"/>
+        </w:rPr>
+      </w:pPr>
+      <w:r>
+        <w:rPr>
+          <w:highlight w:val="white"/>
           <w:rtl w:val="0"/>
         </w:rPr>
         <w:t xml:space="preserve">em que C(t) corresponde ao cosseno da fase instantânea e φ(t) representa a fase instantânea do sinal sísmico no tempo t. A fase instantânea é determinada a partir do sinal analítico, cuja parte imaginária é obtida por meio da transformada de Hilbert. Esse procedimento permite separar as informações de fase e amplitude do traço sísmico (Chopra &amp; Marfurt, 2007). Consequentemente, o cálculo do cosseno da fase torna-se independente dos valores de amplitude, promovendo uma normalização do traço sísmico e removendo as variações relacionadas à intensidade do sinal (Meneses, 2010).</w:t>
@@ -2649,10 +2736,13 @@
         <w:spacing w:after="0" w:before="0" w:line="360" w:lineRule="auto"/>
         <w:ind w:firstLine="709"/>
         <w:jc w:val="both"/>
-        <w:rPr/>
-      </w:pPr>
-      <w:r>
-        <w:rPr>
+        <w:rPr>
+          <w:highlight w:val="white"/>
+        </w:rPr>
+      </w:pPr>
+      <w:r>
+        <w:rPr>
+          <w:highlight w:val="white"/>
           <w:rtl w:val="0"/>
         </w:rPr>
         <w:t xml:space="preserve">Ao reduzir a influência dos contrastes de amplitude, esse atributo evidencia a geometria e a configuração dos refletores, permitindo que feições anteriormente pouco perceptíveis sejam visualizadas com maior clareza (Chopra &amp; Marfurt, 2007). Dessa forma, o cosseno da fase instantânea contribui para realçar a continuidade lateral dos refletores, as mudanças no padrão de acamamento e os limites entre sequências sísmicas, auxiliando a interpretação estratigráfica e estrutural dos dados (Alvarenga, 2016).</w:t>
@@ -2670,17 +2760,21 @@
         <w:spacing w:after="240" w:before="240" w:line="360" w:lineRule="auto"/>
         <w:ind w:firstLine="0"/>
         <w:jc w:val="left"/>
-        <w:rPr/>
+        <w:rPr>
+          <w:highlight w:val="white"/>
+        </w:rPr>
       </w:pPr>
       <w:r>
         <w:rPr>
           <w:color w:val="000000"/>
+          <w:highlight w:val="white"/>
           <w:rtl w:val="0"/>
         </w:rPr>
         <w:t xml:space="preserve">2.2 </w:t>
       </w:r>
       <w:r>
         <w:rPr>
+          <w:highlight w:val="white"/>
           <w:rtl w:val="0"/>
         </w:rPr>
         <w:t xml:space="preserve">Sismoestratigrafia</w:t>
@@ -2691,10 +2785,13 @@
         <w:spacing w:after="240" w:before="240" w:lineRule="auto"/>
         <w:ind w:firstLine="720"/>
         <w:jc w:val="both"/>
-        <w:rPr/>
-      </w:pPr>
-      <w:r>
-        <w:rPr>
+        <w:rPr>
+          <w:highlight w:val="white"/>
+        </w:rPr>
+      </w:pPr>
+      <w:r>
+        <w:rPr>
+          <w:highlight w:val="white"/>
           <w:rtl w:val="0"/>
         </w:rPr>
         <w:t xml:space="preserve">A sismoestratigrafia consiste em um método de interpretação de dados sísmicos voltado à análise das relações estratigráficas e das geometrias deposicionais presentes em subsuperfície. A partir da configuração, continuidade e terminação dos refletores sísmicos, esse método auxilia na identificação de unidades deposicionais, superfícies estratigráficas e possíveis mudanças no padrão de sedimentação (Severiano Ribeiro, 2001).</w:t>
@@ -2705,10 +2802,13 @@
         <w:spacing w:after="240" w:before="240" w:lineRule="auto"/>
         <w:ind w:firstLine="720"/>
         <w:jc w:val="both"/>
-        <w:rPr/>
-      </w:pPr>
-      <w:r>
-        <w:rPr>
+        <w:rPr>
+          <w:highlight w:val="white"/>
+        </w:rPr>
+      </w:pPr>
+      <w:r>
+        <w:rPr>
+          <w:highlight w:val="white"/>
           <w:rtl w:val="0"/>
         </w:rPr>
         <w:t xml:space="preserve">Um princípio essencial da interpretação sismoestratigráfica é que as reflexões sísmicas resultam, predominantemente, de contrastes de impedância acústica entre materiais geológicos. Assim, os refletores podem representar superfícies físicas associadas a eventos ou intervalos temporalmente correlacionáveis, sem que correspondam, obrigatoriamente, a mudanças litológicas. Essas superfícies podem ser classificadas como superfícies estratais ou discordâncias. As superfícies estratais, em geral, acompanham os planos de acamamento e apresentam reduzida variação temporal ao longo de sua extensão. Já as discordâncias possuem maior expressão cronoestratigráfica, pois correspondem a superfícies relacionadas à erosão ou à ausência de deposição, separando estratos mais antigos daqueles depositados posteriormente (Severiano Ribeiro, 2001; Vail &amp; Mitchum Jr., 1977).</w:t>
@@ -2719,10 +2819,13 @@
         <w:spacing w:after="240" w:before="240" w:lineRule="auto"/>
         <w:ind w:firstLine="720"/>
         <w:jc w:val="both"/>
-        <w:rPr/>
-      </w:pPr>
-      <w:r>
-        <w:rPr>
+        <w:rPr>
+          <w:highlight w:val="white"/>
+        </w:rPr>
+      </w:pPr>
+      <w:r>
+        <w:rPr>
+          <w:highlight w:val="white"/>
           <w:rtl w:val="0"/>
         </w:rPr>
         <w:t xml:space="preserve">As discordâncias são particularmente relevantes para a subdivisão do preenchimento sedimentar das bacias, uma vez que delimitam pacotes de estratos geneticamente distintos. Desse modo, permitem reconhecer sequências deposicionais, definidas como sucessões relativamente concordantes de estratos geneticamente relacionados, limitadas no topo e na base por discordâncias ou por suas concordâncias correlativas (Mitchum Jr. et al., 1977). Esses limites podem ser interpretados pela observação da angularidade e dos padrões de terminação dos refletores contra as superfícies limítrofes.</w:t>
@@ -2733,10 +2836,13 @@
         <w:spacing w:after="240" w:before="240" w:lineRule="auto"/>
         <w:ind w:firstLine="720"/>
         <w:jc w:val="both"/>
-        <w:rPr/>
-      </w:pPr>
-      <w:r>
-        <w:rPr>
+        <w:rPr>
+          <w:highlight w:val="white"/>
+        </w:rPr>
+      </w:pPr>
+      <w:r>
+        <w:rPr>
+          <w:highlight w:val="white"/>
           <w:rtl w:val="0"/>
         </w:rPr>
         <w:t xml:space="preserve">Além de contribuírem para o reconhecimento dos limites de sequências, as terminações de refletores permitem caracterizar diferentes superfícies dentro das unidades sísmicas. O truncamento erosivo ocorre quando refletores são interrompidos em seu topo por uma superfície erosiva mais jovem, indicando remoção parcial de estratos preexistentes. Por sua vez, terminações associadas a falhas, deslizamentos gravitacionais ou outras rupturas tectônicas são classificadas como truncamentos estruturais. Outros padrões, como onlap, downlap e toplap, também podem indicar relações deposicionais, variações no espaço de acomodação e mudanças nas condições de sedimentação, contribuindo para a interpretação da evolução estratigráfica da bacia.</w:t>
@@ -2745,12 +2851,15 @@
     <w:p>
       <w:pPr>
         <w:pStyle w:val="Heading3"/>
-        <w:rPr/>
+        <w:rPr>
+          <w:highlight w:val="white"/>
+        </w:rPr>
       </w:pPr>
       <w:bookmarkStart w:colFirst="0" w:colLast="0" w:name="_o1eeu2ym2b2q" w:id="1"/>
       <w:bookmarkEnd w:id="1"/>
       <w:r>
         <w:rPr>
+          <w:highlight w:val="white"/>
           <w:rtl w:val="0"/>
         </w:rPr>
         <w:t xml:space="preserve">2.2.1 Fácies sísmicas </w:t>
@@ -2761,10 +2870,13 @@
         <w:spacing w:after="0" w:before="0" w:line="360" w:lineRule="auto"/>
         <w:ind w:firstLine="709"/>
         <w:jc w:val="both"/>
-        <w:rPr/>
-      </w:pPr>
-      <w:r>
-        <w:rPr>
+        <w:rPr>
+          <w:highlight w:val="white"/>
+        </w:rPr>
+      </w:pPr>
+      <w:r>
+        <w:rPr>
+          <w:highlight w:val="white"/>
           <w:rtl w:val="0"/>
         </w:rPr>
         <w:t xml:space="preserve">As fácies sísmicas, também denominadas sismofácies, correspondem a unidades tridimensionais reconhecidas em dados sísmicos por apresentarem um conjunto de reflexões com características distintas das unidades vizinhas. Essas diferenças são observadas por meio de parâmetros como amplitude, continuidade, frequência, configuração interna e geometria dos refletores (Brown Jr. &amp; Fisher, 1980).</w:t>
@@ -2775,10 +2887,13 @@
         <w:spacing w:after="0" w:before="0" w:line="360" w:lineRule="auto"/>
         <w:ind w:firstLine="709"/>
         <w:jc w:val="both"/>
-        <w:rPr/>
-      </w:pPr>
-      <w:r>
-        <w:rPr>
+        <w:rPr>
+          <w:highlight w:val="white"/>
+        </w:rPr>
+      </w:pPr>
+      <w:r>
+        <w:rPr>
+          <w:highlight w:val="white"/>
           <w:rtl w:val="0"/>
         </w:rPr>
         <w:t xml:space="preserve">A delimitação e o mapeamento dessas unidades no interior das sequências deposicionais constituem a análise sismofaciológica. Esse procedimento busca relacionar os padrões sísmicos observados às condições geológicas responsáveis pela deposição dos estratos, permitindo inferir processos sedimentares, ambiente deposicional, energia do meio e possíveis características litológicas dos pacotes sedimentares (Mitchum Jr. et al., 1977).</w:t>
@@ -2789,10 +2904,13 @@
         <w:spacing w:after="0" w:before="0" w:line="360" w:lineRule="auto"/>
         <w:ind w:firstLine="709"/>
         <w:jc w:val="both"/>
-        <w:rPr/>
-      </w:pPr>
-      <w:r>
-        <w:rPr>
+        <w:rPr>
+          <w:highlight w:val="white"/>
+        </w:rPr>
+      </w:pPr>
+      <w:r>
+        <w:rPr>
+          <w:highlight w:val="white"/>
           <w:rtl w:val="0"/>
         </w:rPr>
         <w:t xml:space="preserve">Entre os parâmetros empregados nessa interpretação, destacam-se a amplitude e a continuidade das reflexões. A amplitude está relacionada ao contraste de impedância acústica entre camadas adjacentes e pode fornecer indícios sobre variações litológicas, espaçamento dos estratos e possíveis mudanças nas propriedades físicas das rochas. A continuidade, por sua vez, expressa o grau de persistência lateral dos refletores, podendo estar associada à regularidade do acamamento, à espessura das camadas e às condições de energia durante a sedimentação. Em conjunto, esses atributos contribuem para a caracterização interna das sismofácies e para a interpretação de seu significado deposicional.</w:t>
@@ -2803,10 +2921,13 @@
         <w:spacing w:after="0" w:before="0" w:line="360" w:lineRule="auto"/>
         <w:ind w:firstLine="709"/>
         <w:jc w:val="both"/>
-        <w:rPr/>
-      </w:pPr>
-      <w:r>
-        <w:rPr>
+        <w:rPr>
+          <w:highlight w:val="white"/>
+        </w:rPr>
+      </w:pPr>
+      <w:r>
+        <w:rPr>
+          <w:highlight w:val="white"/>
           <w:rtl w:val="0"/>
         </w:rPr>
         <w:t xml:space="preserve">As configurações internas dos refletores também são fundamentais para a análise das sismofácies. Os padrões podem ser paralelos ou ondulados, divergentes, progradantes, caóticos e transparentes (Figura 1). Reflexões paralelas, subparalelas ou onduladas geralmente indicam deposição relativamente uniforme e equilíbrio entre sedimentação e subsidência. Já os padrões divergentes refletem alterações na taxa de sedimentação e/ou na criação de espaço de acomodação ao longo do tempo.</w:t>
@@ -2817,10 +2938,13 @@
         <w:spacing w:after="0" w:before="0" w:line="360" w:lineRule="auto"/>
         <w:ind w:firstLine="709"/>
         <w:jc w:val="both"/>
-        <w:rPr/>
-      </w:pPr>
-      <w:r>
-        <w:rPr>
+        <w:rPr>
+          <w:highlight w:val="white"/>
+        </w:rPr>
+      </w:pPr>
+      <w:r>
+        <w:rPr>
+          <w:highlight w:val="white"/>
           <w:rtl w:val="0"/>
         </w:rPr>
         <w:t xml:space="preserve">As configurações progradantes evidenciam o avanço lateral de corpos sedimentares, formando clinoformas. Sua geometria pode variar conforme a interação entre aporte sedimentar, variações relativas do nível do mar, energia do ambiente e características do sistema deposicional. Em contraste, padrões caóticos apresentam reflexões descontínuas e sem organização geométrica definida, podendo estar associados a deposição desorganizada, deformação sedimentar ou processos gravitacionais. Por fim, sismofácies transparentes são caracterizadas pela ausência ou baixa definição de refletores internos, o que pode indicar unidades homogêneas, reduzido contraste de impedância acústica ou limitações de resolução sísmica.</w:t>
@@ -2832,20 +2956,24 @@
         <w:spacing w:after="60" w:before="120" w:line="240" w:lineRule="auto"/>
         <w:ind w:left="0" w:firstLine="0"/>
         <w:jc w:val="center"/>
-        <w:rPr/>
-      </w:pPr>
-      <w:r>
-        <w:rPr/>
+        <w:rPr>
+          <w:highlight w:val="white"/>
+        </w:rPr>
+      </w:pPr>
+      <w:r>
+        <w:rPr>
+          <w:highlight w:val="white"/>
+        </w:rPr>
         <w:drawing>
           <wp:inline distB="114300" distT="114300" distL="114300" distR="114300">
             <wp:extent cx="4690796" cy="4706302"/>
             <wp:effectExtent b="0" l="0" r="0" t="0"/>
-            <wp:docPr id="5" name="image4.png"/>
+            <wp:docPr id="5" name="image5.png"/>
             <a:graphic>
               <a:graphicData uri="http://schemas.openxmlformats.org/drawingml/2006/picture">
                 <pic:pic>
                   <pic:nvPicPr>
-                    <pic:cNvPr id="0" name="image4.png"/>
+                    <pic:cNvPr id="0" name="image5.png"/>
                     <pic:cNvPicPr preferRelativeResize="0"/>
                   </pic:nvPicPr>
                   <pic:blipFill>
@@ -2884,12 +3012,14 @@
         <w:rPr>
           <w:sz w:val="20"/>
           <w:szCs w:val="20"/>
+          <w:highlight w:val="white"/>
         </w:rPr>
       </w:pPr>
       <w:r>
         <w:rPr>
           <w:sz w:val="20"/>
           <w:szCs w:val="20"/>
+          <w:highlight w:val="white"/>
           <w:rtl w:val="0"/>
         </w:rPr>
         <w:t xml:space="preserve">Figura 1 — Esquemas de padrões de configuração dos refletores</w:t>
@@ -2900,7 +3030,9 @@
         <w:spacing w:after="0" w:before="0" w:line="360" w:lineRule="auto"/>
         <w:ind w:left="0" w:firstLine="709"/>
         <w:jc w:val="both"/>
-        <w:rPr/>
+        <w:rPr>
+          <w:highlight w:val="white"/>
+        </w:rPr>
       </w:pPr>
       <w:r>
         <w:rPr>
@@ -2917,12 +3049,14 @@
         <w:rPr>
           <w:sz w:val="20"/>
           <w:szCs w:val="20"/>
+          <w:highlight w:val="white"/>
         </w:rPr>
       </w:pPr>
       <w:r>
         <w:rPr>
           <w:sz w:val="20"/>
           <w:szCs w:val="20"/>
+          <w:highlight w:val="white"/>
           <w:rtl w:val="0"/>
         </w:rPr>
         <w:t xml:space="preserve">Fonte: adaptado de Mitchum Jr. et al. (1977).</w:t>
@@ -2935,12 +3069,15 @@
         <w:spacing w:after="120" w:before="240" w:lineRule="auto"/>
         <w:ind w:firstLine="0"/>
         <w:jc w:val="left"/>
-        <w:rPr/>
+        <w:rPr>
+          <w:highlight w:val="white"/>
+        </w:rPr>
       </w:pPr>
       <w:bookmarkStart w:colFirst="0" w:colLast="0" w:name="_meybu3i0zoza" w:id="2"/>
       <w:bookmarkEnd w:id="2"/>
       <w:r>
         <w:rPr>
+          <w:highlight w:val="white"/>
           <w:rtl w:val="0"/>
         </w:rPr>
         <w:t xml:space="preserve">2.2.2 Formas externas das fácies sísmicas</w:t>
@@ -2951,10 +3088,13 @@
         <w:spacing w:after="0" w:before="0" w:line="360" w:lineRule="auto"/>
         <w:ind w:firstLine="709"/>
         <w:jc w:val="both"/>
-        <w:rPr/>
-      </w:pPr>
-      <w:r>
-        <w:rPr>
+        <w:rPr>
+          <w:highlight w:val="white"/>
+        </w:rPr>
+      </w:pPr>
+      <w:r>
+        <w:rPr>
+          <w:highlight w:val="white"/>
           <w:rtl w:val="0"/>
         </w:rPr>
         <w:t xml:space="preserve">A geometria externa das fácies sísmicas (Figura 2) auxilia na interpretação dos processos deposicionais e da relação dos depósitos com o relevo preexistente. As formas mais comuns incluem geometrias em lençol, montiformas e preenchimentos de relevo negativo (Mitchum Jr. et al., 1977).</w:t>
@@ -2965,10 +3105,13 @@
         <w:spacing w:after="0" w:before="0" w:line="360" w:lineRule="auto"/>
         <w:ind w:firstLine="709"/>
         <w:jc w:val="both"/>
-        <w:rPr/>
-      </w:pPr>
-      <w:r>
-        <w:rPr>
+        <w:rPr>
+          <w:highlight w:val="white"/>
+        </w:rPr>
+      </w:pPr>
+      <w:r>
+        <w:rPr>
+          <w:highlight w:val="white"/>
           <w:rtl w:val="0"/>
         </w:rPr>
         <w:t xml:space="preserve">As fácies em lençol ou drapes correspondem a pacotes tabulares, geralmente compostos por refletores paralelos ou subparalelos, que recobrem a topografia subjacente. Já as montiformas apresentam relevo positivo em relação aos estratos adjacentes e podem estar associadas a lobos deposicionais, contornitos e depósitos gravitacionais. Em especial, depósitos de fluxo de detritos podem formar corpos lobados, com margens relativamente íngremes e aspecto montiforme em seção sísmica (Posamentier &amp; Kolla, 2003).</w:t>
@@ -2980,20 +3123,24 @@
         <w:spacing w:after="60" w:before="120" w:line="240" w:lineRule="auto"/>
         <w:ind w:left="0" w:firstLine="0"/>
         <w:jc w:val="center"/>
-        <w:rPr/>
-      </w:pPr>
-      <w:r>
-        <w:rPr/>
+        <w:rPr>
+          <w:highlight w:val="white"/>
+        </w:rPr>
+      </w:pPr>
+      <w:r>
+        <w:rPr>
+          <w:highlight w:val="white"/>
+        </w:rPr>
         <w:drawing>
           <wp:inline distB="114300" distT="114300" distL="114300" distR="114300">
             <wp:extent cx="5759775" cy="1295400"/>
             <wp:effectExtent b="0" l="0" r="0" t="0"/>
-            <wp:docPr id="1" name="image5.png"/>
+            <wp:docPr id="1" name="image2.png"/>
             <a:graphic>
               <a:graphicData uri="http://schemas.openxmlformats.org/drawingml/2006/picture">
                 <pic:pic>
                   <pic:nvPicPr>
-                    <pic:cNvPr id="0" name="image5.png"/>
+                    <pic:cNvPr id="0" name="image2.png"/>
                     <pic:cNvPicPr preferRelativeResize="0"/>
                   </pic:nvPicPr>
                   <pic:blipFill>
@@ -3032,12 +3179,14 @@
         <w:rPr>
           <w:sz w:val="20"/>
           <w:szCs w:val="20"/>
+          <w:highlight w:val="white"/>
         </w:rPr>
       </w:pPr>
       <w:r>
         <w:rPr>
           <w:sz w:val="20"/>
           <w:szCs w:val="20"/>
+          <w:highlight w:val="white"/>
           <w:rtl w:val="0"/>
         </w:rPr>
         <w:t xml:space="preserve">Figura 2 — Formas externas das fácies sísmicas: (A) lençóis ondulados ou drapes; (B) montiformas; (C) geometria de preenchimento</w:t>
@@ -3052,12 +3201,14 @@
         <w:rPr>
           <w:sz w:val="20"/>
           <w:szCs w:val="20"/>
+          <w:highlight w:val="white"/>
         </w:rPr>
       </w:pPr>
       <w:r>
         <w:rPr>
           <w:sz w:val="20"/>
           <w:szCs w:val="20"/>
+          <w:highlight w:val="white"/>
           <w:rtl w:val="0"/>
         </w:rPr>
         <w:t xml:space="preserve">Fonte: adaptado de Mitchum Jr. et al. (1977).</w:t>
@@ -3068,10 +3219,13 @@
         <w:spacing w:after="0" w:before="0" w:line="360" w:lineRule="auto"/>
         <w:ind w:firstLine="709"/>
         <w:jc w:val="both"/>
-        <w:rPr/>
-      </w:pPr>
-      <w:r>
-        <w:rPr>
+        <w:rPr>
+          <w:highlight w:val="white"/>
+        </w:rPr>
+      </w:pPr>
+      <w:r>
+        <w:rPr>
+          <w:highlight w:val="white"/>
           <w:rtl w:val="0"/>
         </w:rPr>
         <w:t xml:space="preserve">As geometrias de preenchimento (Figura 3) representam depósitos acumulados em feições negativas, como canais, vales, ravinas ou depressões do assoalho marinho. Esses corpos podem apresentar base erosiva, marcada por truncamentos ou incisões, e preenchimento interno concordante, caótico ou transparente. Em ambientes profundos, depósitos gravitacionais podem ocorrer tanto como preenchimentos canalizados quanto como lobos e lençóis, frequentemente exibindo fácies sísmicas caóticas a transparentes e superfícies basais erosivas (Posamentier &amp; Kolla, 2003). Dessa forma, a identificação dos limites laterais, da geometria externa e das reflexões internas é essencial para distinguir depósitos gravitacionais de outros tipos de preenchimento sedimentar (Mitchum Jr. et al., 1977).</w:t>
@@ -3083,20 +3237,24 @@
         <w:spacing w:after="60" w:before="120" w:line="240" w:lineRule="auto"/>
         <w:ind w:left="0" w:firstLine="0"/>
         <w:jc w:val="center"/>
-        <w:rPr/>
-      </w:pPr>
-      <w:r>
-        <w:rPr/>
+        <w:rPr>
+          <w:highlight w:val="white"/>
+        </w:rPr>
+      </w:pPr>
+      <w:r>
+        <w:rPr>
+          <w:highlight w:val="white"/>
+        </w:rPr>
         <w:drawing>
           <wp:inline distB="114300" distT="114300" distL="114300" distR="114300">
             <wp:extent cx="5444561" cy="2798774"/>
             <wp:effectExtent b="0" l="0" r="0" t="0"/>
-            <wp:docPr id="4" name="image2.png"/>
+            <wp:docPr id="4" name="image1.png"/>
             <a:graphic>
               <a:graphicData uri="http://schemas.openxmlformats.org/drawingml/2006/picture">
                 <pic:pic>
                   <pic:nvPicPr>
-                    <pic:cNvPr id="0" name="image2.png"/>
+                    <pic:cNvPr id="0" name="image1.png"/>
                     <pic:cNvPicPr preferRelativeResize="0"/>
                   </pic:nvPicPr>
                   <pic:blipFill>
@@ -3135,12 +3293,14 @@
         <w:rPr>
           <w:sz w:val="20"/>
           <w:szCs w:val="20"/>
+          <w:highlight w:val="white"/>
         </w:rPr>
       </w:pPr>
       <w:r>
         <w:rPr>
           <w:sz w:val="20"/>
           <w:szCs w:val="20"/>
+          <w:highlight w:val="white"/>
           <w:rtl w:val="0"/>
         </w:rPr>
         <w:t xml:space="preserve">Figura 3 — Padrões de configuração interna dos refletores em geometrias de preenchimento: (A) em onlap; (B) progradante; (C) montiforma “onlapante”; (D) caótico; (E) divergente; (F) complexo</w:t>
@@ -3155,12 +3315,14 @@
         <w:rPr>
           <w:sz w:val="20"/>
           <w:szCs w:val="20"/>
+          <w:highlight w:val="white"/>
         </w:rPr>
       </w:pPr>
       <w:r>
         <w:rPr>
           <w:sz w:val="20"/>
           <w:szCs w:val="20"/>
+          <w:highlight w:val="white"/>
           <w:rtl w:val="0"/>
         </w:rPr>
         <w:t xml:space="preserve">Fonte: adaptado de Mitchum Jr. et al. (1977).</w:t>
@@ -3171,16 +3333,14 @@
         <w:pStyle w:val="Heading2"/>
         <w:jc w:val="left"/>
         <w:rPr>
-          <w:b w:val="0"/>
-          <w:bCs w:val="0"/>
+          <w:highlight w:val="white"/>
         </w:rPr>
       </w:pPr>
       <w:bookmarkStart w:colFirst="0" w:colLast="0" w:name="_pfgfl1mim8bb" w:id="3"/>
       <w:bookmarkEnd w:id="3"/>
       <w:r>
         <w:rPr>
-          <w:b w:val="0"/>
-          <w:bCs w:val="0"/>
+          <w:highlight w:val="white"/>
           <w:rtl w:val="0"/>
         </w:rPr>
         <w:t xml:space="preserve">2.3 Movimentos de massa submarinos</w:t>
@@ -3191,10 +3351,13 @@
         <w:spacing w:after="120" w:line="360" w:lineRule="auto"/>
         <w:ind w:left="0" w:firstLine="709"/>
         <w:jc w:val="both"/>
-        <w:rPr/>
-      </w:pPr>
-      <w:r>
-        <w:rPr>
+        <w:rPr>
+          <w:highlight w:val="white"/>
+        </w:rPr>
+      </w:pPr>
+      <w:r>
+        <w:rPr>
+          <w:highlight w:val="white"/>
           <w:rtl w:val="0"/>
         </w:rPr>
         <w:t xml:space="preserve">Os movimentos de massa submarinos correspondem à remobilização e ao deslocamento de sedimentos ou rochas ao longo do fundo marinho sob a ação da gravidade. Esses processos ocorrem quando as forças responsáveis pelo deslocamento do material superam sua resistência ao cisalhamento, provocando a ruptura do pacote sedimentar e seu transporte em direção às porções mais profundas da bacia. Embora apresentem princípios mecânicos semelhantes aos movimentos de massa subaéreos, sua ocorrência no ambiente marinho envolve condições particulares, como a saturação dos sedimentos, o desenvolvimento de excesso de poropressão e a interação entre a massa deslocada e a água (Hampton </w:t>
@@ -3203,12 +3366,14 @@
         <w:rPr>
           <w:i w:val="1"/>
           <w:iCs w:val="1"/>
+          <w:highlight w:val="white"/>
           <w:rtl w:val="0"/>
         </w:rPr>
         <w:t xml:space="preserve">et al</w:t>
       </w:r>
       <w:r>
         <w:rPr>
+          <w:highlight w:val="white"/>
           <w:rtl w:val="0"/>
         </w:rPr>
         <w:t xml:space="preserve">., 1996).</w:t>
@@ -3219,10 +3384,13 @@
         <w:spacing w:after="120" w:line="360" w:lineRule="auto"/>
         <w:ind w:left="0" w:firstLine="709"/>
         <w:jc w:val="both"/>
-        <w:rPr/>
-      </w:pPr>
-      <w:r>
-        <w:rPr>
+        <w:rPr>
+          <w:highlight w:val="white"/>
+        </w:rPr>
+      </w:pPr>
+      <w:r>
+        <w:rPr>
+          <w:highlight w:val="white"/>
           <w:rtl w:val="0"/>
         </w:rPr>
         <w:t xml:space="preserve">Nas margens continentais, os movimentos de massa desempenham um papel importante na redistribuição dos sedimentos. Em um único evento, grandes volumes de material podem ser removidos da plataforma ou do talude e transportados para regiões mais profundas, atravessando extensos trechos da margem com deposição limitada durante o percurso. Esse processo, denominado </w:t>
@@ -3231,12 +3399,14 @@
         <w:rPr>
           <w:i w:val="1"/>
           <w:iCs w:val="1"/>
+          <w:highlight w:val="white"/>
           <w:rtl w:val="0"/>
         </w:rPr>
         <w:t xml:space="preserve">sediment bypassing</w:t>
       </w:r>
       <w:r>
         <w:rPr>
+          <w:highlight w:val="white"/>
           <w:rtl w:val="0"/>
         </w:rPr>
         <w:t xml:space="preserve">, contribui para a transferência de sedimentos em direção ao sopé continental e às bacias oceânicas profundas. Um aspecto particularmente relevante é que movimentos de grandes dimensões não se restringem a áreas muito inclinadas, sendo registrados também em taludes com gradientes inferiores a 2°, que seriam considerados estáveis em muitos ambientes continentais (Hampton </w:t>
@@ -3245,12 +3415,14 @@
         <w:rPr>
           <w:i w:val="1"/>
           <w:iCs w:val="1"/>
+          <w:highlight w:val="white"/>
           <w:rtl w:val="0"/>
         </w:rPr>
         <w:t xml:space="preserve">et al</w:t>
       </w:r>
       <w:r>
         <w:rPr>
+          <w:highlight w:val="white"/>
           <w:rtl w:val="0"/>
         </w:rPr>
         <w:t xml:space="preserve">., 1996; Talling </w:t>
@@ -3259,12 +3431,14 @@
         <w:rPr>
           <w:i w:val="1"/>
           <w:iCs w:val="1"/>
+          <w:highlight w:val="white"/>
           <w:rtl w:val="0"/>
         </w:rPr>
         <w:t xml:space="preserve">et al</w:t>
       </w:r>
       <w:r>
         <w:rPr>
+          <w:highlight w:val="white"/>
           <w:rtl w:val="0"/>
         </w:rPr>
         <w:t xml:space="preserve">., 2014). </w:t>
@@ -3275,10 +3449,13 @@
         <w:spacing w:after="120" w:line="360" w:lineRule="auto"/>
         <w:ind w:left="0" w:firstLine="709"/>
         <w:jc w:val="both"/>
-        <w:rPr/>
-      </w:pPr>
-      <w:r>
-        <w:rPr>
+        <w:rPr>
+          <w:highlight w:val="white"/>
+        </w:rPr>
+      </w:pPr>
+      <w:r>
+        <w:rPr>
+          <w:highlight w:val="white"/>
           <w:rtl w:val="0"/>
         </w:rPr>
         <w:t xml:space="preserve">Os movimentos de massa podem ser classificados de acordo com o comportamento do material durante o deslocamento, considerando aspectos como velocidade, grau de deformação interna e interação entre os grãos. Como apresentado na Figura 4, esses processos formam um contínuo que se estende desde o rastejo, caracterizado pelo movimento lento e pela manutenção dos contatos entre as partículas, até processos mais rápidos e desagregados, como os fluxos de detritos, as correntes de turbidez e as quedas. Ao longo dessa evolução, ocorre o aumento da velocidade e da deformação interna, acompanhado pela redução progressiva da coesão da massa transportada. Uma mesma massa também pode modificar seu comportamento durante o percurso, evoluindo de um deslizamento relativamente coerente para um fluxo de detritos e, com a incorporação de água e a diluição do material, gerar uma corrente de turbidez (Posamentier &amp; Martinsen, 2011).</w:t>
@@ -3289,10 +3466,14 @@
         <w:spacing w:after="120" w:before="0" w:line="240" w:lineRule="auto"/>
         <w:ind w:left="0" w:firstLine="0"/>
         <w:jc w:val="center"/>
-        <w:rPr/>
-      </w:pPr>
-      <w:r>
-        <w:rPr/>
+        <w:rPr>
+          <w:highlight w:val="white"/>
+        </w:rPr>
+      </w:pPr>
+      <w:r>
+        <w:rPr>
+          <w:highlight w:val="white"/>
+        </w:rPr>
         <w:drawing>
           <wp:inline distB="114300" distT="114300" distL="114300" distR="114300">
             <wp:extent cx="5344478" cy="4946954"/>
@@ -3340,12 +3521,14 @@
         <w:rPr>
           <w:sz w:val="20"/>
           <w:szCs w:val="20"/>
+          <w:highlight w:val="white"/>
         </w:rPr>
       </w:pPr>
       <w:r>
         <w:rPr>
           <w:sz w:val="20"/>
           <w:szCs w:val="20"/>
+          <w:highlight w:val="white"/>
           <w:rtl w:val="0"/>
         </w:rPr>
         <w:t xml:space="preserve">Figura 4 — Classificação dos movimentos de massa de acordo com a velocidade, o comportamento do material e o grau de interação entre os grãos</w:t>
@@ -3359,12 +3542,14 @@
         <w:rPr>
           <w:sz w:val="20"/>
           <w:szCs w:val="20"/>
+          <w:highlight w:val="white"/>
         </w:rPr>
       </w:pPr>
       <w:r>
         <w:rPr>
           <w:sz w:val="20"/>
           <w:szCs w:val="20"/>
+          <w:highlight w:val="white"/>
           <w:rtl w:val="0"/>
         </w:rPr>
         <w:t xml:space="preserve">Fonte: traduzido e adaptado de Posamentier &amp; Martinsen (2011).</w:t>
@@ -3375,10 +3560,13 @@
         <w:spacing w:after="120" w:line="360" w:lineRule="auto"/>
         <w:ind w:left="0" w:firstLine="709"/>
         <w:jc w:val="both"/>
-        <w:rPr/>
-      </w:pPr>
-      <w:r>
-        <w:rPr>
+        <w:rPr>
+          <w:highlight w:val="white"/>
+        </w:rPr>
+      </w:pPr>
+      <w:r>
+        <w:rPr>
+          <w:highlight w:val="white"/>
           <w:rtl w:val="0"/>
         </w:rPr>
         <w:t xml:space="preserve">Além de modificarem a morfologia do fundo marinho, esses processos influenciam a organização do registro sedimentar em águas profundas. Em algumas sucessões, os depósitos associados aos movimentos de massa representam uma parcela expressiva da seção estratigráfica, podendo interferir na distribuição e na conectividade dos reservatórios, bem como atuar como barreiras ao fluxo de fluidos. Também constituem riscos geológicos importantes, pois podem danificar cabos submarinos, plataformas e outras estruturas instaladas no fundo do mar, além de, em determinados casos, desencadear tsunamis (Posamentier &amp; Martinsen, 2011).</w:t>
@@ -3389,10 +3577,13 @@
         <w:spacing w:after="120" w:line="360" w:lineRule="auto"/>
         <w:ind w:left="0" w:firstLine="709"/>
         <w:jc w:val="both"/>
-        <w:rPr/>
-      </w:pPr>
-      <w:r>
-        <w:rPr>
+        <w:rPr>
+          <w:highlight w:val="white"/>
+        </w:rPr>
+      </w:pPr>
+      <w:r>
+        <w:rPr>
+          <w:highlight w:val="white"/>
           <w:rtl w:val="0"/>
         </w:rPr>
         <w:t xml:space="preserve">Os movimentos de massa não devem ser entendidos como processos isolados ou necessariamente constantes durante todo o deslocamento. Eles fazem parte de um contínuo, no qual o comportamento da massa pode se modificar progressivamente. Um material inicialmente deslocado como um bloco relativamente coerente pode sofrer deformação interna, fragmentar-se e, com a incorporação de água, evoluir para um fluxo de detritos. Em alguns casos, a desagregação e a diluição da massa podem resultar na formação de uma corrente de turbidez. Dessa forma, diferentes mecanismos de transporte podem ocorrer durante um mesmo evento e produzir depósitos com características internas variadas (Posamentier &amp; Martinsen, 2011; Scarselli, 2020).</w:t>
@@ -3403,10 +3594,13 @@
         <w:spacing w:after="120" w:line="360" w:lineRule="auto"/>
         <w:ind w:left="0" w:firstLine="709"/>
         <w:jc w:val="both"/>
-        <w:rPr/>
-      </w:pPr>
-      <w:r>
-        <w:rPr>
+        <w:rPr>
+          <w:highlight w:val="white"/>
+        </w:rPr>
+      </w:pPr>
+      <w:r>
+        <w:rPr>
+          <w:highlight w:val="white"/>
           <w:rtl w:val="0"/>
         </w:rPr>
         <w:t xml:space="preserve">Nesse contexto, é necessário diferenciar o movimento de massa do produto sedimentar resultante. O termo depósito de transporte de massa, ou </w:t>
@@ -3415,12 +3609,14 @@
         <w:rPr>
           <w:i w:val="1"/>
           <w:iCs w:val="1"/>
+          <w:highlight w:val="white"/>
           <w:rtl w:val="0"/>
         </w:rPr>
         <w:t xml:space="preserve">mass-transport deposit</w:t>
       </w:r>
       <w:r>
         <w:rPr>
+          <w:highlight w:val="white"/>
           <w:rtl w:val="0"/>
         </w:rPr>
         <w:t xml:space="preserve"> (MTD), refere-se ao corpo sedimentar formado pela deposição do material transportado gravitacionalmente. Em sentido estrito, esse termo é aplicado aos depósitos originados pelo deslocamento </w:t>
@@ -3429,12 +3625,14 @@
         <w:rPr>
           <w:i w:val="1"/>
           <w:iCs w:val="1"/>
+          <w:highlight w:val="white"/>
           <w:rtl w:val="0"/>
         </w:rPr>
         <w:t xml:space="preserve">en masse</w:t>
       </w:r>
       <w:r>
         <w:rPr>
+          <w:highlight w:val="white"/>
           <w:rtl w:val="0"/>
         </w:rPr>
         <w:t xml:space="preserve">, no qual os grãos mantêm algum grau de interação entre si e o principal mecanismo de sustentação do material não é a turbulência do fluido. Por essa razão, Posamentier &amp; Martinsen (2011) não incluem os turbiditos entre os MTDs, embora reconheçam que um mesmo evento possa produzir tanto depósitos de transporte de massa quanto depósitos relacionados a correntes de turbidez.</w:t>
@@ -3445,10 +3643,13 @@
         <w:spacing w:after="120" w:line="360" w:lineRule="auto"/>
         <w:ind w:left="0" w:firstLine="709"/>
         <w:jc w:val="both"/>
-        <w:rPr/>
-      </w:pPr>
-      <w:r>
-        <w:rPr>
+        <w:rPr>
+          <w:highlight w:val="white"/>
+        </w:rPr>
+      </w:pPr>
+      <w:r>
+        <w:rPr>
+          <w:highlight w:val="white"/>
           <w:rtl w:val="0"/>
         </w:rPr>
         <w:t xml:space="preserve">A distinção entre os termos MTD e complexo de transporte de massa, ou </w:t>
@@ -3457,12 +3658,14 @@
         <w:rPr>
           <w:i w:val="1"/>
           <w:iCs w:val="1"/>
+          <w:highlight w:val="white"/>
           <w:rtl w:val="0"/>
         </w:rPr>
         <w:t xml:space="preserve">mass-transport complex</w:t>
       </w:r>
       <w:r>
         <w:rPr>
+          <w:highlight w:val="white"/>
           <w:rtl w:val="0"/>
         </w:rPr>
         <w:t xml:space="preserve"> (MTC), não é uniforme na literatura. Alguns autores utilizam as duas expressões como sinônimos, enquanto outros empregam MTD para indicar um depósito individual, formado durante um único evento, e MTC para designar um corpo composto pelo empilhamento ou pela amalgamação de dois ou mais MTDs. Essa variação terminológica dificulta a comparação entre diferentes estudos, principalmente quando a resolução dos dados sísmicos não permite determinar se o corpo foi formado por um ou por vários episódios de transporte (Ortiz-Karpf, 2016).</w:t>
@@ -3473,10 +3676,13 @@
         <w:spacing w:after="120" w:line="360" w:lineRule="auto"/>
         <w:ind w:left="0" w:firstLine="709"/>
         <w:jc w:val="both"/>
-        <w:rPr/>
-      </w:pPr>
-      <w:r>
-        <w:rPr>
+        <w:rPr>
+          <w:highlight w:val="white"/>
+        </w:rPr>
+      </w:pPr>
+      <w:r>
+        <w:rPr>
+          <w:highlight w:val="white"/>
           <w:rtl w:val="0"/>
         </w:rPr>
         <w:t xml:space="preserve">Para evitar essa ambiguidade, neste trabalho o termo MTD será adotado como denominação padrão para as unidades interpretadas como produtos de movimentos de massa. O termo MTC será empregado somente quando houver evidências claras de que a unidade é composta por depósitos relacionados a mais de um evento. Essas evidências podem incluir a identificação de corpos internamente individualizados, superfícies que separem diferentes unidades ou relações de empilhamento e amalgamação que indiquem episódios sucessivos de ruptura, transporte e deposição. Quando não for possível demonstrar a ocorrência de múltiplos eventos, a unidade será tratada como MTD, mesmo que apresente grande extensão ou elevada espessura.</w:t>
@@ -3487,16 +3693,14 @@
         <w:pStyle w:val="Heading3"/>
         <w:jc w:val="left"/>
         <w:rPr>
-          <w:b w:val="0"/>
-          <w:bCs w:val="0"/>
+          <w:highlight w:val="white"/>
         </w:rPr>
       </w:pPr>
       <w:bookmarkStart w:colFirst="0" w:colLast="0" w:name="_a2mvyzh9o22m" w:id="4"/>
       <w:bookmarkEnd w:id="4"/>
       <w:r>
         <w:rPr>
-          <w:b w:val="0"/>
-          <w:bCs w:val="0"/>
+          <w:highlight w:val="white"/>
           <w:rtl w:val="0"/>
         </w:rPr>
         <w:t xml:space="preserve">2.3.1 Mecanismos de ruptura</w:t>
@@ -3507,10 +3711,13 @@
         <w:spacing w:after="120" w:line="360" w:lineRule="auto"/>
         <w:ind w:left="0" w:firstLine="709"/>
         <w:jc w:val="both"/>
-        <w:rPr/>
-      </w:pPr>
-      <w:r>
-        <w:rPr>
+        <w:rPr>
+          <w:highlight w:val="white"/>
+        </w:rPr>
+      </w:pPr>
+      <w:r>
+        <w:rPr>
+          <w:highlight w:val="white"/>
           <w:rtl w:val="0"/>
         </w:rPr>
         <w:t xml:space="preserve">Os movimentos de massa submarinos ocorrem quando as tensões que favorecem o deslocamento do material ao longo do talude superam a resistência ao cisalhamento dos sedimentos ou das rochas. A gravidade constitui a principal força responsável pelo movimento, mas outros processos, como terremotos, erosão e acúmulo de sedimentos, podem aumentar as tensões atuantes ou reduzir a resistência do material. A estabilidade do talude depende, portanto, do equilíbrio entre as forças resistentes e as forças que favorecem o deslocamento (Hampton et al., 1996).</w:t>
@@ -3522,8 +3729,10 @@
         <w:jc w:val="left"/>
         <w:rPr>
           <w:rFonts w:ascii="Times New Roman" w:cs="Times New Roman" w:eastAsia="Times New Roman" w:hAnsi="Times New Roman"/>
-          <w:b w:val="0"/>
-          <w:bCs w:val="0"/>
+          <w:i w:val="0"/>
+          <w:iCs w:val="0"/>
+          <w:color w:val="000000"/>
+          <w:highlight w:val="white"/>
         </w:rPr>
       </w:pPr>
       <w:bookmarkStart w:colFirst="0" w:colLast="0" w:name="_s033fpnlnvlq" w:id="5"/>
@@ -3531,8 +3740,10 @@
       <w:r>
         <w:rPr>
           <w:rFonts w:ascii="Times New Roman" w:cs="Times New Roman" w:eastAsia="Times New Roman" w:hAnsi="Times New Roman"/>
-          <w:b w:val="0"/>
-          <w:bCs w:val="0"/>
+          <w:i w:val="0"/>
+          <w:iCs w:val="0"/>
+          <w:color w:val="000000"/>
+          <w:highlight w:val="white"/>
           <w:rtl w:val="0"/>
         </w:rPr>
         <w:t xml:space="preserve">Fator de segurança</w:t>
@@ -3543,10 +3754,13 @@
         <w:spacing w:after="120" w:line="360" w:lineRule="auto"/>
         <w:ind w:left="0" w:firstLine="709"/>
         <w:jc w:val="both"/>
-        <w:rPr/>
-      </w:pPr>
-      <w:r>
-        <w:rPr>
+        <w:rPr>
+          <w:highlight w:val="white"/>
+        </w:rPr>
+      </w:pPr>
+      <w:r>
+        <w:rPr>
+          <w:highlight w:val="white"/>
           <w:rtl w:val="0"/>
         </w:rPr>
         <w:t xml:space="preserve">A condição de estabilidade pode ser inicialmente avaliada por meio do fator de segurança (FS), definido pela razão entre a resistência disponível ao cisalhamento e a tensão cisalhante mobilizada ao longo de uma superfície potencial de ruptura:</w:t>
@@ -3557,10 +3771,13 @@
         <w:spacing w:after="120" w:before="120" w:line="360" w:lineRule="auto"/>
         <w:ind w:left="0" w:firstLine="0"/>
         <w:jc w:val="center"/>
-        <w:rPr/>
-      </w:pPr>
-      <w:r>
-        <w:rPr>
+        <w:rPr>
+          <w:highlight w:val="white"/>
+        </w:rPr>
+      </w:pPr>
+      <w:r>
+        <w:rPr>
+          <w:highlight w:val="white"/>
           <w:rtl w:val="0"/>
         </w:rPr>
         <w:t xml:space="preserve">FS = τf / τm    (1)</w:t>
@@ -3571,10 +3788,13 @@
         <w:spacing w:after="120" w:line="360" w:lineRule="auto"/>
         <w:ind w:left="0" w:firstLine="709"/>
         <w:jc w:val="both"/>
-        <w:rPr/>
-      </w:pPr>
-      <w:r>
-        <w:rPr>
+        <w:rPr>
+          <w:highlight w:val="white"/>
+        </w:rPr>
+      </w:pPr>
+      <w:r>
+        <w:rPr>
+          <w:highlight w:val="white"/>
           <w:rtl w:val="0"/>
         </w:rPr>
         <w:t xml:space="preserve">em que:</w:t>
@@ -3589,10 +3809,13 @@
         <w:spacing w:after="120" w:line="360" w:lineRule="auto"/>
         <w:ind w:left="0" w:firstLine="709"/>
         <w:jc w:val="both"/>
-        <w:rPr/>
-      </w:pPr>
-      <w:r>
-        <w:rPr>
+        <w:rPr>
+          <w:highlight w:val="white"/>
+        </w:rPr>
+      </w:pPr>
+      <w:r>
+        <w:rPr>
+          <w:highlight w:val="white"/>
           <w:rtl w:val="0"/>
         </w:rPr>
         <w:t xml:space="preserve">FS é o fator de segurança;</w:t>
@@ -3607,10 +3830,13 @@
         <w:spacing w:after="120" w:line="360" w:lineRule="auto"/>
         <w:ind w:left="0" w:firstLine="709"/>
         <w:jc w:val="both"/>
-        <w:rPr/>
-      </w:pPr>
-      <w:r>
-        <w:rPr>
+        <w:rPr>
+          <w:highlight w:val="white"/>
+        </w:rPr>
+      </w:pPr>
+      <w:r>
+        <w:rPr>
+          <w:highlight w:val="white"/>
           <w:rtl w:val="0"/>
         </w:rPr>
         <w:t xml:space="preserve">τf é a resistência ao cisalhamento do material;</w:t>
@@ -3625,10 +3851,13 @@
         <w:spacing w:after="120" w:line="360" w:lineRule="auto"/>
         <w:ind w:left="0" w:firstLine="709"/>
         <w:jc w:val="both"/>
-        <w:rPr/>
-      </w:pPr>
-      <w:r>
-        <w:rPr>
+        <w:rPr>
+          <w:highlight w:val="white"/>
+        </w:rPr>
+      </w:pPr>
+      <w:r>
+        <w:rPr>
+          <w:highlight w:val="white"/>
           <w:rtl w:val="0"/>
         </w:rPr>
         <w:t xml:space="preserve">τm é a tensão cisalhante mobilizada ao longo da superfície potencial de ruptura.</w:t>
@@ -3639,10 +3868,13 @@
         <w:spacing w:after="120" w:line="360" w:lineRule="auto"/>
         <w:ind w:left="0" w:firstLine="709"/>
         <w:jc w:val="both"/>
-        <w:rPr/>
-      </w:pPr>
-      <w:r>
-        <w:rPr>
+        <w:rPr>
+          <w:highlight w:val="white"/>
+        </w:rPr>
+      </w:pPr>
+      <w:r>
+        <w:rPr>
+          <w:highlight w:val="white"/>
           <w:rtl w:val="0"/>
         </w:rPr>
         <w:t xml:space="preserve">Quando FS &gt; 1, a resistência disponível é superior à tensão mobilizada e o talude é considerado estável. Quando FS = 1, o sistema encontra-se na condição limite de equilíbrio. Valores de FS &lt; 1 indicam que as tensões atuantes superaram a resistência do material, levando à ruptura. Embora essa relação seja simplificada, ela permite compreender como diferentes processos ambientais e geológicos podem modificar a estabilidade do talude.</w:t>
@@ -3654,8 +3886,10 @@
         <w:jc w:val="left"/>
         <w:rPr>
           <w:rFonts w:ascii="Times New Roman" w:cs="Times New Roman" w:eastAsia="Times New Roman" w:hAnsi="Times New Roman"/>
-          <w:b w:val="0"/>
-          <w:bCs w:val="0"/>
+          <w:i w:val="0"/>
+          <w:iCs w:val="0"/>
+          <w:color w:val="000000"/>
+          <w:highlight w:val="white"/>
         </w:rPr>
       </w:pPr>
       <w:bookmarkStart w:colFirst="0" w:colLast="0" w:name="_m5qkttbybalp" w:id="6"/>
@@ -3663,8 +3897,10 @@
       <w:r>
         <w:rPr>
           <w:rFonts w:ascii="Times New Roman" w:cs="Times New Roman" w:eastAsia="Times New Roman" w:hAnsi="Times New Roman"/>
-          <w:b w:val="0"/>
-          <w:bCs w:val="0"/>
+          <w:i w:val="0"/>
+          <w:iCs w:val="0"/>
+          <w:color w:val="000000"/>
+          <w:highlight w:val="white"/>
           <w:rtl w:val="0"/>
         </w:rPr>
         <w:t xml:space="preserve">Critério de ruptura de Mohr-Coulomb</w:t>
@@ -3675,10 +3911,13 @@
         <w:spacing w:after="120" w:line="360" w:lineRule="auto"/>
         <w:ind w:left="0" w:firstLine="709"/>
         <w:jc w:val="both"/>
-        <w:rPr/>
-      </w:pPr>
-      <w:r>
-        <w:rPr>
+        <w:rPr>
+          <w:highlight w:val="white"/>
+        </w:rPr>
+      </w:pPr>
+      <w:r>
+        <w:rPr>
+          <w:highlight w:val="white"/>
           <w:rtl w:val="0"/>
         </w:rPr>
         <w:t xml:space="preserve">Um dos modelos mais empregados na análise da estabilidade de taludes é o critério de ruptura de Mohr-Coulomb. Segundo esse critério, a resistência ao cisalhamento do sedimento é determinada pela coesão do material e pelo atrito desenvolvido entre suas partículas:</w:t>
@@ -3689,10 +3928,13 @@
         <w:spacing w:after="120" w:before="120" w:line="360" w:lineRule="auto"/>
         <w:ind w:left="0" w:firstLine="0"/>
         <w:jc w:val="center"/>
-        <w:rPr/>
-      </w:pPr>
-      <w:r>
-        <w:rPr>
+        <w:rPr>
+          <w:highlight w:val="white"/>
+        </w:rPr>
+      </w:pPr>
+      <w:r>
+        <w:rPr>
+          <w:highlight w:val="white"/>
           <w:rtl w:val="0"/>
         </w:rPr>
         <w:t xml:space="preserve">τf = c′ + σ′n tan φ′    (2)</w:t>
@@ -3703,10 +3945,13 @@
         <w:spacing w:after="120" w:line="360" w:lineRule="auto"/>
         <w:ind w:left="0" w:firstLine="709"/>
         <w:jc w:val="both"/>
-        <w:rPr/>
-      </w:pPr>
-      <w:r>
-        <w:rPr>
+        <w:rPr>
+          <w:highlight w:val="white"/>
+        </w:rPr>
+      </w:pPr>
+      <w:r>
+        <w:rPr>
+          <w:highlight w:val="white"/>
           <w:rtl w:val="0"/>
         </w:rPr>
         <w:t xml:space="preserve">em que:</w:t>
@@ -3721,10 +3966,13 @@
         <w:spacing w:after="120" w:line="360" w:lineRule="auto"/>
         <w:ind w:left="0" w:firstLine="709"/>
         <w:jc w:val="both"/>
-        <w:rPr/>
-      </w:pPr>
-      <w:r>
-        <w:rPr>
+        <w:rPr>
+          <w:highlight w:val="white"/>
+        </w:rPr>
+      </w:pPr>
+      <w:r>
+        <w:rPr>
+          <w:highlight w:val="white"/>
           <w:rtl w:val="0"/>
         </w:rPr>
         <w:t xml:space="preserve">τf é a resistência ao cisalhamento;</w:t>
@@ -3739,10 +3987,13 @@
         <w:spacing w:after="120" w:line="360" w:lineRule="auto"/>
         <w:ind w:left="0" w:firstLine="709"/>
         <w:jc w:val="both"/>
-        <w:rPr/>
-      </w:pPr>
-      <w:r>
-        <w:rPr>
+        <w:rPr>
+          <w:highlight w:val="white"/>
+        </w:rPr>
+      </w:pPr>
+      <w:r>
+        <w:rPr>
+          <w:highlight w:val="white"/>
           <w:rtl w:val="0"/>
         </w:rPr>
         <w:t xml:space="preserve">c′ é a coesão efetiva do material;</w:t>
@@ -3757,10 +4008,13 @@
         <w:spacing w:after="120" w:line="360" w:lineRule="auto"/>
         <w:ind w:left="0" w:firstLine="709"/>
         <w:jc w:val="both"/>
-        <w:rPr/>
-      </w:pPr>
-      <w:r>
-        <w:rPr>
+        <w:rPr>
+          <w:highlight w:val="white"/>
+        </w:rPr>
+      </w:pPr>
+      <w:r>
+        <w:rPr>
+          <w:highlight w:val="white"/>
           <w:rtl w:val="0"/>
         </w:rPr>
         <w:t xml:space="preserve">σ′n é a tensão normal efetiva atuante sobre a superfície de ruptura;</w:t>
@@ -3775,10 +4029,13 @@
         <w:spacing w:after="120" w:line="360" w:lineRule="auto"/>
         <w:ind w:left="0" w:firstLine="709"/>
         <w:jc w:val="both"/>
-        <w:rPr/>
-      </w:pPr>
-      <w:r>
-        <w:rPr>
+        <w:rPr>
+          <w:highlight w:val="white"/>
+        </w:rPr>
+      </w:pPr>
+      <w:r>
+        <w:rPr>
+          <w:highlight w:val="white"/>
           <w:rtl w:val="0"/>
         </w:rPr>
         <w:t xml:space="preserve">φ′ é o ângulo de atrito interno efetivo;</w:t>
@@ -3793,10 +4050,13 @@
         <w:spacing w:after="120" w:line="360" w:lineRule="auto"/>
         <w:ind w:left="0" w:firstLine="709"/>
         <w:jc w:val="both"/>
-        <w:rPr/>
-      </w:pPr>
-      <w:r>
-        <w:rPr>
+        <w:rPr>
+          <w:highlight w:val="white"/>
+        </w:rPr>
+      </w:pPr>
+      <w:r>
+        <w:rPr>
+          <w:highlight w:val="white"/>
           <w:rtl w:val="0"/>
         </w:rPr>
         <w:t xml:space="preserve">tan φ′ representa o coeficiente de atrito interno.</w:t>
@@ -3807,10 +4067,13 @@
         <w:spacing w:after="120" w:line="360" w:lineRule="auto"/>
         <w:ind w:left="0" w:firstLine="709"/>
         <w:jc w:val="both"/>
-        <w:rPr/>
-      </w:pPr>
-      <w:r>
-        <w:rPr>
+        <w:rPr>
+          <w:highlight w:val="white"/>
+        </w:rPr>
+      </w:pPr>
+      <w:r>
+        <w:rPr>
+          <w:highlight w:val="white"/>
           <w:rtl w:val="0"/>
         </w:rPr>
         <w:t xml:space="preserve">A coesão está relacionada às forças que mantêm as partículas unidas, como cimentação e interações físico-químicas. O ângulo de atrito interno representa a resistência produzida pelo atrito e pelo imbricamento entre os grãos. Em sedimentos marinhos inconsolidados, a resistência é frequentemente controlada pela tensão efetiva e pelo atrito interno, embora camadas cimentadas ou sedimentos coesivos também possam apresentar uma parcela significativa de coesão.</w:t>
@@ -3822,8 +4085,10 @@
         <w:jc w:val="left"/>
         <w:rPr>
           <w:rFonts w:ascii="Times New Roman" w:cs="Times New Roman" w:eastAsia="Times New Roman" w:hAnsi="Times New Roman"/>
-          <w:b w:val="0"/>
-          <w:bCs w:val="0"/>
+          <w:i w:val="0"/>
+          <w:iCs w:val="0"/>
+          <w:color w:val="000000"/>
+          <w:highlight w:val="white"/>
         </w:rPr>
       </w:pPr>
       <w:bookmarkStart w:colFirst="0" w:colLast="0" w:name="_o97v7vltv7hk" w:id="7"/>
@@ -3831,8 +4096,10 @@
       <w:r>
         <w:rPr>
           <w:rFonts w:ascii="Times New Roman" w:cs="Times New Roman" w:eastAsia="Times New Roman" w:hAnsi="Times New Roman"/>
-          <w:b w:val="0"/>
-          <w:bCs w:val="0"/>
+          <w:i w:val="0"/>
+          <w:iCs w:val="0"/>
+          <w:color w:val="000000"/>
+          <w:highlight w:val="white"/>
           <w:rtl w:val="0"/>
         </w:rPr>
         <w:t xml:space="preserve">Tensão efetiva e poropressão</w:t>
@@ -3843,10 +4110,13 @@
         <w:spacing w:after="120" w:line="360" w:lineRule="auto"/>
         <w:ind w:left="0" w:firstLine="709"/>
         <w:jc w:val="both"/>
-        <w:rPr/>
-      </w:pPr>
-      <w:r>
-        <w:rPr>
+        <w:rPr>
+          <w:highlight w:val="white"/>
+        </w:rPr>
+      </w:pPr>
+      <w:r>
+        <w:rPr>
+          <w:highlight w:val="white"/>
           <w:rtl w:val="0"/>
         </w:rPr>
         <w:t xml:space="preserve">Como os sedimentos marinhos estão saturados, parte da tensão total aplicada ao pacote sedimentar é sustentada pelo fluido presente nos poros. De acordo com o princípio da tensão efetiva de Terzaghi, a tensão normal efetiva pode ser expressa por:</w:t>
@@ -3857,11 +4127,14 @@
         <w:spacing w:after="120" w:before="120" w:line="360" w:lineRule="auto"/>
         <w:ind w:left="0" w:firstLine="0"/>
         <w:jc w:val="center"/>
-        <w:rPr/>
+        <w:rPr>
+          <w:highlight w:val="white"/>
+        </w:rPr>
       </w:pPr>
       <w:r>
         <w:rPr>
           <w:rFonts w:ascii="Cardo" w:cs="Cardo" w:eastAsia="Cardo" w:hAnsi="Cardo"/>
+          <w:highlight w:val="white"/>
           <w:rtl w:val="0"/>
         </w:rPr>
         <w:t xml:space="preserve">σ′n = σn − u    (3)</w:t>
@@ -3872,10 +4145,13 @@
         <w:spacing w:after="120" w:line="360" w:lineRule="auto"/>
         <w:ind w:left="0" w:firstLine="709"/>
         <w:jc w:val="both"/>
-        <w:rPr/>
-      </w:pPr>
-      <w:r>
-        <w:rPr>
+        <w:rPr>
+          <w:highlight w:val="white"/>
+        </w:rPr>
+      </w:pPr>
+      <w:r>
+        <w:rPr>
+          <w:highlight w:val="white"/>
           <w:rtl w:val="0"/>
         </w:rPr>
         <w:t xml:space="preserve">em que:</w:t>
@@ -3890,10 +4166,13 @@
         <w:spacing w:after="120" w:line="360" w:lineRule="auto"/>
         <w:ind w:left="0" w:firstLine="709"/>
         <w:jc w:val="both"/>
-        <w:rPr/>
-      </w:pPr>
-      <w:r>
-        <w:rPr>
+        <w:rPr>
+          <w:highlight w:val="white"/>
+        </w:rPr>
+      </w:pPr>
+      <w:r>
+        <w:rPr>
+          <w:highlight w:val="white"/>
           <w:rtl w:val="0"/>
         </w:rPr>
         <w:t xml:space="preserve">σ′n é a tensão normal efetiva;</w:t>
@@ -3908,10 +4187,13 @@
         <w:spacing w:after="120" w:line="360" w:lineRule="auto"/>
         <w:ind w:left="0" w:firstLine="709"/>
         <w:jc w:val="both"/>
-        <w:rPr/>
-      </w:pPr>
-      <w:r>
-        <w:rPr>
+        <w:rPr>
+          <w:highlight w:val="white"/>
+        </w:rPr>
+      </w:pPr>
+      <w:r>
+        <w:rPr>
+          <w:highlight w:val="white"/>
           <w:rtl w:val="0"/>
         </w:rPr>
         <w:t xml:space="preserve">σn é a tensão normal total;</w:t>
@@ -3926,10 +4208,13 @@
         <w:spacing w:after="120" w:line="360" w:lineRule="auto"/>
         <w:ind w:left="0" w:firstLine="709"/>
         <w:jc w:val="both"/>
-        <w:rPr/>
-      </w:pPr>
-      <w:r>
-        <w:rPr>
+        <w:rPr>
+          <w:highlight w:val="white"/>
+        </w:rPr>
+      </w:pPr>
+      <w:r>
+        <w:rPr>
+          <w:highlight w:val="white"/>
           <w:rtl w:val="0"/>
         </w:rPr>
         <w:t xml:space="preserve">u é a pressão do fluido nos poros, ou poropressão.</w:t>
@@ -3940,10 +4225,13 @@
         <w:spacing w:after="120" w:line="360" w:lineRule="auto"/>
         <w:ind w:left="0" w:firstLine="709"/>
         <w:jc w:val="both"/>
-        <w:rPr/>
-      </w:pPr>
-      <w:r>
-        <w:rPr>
+        <w:rPr>
+          <w:highlight w:val="white"/>
+        </w:rPr>
+      </w:pPr>
+      <w:r>
+        <w:rPr>
+          <w:highlight w:val="white"/>
           <w:rtl w:val="0"/>
         </w:rPr>
         <w:t xml:space="preserve">Substituindo a Equação 3 no critério de Mohr-Coulomb, obtém-se:</w:t>
@@ -3954,11 +4242,14 @@
         <w:spacing w:after="120" w:before="120" w:line="360" w:lineRule="auto"/>
         <w:ind w:left="0" w:firstLine="0"/>
         <w:jc w:val="center"/>
-        <w:rPr/>
+        <w:rPr>
+          <w:highlight w:val="white"/>
+        </w:rPr>
       </w:pPr>
       <w:r>
         <w:rPr>
           <w:rFonts w:ascii="Cardo" w:cs="Cardo" w:eastAsia="Cardo" w:hAnsi="Cardo"/>
+          <w:highlight w:val="white"/>
           <w:rtl w:val="0"/>
         </w:rPr>
         <w:t xml:space="preserve">τf = c′ + (σn − u) tan φ′    (4)</w:t>
@@ -3969,10 +4260,13 @@
         <w:spacing w:after="120" w:line="360" w:lineRule="auto"/>
         <w:ind w:left="0" w:firstLine="709"/>
         <w:jc w:val="both"/>
-        <w:rPr/>
-      </w:pPr>
-      <w:r>
-        <w:rPr>
+        <w:rPr>
+          <w:highlight w:val="white"/>
+        </w:rPr>
+      </w:pPr>
+      <w:r>
+        <w:rPr>
+          <w:highlight w:val="white"/>
           <w:rtl w:val="0"/>
         </w:rPr>
         <w:t xml:space="preserve">Com isso, o fator de segurança pode ser representado de forma simplificada por:</w:t>
@@ -3983,11 +4277,14 @@
         <w:spacing w:after="120" w:before="120" w:line="360" w:lineRule="auto"/>
         <w:ind w:left="0" w:firstLine="0"/>
         <w:jc w:val="center"/>
-        <w:rPr/>
+        <w:rPr>
+          <w:highlight w:val="white"/>
+        </w:rPr>
       </w:pPr>
       <w:r>
         <w:rPr>
           <w:rFonts w:ascii="Cardo" w:cs="Cardo" w:eastAsia="Cardo" w:hAnsi="Cardo"/>
+          <w:highlight w:val="white"/>
           <w:rtl w:val="0"/>
         </w:rPr>
         <w:t xml:space="preserve">FS = [c′ + (σn − u) tan φ′] / τm    (5)</w:t>
@@ -3998,10 +4295,13 @@
         <w:spacing w:after="120" w:line="360" w:lineRule="auto"/>
         <w:ind w:left="0" w:firstLine="709"/>
         <w:jc w:val="both"/>
-        <w:rPr/>
-      </w:pPr>
-      <w:r>
-        <w:rPr>
+        <w:rPr>
+          <w:highlight w:val="white"/>
+        </w:rPr>
+      </w:pPr>
+      <w:r>
+        <w:rPr>
+          <w:highlight w:val="white"/>
           <w:rtl w:val="0"/>
         </w:rPr>
         <w:t xml:space="preserve">As equações mostram que o aumento da poropressão reduz a tensão efetiva e, consequentemente, a resistência ao cisalhamento. Quando a poropressão se aproxima da tensão normal total, a tensão efetiva tende a valores muito baixos e o sedimento perde grande parte de sua resistência. Nessas condições, mesmo um pequeno aumento da tensão cisalhante pode provocar a ruptura. Por essa razão, o excesso de poropressão é considerado um dos principais elementos envolvidos na instabilidade dos taludes submarinos (Hampton et al., 1996; Talling et al., 2014).</w:t>
@@ -4013,8 +4313,10 @@
         <w:jc w:val="left"/>
         <w:rPr>
           <w:rFonts w:ascii="Times New Roman" w:cs="Times New Roman" w:eastAsia="Times New Roman" w:hAnsi="Times New Roman"/>
-          <w:b w:val="0"/>
-          <w:bCs w:val="0"/>
+          <w:i w:val="0"/>
+          <w:iCs w:val="0"/>
+          <w:color w:val="000000"/>
+          <w:highlight w:val="white"/>
         </w:rPr>
       </w:pPr>
       <w:bookmarkStart w:colFirst="0" w:colLast="0" w:name="_ighlknxj0qpm" w:id="8"/>
@@ -4022,8 +4324,10 @@
       <w:r>
         <w:rPr>
           <w:rFonts w:ascii="Times New Roman" w:cs="Times New Roman" w:eastAsia="Times New Roman" w:hAnsi="Times New Roman"/>
-          <w:b w:val="0"/>
-          <w:bCs w:val="0"/>
+          <w:i w:val="0"/>
+          <w:iCs w:val="0"/>
+          <w:color w:val="000000"/>
+          <w:highlight w:val="white"/>
           <w:rtl w:val="0"/>
         </w:rPr>
         <w:t xml:space="preserve">2.3.1.1 Fatores condicionantes e mecanismos de gatilho </w:t>
@@ -4034,10 +4338,13 @@
         <w:spacing w:after="120" w:line="360" w:lineRule="auto"/>
         <w:ind w:left="0" w:firstLine="709"/>
         <w:jc w:val="both"/>
-        <w:rPr/>
-      </w:pPr>
-      <w:r>
-        <w:rPr>
+        <w:rPr>
+          <w:highlight w:val="white"/>
+        </w:rPr>
+      </w:pPr>
+      <w:r>
+        <w:rPr>
+          <w:highlight w:val="white"/>
           <w:rtl w:val="0"/>
         </w:rPr>
         <w:t xml:space="preserve">Os processos que influenciam a estabilidade de um talude podem ser separados em fatores condicionantes e mecanismos de gatilho. Os fatores condicionantes atuam durante períodos relativamente longos, deixando o pacote sedimentar progressivamente mais suscetível à ruptura. Entre eles estão a presença de camadas fracas, a baixa permeabilidade, a elevada porosidade, a rápida acumulação sedimentar e a deformação tectônica.</w:t>
@@ -4048,10 +4355,13 @@
         <w:spacing w:after="120" w:line="360" w:lineRule="auto"/>
         <w:ind w:left="0" w:firstLine="709"/>
         <w:jc w:val="both"/>
-        <w:rPr/>
-      </w:pPr>
-      <w:r>
-        <w:rPr>
+        <w:rPr>
+          <w:highlight w:val="white"/>
+        </w:rPr>
+      </w:pPr>
+      <w:r>
+        <w:rPr>
+          <w:highlight w:val="white"/>
           <w:rtl w:val="0"/>
         </w:rPr>
         <w:t xml:space="preserve">Os gatilhos correspondem a perturbações de curta duração que levam um talude já suscetível a ultrapassar o limite de estabilidade. Um mesmo processo, entretanto, pode atuar como condicionante ou como gatilho, dependendo de sua intensidade e duração. A ruptura também pode resultar da combinação de diferentes processos, sem que seja possível atribuí-la a um único mecanismo (Lee et al., 2007; Scarselli, 2020).</w:t>
@@ -4063,8 +4373,10 @@
         <w:jc w:val="left"/>
         <w:rPr>
           <w:rFonts w:ascii="Times New Roman" w:cs="Times New Roman" w:eastAsia="Times New Roman" w:hAnsi="Times New Roman"/>
-          <w:b w:val="0"/>
-          <w:bCs w:val="0"/>
+          <w:i w:val="0"/>
+          <w:iCs w:val="0"/>
+          <w:color w:val="000000"/>
+          <w:highlight w:val="white"/>
         </w:rPr>
       </w:pPr>
       <w:bookmarkStart w:colFirst="0" w:colLast="0" w:name="_poexuqct3yzg" w:id="9"/>
@@ -4072,8 +4384,10 @@
       <w:r>
         <w:rPr>
           <w:rFonts w:ascii="Times New Roman" w:cs="Times New Roman" w:eastAsia="Times New Roman" w:hAnsi="Times New Roman"/>
-          <w:b w:val="0"/>
-          <w:bCs w:val="0"/>
+          <w:i w:val="0"/>
+          <w:iCs w:val="0"/>
+          <w:color w:val="000000"/>
+          <w:highlight w:val="white"/>
           <w:rtl w:val="0"/>
         </w:rPr>
         <w:t xml:space="preserve">Sedimentação rápida</w:t>
@@ -4084,10 +4398,13 @@
         <w:spacing w:after="120" w:line="360" w:lineRule="auto"/>
         <w:ind w:left="0" w:firstLine="709"/>
         <w:jc w:val="both"/>
-        <w:rPr/>
-      </w:pPr>
-      <w:r>
-        <w:rPr>
+        <w:rPr>
+          <w:highlight w:val="white"/>
+        </w:rPr>
+      </w:pPr>
+      <w:r>
+        <w:rPr>
+          <w:highlight w:val="white"/>
           <w:rtl w:val="0"/>
         </w:rPr>
         <w:t xml:space="preserve">Quando a acumulação sedimentar ocorre mais rapidamente do que a drenagem dos fluidos, a água presente nos poros não consegue ser expulsa na mesma velocidade em que a carga aumenta. Parte da nova carga passa a ser sustentada pelo fluido, gerando excesso de poropressão e mantendo reduzida a tensão efetiva. Ao mesmo tempo, o aumento da espessura do pacote eleva as tensões gravitacionais atuantes no talude. A combinação entre aumento da carga e baixa resistência pode levar o sedimento à ruptura (Lee et al., 2007; Talling et al., 2014).</w:t>
@@ -4098,10 +4415,13 @@
         <w:spacing w:after="120" w:line="360" w:lineRule="auto"/>
         <w:ind w:left="0" w:firstLine="709"/>
         <w:jc w:val="both"/>
-        <w:rPr/>
-      </w:pPr>
-      <w:r>
-        <w:rPr>
+        <w:rPr>
+          <w:highlight w:val="white"/>
+        </w:rPr>
+      </w:pPr>
+      <w:r>
+        <w:rPr>
+          <w:highlight w:val="white"/>
           <w:rtl w:val="0"/>
         </w:rPr>
         <w:t xml:space="preserve">A eficiência desse mecanismo depende da taxa de deposição, da permeabilidade, da compressibilidade e da capacidade de drenagem dos sedimentos. Por isso, a sedimentação rápida é particularmente importante em deltas, leques submarinos e margens que recebem grande aporte sedimentar. Em áreas caracterizadas por baixas taxas de sedimentação, entretanto, esse processo dificilmente explica a ruptura de forma isolada, sendo necessária a presença de camadas fracas ou de outros mecanismos de instabilidade (Urlaub et al., 2015).</w:t>
@@ -4113,8 +4433,10 @@
         <w:jc w:val="left"/>
         <w:rPr>
           <w:rFonts w:ascii="Times New Roman" w:cs="Times New Roman" w:eastAsia="Times New Roman" w:hAnsi="Times New Roman"/>
-          <w:b w:val="0"/>
-          <w:bCs w:val="0"/>
+          <w:i w:val="0"/>
+          <w:iCs w:val="0"/>
+          <w:color w:val="000000"/>
+          <w:highlight w:val="white"/>
         </w:rPr>
       </w:pPr>
       <w:bookmarkStart w:colFirst="0" w:colLast="0" w:name="_9n80vwatxpxv" w:id="10"/>
@@ -4122,8 +4444,10 @@
       <w:r>
         <w:rPr>
           <w:rFonts w:ascii="Times New Roman" w:cs="Times New Roman" w:eastAsia="Times New Roman" w:hAnsi="Times New Roman"/>
-          <w:b w:val="0"/>
-          <w:bCs w:val="0"/>
+          <w:i w:val="0"/>
+          <w:iCs w:val="0"/>
+          <w:color w:val="000000"/>
+          <w:highlight w:val="white"/>
           <w:rtl w:val="0"/>
         </w:rPr>
         <w:t xml:space="preserve">Abalos sísmicos</w:t>
@@ -4134,10 +4458,13 @@
         <w:spacing w:after="120" w:line="360" w:lineRule="auto"/>
         <w:ind w:left="0" w:firstLine="709"/>
         <w:jc w:val="both"/>
-        <w:rPr/>
-      </w:pPr>
-      <w:r>
-        <w:rPr>
+        <w:rPr>
+          <w:highlight w:val="white"/>
+        </w:rPr>
+      </w:pPr>
+      <w:r>
+        <w:rPr>
+          <w:highlight w:val="white"/>
           <w:rtl w:val="0"/>
         </w:rPr>
         <w:t xml:space="preserve">Os terremotos produzem acelerações horizontais e verticais que aumentam temporariamente as tensões de cisalhamento no pacote sedimentar. Como o carregamento é cíclico e ocorre em um intervalo curto, a poropressão gerada durante o abalo pode não se dissipar, reduzindo a tensão efetiva e a resistência do material.</w:t>
@@ -4148,10 +4475,13 @@
         <w:spacing w:after="120" w:line="360" w:lineRule="auto"/>
         <w:ind w:left="0" w:firstLine="709"/>
         <w:jc w:val="both"/>
-        <w:rPr/>
-      </w:pPr>
-      <w:r>
-        <w:rPr>
+        <w:rPr>
+          <w:highlight w:val="white"/>
+        </w:rPr>
+      </w:pPr>
+      <w:r>
+        <w:rPr>
+          <w:highlight w:val="white"/>
           <w:rtl w:val="0"/>
         </w:rPr>
         <w:t xml:space="preserve">Em sedimentos arenosos ou siltosos pouco consolidados, o carregamento cíclico pode causar liquefação, condição na qual os grãos perdem parte do contato entre si e a carga passa a ser sustentada principalmente pela água intersticial. Em materiais coesivos, a perturbação pode provocar remoldamento e perda de resistência. A capacidade de um terremoto desencadear a ruptura depende de fatores como magnitude, duração, distância da fonte sísmica e propriedades geotécnicas dos sedimentos (Hampton et al., 1996; Sultan et al., 2004).</w:t>
@@ -4163,8 +4493,10 @@
         <w:jc w:val="left"/>
         <w:rPr>
           <w:rFonts w:ascii="Times New Roman" w:cs="Times New Roman" w:eastAsia="Times New Roman" w:hAnsi="Times New Roman"/>
-          <w:b w:val="0"/>
-          <w:bCs w:val="0"/>
+          <w:i w:val="0"/>
+          <w:iCs w:val="0"/>
+          <w:color w:val="000000"/>
+          <w:highlight w:val="white"/>
         </w:rPr>
       </w:pPr>
       <w:bookmarkStart w:colFirst="0" w:colLast="0" w:name="_31vrup95l38p" w:id="11"/>
@@ -4172,8 +4504,10 @@
       <w:r>
         <w:rPr>
           <w:rFonts w:ascii="Times New Roman" w:cs="Times New Roman" w:eastAsia="Times New Roman" w:hAnsi="Times New Roman"/>
-          <w:b w:val="0"/>
-          <w:bCs w:val="0"/>
+          <w:i w:val="0"/>
+          <w:iCs w:val="0"/>
+          <w:color w:val="000000"/>
+          <w:highlight w:val="white"/>
           <w:rtl w:val="0"/>
         </w:rPr>
         <w:t xml:space="preserve">Erosão e aumento da inclinação</w:t>
@@ -4184,10 +4518,13 @@
         <w:spacing w:after="120" w:line="360" w:lineRule="auto"/>
         <w:ind w:left="0" w:firstLine="709"/>
         <w:jc w:val="both"/>
-        <w:rPr/>
-      </w:pPr>
-      <w:r>
-        <w:rPr>
+        <w:rPr>
+          <w:highlight w:val="white"/>
+        </w:rPr>
+      </w:pPr>
+      <w:r>
+        <w:rPr>
+          <w:highlight w:val="white"/>
           <w:rtl w:val="0"/>
         </w:rPr>
         <w:t xml:space="preserve">A erosão causada por correntes de fundo, correntes de turbidez ou fluxos de detritos é comum nas margens de canais e cânions submarinos. A remoção de sedimentos na base de uma encosta reduz o suporte do pacote localizado acima e aumenta localmente a inclinação do talude. Como consequência, ocorre aumento da tensão cisalhante associada à gravidade.</w:t>
@@ -4198,10 +4535,13 @@
         <w:spacing w:after="120" w:line="360" w:lineRule="auto"/>
         <w:ind w:left="0" w:firstLine="709"/>
         <w:jc w:val="both"/>
-        <w:rPr/>
-      </w:pPr>
-      <w:r>
-        <w:rPr>
+        <w:rPr>
+          <w:highlight w:val="white"/>
+        </w:rPr>
+      </w:pPr>
+      <w:r>
+        <w:rPr>
+          <w:highlight w:val="white"/>
           <w:rtl w:val="0"/>
         </w:rPr>
         <w:t xml:space="preserve">A incisão de canais e cânions também pode gerar paredes íngremes e favorecer rupturas retrogressivas. Nesses casos, a erosão pode atuar lentamente como fator condicionante ou funcionar como gatilho quando a remoção do suporte basal ocorre de maneira rápida (Lee et al., 2007; Scarselli, 2020).</w:t>
@@ -4213,8 +4553,10 @@
         <w:jc w:val="left"/>
         <w:rPr>
           <w:rFonts w:ascii="Times New Roman" w:cs="Times New Roman" w:eastAsia="Times New Roman" w:hAnsi="Times New Roman"/>
-          <w:b w:val="0"/>
-          <w:bCs w:val="0"/>
+          <w:i w:val="0"/>
+          <w:iCs w:val="0"/>
+          <w:color w:val="000000"/>
+          <w:highlight w:val="white"/>
         </w:rPr>
       </w:pPr>
       <w:bookmarkStart w:colFirst="0" w:colLast="0" w:name="_fqj3k2wvxmec" w:id="12"/>
@@ -4222,8 +4564,10 @@
       <w:r>
         <w:rPr>
           <w:rFonts w:ascii="Times New Roman" w:cs="Times New Roman" w:eastAsia="Times New Roman" w:hAnsi="Times New Roman"/>
-          <w:b w:val="0"/>
-          <w:bCs w:val="0"/>
+          <w:i w:val="0"/>
+          <w:iCs w:val="0"/>
+          <w:color w:val="000000"/>
+          <w:highlight w:val="white"/>
           <w:rtl w:val="0"/>
         </w:rPr>
         <w:t xml:space="preserve">Diapirismo e deformação tectônica</w:t>
@@ -4234,10 +4578,13 @@
         <w:spacing w:after="120" w:line="360" w:lineRule="auto"/>
         <w:ind w:left="0" w:firstLine="709"/>
         <w:jc w:val="both"/>
-        <w:rPr/>
-      </w:pPr>
-      <w:r>
-        <w:rPr>
+        <w:rPr>
+          <w:highlight w:val="white"/>
+        </w:rPr>
+      </w:pPr>
+      <w:r>
+        <w:rPr>
+          <w:highlight w:val="white"/>
           <w:rtl w:val="0"/>
         </w:rPr>
         <w:t xml:space="preserve">A movimentação de camadas evaporíticas, denominada halocinese, produz estruturas como diápiros, domos e muralhas de sal. O crescimento dessas estruturas deforma os estratos sobrejacentes, modifica a geometria do fundo marinho e pode aumentar localmente a inclinação do talude. Essa deformação também favorece o desenvolvimento de falhas e fraturas, que podem funcionar como superfícies de fraqueza ou como caminhos para a migração de fluidos.</w:t>
@@ -4248,10 +4595,13 @@
         <w:spacing w:after="120" w:line="360" w:lineRule="auto"/>
         <w:ind w:left="0" w:firstLine="709"/>
         <w:jc w:val="both"/>
-        <w:rPr/>
-      </w:pPr>
-      <w:r>
-        <w:rPr>
+        <w:rPr>
+          <w:highlight w:val="white"/>
+        </w:rPr>
+      </w:pPr>
+      <w:r>
+        <w:rPr>
+          <w:highlight w:val="white"/>
           <w:rtl w:val="0"/>
         </w:rPr>
         <w:t xml:space="preserve">A tectônica salífera pode, portanto, atuar de diferentes formas: aumentando as tensões gravitacionais, criando superfícies inclinadas, fraturando o pacote sedimentar e favorecendo o desenvolvimento de sobrepressão. Em geral, o diapirismo representa um fator condicionante de longa duração, mas fases de movimentação mais intensa podem contribuir diretamente para a ruptura (Kowsmann et al., 2002).</w:t>
@@ -4263,8 +4613,10 @@
         <w:jc w:val="left"/>
         <w:rPr>
           <w:rFonts w:ascii="Times New Roman" w:cs="Times New Roman" w:eastAsia="Times New Roman" w:hAnsi="Times New Roman"/>
-          <w:b w:val="0"/>
-          <w:bCs w:val="0"/>
+          <w:i w:val="0"/>
+          <w:iCs w:val="0"/>
+          <w:color w:val="000000"/>
+          <w:highlight w:val="white"/>
         </w:rPr>
       </w:pPr>
       <w:bookmarkStart w:colFirst="0" w:colLast="0" w:name="_6t4xwbhkdwji" w:id="13"/>
@@ -4272,8 +4624,10 @@
       <w:r>
         <w:rPr>
           <w:rFonts w:ascii="Times New Roman" w:cs="Times New Roman" w:eastAsia="Times New Roman" w:hAnsi="Times New Roman"/>
-          <w:b w:val="0"/>
-          <w:bCs w:val="0"/>
+          <w:i w:val="0"/>
+          <w:iCs w:val="0"/>
+          <w:color w:val="000000"/>
+          <w:highlight w:val="white"/>
           <w:rtl w:val="0"/>
         </w:rPr>
         <w:t xml:space="preserve">Migração de fluidos e gases</w:t>
@@ -4284,10 +4638,13 @@
         <w:spacing w:after="120" w:line="360" w:lineRule="auto"/>
         <w:ind w:left="0" w:firstLine="709"/>
         <w:jc w:val="both"/>
-        <w:rPr/>
-      </w:pPr>
-      <w:r>
-        <w:rPr>
+        <w:rPr>
+          <w:highlight w:val="white"/>
+        </w:rPr>
+      </w:pPr>
+      <w:r>
+        <w:rPr>
+          <w:highlight w:val="white"/>
           <w:rtl w:val="0"/>
         </w:rPr>
         <w:t xml:space="preserve">Fluidos sobrepressurizados podem migrar verticalmente através de falhas e fraturas ou lateralmente por camadas permeáveis. Quando ficam retidos sob unidades de baixa permeabilidade, provocam aumento da poropressão e redução da resistência ao cisalhamento. Chaminés de gás, vulcões de lama e pockmarks podem indicar a presença de sistemas de migração de fluidos.</w:t>
@@ -4298,10 +4655,13 @@
         <w:spacing w:after="120" w:line="360" w:lineRule="auto"/>
         <w:ind w:left="0" w:firstLine="709"/>
         <w:jc w:val="both"/>
-        <w:rPr/>
-      </w:pPr>
-      <w:r>
-        <w:rPr>
+        <w:rPr>
+          <w:highlight w:val="white"/>
+        </w:rPr>
+      </w:pPr>
+      <w:r>
+        <w:rPr>
+          <w:highlight w:val="white"/>
           <w:rtl w:val="0"/>
         </w:rPr>
         <w:t xml:space="preserve">Entretanto, essas feições não comprovam isoladamente que os fluidos tenham causado o movimento de massa. Em algumas situações, os condutos podem facilitar a drenagem e promover a dissipação da sobrepressão. Assim, a relação entre migração de fluidos e instabilidade deve ser analisada considerando a geometria, a atividade e a evolução do sistema.</w:t>
@@ -4313,8 +4673,10 @@
         <w:jc w:val="left"/>
         <w:rPr>
           <w:rFonts w:ascii="Times New Roman" w:cs="Times New Roman" w:eastAsia="Times New Roman" w:hAnsi="Times New Roman"/>
-          <w:b w:val="0"/>
-          <w:bCs w:val="0"/>
+          <w:i w:val="0"/>
+          <w:iCs w:val="0"/>
+          <w:color w:val="000000"/>
+          <w:highlight w:val="white"/>
         </w:rPr>
       </w:pPr>
       <w:bookmarkStart w:colFirst="0" w:colLast="0" w:name="_3nk1e2ooya3z" w:id="14"/>
@@ -4322,8 +4684,10 @@
       <w:r>
         <w:rPr>
           <w:rFonts w:ascii="Times New Roman" w:cs="Times New Roman" w:eastAsia="Times New Roman" w:hAnsi="Times New Roman"/>
-          <w:b w:val="0"/>
-          <w:bCs w:val="0"/>
+          <w:i w:val="0"/>
+          <w:iCs w:val="0"/>
+          <w:color w:val="000000"/>
+          <w:highlight w:val="white"/>
           <w:rtl w:val="0"/>
         </w:rPr>
         <w:t xml:space="preserve">Dissociação de hidratos de gás</w:t>
@@ -4334,10 +4698,13 @@
         <w:spacing w:after="120" w:line="360" w:lineRule="auto"/>
         <w:ind w:left="0" w:firstLine="709"/>
         <w:jc w:val="both"/>
-        <w:rPr/>
-      </w:pPr>
-      <w:r>
-        <w:rPr>
+        <w:rPr>
+          <w:highlight w:val="white"/>
+        </w:rPr>
+      </w:pPr>
+      <w:r>
+        <w:rPr>
+          <w:highlight w:val="white"/>
           <w:rtl w:val="0"/>
         </w:rPr>
         <w:t xml:space="preserve">Os hidratos de gás são estáveis sob determinadas condições de pressão e temperatura. Mudanças no nível do mar, na temperatura da água de fundo ou no soterramento podem provocar sua dissociação, liberando água e gás no interior do sedimento. Essa liberação pode aumentar a poropressão e reduzir a resistência do pacote sedimentar.</w:t>
@@ -4348,10 +4715,13 @@
         <w:spacing w:after="120" w:line="360" w:lineRule="auto"/>
         <w:ind w:left="0" w:firstLine="709"/>
         <w:jc w:val="both"/>
-        <w:rPr/>
-      </w:pPr>
-      <w:r>
-        <w:rPr>
+        <w:rPr>
+          <w:highlight w:val="white"/>
+        </w:rPr>
+      </w:pPr>
+      <w:r>
+        <w:rPr>
+          <w:highlight w:val="white"/>
           <w:rtl w:val="0"/>
         </w:rPr>
         <w:t xml:space="preserve">Embora seja um mecanismo possível, a associação espacial entre depósitos de movimentos de massa e a zona de estabilidade dos hidratos não é suficiente para demonstrar uma relação causal. A atuação desse processo deve ser avaliada de acordo com a profundidade da água, a concentração de hidratos e as mudanças de pressão e temperatura ocorridas no período da ruptura (Sultan et al., 2004; Talling et al., 2014).</w:t>
@@ -4363,8 +4733,10 @@
         <w:jc w:val="left"/>
         <w:rPr>
           <w:rFonts w:ascii="Times New Roman" w:cs="Times New Roman" w:eastAsia="Times New Roman" w:hAnsi="Times New Roman"/>
-          <w:b w:val="0"/>
-          <w:bCs w:val="0"/>
+          <w:i w:val="0"/>
+          <w:iCs w:val="0"/>
+          <w:color w:val="000000"/>
+          <w:highlight w:val="white"/>
         </w:rPr>
       </w:pPr>
       <w:bookmarkStart w:colFirst="0" w:colLast="0" w:name="_2reljg3yjt3t" w:id="15"/>
@@ -4372,8 +4744,10 @@
       <w:r>
         <w:rPr>
           <w:rFonts w:ascii="Times New Roman" w:cs="Times New Roman" w:eastAsia="Times New Roman" w:hAnsi="Times New Roman"/>
-          <w:b w:val="0"/>
-          <w:bCs w:val="0"/>
+          <w:i w:val="0"/>
+          <w:iCs w:val="0"/>
+          <w:color w:val="000000"/>
+          <w:highlight w:val="white"/>
           <w:rtl w:val="0"/>
         </w:rPr>
         <w:t xml:space="preserve">Ondas e carregamento hidrodinâmico</w:t>
@@ -4384,10 +4758,13 @@
         <w:spacing w:after="120" w:line="360" w:lineRule="auto"/>
         <w:ind w:left="0" w:firstLine="709"/>
         <w:jc w:val="both"/>
-        <w:rPr/>
-      </w:pPr>
-      <w:r>
-        <w:rPr>
+        <w:rPr>
+          <w:highlight w:val="white"/>
+        </w:rPr>
+      </w:pPr>
+      <w:r>
+        <w:rPr>
+          <w:highlight w:val="white"/>
           <w:rtl w:val="0"/>
         </w:rPr>
         <w:t xml:space="preserve">Ondas de tempestade e tsunamis produzem variações cíclicas de pressão sobre o fundo marinho. Essas variações geram tensões de cisalhamento e podem causar excesso de poropressão em sedimentos pouco consolidados. Sua influência é mais significativa na plataforma e no talude superior, diminuindo com o aumento da profundidade.</w:t>
@@ -4398,10 +4775,13 @@
         <w:spacing w:after="120" w:line="360" w:lineRule="auto"/>
         <w:ind w:left="0" w:firstLine="709"/>
         <w:jc w:val="both"/>
-        <w:rPr/>
-      </w:pPr>
-      <w:r>
-        <w:rPr>
+        <w:rPr>
+          <w:highlight w:val="white"/>
+        </w:rPr>
+      </w:pPr>
+      <w:r>
+        <w:rPr>
+          <w:highlight w:val="white"/>
           <w:rtl w:val="0"/>
         </w:rPr>
         <w:t xml:space="preserve">As ondas internas, formadas em massas de água estratificadas, também podem afetar áreas mais profundas. Elas podem favorecer a erosão do fundo e impor esforços repetidos sobre os sedimentos, contribuindo para a instabilidade quando o talude já apresenta baixa resistência (Hampton et al., 1996; Scarselli, 2020).</w:t>
@@ -4412,10 +4792,13 @@
         <w:spacing w:after="120" w:line="360" w:lineRule="auto"/>
         <w:ind w:left="0" w:firstLine="709"/>
         <w:jc w:val="both"/>
-        <w:rPr/>
-      </w:pPr>
-      <w:r>
-        <w:rPr>
+        <w:rPr>
+          <w:highlight w:val="white"/>
+        </w:rPr>
+      </w:pPr>
+      <w:r>
+        <w:rPr>
+          <w:highlight w:val="white"/>
           <w:rtl w:val="0"/>
         </w:rPr>
         <w:t xml:space="preserve">Em síntese, os movimentos de massa submarinos geralmente resultam de uma sucessão de processos. As características litológicas e estratigráficas condicionam a resistência do talude; a sedimentação, a deformação tectônica ou a migração de fluidos aproximam o sistema da condição de ruptura; e um evento de curta duração, como um terremoto ou uma fase erosiva, pode atuar como gatilho final. Portanto, a presença de determinado processo no contexto geológico não é suficiente para estabelecer, por si só, uma relação causal com o movimento de massa.</w:t>
@@ -4426,7 +4809,9 @@
         <w:spacing w:after="120" w:line="360" w:lineRule="auto"/>
         <w:ind w:left="0" w:firstLine="709"/>
         <w:jc w:val="both"/>
-        <w:rPr/>
+        <w:rPr>
+          <w:highlight w:val="white"/>
+        </w:rPr>
       </w:pPr>
       <w:r>
         <w:rPr>
@@ -4439,7 +4824,9 @@
         <w:spacing w:after="120" w:line="360" w:lineRule="auto"/>
         <w:ind w:left="0" w:firstLine="709"/>
         <w:jc w:val="both"/>
-        <w:rPr/>
+        <w:rPr>
+          <w:highlight w:val="white"/>
+        </w:rPr>
       </w:pPr>
       <w:r>
         <w:rPr>

</xml_diff>

<commit_message>
Atualizacao automatica 2026-09-19 18:10:43
</commit_message>
<xml_diff>
--- a/docs/template-tcc-geologia-ufsc.docx
+++ b/docs/template-tcc-geologia-ufsc.docx
@@ -13,12 +13,12 @@
           <wp:inline distB="0" distT="0" distL="114300" distR="114300">
             <wp:extent cx="900000" cy="1236424"/>
             <wp:effectExtent b="0" l="0" r="0" t="0"/>
-            <wp:docPr descr="Símbolo da Universidade Federal de Santa Catarina" id="3" name="image4.png"/>
+            <wp:docPr descr="Símbolo da Universidade Federal de Santa Catarina" id="3" name="image5.png"/>
             <a:graphic>
               <a:graphicData uri="http://schemas.openxmlformats.org/drawingml/2006/picture">
                 <pic:pic>
                   <pic:nvPicPr>
-                    <pic:cNvPr descr="Símbolo da Universidade Federal de Santa Catarina" id="0" name="image4.png"/>
+                    <pic:cNvPr descr="Símbolo da Universidade Federal de Santa Catarina" id="0" name="image5.png"/>
                     <pic:cNvPicPr preferRelativeResize="0"/>
                   </pic:nvPicPr>
                   <pic:blipFill>
@@ -1472,6 +1472,17 @@
         <w:rPr/>
       </w:pPr>
       <w:r>
+        <w:rPr>
+          <w:rtl w:val="0"/>
+        </w:rPr>
+        <w:t xml:space="preserve">Figura 5 — Relações entre tensão total, poropressão, tensão efetiva e resistência ao cisalhamento em sedimentos marinhos saturados</w:t>
+      </w:r>
+    </w:p>
+    <w:p>
+      <w:pPr>
+        <w:rPr/>
+      </w:pPr>
+      <w:r>
         <w:br w:type="page"/>
       </w:r>
       <w:r>
@@ -1768,7 +1779,7 @@
     </w:p>
     <w:sdt>
       <w:sdtPr>
-        <w:id w:val="-894479202"/>
+        <w:id w:val="-813349404"/>
         <w:docPartObj>
           <w:docPartGallery w:val="Table of Contents"/>
           <w:docPartUnique w:val="1"/>
@@ -1967,23 +1978,50 @@
           <w:highlight w:val="white"/>
           <w:rtl w:val="0"/>
         </w:rPr>
-        <w:t xml:space="preserve">., 1996). Mesmo eventos de menor escala podem danificar plataformas de petróleo, dutos e cabos submarinos (Tappin </w:t>
-      </w:r>
-      <w:r>
-        <w:rPr>
-          <w:i w:val="1"/>
-          <w:iCs w:val="1"/>
-          <w:highlight w:val="white"/>
+        <w:t xml:space="preserve">., 1996). </w:t>
+      </w:r>
+      <w:r>
+        <w:rPr>
+          <w:rtl w:val="0"/>
+        </w:rPr>
+        <w:t xml:space="preserve">A magnitude que esses eventos podem atingir é exemplificada pelo Deslizamento de Storegga, ocorrido na margem continental da Noruega, que mobilizou mais de 3.000 km³ de sedimentos e gerou um tsunami que atingiu as costas adjacentes com alturas estimadas entre 6 e 20 m (Bondevik </w:t>
+      </w:r>
+      <w:r>
+        <w:rPr>
+          <w:i w:val="1"/>
+          <w:iCs w:val="1"/>
           <w:rtl w:val="0"/>
         </w:rPr>
         <w:t xml:space="preserve">et al</w:t>
       </w:r>
       <w:r>
         <w:rPr>
-          <w:highlight w:val="white"/>
-          <w:rtl w:val="0"/>
-        </w:rPr>
-        <w:t xml:space="preserve">., 2001). </w:t>
+          <w:rtl w:val="0"/>
+        </w:rPr>
+        <w:t xml:space="preserve">., 2005; 2012). </w:t>
+      </w:r>
+      <w:r>
+        <w:rPr>
+          <w:highlight w:val="white"/>
+          <w:rtl w:val="0"/>
+        </w:rPr>
+        <w:t xml:space="preserve"> Porém, mesmo eventos de menor escala podem danificar plataformas de petróleo, dutos e cabos submarinos (Tappin </w:t>
+      </w:r>
+      <w:r>
+        <w:rPr>
+          <w:i w:val="1"/>
+          <w:iCs w:val="1"/>
+          <w:highlight w:val="white"/>
+          <w:rtl w:val="0"/>
+        </w:rPr>
+        <w:t xml:space="preserve">et al</w:t>
+      </w:r>
+      <w:r>
+        <w:rPr>
+          <w:highlight w:val="white"/>
+          <w:rtl w:val="0"/>
+        </w:rPr>
+        <w:t xml:space="preserve">., 2001).</w:t>
       </w:r>
     </w:p>
     <w:p>
@@ -2968,12 +3006,12 @@
           <wp:inline distB="114300" distT="114300" distL="114300" distR="114300">
             <wp:extent cx="4690796" cy="4706302"/>
             <wp:effectExtent b="0" l="0" r="0" t="0"/>
-            <wp:docPr id="5" name="image5.png"/>
+            <wp:docPr id="7" name="image4.png"/>
             <a:graphic>
               <a:graphicData uri="http://schemas.openxmlformats.org/drawingml/2006/picture">
                 <pic:pic>
                   <pic:nvPicPr>
-                    <pic:cNvPr id="0" name="image5.png"/>
+                    <pic:cNvPr id="0" name="image4.png"/>
                     <pic:cNvPicPr preferRelativeResize="0"/>
                   </pic:nvPicPr>
                   <pic:blipFill>
@@ -3135,12 +3173,12 @@
           <wp:inline distB="114300" distT="114300" distL="114300" distR="114300">
             <wp:extent cx="5759775" cy="1295400"/>
             <wp:effectExtent b="0" l="0" r="0" t="0"/>
-            <wp:docPr id="1" name="image2.png"/>
+            <wp:docPr id="1" name="image3.png"/>
             <a:graphic>
               <a:graphicData uri="http://schemas.openxmlformats.org/drawingml/2006/picture">
                 <pic:pic>
                   <pic:nvPicPr>
-                    <pic:cNvPr id="0" name="image2.png"/>
+                    <pic:cNvPr id="0" name="image3.png"/>
                     <pic:cNvPicPr preferRelativeResize="0"/>
                   </pic:nvPicPr>
                   <pic:blipFill>
@@ -3249,7 +3287,7 @@
           <wp:inline distB="114300" distT="114300" distL="114300" distR="114300">
             <wp:extent cx="5444561" cy="2798774"/>
             <wp:effectExtent b="0" l="0" r="0" t="0"/>
-            <wp:docPr id="4" name="image1.png"/>
+            <wp:docPr id="5" name="image1.png"/>
             <a:graphic>
               <a:graphicData uri="http://schemas.openxmlformats.org/drawingml/2006/picture">
                 <pic:pic>
@@ -3478,12 +3516,12 @@
           <wp:inline distB="114300" distT="114300" distL="114300" distR="114300">
             <wp:extent cx="5344478" cy="4946954"/>
             <wp:effectExtent b="0" l="0" r="0" t="0"/>
-            <wp:docPr id="2" name="image3.png"/>
+            <wp:docPr id="2" name="image2.png"/>
             <a:graphic>
               <a:graphicData uri="http://schemas.openxmlformats.org/drawingml/2006/picture">
                 <pic:pic>
                   <pic:nvPicPr>
-                    <pic:cNvPr id="0" name="image3.png"/>
+                    <pic:cNvPr id="0" name="image2.png"/>
                     <pic:cNvPicPr preferRelativeResize="0"/>
                   </pic:nvPicPr>
                   <pic:blipFill>
@@ -3780,7 +3818,37 @@
           <w:highlight w:val="white"/>
           <w:rtl w:val="0"/>
         </w:rPr>
-        <w:t xml:space="preserve">FS = τf / τm    (1)</w:t>
+        <w:t xml:space="preserve">FS = τ</w:t>
+      </w:r>
+      <w:r>
+        <w:rPr>
+          <w:highlight w:val="white"/>
+          <w:vertAlign w:val="subscript"/>
+          <w:rtl w:val="0"/>
+        </w:rPr>
+        <w:t xml:space="preserve">f</w:t>
+      </w:r>
+      <w:r>
+        <w:rPr>
+          <w:highlight w:val="white"/>
+          <w:rtl w:val="0"/>
+        </w:rPr>
+        <w:t xml:space="preserve"> / τ</w:t>
+      </w:r>
+      <w:r>
+        <w:rPr>
+          <w:highlight w:val="white"/>
+          <w:vertAlign w:val="subscript"/>
+          <w:rtl w:val="0"/>
+        </w:rPr>
+        <w:t xml:space="preserve">m</w:t>
+      </w:r>
+      <w:r>
+        <w:rPr>
+          <w:highlight w:val="white"/>
+          <w:rtl w:val="0"/>
+        </w:rPr>
+        <w:t xml:space="preserve">    (1)</w:t>
       </w:r>
     </w:p>
     <w:p>
@@ -3839,7 +3907,22 @@
           <w:highlight w:val="white"/>
           <w:rtl w:val="0"/>
         </w:rPr>
-        <w:t xml:space="preserve">τf é a resistência ao cisalhamento do material;</w:t>
+        <w:t xml:space="preserve">τ</w:t>
+      </w:r>
+      <w:r>
+        <w:rPr>
+          <w:highlight w:val="white"/>
+          <w:vertAlign w:val="subscript"/>
+          <w:rtl w:val="0"/>
+        </w:rPr>
+        <w:t xml:space="preserve">f</w:t>
+      </w:r>
+      <w:r>
+        <w:rPr>
+          <w:highlight w:val="white"/>
+          <w:rtl w:val="0"/>
+        </w:rPr>
+        <w:t xml:space="preserve"> é a resistência ao cisalhamento do material;</w:t>
       </w:r>
     </w:p>
     <w:p>
@@ -3860,7 +3943,22 @@
           <w:highlight w:val="white"/>
           <w:rtl w:val="0"/>
         </w:rPr>
-        <w:t xml:space="preserve">τm é a tensão cisalhante mobilizada ao longo da superfície potencial de ruptura.</w:t>
+        <w:t xml:space="preserve">τ</w:t>
+      </w:r>
+      <w:r>
+        <w:rPr>
+          <w:highlight w:val="white"/>
+          <w:vertAlign w:val="subscript"/>
+          <w:rtl w:val="0"/>
+        </w:rPr>
+        <w:t xml:space="preserve">m</w:t>
+      </w:r>
+      <w:r>
+        <w:rPr>
+          <w:highlight w:val="white"/>
+          <w:rtl w:val="0"/>
+        </w:rPr>
+        <w:t xml:space="preserve"> é a tensão cisalhante mobilizada ao longo da superfície potencial de ruptura.</w:t>
       </w:r>
     </w:p>
     <w:p>
@@ -3937,7 +4035,37 @@
           <w:highlight w:val="white"/>
           <w:rtl w:val="0"/>
         </w:rPr>
-        <w:t xml:space="preserve">τf = c′ + σ′n tan φ′    (2)</w:t>
+        <w:t xml:space="preserve">τ</w:t>
+      </w:r>
+      <w:r>
+        <w:rPr>
+          <w:highlight w:val="white"/>
+          <w:vertAlign w:val="subscript"/>
+          <w:rtl w:val="0"/>
+        </w:rPr>
+        <w:t xml:space="preserve">f</w:t>
+      </w:r>
+      <w:r>
+        <w:rPr>
+          <w:highlight w:val="white"/>
+          <w:rtl w:val="0"/>
+        </w:rPr>
+        <w:t xml:space="preserve"> = c′ + σ′</w:t>
+      </w:r>
+      <w:r>
+        <w:rPr>
+          <w:highlight w:val="white"/>
+          <w:vertAlign w:val="subscript"/>
+          <w:rtl w:val="0"/>
+        </w:rPr>
+        <w:t xml:space="preserve">n</w:t>
+      </w:r>
+      <w:r>
+        <w:rPr>
+          <w:highlight w:val="white"/>
+          <w:rtl w:val="0"/>
+        </w:rPr>
+        <w:t xml:space="preserve"> tan φ′    (2)</w:t>
       </w:r>
     </w:p>
     <w:p>
@@ -3975,7 +4103,22 @@
           <w:highlight w:val="white"/>
           <w:rtl w:val="0"/>
         </w:rPr>
-        <w:t xml:space="preserve">τf é a resistência ao cisalhamento;</w:t>
+        <w:t xml:space="preserve">τ</w:t>
+      </w:r>
+      <w:r>
+        <w:rPr>
+          <w:highlight w:val="white"/>
+          <w:vertAlign w:val="subscript"/>
+          <w:rtl w:val="0"/>
+        </w:rPr>
+        <w:t xml:space="preserve">f</w:t>
+      </w:r>
+      <w:r>
+        <w:rPr>
+          <w:highlight w:val="white"/>
+          <w:rtl w:val="0"/>
+        </w:rPr>
+        <w:t xml:space="preserve"> é a resistência ao cisalhamento;</w:t>
       </w:r>
     </w:p>
     <w:p>
@@ -4017,7 +4160,22 @@
           <w:highlight w:val="white"/>
           <w:rtl w:val="0"/>
         </w:rPr>
-        <w:t xml:space="preserve">σ′n é a tensão normal efetiva atuante sobre a superfície de ruptura;</w:t>
+        <w:t xml:space="preserve">σ′</w:t>
+      </w:r>
+      <w:r>
+        <w:rPr>
+          <w:highlight w:val="white"/>
+          <w:vertAlign w:val="subscript"/>
+          <w:rtl w:val="0"/>
+        </w:rPr>
+        <w:t xml:space="preserve">n</w:t>
+      </w:r>
+      <w:r>
+        <w:rPr>
+          <w:highlight w:val="white"/>
+          <w:rtl w:val="0"/>
+        </w:rPr>
+        <w:t xml:space="preserve"> é a tensão normal efetiva atuante sobre a superfície de ruptura;</w:t>
       </w:r>
     </w:p>
     <w:p>
@@ -4121,6 +4279,11 @@
         </w:rPr>
         <w:t xml:space="preserve">Como os sedimentos marinhos estão saturados, parte da tensão total aplicada ao pacote sedimentar é sustentada pelo fluido presente nos poros. De acordo com o princípio da tensão efetiva de Terzaghi, a tensão normal efetiva pode ser expressa por:</w:t>
       </w:r>
+      <w:r>
+        <w:rPr>
+          <w:rtl w:val="0"/>
+        </w:rPr>
+      </w:r>
     </w:p>
     <w:p>
       <w:pPr>
@@ -4133,11 +4296,41 @@
       </w:pPr>
       <w:r>
         <w:rPr>
-          <w:rFonts w:ascii="Cardo" w:cs="Cardo" w:eastAsia="Cardo" w:hAnsi="Cardo"/>
-          <w:highlight w:val="white"/>
-          <w:rtl w:val="0"/>
-        </w:rPr>
-        <w:t xml:space="preserve">σ′n = σn − u    (3)</w:t>
+          <w:highlight w:val="white"/>
+          <w:rtl w:val="0"/>
+        </w:rPr>
+        <w:t xml:space="preserve">σ′</w:t>
+      </w:r>
+      <w:r>
+        <w:rPr>
+          <w:highlight w:val="white"/>
+          <w:vertAlign w:val="subscript"/>
+          <w:rtl w:val="0"/>
+        </w:rPr>
+        <w:t xml:space="preserve">n</w:t>
+      </w:r>
+      <w:r>
+        <w:rPr>
+          <w:highlight w:val="white"/>
+          <w:rtl w:val="0"/>
+        </w:rPr>
+        <w:t xml:space="preserve"> = σ</w:t>
+      </w:r>
+      <w:r>
+        <w:rPr>
+          <w:highlight w:val="white"/>
+          <w:vertAlign w:val="subscript"/>
+          <w:rtl w:val="0"/>
+        </w:rPr>
+        <w:t xml:space="preserve">n</w:t>
+      </w:r>
+      <w:r>
+        <w:rPr>
+          <w:rFonts w:ascii="Gungsuh" w:cs="Gungsuh" w:eastAsia="Gungsuh" w:hAnsi="Gungsuh"/>
+          <w:highlight w:val="white"/>
+          <w:rtl w:val="0"/>
+        </w:rPr>
+        <w:t xml:space="preserve"> − u    (3)</w:t>
       </w:r>
     </w:p>
     <w:p>
@@ -4175,7 +4368,22 @@
           <w:highlight w:val="white"/>
           <w:rtl w:val="0"/>
         </w:rPr>
-        <w:t xml:space="preserve">σ′n é a tensão normal efetiva;</w:t>
+        <w:t xml:space="preserve">σ′</w:t>
+      </w:r>
+      <w:r>
+        <w:rPr>
+          <w:highlight w:val="white"/>
+          <w:vertAlign w:val="subscript"/>
+          <w:rtl w:val="0"/>
+        </w:rPr>
+        <w:t xml:space="preserve">n</w:t>
+      </w:r>
+      <w:r>
+        <w:rPr>
+          <w:highlight w:val="white"/>
+          <w:rtl w:val="0"/>
+        </w:rPr>
+        <w:t xml:space="preserve"> é a tensão normal efetiva;</w:t>
       </w:r>
     </w:p>
     <w:p>
@@ -4196,7 +4404,22 @@
           <w:highlight w:val="white"/>
           <w:rtl w:val="0"/>
         </w:rPr>
-        <w:t xml:space="preserve">σn é a tensão normal total;</w:t>
+        <w:t xml:space="preserve">σ</w:t>
+      </w:r>
+      <w:r>
+        <w:rPr>
+          <w:highlight w:val="white"/>
+          <w:vertAlign w:val="subscript"/>
+          <w:rtl w:val="0"/>
+        </w:rPr>
+        <w:t xml:space="preserve">n</w:t>
+      </w:r>
+      <w:r>
+        <w:rPr>
+          <w:highlight w:val="white"/>
+          <w:rtl w:val="0"/>
+        </w:rPr>
+        <w:t xml:space="preserve"> é a tensão normal total;</w:t>
       </w:r>
     </w:p>
     <w:p>
@@ -4248,11 +4471,41 @@
       </w:pPr>
       <w:r>
         <w:rPr>
-          <w:rFonts w:ascii="Cardo" w:cs="Cardo" w:eastAsia="Cardo" w:hAnsi="Cardo"/>
-          <w:highlight w:val="white"/>
-          <w:rtl w:val="0"/>
-        </w:rPr>
-        <w:t xml:space="preserve">τf = c′ + (σn − u) tan φ′    (4)</w:t>
+          <w:highlight w:val="white"/>
+          <w:rtl w:val="0"/>
+        </w:rPr>
+        <w:t xml:space="preserve">τ</w:t>
+      </w:r>
+      <w:r>
+        <w:rPr>
+          <w:highlight w:val="white"/>
+          <w:vertAlign w:val="subscript"/>
+          <w:rtl w:val="0"/>
+        </w:rPr>
+        <w:t xml:space="preserve">f</w:t>
+      </w:r>
+      <w:r>
+        <w:rPr>
+          <w:highlight w:val="white"/>
+          <w:rtl w:val="0"/>
+        </w:rPr>
+        <w:t xml:space="preserve"> = c′ + (σ</w:t>
+      </w:r>
+      <w:r>
+        <w:rPr>
+          <w:highlight w:val="white"/>
+          <w:vertAlign w:val="subscript"/>
+          <w:rtl w:val="0"/>
+        </w:rPr>
+        <w:t xml:space="preserve">n</w:t>
+      </w:r>
+      <w:r>
+        <w:rPr>
+          <w:rFonts w:ascii="Gungsuh" w:cs="Gungsuh" w:eastAsia="Gungsuh" w:hAnsi="Gungsuh"/>
+          <w:highlight w:val="white"/>
+          <w:rtl w:val="0"/>
+        </w:rPr>
+        <w:t xml:space="preserve"> − u) tan φ′    (4)</w:t>
       </w:r>
     </w:p>
     <w:p>
@@ -4283,11 +4536,41 @@
       </w:pPr>
       <w:r>
         <w:rPr>
-          <w:rFonts w:ascii="Cardo" w:cs="Cardo" w:eastAsia="Cardo" w:hAnsi="Cardo"/>
-          <w:highlight w:val="white"/>
-          <w:rtl w:val="0"/>
-        </w:rPr>
-        <w:t xml:space="preserve">FS = [c′ + (σn − u) tan φ′] / τm    (5)</w:t>
+          <w:highlight w:val="white"/>
+          <w:rtl w:val="0"/>
+        </w:rPr>
+        <w:t xml:space="preserve">FS = [c′ + (σ</w:t>
+      </w:r>
+      <w:r>
+        <w:rPr>
+          <w:highlight w:val="white"/>
+          <w:vertAlign w:val="subscript"/>
+          <w:rtl w:val="0"/>
+        </w:rPr>
+        <w:t xml:space="preserve">n</w:t>
+      </w:r>
+      <w:r>
+        <w:rPr>
+          <w:rFonts w:ascii="Gungsuh" w:cs="Gungsuh" w:eastAsia="Gungsuh" w:hAnsi="Gungsuh"/>
+          <w:highlight w:val="white"/>
+          <w:rtl w:val="0"/>
+        </w:rPr>
+        <w:t xml:space="preserve"> − u) tan φ′] / τ</w:t>
+      </w:r>
+      <w:r>
+        <w:rPr>
+          <w:highlight w:val="white"/>
+          <w:vertAlign w:val="subscript"/>
+          <w:rtl w:val="0"/>
+        </w:rPr>
+        <w:t xml:space="preserve">m</w:t>
+      </w:r>
+      <w:r>
+        <w:rPr>
+          <w:highlight w:val="white"/>
+          <w:rtl w:val="0"/>
+        </w:rPr>
+        <w:t xml:space="preserve">    (5)</w:t>
       </w:r>
     </w:p>
     <w:p>
@@ -4304,7 +4587,97 @@
           <w:highlight w:val="white"/>
           <w:rtl w:val="0"/>
         </w:rPr>
-        <w:t xml:space="preserve">As equações mostram que o aumento da poropressão reduz a tensão efetiva e, consequentemente, a resistência ao cisalhamento. Quando a poropressão se aproxima da tensão normal total, a tensão efetiva tende a valores muito baixos e o sedimento perde grande parte de sua resistência. Nessas condições, mesmo um pequeno aumento da tensão cisalhante pode provocar a ruptura. Por essa razão, o excesso de poropressão é considerado um dos principais elementos envolvidos na instabilidade dos taludes submarinos (Hampton et al., 1996; Talling et al., 2014).</w:t>
+        <w:t xml:space="preserve">As equações mostram que o aumento da poropressão reduz a tensão efetiva e, consequentemente, a resistência ao cisalhamento. Quando a poropressão se aproxima da tensão normal total, a tensão efetiva tende a valores muito baixos e o sedimento perde grande parte de sua resistência. A relação entre tensão total, poropressão, tensão efetiva e resistência ao cisalhamento é sintetizada na Figura 5. Nessa figura, a poropressão é representada pelo símbolo μ; neste texto e nas equações, adota-se u. Nessas condições, mesmo um pequeno aumento da tensão cisalhante pode provocar a ruptura (Hampton et al., 1996; Talling et al., 2014).</w:t>
+      </w:r>
+    </w:p>
+    <w:p>
+      <w:pPr>
+        <w:spacing w:after="120" w:before="0" w:line="240" w:lineRule="auto"/>
+        <w:ind w:left="0" w:firstLine="0"/>
+        <w:jc w:val="center"/>
+        <w:rPr>
+          <w:highlight w:val="white"/>
+        </w:rPr>
+      </w:pPr>
+      <w:r>
+        <w:rPr>
+          <w:highlight w:val="white"/>
+        </w:rPr>
+        <w:drawing>
+          <wp:inline distB="114300" distT="114300" distL="114300" distR="114300">
+            <wp:extent cx="3481083" cy="5218748"/>
+            <wp:effectExtent b="0" l="0" r="0" t="0"/>
+            <wp:docPr id="6" name="image6.png"/>
+            <a:graphic>
+              <a:graphicData uri="http://schemas.openxmlformats.org/drawingml/2006/picture">
+                <pic:pic>
+                  <pic:nvPicPr>
+                    <pic:cNvPr id="0" name="image6.png"/>
+                    <pic:cNvPicPr preferRelativeResize="0"/>
+                  </pic:nvPicPr>
+                  <pic:blipFill>
+                    <a:blip r:embed="rId11"/>
+                    <a:srcRect b="0" l="0" r="0" t="0"/>
+                    <a:stretch>
+                      <a:fillRect/>
+                    </a:stretch>
+                  </pic:blipFill>
+                  <pic:spPr>
+                    <a:xfrm>
+                      <a:off x="0" y="0"/>
+                      <a:ext cx="3481083" cy="5218748"/>
+                    </a:xfrm>
+                    <a:prstGeom prst="rect"/>
+                    <a:ln/>
+                  </pic:spPr>
+                </pic:pic>
+              </a:graphicData>
+            </a:graphic>
+          </wp:inline>
+        </w:drawing>
+      </w:r>
+      <w:r>
+        <w:rPr>
+          <w:rtl w:val="0"/>
+        </w:rPr>
+      </w:r>
+    </w:p>
+    <w:p>
+      <w:pPr>
+        <w:spacing w:after="120" w:before="0" w:line="240" w:lineRule="auto"/>
+        <w:ind w:left="0" w:firstLine="0"/>
+        <w:jc w:val="center"/>
+        <w:rPr>
+          <w:sz w:val="20"/>
+          <w:szCs w:val="20"/>
+        </w:rPr>
+      </w:pPr>
+      <w:r>
+        <w:rPr>
+          <w:sz w:val="20"/>
+          <w:szCs w:val="20"/>
+          <w:rtl w:val="0"/>
+        </w:rPr>
+        <w:t xml:space="preserve">Figura 5 — Relações entre tensão total, poropressão, tensão efetiva e resistência ao cisalhamento em sedimentos marinhos saturados</w:t>
+      </w:r>
+    </w:p>
+    <w:p>
+      <w:pPr>
+        <w:spacing w:after="120" w:before="0" w:line="240" w:lineRule="auto"/>
+        <w:ind w:left="0" w:firstLine="0"/>
+        <w:jc w:val="center"/>
+        <w:rPr>
+          <w:sz w:val="20"/>
+          <w:szCs w:val="20"/>
+        </w:rPr>
+      </w:pPr>
+      <w:r>
+        <w:rPr>
+          <w:sz w:val="20"/>
+          <w:szCs w:val="20"/>
+          <w:rtl w:val="0"/>
+        </w:rPr>
+        <w:t xml:space="preserve">Fonte: traduzido e adaptado de Talling et al. (2014).</w:t>
       </w:r>
     </w:p>
     <w:p>
@@ -4725,6 +5098,58 @@
           <w:rtl w:val="0"/>
         </w:rPr>
         <w:t xml:space="preserve">Embora seja um mecanismo possível, a associação espacial entre depósitos de movimentos de massa e a zona de estabilidade dos hidratos não é suficiente para demonstrar uma relação causal. A atuação desse processo deve ser avaliada de acordo com a profundidade da água, a concentração de hidratos e as mudanças de pressão e temperatura ocorridas no período da ruptura (Sultan et al., 2004; Talling et al., 2014).</w:t>
+      </w:r>
+    </w:p>
+    <w:p>
+      <w:pPr>
+        <w:spacing w:after="120" w:line="360" w:lineRule="auto"/>
+        <w:ind w:left="0" w:firstLine="709"/>
+        <w:jc w:val="both"/>
+        <w:rPr>
+          <w:highlight w:val="white"/>
+        </w:rPr>
+      </w:pPr>
+      <w:r>
+        <w:rPr>
+          <w:highlight w:val="white"/>
+        </w:rPr>
+        <w:drawing>
+          <wp:inline distB="114300" distT="114300" distL="114300" distR="114300">
+            <wp:extent cx="5759775" cy="4127500"/>
+            <wp:effectExtent b="0" l="0" r="0" t="0"/>
+            <wp:docPr id="4" name="image7.png"/>
+            <a:graphic>
+              <a:graphicData uri="http://schemas.openxmlformats.org/drawingml/2006/picture">
+                <pic:pic>
+                  <pic:nvPicPr>
+                    <pic:cNvPr id="0" name="image7.png"/>
+                    <pic:cNvPicPr preferRelativeResize="0"/>
+                  </pic:nvPicPr>
+                  <pic:blipFill>
+                    <a:blip r:embed="rId12"/>
+                    <a:srcRect b="0" l="0" r="0" t="0"/>
+                    <a:stretch>
+                      <a:fillRect/>
+                    </a:stretch>
+                  </pic:blipFill>
+                  <pic:spPr>
+                    <a:xfrm>
+                      <a:off x="0" y="0"/>
+                      <a:ext cx="5759775" cy="4127500"/>
+                    </a:xfrm>
+                    <a:prstGeom prst="rect"/>
+                    <a:ln/>
+                  </pic:spPr>
+                </pic:pic>
+              </a:graphicData>
+            </a:graphic>
+          </wp:inline>
+        </w:drawing>
+      </w:r>
+      <w:r>
+        <w:rPr>
+          <w:rtl w:val="0"/>
+        </w:rPr>
       </w:r>
     </w:p>
     <w:p>
@@ -5702,7 +6127,7 @@
           <w:szCs w:val="20"/>
           <w:rtl w:val="0"/>
         </w:rPr>
-        <w:t xml:space="preserve">Figura 5 — Título descritivo da figura</w:t>
+        <w:t xml:space="preserve">Figura 6 — Título descritivo da figura</w:t>
       </w:r>
       <w:r>
         <w:rPr>
@@ -6023,7 +6448,7 @@
         </w:rPr>
         <w:t xml:space="preserve">ALBERTON, M. E. et al. Identificação de potenciais depósitos de fosforita no Terraço do Rio Grande, Bacia de Pelotas. Pesquisas em Geociências, v. 51, n. 4, 2024. DOI: </w:t>
       </w:r>
-      <w:hyperlink r:id="rId11">
+      <w:hyperlink r:id="rId13">
         <w:r>
           <w:rPr>
             <w:i w:val="1"/>
@@ -6065,7 +6490,7 @@
         </w:rPr>
         <w:t xml:space="preserve">ALVARENGA, R. S. Análise sismoestratigráfica de bacias rifte: definição de sismofácies e arcabouço tectono-estratigráfico. 2016. 179 f. Tese (Doutorado em Geociências) — Universidade Federal do Rio Grande do Sul, Porto Alegre, 2016. Disponível em: </w:t>
       </w:r>
-      <w:hyperlink r:id="rId12">
+      <w:hyperlink r:id="rId14">
         <w:r>
           <w:rPr>
             <w:i w:val="1"/>
@@ -6107,7 +6532,7 @@
         </w:rPr>
         <w:t xml:space="preserve">ASSUMPÇÃO, M. et al. Intraplate seismicity in Brazil. In: TALWANI, P. (org.). Intraplate seismicity. Cambridge: Cambridge University Press, 2014. p. 50–71. DOI: </w:t>
       </w:r>
-      <w:hyperlink r:id="rId13">
+      <w:hyperlink r:id="rId15">
         <w:r>
           <w:rPr>
             <w:i w:val="1"/>
@@ -6149,7 +6574,7 @@
         </w:rPr>
         <w:t xml:space="preserve">BORGES, R. G.; LIMA, A. C.; KOWSMANN, R. O. Áreas propensas a escorregamentos no talude continental. In: KOWSMANN, R. O. (org.). Geologia e geomorfologia. Rio de Janeiro: Elsevier, 2015. p. 99–136. DOI: </w:t>
       </w:r>
-      <w:hyperlink r:id="rId14">
+      <w:hyperlink r:id="rId16">
         <w:r>
           <w:rPr>
             <w:i w:val="1"/>
@@ -6212,7 +6637,7 @@
         </w:rPr>
         <w:t xml:space="preserve">BULHÕES, E. &amp; AMORIM, W. N. de. Princípio da SismoCamada Elementar e sua aplicação à Técnica Volume de Amplitudes (tecVA). In: INTERNATIONAL CONGRESS OF THE BRAZILIAN GEOPHYSICAL SOCIETY, 9., 2005, Salvador. Anais [...]. Salvador: Sociedade Brasileira de Geofísica, 2005. DOI: </w:t>
       </w:r>
-      <w:hyperlink r:id="rId15">
+      <w:hyperlink r:id="rId17">
         <w:r>
           <w:rPr>
             <w:i w:val="1"/>
@@ -6275,7 +6700,7 @@
         </w:rPr>
         <w:t xml:space="preserve">CARDONA, S. et al. Fabric development and pore-throat reduction in a mass-transport deposit in the Jubilee Gas Field, Eastern Gulf of Mexico: consequences for the sealing capacity of MTDs. In: LAMARCHE, G. et al. (org.). Submarine mass movements and their consequences. Cham: Springer, 2016. p. 27–37. DOI: </w:t>
       </w:r>
-      <w:hyperlink r:id="rId16">
+      <w:hyperlink r:id="rId18">
         <w:r>
           <w:rPr>
             <w:i w:val="1"/>
@@ -6317,7 +6742,7 @@
         </w:rPr>
         <w:t xml:space="preserve">CHOPRA, S. &amp; MARFURT, K. J. Seismic attributes: a historical perspective. Geophysics, v. 70, n. 5, 2005. DOI: </w:t>
       </w:r>
-      <w:hyperlink r:id="rId17">
+      <w:hyperlink r:id="rId19">
         <w:r>
           <w:rPr>
             <w:i w:val="1"/>
@@ -6359,7 +6784,7 @@
         </w:rPr>
         <w:t xml:space="preserve">CHOPRA, S. &amp; MARFURT, K. J. Seismic attributes for prospect identification and reservoir characterization. Tulsa: Society of Exploration Geophysicists; European Association of Geoscientists and Engineers, 2007. (Geophysical Developments, v. 11). DOI: </w:t>
       </w:r>
-      <w:hyperlink r:id="rId18">
+      <w:hyperlink r:id="rId20">
         <w:r>
           <w:rPr>
             <w:i w:val="1"/>
@@ -6401,7 +6826,7 @@
         </w:rPr>
         <w:t xml:space="preserve">CLARE, M. A. et al. A consistent global approach for the morphometric characterization of subaqueous landslides. Geological Society, London, Special Publications, v. 477, p. 455–477, 2018. DOI: </w:t>
       </w:r>
-      <w:hyperlink r:id="rId19">
+      <w:hyperlink r:id="rId21">
         <w:r>
           <w:rPr>
             <w:i w:val="1"/>
@@ -6443,7 +6868,7 @@
         </w:rPr>
         <w:t xml:space="preserve">ELSEVIER. Scopus: a comprehensive abstract and citation database for impact makers. [S. l.], [s. d.]. Disponível em: </w:t>
       </w:r>
-      <w:hyperlink r:id="rId20">
+      <w:hyperlink r:id="rId22">
         <w:r>
           <w:rPr>
             <w:i w:val="1"/>
@@ -6485,7 +6910,7 @@
         </w:rPr>
         <w:t xml:space="preserve">FERNANDEZ, R. O. Bacia de Santos: sumário geológico e setores em oferta. Brasília, DF: Agência Nacional do Petróleo, Gás Natural e Biocombustíveis, 2017. Disponível em: </w:t>
       </w:r>
-      <w:hyperlink r:id="rId21">
+      <w:hyperlink r:id="rId23">
         <w:r>
           <w:rPr>
             <w:i w:val="1"/>
@@ -6527,7 +6952,7 @@
         </w:rPr>
         <w:t xml:space="preserve">FIGUEIREDO, A. G. de et al. Geomorfologia e sedimentologia da plataforma continental. In: KOWSMANN, R. O. (org.). Geologia e geomorfologia. Rio de Janeiro: Elsevier, 2015. p. 13–32. DOI: </w:t>
       </w:r>
-      <w:hyperlink r:id="rId22">
+      <w:hyperlink r:id="rId24">
         <w:r>
           <w:rPr>
             <w:i w:val="1"/>
@@ -6569,7 +6994,7 @@
         </w:rPr>
         <w:t xml:space="preserve">GAMBOA, D. &amp; ALVES, T. M. Bi-modal deformation styles in confined mass-transport deposits: examples from a salt minibasin in SE Brazil. Marine Geology, v. 379, p. 176–193, 2016. DOI: </w:t>
       </w:r>
-      <w:hyperlink r:id="rId23">
+      <w:hyperlink r:id="rId25">
         <w:r>
           <w:rPr>
             <w:i w:val="1"/>
@@ -6611,7 +7036,7 @@
         </w:rPr>
         <w:t xml:space="preserve">GÜRALP SYSTEMS LIMITED. Ocean bottom seismometers. Aldermaston: Güralp Systems Limited, [s. d.]. Disponível em: </w:t>
       </w:r>
-      <w:hyperlink r:id="rId24">
+      <w:hyperlink r:id="rId26">
         <w:r>
           <w:rPr>
             <w:i w:val="1"/>
@@ -6653,7 +7078,7 @@
         </w:rPr>
         <w:t xml:space="preserve">HAMPTON, M. A.; LEE, H. J.; LOCAT, J. Submarine landslides. Reviews of Geophysics, v. 34, n. 1, p. 33–59, 1996. DOI: </w:t>
       </w:r>
-      <w:hyperlink r:id="rId25">
+      <w:hyperlink r:id="rId27">
         <w:r>
           <w:rPr>
             <w:i w:val="1"/>
@@ -6695,7 +7120,7 @@
         </w:rPr>
         <w:t xml:space="preserve">HERCOS, C. Z. Os depósitos de movimento de massa submarinos nas bacias marginais do sudeste brasileiro: tipos, ocorrências, idades, feições diagnósticas. In: CONGRESSO INTERNACIONAL DA SOCIEDADE BRASILEIRA DE GEOFÍSICA, 17., 2021, Rio de Janeiro. Anais [...]. Rio de Janeiro: Sociedade Brasileira de Geofísica, 2021. Disponível em: </w:t>
       </w:r>
-      <w:hyperlink r:id="rId26">
+      <w:hyperlink r:id="rId28">
         <w:r>
           <w:rPr>
             <w:i w:val="1"/>
@@ -6758,7 +7183,7 @@
         </w:rPr>
         <w:t xml:space="preserve">KNELLER, B. et al. Mass-transport and slope accommodation: implications for turbidite sandstone reservoirs. AAPG Bulletin, v. 100, n. 2, p. 213–235, 2016. DOI: </w:t>
       </w:r>
-      <w:hyperlink r:id="rId27">
+      <w:hyperlink r:id="rId29">
         <w:r>
           <w:rPr>
             <w:i w:val="1"/>
@@ -6800,7 +7225,7 @@
         </w:rPr>
         <w:t xml:space="preserve">KOWSMANN, R. O.; LIMA, A. C.; VICALVI, M. A. Feições indicadoras de instabilidade geológica no talude continental e no platô de São Paulo. In: KOWSMANN, R. O. (org.). Geologia e geomorfologia. Rio de Janeiro: Elsevier, 2015. p. 71–97. DOI: </w:t>
       </w:r>
-      <w:hyperlink r:id="rId28">
+      <w:hyperlink r:id="rId30">
         <w:r>
           <w:rPr>
             <w:i w:val="1"/>
@@ -6842,7 +7267,7 @@
         </w:rPr>
         <w:t xml:space="preserve">KRYLOV, A. A. et al. Peculiarities of the HVSR method application to seismic records obtained by ocean-bottom seismographs in the Arctic. Journal of Marine Science and Engineering, v. 8, n. 12, 2020. DOI: </w:t>
       </w:r>
-      <w:hyperlink r:id="rId29">
+      <w:hyperlink r:id="rId31">
         <w:r>
           <w:rPr>
             <w:i w:val="1"/>
@@ -6884,7 +7309,7 @@
         </w:rPr>
         <w:t xml:space="preserve">LEE, H. J. et al. Submarine mass movements on continental margins. In: NITTROUER, C. A. et al. (org.). Continental margin sedimentation: from sediment transport to sequence stratigraphy. Oxford: Blackwell, 2007. p. 213–274. DOI: </w:t>
       </w:r>
-      <w:hyperlink r:id="rId30">
+      <w:hyperlink r:id="rId32">
         <w:r>
           <w:rPr>
             <w:i w:val="1"/>
@@ -6926,7 +7351,7 @@
         </w:rPr>
         <w:t xml:space="preserve">MECKEL III, L. D. Reservoir characteristics and classification of sand-prone submarine mass-transport deposits. In: SHIPP, R. C.; WEIMER, P.; POSAMENTIER, H. W. (org.). Mass-transport deposits in deepwater settings. Tulsa: SEPM Society for Sedimentary Geology, 2011. p. 423–452. DOI: </w:t>
       </w:r>
-      <w:hyperlink r:id="rId31">
+      <w:hyperlink r:id="rId33">
         <w:r>
           <w:rPr>
             <w:i w:val="1"/>
@@ -6968,7 +7393,7 @@
         </w:rPr>
         <w:t xml:space="preserve">MENESES, A. R. dos S. Estudo teórico de atributos sísmicos em dados sísmicos de reflexão. 2010. 86 f. Trabalho de Conclusão de Curso — Universidade Federal da Bahia, Salvador, 2010. Disponível em: </w:t>
       </w:r>
-      <w:hyperlink r:id="rId32">
+      <w:hyperlink r:id="rId34">
         <w:r>
           <w:rPr>
             <w:i w:val="1"/>
@@ -7010,7 +7435,7 @@
         </w:rPr>
         <w:t xml:space="preserve">MIO, E. de; CHANG, H. K.; CORRÊA, F. S. Integração de métodos geofísicos na modelagem crustal da Bacia de Santos. Revista Brasileira de Geofísica, v. 23, n. 3, p. 275–284, 2005. DOI: </w:t>
       </w:r>
-      <w:hyperlink r:id="rId33">
+      <w:hyperlink r:id="rId35">
         <w:r>
           <w:rPr>
             <w:i w:val="1"/>
@@ -7052,7 +7477,7 @@
         </w:rPr>
         <w:t xml:space="preserve">MITCHUM JR., R. M. et al. Seismic stratigraphy and global changes of sea level, part 6: stratigraphic interpretation of seismic reflection patterns in depositional sequences. In: PAYTON, C. E. (org.). Seismic stratigraphy: applications to hydrocarbon exploration. Tulsa: American Association of Petroleum Geologists, 1977. p. 117–133. (AAPG Memoir, v. 26). DOI: </w:t>
       </w:r>
-      <w:hyperlink r:id="rId34">
+      <w:hyperlink r:id="rId36">
         <w:r>
           <w:rPr>
             <w:i w:val="1"/>
@@ -7094,7 +7519,7 @@
         </w:rPr>
         <w:t xml:space="preserve">MOSCARDELLI, L. &amp; WOOD, L. New classification system for mass transport complexes in offshore Trinidad. Basin Research, v. 20, n. 1, p. 73–98, 2008. DOI: </w:t>
       </w:r>
-      <w:hyperlink r:id="rId35">
+      <w:hyperlink r:id="rId37">
         <w:r>
           <w:rPr>
             <w:i w:val="1"/>
@@ -7136,7 +7561,7 @@
         </w:rPr>
         <w:t xml:space="preserve">MOSCARDELLI, L. &amp; WOOD, L. Morphometry of mass-transport deposits as a predictive tool. Geological Society of America Bulletin, v. 128, n. 1–2, p. 47–80, 2016. DOI: </w:t>
       </w:r>
-      <w:hyperlink r:id="rId36">
+      <w:hyperlink r:id="rId38">
         <w:r>
           <w:rPr>
             <w:i w:val="1"/>
@@ -7178,7 +7603,7 @@
         </w:rPr>
         <w:t xml:space="preserve">NAKAMURA, Y. A method for dynamic characteristics estimation of subsurface using microtremor on the ground surface. Quarterly Report of Railway Technical Research Institute, v. 30, n. 1, p. 25–33, 1989. Disponível em: </w:t>
       </w:r>
-      <w:hyperlink r:id="rId37">
+      <w:hyperlink r:id="rId39">
         <w:r>
           <w:rPr>
             <w:i w:val="1"/>
@@ -7220,7 +7645,7 @@
         </w:rPr>
         <w:t xml:space="preserve">OKADA, H. &amp; SUTO, K. The microtremor survey method. Tulsa: Society of Exploration Geophysicists, 2003. DOI: </w:t>
       </w:r>
-      <w:hyperlink r:id="rId38">
+      <w:hyperlink r:id="rId40">
         <w:r>
           <w:rPr>
             <w:i w:val="1"/>
@@ -7283,7 +7708,7 @@
         </w:rPr>
         <w:t xml:space="preserve">PEREIRA, V.; BASILIO, M. P.; SANTOS, C. H. T. PyBibX: a Python library for bibliometric and scientometric analysis powered with artificial intelligence tools. Data Technologies and Applications, v. 59, n. 2, p. 302–337, 2025. DOI: </w:t>
       </w:r>
-      <w:hyperlink r:id="rId39">
+      <w:hyperlink r:id="rId41">
         <w:r>
           <w:rPr>
             <w:i w:val="1"/>
@@ -7325,7 +7750,7 @@
         </w:rPr>
         <w:t xml:space="preserve">POPE, E. L.; TALLING, P. J.; CARTER, L. Which earthquakes trigger damaging submarine mass movements: insights from a global record of submarine cable breaks? Marine Geology, v. 384, p. 131–146, 2017. DOI: </w:t>
       </w:r>
-      <w:hyperlink r:id="rId40">
+      <w:hyperlink r:id="rId42">
         <w:r>
           <w:rPr>
             <w:i w:val="1"/>
@@ -7367,7 +7792,7 @@
         </w:rPr>
         <w:t xml:space="preserve">POSAMENTIER, H. W. &amp; KOLLA, V. Seismic geomorphology and stratigraphy of depositional elements in deep-water settings. Journal of Sedimentary Research, v. 73, n. 3, p. 367–388, 2003. DOI: </w:t>
       </w:r>
-      <w:hyperlink r:id="rId41">
+      <w:hyperlink r:id="rId43">
         <w:r>
           <w:rPr>
             <w:i w:val="1"/>
@@ -7430,7 +7855,7 @@
         </w:rPr>
         <w:t xml:space="preserve">PREISSLER, A. G. Geomorfologia sísmica de feições deposicionais e erosionais do sistema deltaico Eridanos (Plioceno do Setor Holandês do Mar do Norte). 2016. 71 f. Dissertação (Mestrado) — Universidade do Vale do Rio dos Sinos, São Leopoldo, 2016. Disponível em: </w:t>
       </w:r>
-      <w:hyperlink r:id="rId42">
+      <w:hyperlink r:id="rId44">
         <w:r>
           <w:rPr>
             <w:i w:val="1"/>
@@ -7514,7 +7939,7 @@
         </w:rPr>
         <w:t xml:space="preserve">SILVEIRA, I. C. A. et al. Caracterização da oceanografia física do talude continental e região oceânica da Bacia de Campos. In: Meteorologia e oceanografia. [S. l.]: Elsevier, 2016. p. 135–189. DOI: </w:t>
       </w:r>
-      <w:hyperlink r:id="rId43">
+      <w:hyperlink r:id="rId45">
         <w:r>
           <w:rPr>
             <w:i w:val="1"/>
@@ -7556,7 +7981,7 @@
         </w:rPr>
         <w:t xml:space="preserve">SRISAWAD, S. &amp; LERTSTTISPHAN, K. Bibliometric analysis of references selection that influence citations among articles of Thai multidisciplinary journals. Journal of Scientometric Research, v. 10, n. 3, p. 288–296, 2021. DOI: </w:t>
       </w:r>
-      <w:hyperlink r:id="rId44">
+      <w:hyperlink r:id="rId46">
         <w:r>
           <w:rPr>
             <w:i w:val="1"/>
@@ -7619,7 +8044,7 @@
         </w:rPr>
         <w:t xml:space="preserve">TALLING, P. J. et al. Large submarine landslides on continental slopes: geohazards, methane release, and climate change. Oceanography, v. 27, n. 2, p. 32–45, 2014. DOI: </w:t>
       </w:r>
-      <w:hyperlink r:id="rId45">
+      <w:hyperlink r:id="rId47">
         <w:r>
           <w:rPr>
             <w:i w:val="1"/>
@@ -7745,7 +8170,7 @@
         </w:rPr>
         <w:t xml:space="preserve">VANNESTE, M. et al. Seafloor instabilities and sediment deformation processes: the need for integrated, multi-disciplinary investigations. Marine Geology, v. 352, p. 183–214, 2014. DOI: </w:t>
       </w:r>
-      <w:hyperlink r:id="rId46">
+      <w:hyperlink r:id="rId48">
         <w:r>
           <w:rPr>
             <w:i w:val="1"/>
@@ -7787,7 +8212,7 @@
         </w:rPr>
         <w:t xml:space="preserve">VANTASSEL, J. P.; COX, B. R.; BRANNON, D. M. HVSRweb: an open-source, web-based application for horizontal-to-vertical spectral ratio processing. In: INTERNATIONAL FOUNDATIONS CONGRESS AND EQUIPMENT EXPO, 2021, Dallas. Proceedings [...]. Dallas: ASCE, 2021. p. 51–60. DOI: </w:t>
       </w:r>
-      <w:hyperlink r:id="rId47">
+      <w:hyperlink r:id="rId49">
         <w:r>
           <w:rPr>
             <w:i w:val="1"/>
@@ -7829,7 +8254,7 @@
         </w:rPr>
         <w:t xml:space="preserve">YILMAZ, Ö. Seismic data analysis: processing, inversion, and interpretation of seismic data. Tulsa: Society of Exploration Geophysicists, 2001. (Investigations in Geophysics, v. 10). DOI: </w:t>
       </w:r>
-      <w:hyperlink r:id="rId48">
+      <w:hyperlink r:id="rId50">
         <w:r>
           <w:rPr>
             <w:i w:val="1"/>
@@ -7967,7 +8392,7 @@
       </w:r>
     </w:p>
     <w:sectPr>
-      <w:footerReference r:id="rId49" w:type="default"/>
+      <w:footerReference r:id="rId51" w:type="default"/>
       <w:pgSz w:h="16838" w:w="11906" w:orient="portrait"/>
       <w:pgMar w:bottom="1134" w:top="1701" w:left="1701" w:right="1134" w:header="709" w:footer="709"/>
       <w:pgNumType w:start="1"/>

</xml_diff>

<commit_message>
Ajusta figura de relacoes de forca e simbolos
</commit_message>
<xml_diff>
--- a/docs/template-tcc-geologia-ufsc.docx
+++ b/docs/template-tcc-geologia-ufsc.docx
@@ -13,12 +13,12 @@
           <wp:inline distB="0" distT="0" distL="114300" distR="114300">
             <wp:extent cx="900000" cy="1236424"/>
             <wp:effectExtent b="0" l="0" r="0" t="0"/>
-            <wp:docPr descr="Símbolo da Universidade Federal de Santa Catarina" id="3" name="image5.png"/>
+            <wp:docPr descr="Símbolo da Universidade Federal de Santa Catarina" id="3" name="image1.png"/>
             <a:graphic>
               <a:graphicData uri="http://schemas.openxmlformats.org/drawingml/2006/picture">
                 <pic:pic>
                   <pic:nvPicPr>
-                    <pic:cNvPr descr="Símbolo da Universidade Federal de Santa Catarina" id="0" name="image5.png"/>
+                    <pic:cNvPr descr="Símbolo da Universidade Federal de Santa Catarina" id="0" name="image1.png"/>
                     <pic:cNvPicPr preferRelativeResize="0"/>
                   </pic:nvPicPr>
                   <pic:blipFill>
@@ -1779,7 +1779,7 @@
     </w:p>
     <w:sdt>
       <w:sdtPr>
-        <w:id w:val="-813349404"/>
+        <w:id w:val="-325233542"/>
         <w:docPartObj>
           <w:docPartGallery w:val="Table of Contents"/>
           <w:docPartUnique w:val="1"/>
@@ -3006,12 +3006,12 @@
           <wp:inline distB="114300" distT="114300" distL="114300" distR="114300">
             <wp:extent cx="4690796" cy="4706302"/>
             <wp:effectExtent b="0" l="0" r="0" t="0"/>
-            <wp:docPr id="7" name="image4.png"/>
+            <wp:docPr id="7" name="image6.png"/>
             <a:graphic>
               <a:graphicData uri="http://schemas.openxmlformats.org/drawingml/2006/picture">
                 <pic:pic>
                   <pic:nvPicPr>
-                    <pic:cNvPr id="0" name="image4.png"/>
+                    <pic:cNvPr id="0" name="image6.png"/>
                     <pic:cNvPicPr preferRelativeResize="0"/>
                   </pic:nvPicPr>
                   <pic:blipFill>
@@ -3173,12 +3173,12 @@
           <wp:inline distB="114300" distT="114300" distL="114300" distR="114300">
             <wp:extent cx="5759775" cy="1295400"/>
             <wp:effectExtent b="0" l="0" r="0" t="0"/>
-            <wp:docPr id="1" name="image3.png"/>
+            <wp:docPr id="1" name="image4.png"/>
             <a:graphic>
               <a:graphicData uri="http://schemas.openxmlformats.org/drawingml/2006/picture">
                 <pic:pic>
                   <pic:nvPicPr>
-                    <pic:cNvPr id="0" name="image3.png"/>
+                    <pic:cNvPr id="0" name="image4.png"/>
                     <pic:cNvPicPr preferRelativeResize="0"/>
                   </pic:nvPicPr>
                   <pic:blipFill>
@@ -3287,12 +3287,12 @@
           <wp:inline distB="114300" distT="114300" distL="114300" distR="114300">
             <wp:extent cx="5444561" cy="2798774"/>
             <wp:effectExtent b="0" l="0" r="0" t="0"/>
-            <wp:docPr id="5" name="image1.png"/>
+            <wp:docPr id="5" name="image3.png"/>
             <a:graphic>
               <a:graphicData uri="http://schemas.openxmlformats.org/drawingml/2006/picture">
                 <pic:pic>
                   <pic:nvPicPr>
-                    <pic:cNvPr id="0" name="image1.png"/>
+                    <pic:cNvPr id="0" name="image3.png"/>
                     <pic:cNvPicPr preferRelativeResize="0"/>
                   </pic:nvPicPr>
                   <pic:blipFill>
@@ -4587,7 +4587,7 @@
           <w:highlight w:val="white"/>
           <w:rtl w:val="0"/>
         </w:rPr>
-        <w:t xml:space="preserve">As equações mostram que o aumento da poropressão reduz a tensão efetiva e, consequentemente, a resistência ao cisalhamento. Quando a poropressão se aproxima da tensão normal total, a tensão efetiva tende a valores muito baixos e o sedimento perde grande parte de sua resistência. A relação entre tensão total, poropressão, tensão efetiva e resistência ao cisalhamento é sintetizada na Figura 5. Nessa figura, a poropressão é representada pelo símbolo μ; neste texto e nas equações, adota-se u. Nessas condições, mesmo um pequeno aumento da tensão cisalhante pode provocar a ruptura (Hampton et al., 1996; Talling et al., 2014).</w:t>
+        <w:t xml:space="preserve">As equações mostram que o aumento da poropressão reduz a tensão efetiva e, consequentemente, a resistência ao cisalhamento. Quando a poropressão se aproxima da tensão normal total, a tensão efetiva tende a valores muito baixos e o sedimento perde grande parte de sua resistência. A relação entre tensão total, poropressão, tensão efetiva e resistência ao cisalhamento é sintetizada na Figura 5. Na figura, a poropressão e o ângulo de atrito são representados por μ e θ; neste texto e nas equações, adotam-se u e φ′, respectivamente. Nessas condições, mesmo um pequeno aumento da tensão cisalhante pode provocar a ruptura (Hampton et al., 1996; Talling et al., 2014).</w:t>
       </w:r>
     </w:p>
     <w:p>
@@ -4607,12 +4607,12 @@
           <wp:inline distB="114300" distT="114300" distL="114300" distR="114300">
             <wp:extent cx="3481083" cy="5218748"/>
             <wp:effectExtent b="0" l="0" r="0" t="0"/>
-            <wp:docPr id="6" name="image6.png"/>
+            <wp:docPr id="6" name="image7.png"/>
             <a:graphic>
               <a:graphicData uri="http://schemas.openxmlformats.org/drawingml/2006/picture">
                 <pic:pic>
                   <pic:nvPicPr>
-                    <pic:cNvPr id="0" name="image6.png"/>
+                    <pic:cNvPr id="0" name="image7.png"/>
                     <pic:cNvPicPr preferRelativeResize="0"/>
                   </pic:nvPicPr>
                   <pic:blipFill>
@@ -5117,12 +5117,12 @@
           <wp:inline distB="114300" distT="114300" distL="114300" distR="114300">
             <wp:extent cx="5759775" cy="4127500"/>
             <wp:effectExtent b="0" l="0" r="0" t="0"/>
-            <wp:docPr id="4" name="image7.png"/>
+            <wp:docPr id="4" name="image5.png"/>
             <a:graphic>
               <a:graphicData uri="http://schemas.openxmlformats.org/drawingml/2006/picture">
                 <pic:pic>
                   <pic:nvPicPr>
-                    <pic:cNvPr id="0" name="image7.png"/>
+                    <pic:cNvPr id="0" name="image5.png"/>
                     <pic:cNvPicPr preferRelativeResize="0"/>
                   </pic:nvPicPr>
                   <pic:blipFill>

</xml_diff>

<commit_message>
Atualizacao automatica 2026-09-19 18:20:40
</commit_message>
<xml_diff>
--- a/docs/template-tcc-geologia-ufsc.docx
+++ b/docs/template-tcc-geologia-ufsc.docx
@@ -13,12 +13,12 @@
           <wp:inline distB="0" distT="0" distL="114300" distR="114300">
             <wp:extent cx="900000" cy="1236424"/>
             <wp:effectExtent b="0" l="0" r="0" t="0"/>
-            <wp:docPr descr="Símbolo da Universidade Federal de Santa Catarina" id="3" name="image1.png"/>
+            <wp:docPr descr="Símbolo da Universidade Federal de Santa Catarina" id="3" name="image4.png"/>
             <a:graphic>
               <a:graphicData uri="http://schemas.openxmlformats.org/drawingml/2006/picture">
                 <pic:pic>
                   <pic:nvPicPr>
-                    <pic:cNvPr descr="Símbolo da Universidade Federal de Santa Catarina" id="0" name="image1.png"/>
+                    <pic:cNvPr descr="Símbolo da Universidade Federal de Santa Catarina" id="0" name="image4.png"/>
                     <pic:cNvPicPr preferRelativeResize="0"/>
                   </pic:nvPicPr>
                   <pic:blipFill>
@@ -1475,7 +1475,7 @@
         <w:rPr>
           <w:rtl w:val="0"/>
         </w:rPr>
-        <w:t xml:space="preserve">Figura 5 — Relações entre tensão total, poropressão, tensão efetiva e resistência ao cisalhamento em sedimentos marinhos saturados</w:t>
+        <w:t xml:space="preserve">Figura 5 — Relações de força e condições de estabilidade em sedimentos marinhos: (a) forças atuantes em um bloco sedimentar sobre um talude; (b) variação das tensões total, efetiva e da poropressão com a profundidade; (c) resistência ao cisalhamento e condição de ruptura</w:t>
       </w:r>
     </w:p>
     <w:p>
@@ -1779,7 +1779,7 @@
     </w:p>
     <w:sdt>
       <w:sdtPr>
-        <w:id w:val="-325233542"/>
+        <w:id w:val="1468638542"/>
         <w:docPartObj>
           <w:docPartGallery w:val="Table of Contents"/>
           <w:docPartUnique w:val="1"/>
@@ -3006,12 +3006,12 @@
           <wp:inline distB="114300" distT="114300" distL="114300" distR="114300">
             <wp:extent cx="4690796" cy="4706302"/>
             <wp:effectExtent b="0" l="0" r="0" t="0"/>
-            <wp:docPr id="7" name="image6.png"/>
+            <wp:docPr id="7" name="image3.png"/>
             <a:graphic>
               <a:graphicData uri="http://schemas.openxmlformats.org/drawingml/2006/picture">
                 <pic:pic>
                   <pic:nvPicPr>
-                    <pic:cNvPr id="0" name="image6.png"/>
+                    <pic:cNvPr id="0" name="image3.png"/>
                     <pic:cNvPicPr preferRelativeResize="0"/>
                   </pic:nvPicPr>
                   <pic:blipFill>
@@ -3173,12 +3173,12 @@
           <wp:inline distB="114300" distT="114300" distL="114300" distR="114300">
             <wp:extent cx="5759775" cy="1295400"/>
             <wp:effectExtent b="0" l="0" r="0" t="0"/>
-            <wp:docPr id="1" name="image4.png"/>
+            <wp:docPr id="1" name="image2.png"/>
             <a:graphic>
               <a:graphicData uri="http://schemas.openxmlformats.org/drawingml/2006/picture">
                 <pic:pic>
                   <pic:nvPicPr>
-                    <pic:cNvPr id="0" name="image4.png"/>
+                    <pic:cNvPr id="0" name="image2.png"/>
                     <pic:cNvPicPr preferRelativeResize="0"/>
                   </pic:nvPicPr>
                   <pic:blipFill>
@@ -3287,12 +3287,12 @@
           <wp:inline distB="114300" distT="114300" distL="114300" distR="114300">
             <wp:extent cx="5444561" cy="2798774"/>
             <wp:effectExtent b="0" l="0" r="0" t="0"/>
-            <wp:docPr id="5" name="image3.png"/>
+            <wp:docPr id="5" name="image1.png"/>
             <a:graphic>
               <a:graphicData uri="http://schemas.openxmlformats.org/drawingml/2006/picture">
                 <pic:pic>
                   <pic:nvPicPr>
-                    <pic:cNvPr id="0" name="image3.png"/>
+                    <pic:cNvPr id="0" name="image1.png"/>
                     <pic:cNvPicPr preferRelativeResize="0"/>
                   </pic:nvPicPr>
                   <pic:blipFill>
@@ -3516,12 +3516,12 @@
           <wp:inline distB="114300" distT="114300" distL="114300" distR="114300">
             <wp:extent cx="5344478" cy="4946954"/>
             <wp:effectExtent b="0" l="0" r="0" t="0"/>
-            <wp:docPr id="2" name="image2.png"/>
+            <wp:docPr id="2" name="image5.png"/>
             <a:graphic>
               <a:graphicData uri="http://schemas.openxmlformats.org/drawingml/2006/picture">
                 <pic:pic>
                   <pic:nvPicPr>
-                    <pic:cNvPr id="0" name="image2.png"/>
+                    <pic:cNvPr id="0" name="image5.png"/>
                     <pic:cNvPicPr preferRelativeResize="0"/>
                   </pic:nvPicPr>
                   <pic:blipFill>
@@ -4587,7 +4587,7 @@
           <w:highlight w:val="white"/>
           <w:rtl w:val="0"/>
         </w:rPr>
-        <w:t xml:space="preserve">As equações mostram que o aumento da poropressão reduz a tensão efetiva e, consequentemente, a resistência ao cisalhamento. Quando a poropressão se aproxima da tensão normal total, a tensão efetiva tende a valores muito baixos e o sedimento perde grande parte de sua resistência. A relação entre tensão total, poropressão, tensão efetiva e resistência ao cisalhamento é sintetizada na Figura 5. Na figura, a poropressão e o ângulo de atrito são representados por μ e θ; neste texto e nas equações, adotam-se u e φ′, respectivamente. Nessas condições, mesmo um pequeno aumento da tensão cisalhante pode provocar a ruptura (Hampton et al., 1996; Talling et al., 2014).</w:t>
+        <w:t xml:space="preserve">As forças gravitacionais atuantes sobre um bloco sedimentar em um talude e suas componentes normal e tangencial são representadas na Figura 5(a). As equações mostram que o aumento da poropressão reduz a tensão efetiva e, consequentemente, a resistência ao cisalhamento, relação ilustrada na Figura 5(b). Quando a poropressão se aproxima da tensão normal total, a tensão efetiva tende a valores muito baixos e o sedimento perde grande parte de sua resistência; nessas condições, mesmo um pequeno aumento da tensão cisalhante pode provocar a ruptura, como sintetizado na Figura 5(c) (Hampton et al., 1996; Talling et al., 2014). Na figura, a poropressão e o ângulo de atrito são representados por μ e θ; neste texto e nas equações, adotam-se u e φ′, respectivamente.</w:t>
       </w:r>
     </w:p>
     <w:p>
@@ -4658,7 +4658,7 @@
           <w:szCs w:val="20"/>
           <w:rtl w:val="0"/>
         </w:rPr>
-        <w:t xml:space="preserve">Figura 5 — Relações entre tensão total, poropressão, tensão efetiva e resistência ao cisalhamento em sedimentos marinhos saturados</w:t>
+        <w:t xml:space="preserve">Figura 5 — Relações de força e condições de estabilidade em sedimentos marinhos: (a) forças atuantes em um bloco sedimentar sobre um talude; (b) variação das tensões total, efetiva e da poropressão com a profundidade; (c) resistência ao cisalhamento e condição de ruptura</w:t>
       </w:r>
     </w:p>
     <w:p>
@@ -5117,12 +5117,12 @@
           <wp:inline distB="114300" distT="114300" distL="114300" distR="114300">
             <wp:extent cx="5759775" cy="4127500"/>
             <wp:effectExtent b="0" l="0" r="0" t="0"/>
-            <wp:docPr id="4" name="image5.png"/>
+            <wp:docPr id="4" name="image6.png"/>
             <a:graphic>
               <a:graphicData uri="http://schemas.openxmlformats.org/drawingml/2006/picture">
                 <pic:pic>
                   <pic:nvPicPr>
-                    <pic:cNvPr id="0" name="image5.png"/>
+                    <pic:cNvPr id="0" name="image6.png"/>
                     <pic:cNvPicPr preferRelativeResize="0"/>
                   </pic:nvPicPr>
                   <pic:blipFill>
@@ -5145,6 +5145,27 @@
             </a:graphic>
           </wp:inline>
         </w:drawing>
+      </w:r>
+      <w:r>
+        <w:rPr>
+          <w:rtl w:val="0"/>
+        </w:rPr>
+      </w:r>
+    </w:p>
+    <w:p>
+      <w:pPr>
+        <w:spacing w:after="120" w:line="360" w:lineRule="auto"/>
+        <w:ind w:left="0" w:firstLine="709"/>
+        <w:jc w:val="both"/>
+        <w:rPr>
+          <w:highlight w:val="white"/>
+        </w:rPr>
+      </w:pPr>
+      <w:r>
+        <w:rPr>
+          <w:rtl w:val="0"/>
+        </w:rPr>
+        <w:t xml:space="preserve">Figura X – Síntese dos processos de dissociação de hidratos de gás previamente propostos como possíveis causas de movimentos de massa submarinos ou de emissões de metano. </w:t>
       </w:r>
       <w:r>
         <w:rPr>

</xml_diff>

<commit_message>
Atualizacao automatica 2026-09-19 18:22:41
</commit_message>
<xml_diff>
--- a/docs/template-tcc-geologia-ufsc.docx
+++ b/docs/template-tcc-geologia-ufsc.docx
@@ -1475,7 +1475,7 @@
         <w:rPr>
           <w:rtl w:val="0"/>
         </w:rPr>
-        <w:t xml:space="preserve">Figura 5 — Relações de força e condições de estabilidade em sedimentos marinhos: (a) forças atuantes em um bloco sedimentar sobre um talude; (b) variação das tensões total, efetiva e da poropressão com a profundidade; (c) resistência ao cisalhamento e condição de ruptura</w:t>
+        <w:t xml:space="preserve">Figura 5 — Relações de força e condições de estabilidade em sedimentos marinhos: (a) equilíbrio entre a força motriz e a resistência ao cisalhamento em um talude; (b) excesso de poropressão no espaço poroso do sedimento; (c) variação da tensão total, da poropressão e da tensão efetiva com a profundidade</w:t>
       </w:r>
     </w:p>
     <w:p>
@@ -1779,7 +1779,7 @@
     </w:p>
     <w:sdt>
       <w:sdtPr>
-        <w:id w:val="1468638542"/>
+        <w:id w:val="-852877217"/>
         <w:docPartObj>
           <w:docPartGallery w:val="Table of Contents"/>
           <w:docPartUnique w:val="1"/>
@@ -3173,12 +3173,12 @@
           <wp:inline distB="114300" distT="114300" distL="114300" distR="114300">
             <wp:extent cx="5759775" cy="1295400"/>
             <wp:effectExtent b="0" l="0" r="0" t="0"/>
-            <wp:docPr id="1" name="image2.png"/>
+            <wp:docPr id="1" name="image5.png"/>
             <a:graphic>
               <a:graphicData uri="http://schemas.openxmlformats.org/drawingml/2006/picture">
                 <pic:pic>
                   <pic:nvPicPr>
-                    <pic:cNvPr id="0" name="image2.png"/>
+                    <pic:cNvPr id="0" name="image5.png"/>
                     <pic:cNvPicPr preferRelativeResize="0"/>
                   </pic:nvPicPr>
                   <pic:blipFill>
@@ -3516,12 +3516,12 @@
           <wp:inline distB="114300" distT="114300" distL="114300" distR="114300">
             <wp:extent cx="5344478" cy="4946954"/>
             <wp:effectExtent b="0" l="0" r="0" t="0"/>
-            <wp:docPr id="2" name="image5.png"/>
+            <wp:docPr id="2" name="image2.png"/>
             <a:graphic>
               <a:graphicData uri="http://schemas.openxmlformats.org/drawingml/2006/picture">
                 <pic:pic>
                   <pic:nvPicPr>
-                    <pic:cNvPr id="0" name="image5.png"/>
+                    <pic:cNvPr id="0" name="image2.png"/>
                     <pic:cNvPicPr preferRelativeResize="0"/>
                   </pic:nvPicPr>
                   <pic:blipFill>
@@ -4587,7 +4587,7 @@
           <w:highlight w:val="white"/>
           <w:rtl w:val="0"/>
         </w:rPr>
-        <w:t xml:space="preserve">As forças gravitacionais atuantes sobre um bloco sedimentar em um talude e suas componentes normal e tangencial são representadas na Figura 5(a). As equações mostram que o aumento da poropressão reduz a tensão efetiva e, consequentemente, a resistência ao cisalhamento, relação ilustrada na Figura 5(b). Quando a poropressão se aproxima da tensão normal total, a tensão efetiva tende a valores muito baixos e o sedimento perde grande parte de sua resistência; nessas condições, mesmo um pequeno aumento da tensão cisalhante pode provocar a ruptura, como sintetizado na Figura 5(c) (Hampton et al., 1996; Talling et al., 2014). Na figura, a poropressão e o ângulo de atrito são representados por μ e θ; neste texto e nas equações, adotam-se u e φ′, respectivamente.</w:t>
+        <w:t xml:space="preserve">As forças atuantes sobre um bloco sedimentar em um talude e o equilíbrio entre a componente tangencial do peso e a resistência ao cisalhamento são representados na Figura 5(a). Nos sedimentos saturados, a água ocupa os espaços entre os grãos e o excesso de poropressão reduz o contato efetivo entre eles, como ilustrado na Figura 5(b). As equações mostram que esse aumento da poropressão reduz a tensão efetiva e, consequentemente, a resistência ao cisalhamento; a variação da tensão total, da poropressão e da tensão efetiva com a profundidade é apresentada na Figura 5(c). Quando a poropressão se aproxima da tensão normal total, a tensão efetiva tende a valores muito baixos e o sedimento perde grande parte de sua resistência. Nessas condições, mesmo um pequeno aumento da tensão cisalhante pode provocar a ruptura (Hampton et al., 1996; Talling et al., 2014). Na figura, a poropressão e o ângulo de atrito são representados por μ e θ; neste texto e nas equações, adotam-se u e φ′, respectivamente.</w:t>
       </w:r>
     </w:p>
     <w:p>
@@ -4658,7 +4658,7 @@
           <w:szCs w:val="20"/>
           <w:rtl w:val="0"/>
         </w:rPr>
-        <w:t xml:space="preserve">Figura 5 — Relações de força e condições de estabilidade em sedimentos marinhos: (a) forças atuantes em um bloco sedimentar sobre um talude; (b) variação das tensões total, efetiva e da poropressão com a profundidade; (c) resistência ao cisalhamento e condição de ruptura</w:t>
+        <w:t xml:space="preserve">Figura 5 — Relações de força e condições de estabilidade em sedimentos marinhos: (a) equilíbrio entre a força motriz e a resistência ao cisalhamento em um talude; (b) excesso de poropressão no espaço poroso do sedimento; (c) variação da tensão total, da poropressão e da tensão efetiva com a profundidade</w:t>
       </w:r>
     </w:p>
     <w:p>

</xml_diff>